<commit_message>
Record GitHub repository in the deployment and change log
Co-Authored-By: Claude Opus 5.5 <noreply@anthropic.com>
</commit_message>
<xml_diff>
--- a/documentation/Deployment and Change Log.docx
+++ b/documentation/Deployment and Change Log.docx
@@ -63,7 +63,7 @@
           <w:left w:w="10" w:type="dxa"/>
           <w:right w:w="10" w:type="dxa"/>
         </w:tblCellMar>
-        <w:tblLook w:val="04A0" w:firstRow="1" w:lastRow="0" w:firstColumn="1" w:lastColumn="0" w:noHBand="0" w:noVBand="1"/>
+        <w:tblLook w:val="0000" w:firstRow="0" w:lastRow="0" w:firstColumn="0" w:lastColumn="0" w:noHBand="0" w:noVBand="0"/>
       </w:tblPr>
       <w:tblGrid>
         <w:gridCol w:w="2791"/>
@@ -193,7 +193,7 @@
               <w:spacing w:after="40"/>
             </w:pPr>
             <w:r>
-              <w:t>1.8</w:t>
+              <w:t>1.9</w:t>
             </w:r>
           </w:p>
         </w:tc>
@@ -406,7 +406,7 @@
               <w:spacing w:after="40"/>
             </w:pPr>
             <w:r>
-              <w:t>Status</w:t>
+              <w:t>Source code</w:t>
             </w:r>
           </w:p>
         </w:tc>
@@ -431,7 +431,28 @@
               <w:spacing w:after="40"/>
             </w:pPr>
             <w:r>
-              <w:t>Built and tested locally. Not yet deployed.</w:t>
+              <w:rPr>
+                <w:rFonts w:ascii="Consolas" w:eastAsia="Consolas" w:hAnsi="Consolas" w:cs="Consolas"/>
+                <w:color w:val="4E11DC"/>
+                <w:sz w:val="19"/>
+                <w:szCs w:val="19"/>
+              </w:rPr>
+              <w:t>github.com/ohemengemmanuel/Altura-hurtz</w:t>
+            </w:r>
+            <w:r>
+              <w:t xml:space="preserve"> (branch </w:t>
+            </w:r>
+            <w:r>
+              <w:rPr>
+                <w:rFonts w:ascii="Consolas" w:eastAsia="Consolas" w:hAnsi="Consolas" w:cs="Consolas"/>
+                <w:color w:val="4E11DC"/>
+                <w:sz w:val="19"/>
+                <w:szCs w:val="19"/>
+              </w:rPr>
+              <w:t>main</w:t>
+            </w:r>
+            <w:r>
+              <w:t>)</w:t>
             </w:r>
           </w:p>
         </w:tc>
@@ -464,6 +485,64 @@
               <w:spacing w:after="40"/>
             </w:pPr>
             <w:r>
+              <w:t>Status</w:t>
+            </w:r>
+          </w:p>
+        </w:tc>
+        <w:tc>
+          <w:tcPr>
+            <w:tcW w:w="6515" w:type="dxa"/>
+            <w:tcBorders>
+              <w:top w:val="single" w:sz="4" w:space="0" w:color="C9C3E6"/>
+              <w:left w:val="single" w:sz="4" w:space="0" w:color="C9C3E6"/>
+              <w:bottom w:val="single" w:sz="4" w:space="0" w:color="C9C3E6"/>
+              <w:right w:val="single" w:sz="4" w:space="0" w:color="C9C3E6"/>
+            </w:tcBorders>
+            <w:tcMar>
+              <w:top w:w="80" w:type="dxa"/>
+              <w:left w:w="110" w:type="dxa"/>
+              <w:bottom w:w="80" w:type="dxa"/>
+              <w:right w:w="110" w:type="dxa"/>
+            </w:tcMar>
+          </w:tcPr>
+          <w:p>
+            <w:pPr>
+              <w:spacing w:after="40"/>
+            </w:pPr>
+            <w:r>
+              <w:t>Built and tested locally. Not yet deployed.</w:t>
+            </w:r>
+          </w:p>
+        </w:tc>
+      </w:tr>
+      <w:tr>
+        <w:tblPrEx>
+          <w:tblCellMar>
+            <w:top w:w="0" w:type="dxa"/>
+            <w:bottom w:w="0" w:type="dxa"/>
+          </w:tblCellMar>
+        </w:tblPrEx>
+        <w:tc>
+          <w:tcPr>
+            <w:tcW w:w="2791" w:type="dxa"/>
+            <w:tcBorders>
+              <w:top w:val="single" w:sz="4" w:space="0" w:color="C9C3E6"/>
+              <w:left w:val="single" w:sz="4" w:space="0" w:color="C9C3E6"/>
+              <w:bottom w:val="single" w:sz="4" w:space="0" w:color="C9C3E6"/>
+              <w:right w:val="single" w:sz="4" w:space="0" w:color="C9C3E6"/>
+            </w:tcBorders>
+            <w:tcMar>
+              <w:top w:w="80" w:type="dxa"/>
+              <w:left w:w="110" w:type="dxa"/>
+              <w:bottom w:w="80" w:type="dxa"/>
+              <w:right w:w="110" w:type="dxa"/>
+            </w:tcMar>
+          </w:tcPr>
+          <w:p>
+            <w:pPr>
+              <w:spacing w:after="40"/>
+            </w:pPr>
+            <w:r>
               <w:t>Last updated</w:t>
             </w:r>
           </w:p>
@@ -489,7 +568,7 @@
               <w:spacing w:after="40"/>
             </w:pPr>
             <w:r>
-              <w:t>27 September 2026 (metallic gain fader)</w:t>
+              <w:t>27 September 2026 (pushed to GitHub)</w:t>
             </w:r>
           </w:p>
         </w:tc>
@@ -517,7 +596,7 @@
     <w:sdt>
       <w:sdtPr>
         <w:alias w:val="Contents"/>
-        <w:id w:val="1133290510"/>
+        <w:id w:val="683254612"/>
       </w:sdtPr>
       <w:sdtEndPr/>
       <w:sdtContent>
@@ -546,7 +625,7 @@
           <w:r>
             <w:fldChar w:fldCharType="separate"/>
           </w:r>
-          <w:hyperlink w:anchor="_Toc241369936" w:history="1">
+          <w:hyperlink w:anchor="_Toc241371001" w:history="1">
             <w:r>
               <w:rPr>
                 <w:rStyle w:val="Hyperlink"/>
@@ -570,7 +649,7 @@
               <w:rPr>
                 <w:noProof/>
               </w:rPr>
-              <w:instrText xml:space="preserve"> PAGEREF _Toc241369936 \h </w:instrText>
+              <w:instrText xml:space="preserve"> PAGEREF _Toc241371001 \h </w:instrText>
             </w:r>
             <w:r>
               <w:rPr>
@@ -613,7 +692,7 @@
               <w14:ligatures w14:val="standardContextual"/>
             </w:rPr>
           </w:pPr>
-          <w:hyperlink w:anchor="_Toc241369937" w:history="1">
+          <w:hyperlink w:anchor="_Toc241371002" w:history="1">
             <w:r>
               <w:rPr>
                 <w:rStyle w:val="Hyperlink"/>
@@ -637,7 +716,7 @@
               <w:rPr>
                 <w:noProof/>
               </w:rPr>
-              <w:instrText xml:space="preserve"> PAGEREF _Toc241369937 \h </w:instrText>
+              <w:instrText xml:space="preserve"> PAGEREF _Toc241371002 \h </w:instrText>
             </w:r>
             <w:r>
               <w:rPr>
@@ -680,7 +759,7 @@
               <w14:ligatures w14:val="standardContextual"/>
             </w:rPr>
           </w:pPr>
-          <w:hyperlink w:anchor="_Toc241369938" w:history="1">
+          <w:hyperlink w:anchor="_Toc241371003" w:history="1">
             <w:r>
               <w:rPr>
                 <w:rStyle w:val="Hyperlink"/>
@@ -704,7 +783,7 @@
               <w:rPr>
                 <w:noProof/>
               </w:rPr>
-              <w:instrText xml:space="preserve"> PAGEREF _Toc241369938 \h </w:instrText>
+              <w:instrText xml:space="preserve"> PAGEREF _Toc241371003 \h </w:instrText>
             </w:r>
             <w:r>
               <w:rPr>
@@ -747,7 +826,7 @@
               <w14:ligatures w14:val="standardContextual"/>
             </w:rPr>
           </w:pPr>
-          <w:hyperlink w:anchor="_Toc241369939" w:history="1">
+          <w:hyperlink w:anchor="_Toc241371004" w:history="1">
             <w:r>
               <w:rPr>
                 <w:rStyle w:val="Hyperlink"/>
@@ -771,7 +850,7 @@
               <w:rPr>
                 <w:noProof/>
               </w:rPr>
-              <w:instrText xml:space="preserve"> PAGEREF _Toc241369939 \h </w:instrText>
+              <w:instrText xml:space="preserve"> PAGEREF _Toc241371004 \h </w:instrText>
             </w:r>
             <w:r>
               <w:rPr>
@@ -814,7 +893,7 @@
               <w14:ligatures w14:val="standardContextual"/>
             </w:rPr>
           </w:pPr>
-          <w:hyperlink w:anchor="_Toc241369940" w:history="1">
+          <w:hyperlink w:anchor="_Toc241371005" w:history="1">
             <w:r>
               <w:rPr>
                 <w:rStyle w:val="Hyperlink"/>
@@ -838,7 +917,7 @@
               <w:rPr>
                 <w:noProof/>
               </w:rPr>
-              <w:instrText xml:space="preserve"> PAGEREF _Toc241369940 \h </w:instrText>
+              <w:instrText xml:space="preserve"> PAGEREF _Toc241371005 \h </w:instrText>
             </w:r>
             <w:r>
               <w:rPr>
@@ -881,7 +960,7 @@
               <w14:ligatures w14:val="standardContextual"/>
             </w:rPr>
           </w:pPr>
-          <w:hyperlink w:anchor="_Toc241369941" w:history="1">
+          <w:hyperlink w:anchor="_Toc241371006" w:history="1">
             <w:r>
               <w:rPr>
                 <w:rStyle w:val="Hyperlink"/>
@@ -905,7 +984,7 @@
               <w:rPr>
                 <w:noProof/>
               </w:rPr>
-              <w:instrText xml:space="preserve"> PAGEREF _Toc241369941 \h </w:instrText>
+              <w:instrText xml:space="preserve"> PAGEREF _Toc241371006 \h </w:instrText>
             </w:r>
             <w:r>
               <w:rPr>
@@ -948,7 +1027,7 @@
               <w14:ligatures w14:val="standardContextual"/>
             </w:rPr>
           </w:pPr>
-          <w:hyperlink w:anchor="_Toc241369942" w:history="1">
+          <w:hyperlink w:anchor="_Toc241371007" w:history="1">
             <w:r>
               <w:rPr>
                 <w:rStyle w:val="Hyperlink"/>
@@ -972,7 +1051,7 @@
               <w:rPr>
                 <w:noProof/>
               </w:rPr>
-              <w:instrText xml:space="preserve"> PAGEREF _Toc241369942 \h </w:instrText>
+              <w:instrText xml:space="preserve"> PAGEREF _Toc241371007 \h </w:instrText>
             </w:r>
             <w:r>
               <w:rPr>
@@ -1015,7 +1094,7 @@
               <w14:ligatures w14:val="standardContextual"/>
             </w:rPr>
           </w:pPr>
-          <w:hyperlink w:anchor="_Toc241369943" w:history="1">
+          <w:hyperlink w:anchor="_Toc241371008" w:history="1">
             <w:r>
               <w:rPr>
                 <w:rStyle w:val="Hyperlink"/>
@@ -1039,7 +1118,7 @@
               <w:rPr>
                 <w:noProof/>
               </w:rPr>
-              <w:instrText xml:space="preserve"> PAGEREF _Toc241369943 \h </w:instrText>
+              <w:instrText xml:space="preserve"> PAGEREF _Toc241371008 \h </w:instrText>
             </w:r>
             <w:r>
               <w:rPr>
@@ -1082,7 +1161,7 @@
               <w14:ligatures w14:val="standardContextual"/>
             </w:rPr>
           </w:pPr>
-          <w:hyperlink w:anchor="_Toc241369944" w:history="1">
+          <w:hyperlink w:anchor="_Toc241371009" w:history="1">
             <w:r>
               <w:rPr>
                 <w:rStyle w:val="Hyperlink"/>
@@ -1106,7 +1185,7 @@
               <w:rPr>
                 <w:noProof/>
               </w:rPr>
-              <w:instrText xml:space="preserve"> PAGEREF _Toc241369944 \h </w:instrText>
+              <w:instrText xml:space="preserve"> PAGEREF _Toc241371009 \h </w:instrText>
             </w:r>
             <w:r>
               <w:rPr>
@@ -1149,7 +1228,7 @@
               <w14:ligatures w14:val="standardContextual"/>
             </w:rPr>
           </w:pPr>
-          <w:hyperlink w:anchor="_Toc241369945" w:history="1">
+          <w:hyperlink w:anchor="_Toc241371010" w:history="1">
             <w:r>
               <w:rPr>
                 <w:rStyle w:val="Hyperlink"/>
@@ -1173,7 +1252,7 @@
               <w:rPr>
                 <w:noProof/>
               </w:rPr>
-              <w:instrText xml:space="preserve"> PAGEREF _Toc241369945 \h </w:instrText>
+              <w:instrText xml:space="preserve"> PAGEREF _Toc241371010 \h </w:instrText>
             </w:r>
             <w:r>
               <w:rPr>
@@ -1216,7 +1295,7 @@
               <w14:ligatures w14:val="standardContextual"/>
             </w:rPr>
           </w:pPr>
-          <w:hyperlink w:anchor="_Toc241369946" w:history="1">
+          <w:hyperlink w:anchor="_Toc241371011" w:history="1">
             <w:r>
               <w:rPr>
                 <w:rStyle w:val="Hyperlink"/>
@@ -1240,7 +1319,7 @@
               <w:rPr>
                 <w:noProof/>
               </w:rPr>
-              <w:instrText xml:space="preserve"> PAGEREF _Toc241369946 \h </w:instrText>
+              <w:instrText xml:space="preserve"> PAGEREF _Toc241371011 \h </w:instrText>
             </w:r>
             <w:r>
               <w:rPr>
@@ -1283,7 +1362,7 @@
               <w14:ligatures w14:val="standardContextual"/>
             </w:rPr>
           </w:pPr>
-          <w:hyperlink w:anchor="_Toc241369947" w:history="1">
+          <w:hyperlink w:anchor="_Toc241371012" w:history="1">
             <w:r>
               <w:rPr>
                 <w:rStyle w:val="Hyperlink"/>
@@ -1307,7 +1386,7 @@
               <w:rPr>
                 <w:noProof/>
               </w:rPr>
-              <w:instrText xml:space="preserve"> PAGEREF _Toc241369947 \h </w:instrText>
+              <w:instrText xml:space="preserve"> PAGEREF _Toc241371012 \h </w:instrText>
             </w:r>
             <w:r>
               <w:rPr>
@@ -1350,7 +1429,7 @@
               <w14:ligatures w14:val="standardContextual"/>
             </w:rPr>
           </w:pPr>
-          <w:hyperlink w:anchor="_Toc241369948" w:history="1">
+          <w:hyperlink w:anchor="_Toc241371013" w:history="1">
             <w:r>
               <w:rPr>
                 <w:rStyle w:val="Hyperlink"/>
@@ -1374,7 +1453,7 @@
               <w:rPr>
                 <w:noProof/>
               </w:rPr>
-              <w:instrText xml:space="preserve"> PAGEREF _Toc241369948 \h </w:instrText>
+              <w:instrText xml:space="preserve"> PAGEREF _Toc241371013 \h </w:instrText>
             </w:r>
             <w:r>
               <w:rPr>
@@ -1417,7 +1496,7 @@
               <w14:ligatures w14:val="standardContextual"/>
             </w:rPr>
           </w:pPr>
-          <w:hyperlink w:anchor="_Toc241369949" w:history="1">
+          <w:hyperlink w:anchor="_Toc241371014" w:history="1">
             <w:r>
               <w:rPr>
                 <w:rStyle w:val="Hyperlink"/>
@@ -1441,7 +1520,7 @@
               <w:rPr>
                 <w:noProof/>
               </w:rPr>
-              <w:instrText xml:space="preserve"> PAGEREF _Toc241369949 \h </w:instrText>
+              <w:instrText xml:space="preserve"> PAGEREF _Toc241371014 \h </w:instrText>
             </w:r>
             <w:r>
               <w:rPr>
@@ -1484,7 +1563,7 @@
               <w14:ligatures w14:val="standardContextual"/>
             </w:rPr>
           </w:pPr>
-          <w:hyperlink w:anchor="_Toc241369950" w:history="1">
+          <w:hyperlink w:anchor="_Toc241371015" w:history="1">
             <w:r>
               <w:rPr>
                 <w:rStyle w:val="Hyperlink"/>
@@ -1508,7 +1587,7 @@
               <w:rPr>
                 <w:noProof/>
               </w:rPr>
-              <w:instrText xml:space="preserve"> PAGEREF _Toc241369950 \h </w:instrText>
+              <w:instrText xml:space="preserve"> PAGEREF _Toc241371015 \h </w:instrText>
             </w:r>
             <w:r>
               <w:rPr>
@@ -1551,7 +1630,7 @@
               <w14:ligatures w14:val="standardContextual"/>
             </w:rPr>
           </w:pPr>
-          <w:hyperlink w:anchor="_Toc241369951" w:history="1">
+          <w:hyperlink w:anchor="_Toc241371016" w:history="1">
             <w:r>
               <w:rPr>
                 <w:rStyle w:val="Hyperlink"/>
@@ -1575,7 +1654,7 @@
               <w:rPr>
                 <w:noProof/>
               </w:rPr>
-              <w:instrText xml:space="preserve"> PAGEREF _Toc241369951 \h </w:instrText>
+              <w:instrText xml:space="preserve"> PAGEREF _Toc241371016 \h </w:instrText>
             </w:r>
             <w:r>
               <w:rPr>
@@ -1618,7 +1697,7 @@
               <w14:ligatures w14:val="standardContextual"/>
             </w:rPr>
           </w:pPr>
-          <w:hyperlink w:anchor="_Toc241369952" w:history="1">
+          <w:hyperlink w:anchor="_Toc241371017" w:history="1">
             <w:r>
               <w:rPr>
                 <w:rStyle w:val="Hyperlink"/>
@@ -1642,7 +1721,7 @@
               <w:rPr>
                 <w:noProof/>
               </w:rPr>
-              <w:instrText xml:space="preserve"> PAGEREF _Toc241369952 \h </w:instrText>
+              <w:instrText xml:space="preserve"> PAGEREF _Toc241371017 \h </w:instrText>
             </w:r>
             <w:r>
               <w:rPr>
@@ -1685,7 +1764,7 @@
               <w14:ligatures w14:val="standardContextual"/>
             </w:rPr>
           </w:pPr>
-          <w:hyperlink w:anchor="_Toc241369953" w:history="1">
+          <w:hyperlink w:anchor="_Toc241371018" w:history="1">
             <w:r>
               <w:rPr>
                 <w:rStyle w:val="Hyperlink"/>
@@ -1709,7 +1788,7 @@
               <w:rPr>
                 <w:noProof/>
               </w:rPr>
-              <w:instrText xml:space="preserve"> PAGEREF _Toc241369953 \h </w:instrText>
+              <w:instrText xml:space="preserve"> PAGEREF _Toc241371018 \h </w:instrText>
             </w:r>
             <w:r>
               <w:rPr>
@@ -1752,7 +1831,7 @@
               <w14:ligatures w14:val="standardContextual"/>
             </w:rPr>
           </w:pPr>
-          <w:hyperlink w:anchor="_Toc241369954" w:history="1">
+          <w:hyperlink w:anchor="_Toc241371019" w:history="1">
             <w:r>
               <w:rPr>
                 <w:rStyle w:val="Hyperlink"/>
@@ -1776,7 +1855,7 @@
               <w:rPr>
                 <w:noProof/>
               </w:rPr>
-              <w:instrText xml:space="preserve"> PAGEREF _Toc241369954 \h </w:instrText>
+              <w:instrText xml:space="preserve"> PAGEREF _Toc241371019 \h </w:instrText>
             </w:r>
             <w:r>
               <w:rPr>
@@ -1819,7 +1898,7 @@
               <w14:ligatures w14:val="standardContextual"/>
             </w:rPr>
           </w:pPr>
-          <w:hyperlink w:anchor="_Toc241369955" w:history="1">
+          <w:hyperlink w:anchor="_Toc241371020" w:history="1">
             <w:r>
               <w:rPr>
                 <w:rStyle w:val="Hyperlink"/>
@@ -1843,7 +1922,7 @@
               <w:rPr>
                 <w:noProof/>
               </w:rPr>
-              <w:instrText xml:space="preserve"> PAGEREF _Toc241369955 \h </w:instrText>
+              <w:instrText xml:space="preserve"> PAGEREF _Toc241371020 \h </w:instrText>
             </w:r>
             <w:r>
               <w:rPr>
@@ -1860,7 +1939,7 @@
               <w:rPr>
                 <w:noProof/>
               </w:rPr>
-              <w:t>7</w:t>
+              <w:t>8</w:t>
             </w:r>
             <w:r>
               <w:rPr>
@@ -1886,7 +1965,7 @@
               <w14:ligatures w14:val="standardContextual"/>
             </w:rPr>
           </w:pPr>
-          <w:hyperlink w:anchor="_Toc241369956" w:history="1">
+          <w:hyperlink w:anchor="_Toc241371021" w:history="1">
             <w:r>
               <w:rPr>
                 <w:rStyle w:val="Hyperlink"/>
@@ -1910,7 +1989,7 @@
               <w:rPr>
                 <w:noProof/>
               </w:rPr>
-              <w:instrText xml:space="preserve"> PAGEREF _Toc241369956 \h </w:instrText>
+              <w:instrText xml:space="preserve"> PAGEREF _Toc241371021 \h </w:instrText>
             </w:r>
             <w:r>
               <w:rPr>
@@ -1953,7 +2032,7 @@
               <w14:ligatures w14:val="standardContextual"/>
             </w:rPr>
           </w:pPr>
-          <w:hyperlink w:anchor="_Toc241369957" w:history="1">
+          <w:hyperlink w:anchor="_Toc241371022" w:history="1">
             <w:r>
               <w:rPr>
                 <w:rStyle w:val="Hyperlink"/>
@@ -1977,7 +2056,7 @@
               <w:rPr>
                 <w:noProof/>
               </w:rPr>
-              <w:instrText xml:space="preserve"> PAGEREF _Toc241369957 \h </w:instrText>
+              <w:instrText xml:space="preserve"> PAGEREF _Toc241371022 \h </w:instrText>
             </w:r>
             <w:r>
               <w:rPr>
@@ -2020,7 +2099,7 @@
               <w14:ligatures w14:val="standardContextual"/>
             </w:rPr>
           </w:pPr>
-          <w:hyperlink w:anchor="_Toc241369958" w:history="1">
+          <w:hyperlink w:anchor="_Toc241371023" w:history="1">
             <w:r>
               <w:rPr>
                 <w:rStyle w:val="Hyperlink"/>
@@ -2044,7 +2123,7 @@
               <w:rPr>
                 <w:noProof/>
               </w:rPr>
-              <w:instrText xml:space="preserve"> PAGEREF _Toc241369958 \h </w:instrText>
+              <w:instrText xml:space="preserve"> PAGEREF _Toc241371023 \h </w:instrText>
             </w:r>
             <w:r>
               <w:rPr>
@@ -2061,7 +2140,7 @@
               <w:rPr>
                 <w:noProof/>
               </w:rPr>
-              <w:t>11</w:t>
+              <w:t>12</w:t>
             </w:r>
             <w:r>
               <w:rPr>
@@ -2087,7 +2166,7 @@
       <w:pPr>
         <w:pStyle w:val="Heading1"/>
       </w:pPr>
-      <w:bookmarkStart w:id="0" w:name="_Toc241369936"/>
+      <w:bookmarkStart w:id="0" w:name="_Toc241371001"/>
       <w:r>
         <w:t>1. Project overview</w:t>
       </w:r>
@@ -2137,7 +2216,7 @@
       <w:pPr>
         <w:pStyle w:val="Heading2"/>
       </w:pPr>
-      <w:bookmarkStart w:id="1" w:name="_Toc241369937"/>
+      <w:bookmarkStart w:id="1" w:name="_Toc241371002"/>
       <w:r>
         <w:t>Pages</w:t>
       </w:r>
@@ -2158,7 +2237,7 @@
           <w:left w:w="10" w:type="dxa"/>
           <w:right w:w="10" w:type="dxa"/>
         </w:tblCellMar>
-        <w:tblLook w:val="04A0" w:firstRow="1" w:lastRow="0" w:firstColumn="1" w:lastColumn="0" w:noHBand="0" w:noVBand="1"/>
+        <w:tblLook w:val="0000" w:firstRow="0" w:lastRow="0" w:firstColumn="0" w:lastColumn="0" w:noHBand="0" w:noVBand="0"/>
       </w:tblPr>
       <w:tblGrid>
         <w:gridCol w:w="2419"/>
@@ -2894,7 +2973,7 @@
       <w:pPr>
         <w:pStyle w:val="Heading1"/>
       </w:pPr>
-      <w:bookmarkStart w:id="2" w:name="_Toc241369938"/>
+      <w:bookmarkStart w:id="2" w:name="_Toc241371003"/>
       <w:r>
         <w:t>2. Folder structure</w:t>
       </w:r>
@@ -2935,7 +3014,7 @@
           <w:left w:w="10" w:type="dxa"/>
           <w:right w:w="10" w:type="dxa"/>
         </w:tblCellMar>
-        <w:tblLook w:val="04A0" w:firstRow="1" w:lastRow="0" w:firstColumn="1" w:lastColumn="0" w:noHBand="0" w:noVBand="1"/>
+        <w:tblLook w:val="0000" w:firstRow="0" w:lastRow="0" w:firstColumn="0" w:lastColumn="0" w:noHBand="0" w:noVBand="0"/>
       </w:tblPr>
       <w:tblGrid>
         <w:gridCol w:w="3164"/>
@@ -3872,7 +3951,7 @@
       <w:pPr>
         <w:pStyle w:val="Heading1"/>
       </w:pPr>
-      <w:bookmarkStart w:id="3" w:name="_Toc241369939"/>
+      <w:bookmarkStart w:id="3" w:name="_Toc241371004"/>
       <w:r>
         <w:t>3. How the site works</w:t>
       </w:r>
@@ -3882,7 +3961,7 @@
       <w:pPr>
         <w:pStyle w:val="Heading2"/>
       </w:pPr>
-      <w:bookmarkStart w:id="4" w:name="_Toc241369940"/>
+      <w:bookmarkStart w:id="4" w:name="_Toc241371005"/>
       <w:r>
         <w:t>Design</w:t>
       </w:r>
@@ -4022,7 +4101,7 @@
       <w:pPr>
         <w:pStyle w:val="Heading2"/>
       </w:pPr>
-      <w:bookmarkStart w:id="5" w:name="_Toc241369941"/>
+      <w:bookmarkStart w:id="5" w:name="_Toc241371006"/>
       <w:r>
         <w:t>Pricing</w:t>
       </w:r>
@@ -4063,7 +4142,7 @@
           <w:left w:w="10" w:type="dxa"/>
           <w:right w:w="10" w:type="dxa"/>
         </w:tblCellMar>
-        <w:tblLook w:val="04A0" w:firstRow="1" w:lastRow="0" w:firstColumn="1" w:lastColumn="0" w:noHBand="0" w:noVBand="1"/>
+        <w:tblLook w:val="0000" w:firstRow="0" w:lastRow="0" w:firstColumn="0" w:lastColumn="0" w:noHBand="0" w:noVBand="0"/>
       </w:tblPr>
       <w:tblGrid>
         <w:gridCol w:w="2791"/>
@@ -4472,7 +4551,7 @@
       <w:pPr>
         <w:pStyle w:val="Heading2"/>
       </w:pPr>
-      <w:bookmarkStart w:id="6" w:name="_Toc241369942"/>
+      <w:bookmarkStart w:id="6" w:name="_Toc241371007"/>
       <w:r>
         <w:t>Booking flow</w:t>
       </w:r>
@@ -4559,7 +4638,7 @@
       <w:pPr>
         <w:pStyle w:val="Heading2"/>
       </w:pPr>
-      <w:bookmarkStart w:id="7" w:name="_Toc241369943"/>
+      <w:bookmarkStart w:id="7" w:name="_Toc241371008"/>
       <w:r>
         <w:t>Payments</w:t>
       </w:r>
@@ -4587,7 +4666,7 @@
       <w:pPr>
         <w:pStyle w:val="Heading2"/>
       </w:pPr>
-      <w:bookmarkStart w:id="8" w:name="_Toc241369944"/>
+      <w:bookmarkStart w:id="8" w:name="_Toc241371009"/>
       <w:r>
         <w:t>File uploads</w:t>
       </w:r>
@@ -4605,7 +4684,7 @@
       <w:pPr>
         <w:pStyle w:val="Heading1"/>
       </w:pPr>
-      <w:bookmarkStart w:id="9" w:name="_Toc241369945"/>
+      <w:bookmarkStart w:id="9" w:name="_Toc241371010"/>
       <w:r>
         <w:t>4. Before launch checklist</w:t>
       </w:r>
@@ -4646,7 +4725,7 @@
           <w:left w:w="10" w:type="dxa"/>
           <w:right w:w="10" w:type="dxa"/>
         </w:tblCellMar>
-        <w:tblLook w:val="04A0" w:firstRow="1" w:lastRow="0" w:firstColumn="1" w:lastColumn="0" w:noHBand="0" w:noVBand="1"/>
+        <w:tblLook w:val="0000" w:firstRow="0" w:lastRow="0" w:firstColumn="0" w:lastColumn="0" w:noHBand="0" w:noVBand="0"/>
       </w:tblPr>
       <w:tblGrid>
         <w:gridCol w:w="2791"/>
@@ -5925,7 +6004,7 @@
       <w:pPr>
         <w:pStyle w:val="Heading1"/>
       </w:pPr>
-      <w:bookmarkStart w:id="10" w:name="_Toc241369946"/>
+      <w:bookmarkStart w:id="10" w:name="_Toc241371011"/>
       <w:r>
         <w:t>5. Deployment</w:t>
       </w:r>
@@ -5991,7 +6070,7 @@
       <w:pPr>
         <w:pStyle w:val="Heading2"/>
       </w:pPr>
-      <w:bookmarkStart w:id="11" w:name="_Toc241369947"/>
+      <w:bookmarkStart w:id="11" w:name="_Toc241371012"/>
       <w:r>
         <w:t>5.1 Test on your computer</w:t>
       </w:r>
@@ -6075,7 +6154,7 @@
       <w:pPr>
         <w:pStyle w:val="Heading2"/>
       </w:pPr>
-      <w:bookmarkStart w:id="12" w:name="_Toc241369948"/>
+      <w:bookmarkStart w:id="12" w:name="_Toc241371013"/>
       <w:r>
         <w:t>5.2 Option A: Netlify (quickest, free)</w:t>
       </w:r>
@@ -6173,7 +6252,7 @@
       <w:pPr>
         <w:pStyle w:val="Heading2"/>
       </w:pPr>
-      <w:bookmarkStart w:id="13" w:name="_Toc241369949"/>
+      <w:bookmarkStart w:id="13" w:name="_Toc241371014"/>
       <w:r>
         <w:t>5.3 Option B: GitHub Pages (free, keeps history)</w:t>
       </w:r>
@@ -6295,7 +6374,7 @@
       <w:pPr>
         <w:pStyle w:val="Heading2"/>
       </w:pPr>
-      <w:bookmarkStart w:id="14" w:name="_Toc241369950"/>
+      <w:bookmarkStart w:id="14" w:name="_Toc241371015"/>
       <w:r>
         <w:t>5.4 Option C: Shared hosting with cPanel</w:t>
       </w:r>
@@ -6404,7 +6483,7 @@
       <w:pPr>
         <w:pStyle w:val="Heading2"/>
       </w:pPr>
-      <w:bookmarkStart w:id="15" w:name="_Toc241369951"/>
+      <w:bookmarkStart w:id="15" w:name="_Toc241371016"/>
       <w:r>
         <w:t>5.5 Connect the booking forms</w:t>
       </w:r>
@@ -6522,7 +6601,7 @@
       <w:pPr>
         <w:pStyle w:val="Heading2"/>
       </w:pPr>
-      <w:bookmarkStart w:id="16" w:name="_Toc241369952"/>
+      <w:bookmarkStart w:id="16" w:name="_Toc241371017"/>
       <w:r>
         <w:t>5.6 Domain and HTTPS</w:t>
       </w:r>
@@ -6582,7 +6661,7 @@
       <w:pPr>
         <w:pStyle w:val="Heading2"/>
       </w:pPr>
-      <w:bookmarkStart w:id="17" w:name="_Toc241369953"/>
+      <w:bookmarkStart w:id="17" w:name="_Toc241371018"/>
       <w:r>
         <w:t>5.7 Checks after every deployment</w:t>
       </w:r>
@@ -6644,7 +6723,7 @@
       <w:pPr>
         <w:pStyle w:val="Heading2"/>
       </w:pPr>
-      <w:bookmarkStart w:id="18" w:name="_Toc241369954"/>
+      <w:bookmarkStart w:id="18" w:name="_Toc241371019"/>
       <w:r>
         <w:t>5.8 Deployment record</w:t>
       </w:r>
@@ -6665,14 +6744,14 @@
           <w:left w:w="10" w:type="dxa"/>
           <w:right w:w="10" w:type="dxa"/>
         </w:tblCellMar>
-        <w:tblLook w:val="04A0" w:firstRow="1" w:lastRow="0" w:firstColumn="1" w:lastColumn="0" w:noHBand="0" w:noVBand="1"/>
+        <w:tblLook w:val="0000" w:firstRow="0" w:lastRow="0" w:firstColumn="0" w:lastColumn="0" w:noHBand="0" w:noVBand="0"/>
       </w:tblPr>
       <w:tblGrid>
-        <w:gridCol w:w="1302"/>
-        <w:gridCol w:w="1116"/>
-        <w:gridCol w:w="2791"/>
-        <w:gridCol w:w="1488"/>
-        <w:gridCol w:w="2609"/>
+        <w:gridCol w:w="728"/>
+        <w:gridCol w:w="999"/>
+        <w:gridCol w:w="3839"/>
+        <w:gridCol w:w="2077"/>
+        <w:gridCol w:w="1663"/>
       </w:tblGrid>
       <w:tr>
         <w:tblPrEx>
@@ -6862,6 +6941,9 @@
             <w:pPr>
               <w:spacing w:after="40"/>
             </w:pPr>
+            <w:r>
+              <w:t>27 Sep 2026</w:t>
+            </w:r>
           </w:p>
         </w:tc>
         <w:tc>
@@ -6885,7 +6967,7 @@
               <w:spacing w:after="40"/>
             </w:pPr>
             <w:r>
-              <w:t>1.0.0</w:t>
+              <w:t>1.7.1</w:t>
             </w:r>
           </w:p>
         </w:tc>
@@ -6910,7 +6992,7 @@
               <w:spacing w:after="40"/>
             </w:pPr>
             <w:r>
-              <w:t>Not yet deployed</w:t>
+              <w:t>GitHub repository only: github.com/ohemengemmanuel/Altura-hurtz (branch main). Not yet live on a host.</w:t>
             </w:r>
           </w:p>
         </w:tc>
@@ -6934,6 +7016,9 @@
             <w:pPr>
               <w:spacing w:after="40"/>
             </w:pPr>
+            <w:r>
+              <w:t>ohemengemmanuel</w:t>
+            </w:r>
           </w:p>
         </w:tc>
         <w:tc>
@@ -6957,7 +7042,7 @@
               <w:spacing w:after="40"/>
             </w:pPr>
             <w:r>
-              <w:t>Awaiting contact details, discount rates and host choice.</w:t>
+              <w:t>First push of design, development and documentation folders. The font-preview trial files are excluded by .gitignore because their licences are unconfirmed.</w:t>
             </w:r>
           </w:p>
         </w:tc>
@@ -7203,7 +7288,7 @@
       <w:pPr>
         <w:pStyle w:val="Heading1"/>
       </w:pPr>
-      <w:bookmarkStart w:id="19" w:name="_Toc241369955"/>
+      <w:bookmarkStart w:id="19" w:name="_Toc241371020"/>
       <w:r>
         <w:t>6. Editing guide</w:t>
       </w:r>
@@ -7224,7 +7309,7 @@
           <w:left w:w="10" w:type="dxa"/>
           <w:right w:w="10" w:type="dxa"/>
         </w:tblCellMar>
-        <w:tblLook w:val="04A0" w:firstRow="1" w:lastRow="0" w:firstColumn="1" w:lastColumn="0" w:noHBand="0" w:noVBand="1"/>
+        <w:tblLook w:val="0000" w:firstRow="0" w:lastRow="0" w:firstColumn="0" w:lastColumn="0" w:noHBand="0" w:noVBand="0"/>
       </w:tblPr>
       <w:tblGrid>
         <w:gridCol w:w="2791"/>
@@ -8186,7 +8271,7 @@
       <w:pPr>
         <w:pStyle w:val="Heading1"/>
       </w:pPr>
-      <w:bookmarkStart w:id="20" w:name="_Toc241369956"/>
+      <w:bookmarkStart w:id="20" w:name="_Toc241371021"/>
       <w:r>
         <w:t>7. Change log</w:t>
       </w:r>
@@ -8215,7 +8300,7 @@
           <w:left w:w="10" w:type="dxa"/>
           <w:right w:w="10" w:type="dxa"/>
         </w:tblCellMar>
-        <w:tblLook w:val="04A0" w:firstRow="1" w:lastRow="0" w:firstColumn="1" w:lastColumn="0" w:noHBand="0" w:noVBand="1"/>
+        <w:tblLook w:val="0000" w:firstRow="0" w:lastRow="0" w:firstColumn="0" w:lastColumn="0" w:noHBand="0" w:noVBand="0"/>
       </w:tblPr>
       <w:tblGrid>
         <w:gridCol w:w="1209"/>
@@ -8401,10 +8486,7 @@
               <w:spacing w:after="40"/>
             </w:pPr>
             <w:r>
-              <w:t>Replaced the round Gain dial with a vertical, metallic fader like a mixing console channel: a brushed aluminium cap with bevelled edges and a grip line, a machined metal slot with a violet fill up to the cap, a dB scale (plus 3, 0, minus 6, minus 12) with 0 dB highlighted, all mounted on a small dark anodised metal plate so the scale stays readable over the meters. Same range and effect as before (minus 12 to plus 3 dB). Controls: drag the cap or click anywhere on the track to jump there, mouse wheel, arrow</w:t>
-            </w:r>
-            <w:r>
-              <w:t xml:space="preserve"> keys, Page Up and Page Down, Home and End, double-click to reset, and touch drag on phones. Tested in Chrome at 1366 and 390 px.</w:t>
+              <w:t>Project put under version control and pushed to GitHub at github.com/ohemengemmanuel/Altura-hurtz (branch main). Added a README and a .gitignore. The development/font-preview folder and font-preview.html are kept out of the repository because the trial font licences are unconfirmed.</w:t>
             </w:r>
           </w:p>
         </w:tc>
@@ -8437,7 +8519,7 @@
               <w:spacing w:after="40"/>
             </w:pPr>
             <w:r>
-              <w:t>1.7.0</w:t>
+              <w:t>1.7.1</w:t>
             </w:r>
           </w:p>
         </w:tc>
@@ -8487,10 +8569,10 @@
               <w:spacing w:after="40"/>
             </w:pPr>
             <w:r>
-              <w:t>Added a Gain dial to the Ready when you are card that sets the height of the meter bars, styled like a plugin knob with a violet value arc and a dB readout. Range minus 12 dB (bars reach about a quarter height) to plus 3 dB (bars clip into the red), starting at 0 dB. Controls: drag up, down or sideways, mouse wheel, arrow keys (0.5 dB), Page Up and Page Down (3 dB), Home and End, and double-click to reset. Works with touch on phones. Announced to screen readers as a slider with its dB value. The dial only c</w:t>
-            </w:r>
-            <w:r>
-              <w:t>hanges two values on the meter bank; the bars keep animating on the graphics card. Tested in Chrome at 1366 and 390 px with mouse drag, double-click and keyboard.</w:t>
+              <w:t>Replaced the round Gain dial with a vertical, metallic fader like a mixing console channel: a brushed aluminium cap with bevelled edges and a grip line, a machined metal slot with a violet fill up to the cap, a dB scale (plus 3, 0, minus 6, minus 12) with 0 dB highlighted, all mounted on a small dark anodised metal plate so the scale stays readable over the meters. Same range and effect as before (minus 12 to plus 3 dB). Controls: drag the cap or click anywhere on the track to jump there, mouse wheel, arrow</w:t>
+            </w:r>
+            <w:r>
+              <w:t xml:space="preserve"> keys, Page Up and Page Down, Home and End, double-click to reset, and touch drag on phones. Tested in Chrome at 1366 and 390 px.</w:t>
             </w:r>
           </w:p>
         </w:tc>
@@ -8523,7 +8605,7 @@
               <w:spacing w:after="40"/>
             </w:pPr>
             <w:r>
-              <w:t>1.6.2</w:t>
+              <w:t>1.7.0</w:t>
             </w:r>
           </w:p>
         </w:tc>
@@ -8573,7 +8655,10 @@
               <w:spacing w:after="40"/>
             </w:pPr>
             <w:r>
-              <w:t>Slowed the meter bank in the Ready when you are card by 25%. Each bar now loops over 3.3 to 4.8 seconds instead of 2.6 to 3.8, with start offsets scaled to match so the bars stay spread out and stereo pairs stay together.</w:t>
+              <w:t>Added a Gain dial to the Ready when you are card that sets the height of the meter bars, styled like a plugin knob with a violet value arc and a dB readout. Range minus 12 dB (bars reach about a quarter height) to plus 3 dB (bars clip into the red), starting at 0 dB. Controls: drag up, down or sideways, mouse wheel, arrow keys (0.5 dB), Page Up and Page Down (3 dB), Home and End, and double-click to reset. Works with touch on phones. Announced to screen readers as a slider with its dB value. The dial only c</w:t>
+            </w:r>
+            <w:r>
+              <w:t>hanges two values on the meter bank; the bars keep animating on the graphics card. Tested in Chrome at 1366 and 390 px with mouse drag, double-click and keyboard.</w:t>
             </w:r>
           </w:p>
         </w:tc>
@@ -8606,7 +8691,7 @@
               <w:spacing w:after="40"/>
             </w:pPr>
             <w:r>
-              <w:t>1.6.1</w:t>
+              <w:t>1.6.2</w:t>
             </w:r>
           </w:p>
         </w:tc>
@@ -8656,10 +8741,7 @@
               <w:spacing w:after="40"/>
             </w:pPr>
             <w:r>
-              <w:t>Replaced the analog VU meters with a digital meter bank in the style of DAW mixer meters: 14 stereo channel strips (28 bars) of LED segments lit ice blue at the bottom, violet in the middle and booth red at the top, with unlit segments faintly visible and a white peak-hold line on each bar. The bank is a background layer that fades into the card: towards the text on the left and down into the card at the bottom on desktop, and at both sides and the bottom on phones where it sits under the buttons. Performan</w:t>
-            </w:r>
-            <w:r>
-              <w:t>ce: segments and colours are static, only a dark cover over unlit segments and the peak line move (transform on the graphics card, no JavaScript per frame), six shared motion patterns are reused with different timing, left and right bars in a pair move together with a small offset, and the bank pauses when off screen. Tested in Chrome at 1366 and 390 px.</w:t>
+              <w:t>Slowed the meter bank in the Ready when you are card by 25%. Each bar now loops over 3.3 to 4.8 seconds instead of 2.6 to 3.8, with start offsets scaled to match so the bars stay spread out and stereo pairs stay together.</w:t>
             </w:r>
           </w:p>
         </w:tc>
@@ -8692,7 +8774,7 @@
               <w:spacing w:after="40"/>
             </w:pPr>
             <w:r>
-              <w:t>1.6.0</w:t>
+              <w:t>1.6.1</w:t>
             </w:r>
           </w:p>
         </w:tc>
@@ -8742,10 +8824,10 @@
               <w:spacing w:after="40"/>
             </w:pPr>
             <w:r>
-              <w:t>Added a pair of analog VU meters (L and R) to the Ready when you are card. Scale from minus 20 to plus 3 VU with the 0 to plus 3 red zone, glowing needles and a red peak light that flashes when a needle reaches the red. Needles follow fixed musical patterns of different lengths so the channels never move in sync. Performance: faces are drawn once as SVG, only the needles and peak lights animate (rotation and opacity, handled by the graphics card with no JavaScript per frame), the meters pause whenever the c</w:t>
-            </w:r>
-            <w:r>
-              <w:t>ard is off screen, and they stay still for visitors with reduced motion on. Tested in Chrome at 1366 and 390 px: running on screen, paused when scrolled away. On phones the meters sit under the buttons.</w:t>
+              <w:t>Replaced the analog VU meters with a digital meter bank in the style of DAW mixer meters: 14 stereo channel strips (28 bars) of LED segments lit ice blue at the bottom, violet in the middle and booth red at the top, with unlit segments faintly visible and a white peak-hold line on each bar. The bank is a background layer that fades into the card: towards the text on the left and down into the card at the bottom on desktop, and at both sides and the bottom on phones where it sits under the buttons. Performan</w:t>
+            </w:r>
+            <w:r>
+              <w:t>ce: segments and colours are static, only a dark cover over unlit segments and the peak line move (transform on the graphics card, no JavaScript per frame), six shared motion patterns are reused with different timing, left and right bars in a pair move together with a small offset, and the bank pauses when off screen. Tested in Chrome at 1366 and 390 px.</w:t>
             </w:r>
           </w:p>
         </w:tc>
@@ -8778,7 +8860,7 @@
               <w:spacing w:after="40"/>
             </w:pPr>
             <w:r>
-              <w:t>1.5.2</w:t>
+              <w:t>1.6.0</w:t>
             </w:r>
           </w:p>
         </w:tc>
@@ -8828,7 +8910,10 @@
               <w:spacing w:after="40"/>
             </w:pPr>
             <w:r>
-              <w:t>On phones and tablets (up to 860 px wide) the studio section heading, The studio / A room built around your voice, now sits on the bottom of the studio photo over a dark fade instead of below it. The description and gear list follow under the photo. Desktop layout is unchanged. The photo and text now fade in together as one block so the heading never shows without its photo.</w:t>
+              <w:t>Added a pair of analog VU meters (L and R) to the Ready when you are card. Scale from minus 20 to plus 3 VU with the 0 to plus 3 red zone, glowing needles and a red peak light that flashes when a needle reaches the red. Needles follow fixed musical patterns of different lengths so the channels never move in sync. Performance: faces are drawn once as SVG, only the needles and peak lights animate (rotation and opacity, handled by the graphics card with no JavaScript per frame), the meters pause whenever the c</w:t>
+            </w:r>
+            <w:r>
+              <w:t>ard is off screen, and they stay still for visitors with reduced motion on. Tested in Chrome at 1366 and 390 px: running on screen, paused when scrolled away. On phones the meters sit under the buttons.</w:t>
             </w:r>
           </w:p>
         </w:tc>
@@ -8861,7 +8946,7 @@
               <w:spacing w:after="40"/>
             </w:pPr>
             <w:r>
-              <w:t>1.5.1</w:t>
+              <w:t>1.5.2</w:t>
             </w:r>
           </w:p>
         </w:tc>
@@ -8911,7 +8996,7 @@
               <w:spacing w:after="40"/>
             </w:pPr>
             <w:r>
-              <w:t>Phone menu button: removed its round border and background in both the closed and open states, so only the equalizer bars (and the X when open) show. The bar bounce and the open and close morph now run 25% slower.</w:t>
+              <w:t>On phones and tablets (up to 860 px wide) the studio section heading, The studio / A room built around your voice, now sits on the bottom of the studio photo over a dark fade instead of below it. The description and gear list follow under the photo. Desktop layout is unchanged. The photo and text now fade in together as one block so the heading never shows without its photo.</w:t>
             </w:r>
           </w:p>
         </w:tc>
@@ -8944,7 +9029,7 @@
               <w:spacing w:after="40"/>
             </w:pPr>
             <w:r>
-              <w:t>1.5.0</w:t>
+              <w:t>1.5.1</w:t>
             </w:r>
           </w:p>
         </w:tc>
@@ -8994,10 +9079,7 @@
               <w:spacing w:after="40"/>
             </w:pPr>
             <w:r>
-              <w:t xml:space="preserve">Added mild animations. Scroll reveal: section headings, service cards, steps, policies, contact details, forms and summaries fade up 14 px as they come into view, with a short stagger inside grids. Only elements that start below the screen are animated, so nothing visible flickers on page load. Home hero: text rises in and the photo settles from a slight zoom, on the first home visit of a browsing session only. Hover: cards lift and their photos zoom slightly, card arrows nudge forward, buttons lift with a </w:t>
-            </w:r>
-            <w:r>
-              <w:t>violet glow, social icons lift. Booking: the estimated total pulses when it changes and the booking summary eases in. Tested in Chrome in real time on four pages: nothing on screen was hidden at load and every element was visible after scrolling.</w:t>
+              <w:t>Phone menu button: removed its round border and background in both the closed and open states, so only the equalizer bars (and the X when open) show. The bar bounce and the open and close morph now run 25% slower.</w:t>
             </w:r>
           </w:p>
         </w:tc>
@@ -9030,7 +9112,7 @@
               <w:spacing w:after="40"/>
             </w:pPr>
             <w:r>
-              <w:t>1.4.2</w:t>
+              <w:t>1.5.0</w:t>
             </w:r>
           </w:p>
         </w:tc>
@@ -9080,7 +9162,10 @@
               <w:spacing w:after="40"/>
             </w:pPr>
             <w:r>
-              <w:t>On phones and small tablets (up to 820 px wide) the round icon to the left of the Altura Hertz wordmark in the header is hidden, leaving the wordmark and the equalizer menu button. Desktop and the footer keep the icon.</w:t>
+              <w:t xml:space="preserve">Added mild animations. Scroll reveal: section headings, service cards, steps, policies, contact details, forms and summaries fade up 14 px as they come into view, with a short stagger inside grids. Only elements that start below the screen are animated, so nothing visible flickers on page load. Home hero: text rises in and the photo settles from a slight zoom, on the first home visit of a browsing session only. Hover: cards lift and their photos zoom slightly, card arrows nudge forward, buttons lift with a </w:t>
+            </w:r>
+            <w:r>
+              <w:t>violet glow, social icons lift. Booking: the estimated total pulses when it changes and the booking summary eases in. Tested in Chrome in real time on four pages: nothing on screen was hidden at load and every element was visible after scrolling.</w:t>
             </w:r>
           </w:p>
         </w:tc>
@@ -9113,7 +9198,7 @@
               <w:spacing w:after="40"/>
             </w:pPr>
             <w:r>
-              <w:t>1.4.1</w:t>
+              <w:t>1.4.2</w:t>
             </w:r>
           </w:p>
         </w:tc>
@@ -9163,7 +9248,7 @@
               <w:spacing w:after="40"/>
             </w:pPr>
             <w:r>
-              <w:t>Halved the space above and below the Choose your session section. Measured before and after: phone 390 x 740 went from 92 to 49 px above and 156 to 78 px below; laptop 1366 x 657 from 67 to 34 px and 177 to 88 px; desktop 1920 x 960 from 163 to 84 px and 273 to 137 px. The section no longer stretches to fill the screen. All five cards still fit on screen when jumping to the section.</w:t>
+              <w:t>On phones and small tablets (up to 820 px wide) the round icon to the left of the Altura Hertz wordmark in the header is hidden, leaving the wordmark and the equalizer menu button. Desktop and the footer keep the icon.</w:t>
             </w:r>
           </w:p>
         </w:tc>
@@ -9196,7 +9281,7 @@
               <w:spacing w:after="40"/>
             </w:pPr>
             <w:r>
-              <w:t>1.4.0</w:t>
+              <w:t>1.4.1</w:t>
             </w:r>
           </w:p>
         </w:tc>
@@ -9246,7 +9331,7 @@
               <w:spacing w:after="40"/>
             </w:pPr>
             <w:r>
-              <w:t>Redesigned the phone menu button as an animated equalizer. Closed, four gradient bars bounce like a level meter. Open, the outer bars drop out, the middle two cross into an X and the button glows violet. The menu now slides down with a staggered reveal of each link, the Book a session button fills the full width, and the menu closes with Escape or a tap outside it.</w:t>
+              <w:t>Halved the space above and below the Choose your session section. Measured before and after: phone 390 x 740 went from 92 to 49 px above and 156 to 78 px below; laptop 1366 x 657 from 67 to 34 px and 177 to 88 px; desktop 1920 x 960 from 163 to 84 px and 273 to 137 px. The section no longer stretches to fill the screen. All five cards still fit on screen when jumping to the section.</w:t>
             </w:r>
           </w:p>
         </w:tc>
@@ -9279,7 +9364,7 @@
               <w:spacing w:after="40"/>
             </w:pPr>
             <w:r>
-              <w:t>1.3.2</w:t>
+              <w:t>1.4.0</w:t>
             </w:r>
           </w:p>
         </w:tc>
@@ -9329,7 +9414,7 @@
               <w:spacing w:after="40"/>
             </w:pPr>
             <w:r>
-              <w:t>Removed the All prices in Ghana cedis note from the footer. Removed the divider lines between sections: under the header, under the hero and page headings, above the footer and above the copyright line.</w:t>
+              <w:t>Redesigned the phone menu button as an animated equalizer. Closed, four gradient bars bounce like a level meter. Open, the outer bars drop out, the middle two cross into an X and the button glows violet. The menu now slides down with a staggered reveal of each link, the Book a session button fills the full width, and the menu closes with Escape or a tap outside it.</w:t>
             </w:r>
           </w:p>
         </w:tc>
@@ -9362,7 +9447,7 @@
               <w:spacing w:after="40"/>
             </w:pPr>
             <w:r>
-              <w:t>1.3.1</w:t>
+              <w:t>1.3.2</w:t>
             </w:r>
           </w:p>
         </w:tc>
@@ -9412,19 +9497,7 @@
               <w:spacing w:after="40"/>
             </w:pPr>
             <w:r>
-              <w:t xml:space="preserve">All six social icons now always show in the footer. Icons whose link is not set yet in </w:t>
-            </w:r>
-            <w:r>
-              <w:rPr>
-                <w:rFonts w:ascii="Consolas" w:eastAsia="Consolas" w:hAnsi="Consolas" w:cs="Consolas"/>
-                <w:color w:val="4E11DC"/>
-                <w:sz w:val="19"/>
-                <w:szCs w:val="19"/>
-              </w:rPr>
-              <w:t>config.js</w:t>
-            </w:r>
-            <w:r>
-              <w:t xml:space="preserve"> stay visible but do nothing when clicked, and show a coming soon tooltip.</w:t>
+              <w:t>Removed the All prices in Ghana cedis note from the footer. Removed the divider lines between sections: under the header, under the hero and page headings, above the footer and above the copyright line.</w:t>
             </w:r>
           </w:p>
         </w:tc>
@@ -9457,7 +9530,7 @@
               <w:spacing w:after="40"/>
             </w:pPr>
             <w:r>
-              <w:t>1.3.0</w:t>
+              <w:t>1.3.1</w:t>
             </w:r>
           </w:p>
         </w:tc>
@@ -9507,7 +9580,7 @@
               <w:spacing w:after="40"/>
             </w:pPr>
             <w:r>
-              <w:t xml:space="preserve">Added a row of social media icons to the footer, modelled on </w:t>
+              <w:t xml:space="preserve">All six social icons now always show in the footer. Icons whose link is not set yet in </w:t>
             </w:r>
             <w:r>
               <w:rPr>
@@ -9516,22 +9589,10 @@
                 <w:sz w:val="19"/>
                 <w:szCs w:val="19"/>
               </w:rPr>
-              <w:t>design/inspo/socials footer.png</w:t>
-            </w:r>
-            <w:r>
-              <w:t xml:space="preserve">: Facebook, Instagram, Threads, YouTube, TikTok and WhatsApp. Icons are white, turn violet on hover, and each only appears once its link is set in </w:t>
-            </w:r>
-            <w:r>
-              <w:rPr>
-                <w:rFonts w:ascii="Consolas" w:eastAsia="Consolas" w:hAnsi="Consolas" w:cs="Consolas"/>
-                <w:color w:val="4E11DC"/>
-                <w:sz w:val="19"/>
-                <w:szCs w:val="19"/>
-              </w:rPr>
               <w:t>config.js</w:t>
             </w:r>
             <w:r>
-              <w:t>. The text links for WhatsApp, Instagram, TikTok and YouTube were removed from the Studio column since the icons replace them.</w:t>
+              <w:t xml:space="preserve"> stay visible but do nothing when clicked, and show a coming soon tooltip.</w:t>
             </w:r>
           </w:p>
         </w:tc>
@@ -9564,7 +9625,7 @@
               <w:spacing w:after="40"/>
             </w:pPr>
             <w:r>
-              <w:t>1.2.1</w:t>
+              <w:t>1.3.0</w:t>
             </w:r>
           </w:p>
         </w:tc>
@@ -9614,7 +9675,31 @@
               <w:spacing w:after="40"/>
             </w:pPr>
             <w:r>
-              <w:t>Removed the Services column from the footer on every page. The footer now shows the studio name and description on the left and the Studio links on the right.</w:t>
+              <w:t xml:space="preserve">Added a row of social media icons to the footer, modelled on </w:t>
+            </w:r>
+            <w:r>
+              <w:rPr>
+                <w:rFonts w:ascii="Consolas" w:eastAsia="Consolas" w:hAnsi="Consolas" w:cs="Consolas"/>
+                <w:color w:val="4E11DC"/>
+                <w:sz w:val="19"/>
+                <w:szCs w:val="19"/>
+              </w:rPr>
+              <w:t>design/inspo/socials footer.png</w:t>
+            </w:r>
+            <w:r>
+              <w:t xml:space="preserve">: Facebook, Instagram, Threads, YouTube, TikTok and WhatsApp. Icons are white, turn violet on hover, and each only appears once its link is set in </w:t>
+            </w:r>
+            <w:r>
+              <w:rPr>
+                <w:rFonts w:ascii="Consolas" w:eastAsia="Consolas" w:hAnsi="Consolas" w:cs="Consolas"/>
+                <w:color w:val="4E11DC"/>
+                <w:sz w:val="19"/>
+                <w:szCs w:val="19"/>
+              </w:rPr>
+              <w:t>config.js</w:t>
+            </w:r>
+            <w:r>
+              <w:t>. The text links for WhatsApp, Instagram, TikTok and YouTube were removed from the Studio column since the icons replace them.</w:t>
             </w:r>
           </w:p>
         </w:tc>
@@ -9647,7 +9732,7 @@
               <w:spacing w:after="40"/>
             </w:pPr>
             <w:r>
-              <w:t>1.2.0</w:t>
+              <w:t>1.2.1</w:t>
             </w:r>
           </w:p>
         </w:tc>
@@ -9697,7 +9782,7 @@
               <w:spacing w:after="40"/>
             </w:pPr>
             <w:r>
-              <w:t>Landing page photo re-exported from the full size original (4032 x 3024) at 1280, 1920, 2560 and 3840 pixels wide with higher quality and light sharpening. The page now loads the size that suits each screen and requests it early, so it is sharp on high resolution laptops and phones. Replaces the single 1920 pixel file.</w:t>
+              <w:t>Removed the Services column from the footer on every page. The footer now shows the studio name and description on the left and the Studio links on the right.</w:t>
             </w:r>
           </w:p>
         </w:tc>
@@ -9730,7 +9815,7 @@
               <w:spacing w:after="40"/>
             </w:pPr>
             <w:r>
-              <w:t>1.1.0</w:t>
+              <w:t>1.2.0</w:t>
             </w:r>
           </w:p>
         </w:tc>
@@ -9780,7 +9865,7 @@
               <w:spacing w:after="40"/>
             </w:pPr>
             <w:r>
-              <w:t>Fixed the flicker when moving between pages: fonts and icons are now bundled with the site and preloaded, the dark background is set before styles load, icons keep a fixed size while loading, and pages fade into each other with the header held still.</w:t>
+              <w:t>Landing page photo re-exported from the full size original (4032 x 3024) at 1280, 1920, 2560 and 3840 pixels wide with higher quality and light sharpening. The page now loads the size that suits each screen and requests it early, so it is sharp on high resolution laptops and phones. Replaces the single 1920 pixel file.</w:t>
             </w:r>
           </w:p>
         </w:tc>
@@ -9863,7 +9948,7 @@
               <w:spacing w:after="40"/>
             </w:pPr>
             <w:r>
-              <w:t>Book a session no longer animates a scroll while the next page is loading. Smooth scrolling now only applies to links within the same page, and the phone menu closes after a tap.</w:t>
+              <w:t>Fixed the flicker when moving between pages: fonts and icons are now bundled with the site and preloaded, the dark background is set before styles load, icons keep a fixed size while loading, and pages fade into each other with the header held still.</w:t>
             </w:r>
           </w:p>
         </w:tc>
@@ -9946,7 +10031,7 @@
               <w:spacing w:after="40"/>
             </w:pPr>
             <w:r>
-              <w:t>Services moved directly under the hero and resized so all five fit in one screen height: one row of five cards on computers (checked at 1366 x 657 and 1920 x 960) and compact rows on tablets and phones (checked at 360 x 640, 390 x 740 and 768 x 900).</w:t>
+              <w:t>Book a session no longer animates a scroll while the next page is loading. Smooth scrolling now only applies to links within the same page, and the phone menu closes after a tap.</w:t>
             </w:r>
           </w:p>
         </w:tc>
@@ -9979,7 +10064,7 @@
               <w:spacing w:after="40"/>
             </w:pPr>
             <w:r>
-              <w:t>1.0.0</w:t>
+              <w:t>1.1.0</w:t>
             </w:r>
           </w:p>
         </w:tc>
@@ -10029,7 +10114,7 @@
               <w:spacing w:after="40"/>
             </w:pPr>
             <w:r>
-              <w:t>Initial website build: seven pages, shared stylesheet, settings file, booking and pricing script, beat catalogue script.</w:t>
+              <w:t>Services moved directly under the hero and resized so all five fit in one screen height: one row of five cards on computers (checked at 1366 x 657 and 1920 x 960) and compact rows on tablets and phones (checked at 360 x 640, 390 x 740 and 768 x 900).</w:t>
             </w:r>
           </w:p>
         </w:tc>
@@ -10112,7 +10197,7 @@
               <w:spacing w:after="40"/>
             </w:pPr>
             <w:r>
-              <w:t>Booking forms for recording + mixing and mastering, recording only and mixing and mastering, with live pricing, discount tables, one title field per track, file or link uploads, payment choice and policy agreement.</w:t>
+              <w:t>Initial website build: seven pages, shared stylesheet, settings file, booking and pricing script, beat catalogue script.</w:t>
             </w:r>
           </w:p>
         </w:tc>
@@ -10195,7 +10280,7 @@
               <w:spacing w:after="40"/>
             </w:pPr>
             <w:r>
-              <w:t>Request forms for custom beats and cover art, and a message form on the Contact page.</w:t>
+              <w:t>Booking forms for recording + mixing and mastering, recording only and mixing and mastering, with live pricing, discount tables, one title field per track, file or link uploads, payment choice and policy agreement.</w:t>
             </w:r>
           </w:p>
         </w:tc>
@@ -10278,7 +10363,7 @@
               <w:spacing w:after="40"/>
             </w:pPr>
             <w:r>
-              <w:t>Booking summary with reference number, sent by WhatsApp or email until a form service is connected.</w:t>
+              <w:t>Request forms for custom beats and cover art, and a message form on the Contact page.</w:t>
             </w:r>
           </w:p>
         </w:tc>
@@ -10361,7 +10446,7 @@
               <w:spacing w:after="40"/>
             </w:pPr>
             <w:r>
-              <w:t>Studio photos converted to WebP. Total image weight reduced from about 13 MB to 540 KB.</w:t>
+              <w:t>Booking summary with reference number, sent by WhatsApp or email until a form service is connected.</w:t>
             </w:r>
           </w:p>
         </w:tc>
@@ -10444,7 +10529,7 @@
               <w:spacing w:after="40"/>
             </w:pPr>
             <w:r>
-              <w:t>Project organised into design, development and documentation folders.</w:t>
+              <w:t>Studio photos converted to WebP. Total image weight reduced from about 13 MB to 540 KB.</w:t>
             </w:r>
           </w:p>
         </w:tc>
@@ -10477,6 +10562,89 @@
               <w:spacing w:after="40"/>
             </w:pPr>
             <w:r>
+              <w:t>1.0.0</w:t>
+            </w:r>
+          </w:p>
+        </w:tc>
+        <w:tc>
+          <w:tcPr>
+            <w:tcW w:w="1582" w:type="dxa"/>
+            <w:tcBorders>
+              <w:top w:val="single" w:sz="4" w:space="0" w:color="C9C3E6"/>
+              <w:left w:val="single" w:sz="4" w:space="0" w:color="C9C3E6"/>
+              <w:bottom w:val="single" w:sz="4" w:space="0" w:color="C9C3E6"/>
+              <w:right w:val="single" w:sz="4" w:space="0" w:color="C9C3E6"/>
+            </w:tcBorders>
+            <w:tcMar>
+              <w:top w:w="80" w:type="dxa"/>
+              <w:left w:w="110" w:type="dxa"/>
+              <w:bottom w:w="80" w:type="dxa"/>
+              <w:right w:w="110" w:type="dxa"/>
+            </w:tcMar>
+          </w:tcPr>
+          <w:p>
+            <w:pPr>
+              <w:spacing w:after="40"/>
+            </w:pPr>
+            <w:r>
+              <w:t>27 Sep 2026</w:t>
+            </w:r>
+          </w:p>
+        </w:tc>
+        <w:tc>
+          <w:tcPr>
+            <w:tcW w:w="6515" w:type="dxa"/>
+            <w:tcBorders>
+              <w:top w:val="single" w:sz="4" w:space="0" w:color="C9C3E6"/>
+              <w:left w:val="single" w:sz="4" w:space="0" w:color="C9C3E6"/>
+              <w:bottom w:val="single" w:sz="4" w:space="0" w:color="C9C3E6"/>
+              <w:right w:val="single" w:sz="4" w:space="0" w:color="C9C3E6"/>
+            </w:tcBorders>
+            <w:tcMar>
+              <w:top w:w="80" w:type="dxa"/>
+              <w:left w:w="110" w:type="dxa"/>
+              <w:bottom w:w="80" w:type="dxa"/>
+              <w:right w:w="110" w:type="dxa"/>
+            </w:tcMar>
+          </w:tcPr>
+          <w:p>
+            <w:pPr>
+              <w:spacing w:after="40"/>
+            </w:pPr>
+            <w:r>
+              <w:t>Project organised into design, development and documentation folders.</w:t>
+            </w:r>
+          </w:p>
+        </w:tc>
+      </w:tr>
+      <w:tr>
+        <w:tblPrEx>
+          <w:tblCellMar>
+            <w:top w:w="0" w:type="dxa"/>
+            <w:bottom w:w="0" w:type="dxa"/>
+          </w:tblCellMar>
+        </w:tblPrEx>
+        <w:tc>
+          <w:tcPr>
+            <w:tcW w:w="1209" w:type="dxa"/>
+            <w:tcBorders>
+              <w:top w:val="single" w:sz="4" w:space="0" w:color="C9C3E6"/>
+              <w:left w:val="single" w:sz="4" w:space="0" w:color="C9C3E6"/>
+              <w:bottom w:val="single" w:sz="4" w:space="0" w:color="C9C3E6"/>
+              <w:right w:val="single" w:sz="4" w:space="0" w:color="C9C3E6"/>
+            </w:tcBorders>
+            <w:tcMar>
+              <w:top w:w="80" w:type="dxa"/>
+              <w:left w:w="110" w:type="dxa"/>
+              <w:bottom w:w="80" w:type="dxa"/>
+              <w:right w:w="110" w:type="dxa"/>
+            </w:tcMar>
+          </w:tcPr>
+          <w:p>
+            <w:pPr>
+              <w:spacing w:after="40"/>
+            </w:pPr>
+            <w:r>
               <w:t>0.1.0</w:t>
             </w:r>
           </w:p>
@@ -10537,7 +10705,7 @@
       <w:pPr>
         <w:pStyle w:val="Heading2"/>
       </w:pPr>
-      <w:bookmarkStart w:id="21" w:name="_Toc241369957"/>
+      <w:bookmarkStart w:id="21" w:name="_Toc241371022"/>
       <w:r>
         <w:t>Decisions made during the build</w:t>
       </w:r>
@@ -10687,7 +10855,7 @@
       <w:pPr>
         <w:pStyle w:val="Heading1"/>
       </w:pPr>
-      <w:bookmarkStart w:id="22" w:name="_Toc241369958"/>
+      <w:bookmarkStart w:id="22" w:name="_Toc241371023"/>
       <w:r>
         <w:t>8. Future improvements</w:t>
       </w:r>
@@ -10869,10 +11037,10 @@
 <file path=word/numbering.xml><?xml version="1.0" encoding="utf-8"?>
 <w:numbering xmlns:wpc="http://schemas.microsoft.com/office/word/2010/wordprocessingCanvas" xmlns:cx="http://schemas.microsoft.com/office/drawing/2014/chartex" xmlns:cx1="http://schemas.microsoft.com/office/drawing/2015/9/8/chartex" xmlns:cx2="http://schemas.microsoft.com/office/drawing/2015/10/21/chartex" xmlns:cx3="http://schemas.microsoft.com/office/drawing/2016/5/9/chartex" xmlns:cx4="http://schemas.microsoft.com/office/drawing/2016/5/10/chartex" xmlns:cx5="http://schemas.microsoft.com/office/drawing/2016/5/11/chartex" xmlns:cx6="http://schemas.microsoft.com/office/drawing/2016/5/12/chartex" xmlns:cx7="http://schemas.microsoft.com/office/drawing/2016/5/13/chartex" xmlns:cx8="http://schemas.microsoft.com/office/drawing/2016/5/14/chartex" xmlns:mc="http://schemas.openxmlformats.org/markup-compatibility/2006" xmlns:aink="http://schemas.microsoft.com/office/drawing/2016/ink" xmlns:am3d="http://schemas.microsoft.com/office/drawing/2017/model3d" xmlns:o="urn:schemas-microsoft-com:office:office" xmlns:oel="http://schemas.microsoft.com/office/2019/extlst" xmlns:r="http://schemas.openxmlformats.org/officeDocument/2006/relationships" xmlns:m="http://schemas.openxmlformats.org/officeDocument/2006/math" xmlns:v="urn:schemas-microsoft-com:vml" xmlns:wp14="http://schemas.microsoft.com/office/word/2010/wordprocessingDrawing" xmlns:wp="http://schemas.openxmlformats.org/drawingml/2006/wordprocessingDrawing" xmlns:w10="urn:schemas-microsoft-com:office:word" xmlns:w="http://schemas.openxmlformats.org/wordprocessingml/2006/main" xmlns:w14="http://schemas.microsoft.com/office/word/2010/wordml" xmlns:w15="http://schemas.microsoft.com/office/word/2012/wordml" xmlns:w16cex="http://schemas.microsoft.com/office/word/2018/wordml/cex" xmlns:w16cid="http://schemas.microsoft.com/office/word/2016/wordml/cid" xmlns:w16="http://schemas.microsoft.com/office/word/2018/wordml" xmlns:w16du="http://schemas.microsoft.com/office/word/2023/wordml/word16du" xmlns:w16sdtdh="http://schemas.microsoft.com/office/word/2020/wordml/sdtdatahash" xmlns:w16sdtfl="http://schemas.microsoft.com/office/word/2024/wordml/sdtformatlock" xmlns:w16se="http://schemas.microsoft.com/office/word/2015/wordml/symex" xmlns:wpg="http://schemas.microsoft.com/office/word/2010/wordprocessingGroup" xmlns:wpi="http://schemas.microsoft.com/office/word/2010/wordprocessingInk" xmlns:wne="http://schemas.microsoft.com/office/word/2006/wordml" xmlns:wps="http://schemas.microsoft.com/office/word/2010/wordprocessingShape" mc:Ignorable="w14 w15 w16se w16cid w16 w16cex w16sdtdh w16sdtfl w16du wp14">
   <w:abstractNum w:abstractNumId="0" w15:restartNumberingAfterBreak="0">
-    <w:nsid w:val="011D58FF"/>
+    <w:nsid w:val="28AB6E65"/>
     <w:multiLevelType w:val="hybridMultilevel"/>
-    <w:tmpl w:val="E2766012"/>
-    <w:lvl w:ilvl="0" w:tplc="3006DA4A">
+    <w:tmpl w:val="C8EA34C2"/>
+    <w:lvl w:ilvl="0" w:tplc="724A0742">
       <w:start w:val="1"/>
       <w:numFmt w:val="decimal"/>
       <w:lvlText w:val="%1."/>
@@ -10881,52 +11049,52 @@
         <w:ind w:left="540" w:hanging="340"/>
       </w:pPr>
     </w:lvl>
-    <w:lvl w:ilvl="1" w:tplc="06286CE6">
+    <w:lvl w:ilvl="1" w:tplc="D5162A84">
       <w:numFmt w:val="decimal"/>
       <w:lvlText w:val=""/>
       <w:lvlJc w:val="left"/>
     </w:lvl>
-    <w:lvl w:ilvl="2" w:tplc="3366190A">
+    <w:lvl w:ilvl="2" w:tplc="5DF85A58">
       <w:numFmt w:val="decimal"/>
       <w:lvlText w:val=""/>
       <w:lvlJc w:val="left"/>
     </w:lvl>
-    <w:lvl w:ilvl="3" w:tplc="EFCACEDE">
+    <w:lvl w:ilvl="3" w:tplc="68529A0C">
       <w:numFmt w:val="decimal"/>
       <w:lvlText w:val=""/>
       <w:lvlJc w:val="left"/>
     </w:lvl>
-    <w:lvl w:ilvl="4" w:tplc="A386C294">
+    <w:lvl w:ilvl="4" w:tplc="64E88930">
       <w:numFmt w:val="decimal"/>
       <w:lvlText w:val=""/>
       <w:lvlJc w:val="left"/>
     </w:lvl>
-    <w:lvl w:ilvl="5" w:tplc="62F27ABC">
+    <w:lvl w:ilvl="5" w:tplc="72B023F2">
       <w:numFmt w:val="decimal"/>
       <w:lvlText w:val=""/>
       <w:lvlJc w:val="left"/>
     </w:lvl>
-    <w:lvl w:ilvl="6" w:tplc="FD1CC1B6">
+    <w:lvl w:ilvl="6" w:tplc="681C52B8">
       <w:numFmt w:val="decimal"/>
       <w:lvlText w:val=""/>
       <w:lvlJc w:val="left"/>
     </w:lvl>
-    <w:lvl w:ilvl="7" w:tplc="F8BAA5C0">
+    <w:lvl w:ilvl="7" w:tplc="B8D6872E">
       <w:numFmt w:val="decimal"/>
       <w:lvlText w:val=""/>
       <w:lvlJc w:val="left"/>
     </w:lvl>
-    <w:lvl w:ilvl="8" w:tplc="42AEA3F2">
+    <w:lvl w:ilvl="8" w:tplc="8C4CB468">
       <w:numFmt w:val="decimal"/>
       <w:lvlText w:val=""/>
       <w:lvlJc w:val="left"/>
     </w:lvl>
   </w:abstractNum>
   <w:abstractNum w:abstractNumId="1" w15:restartNumberingAfterBreak="0">
-    <w:nsid w:val="19C96780"/>
+    <w:nsid w:val="2F022C07"/>
     <w:multiLevelType w:val="hybridMultilevel"/>
-    <w:tmpl w:val="D07CC780"/>
-    <w:lvl w:ilvl="0" w:tplc="0BFE8EAA">
+    <w:tmpl w:val="695AFDCA"/>
+    <w:lvl w:ilvl="0" w:tplc="DFA8B8BC">
       <w:start w:val="1"/>
       <w:numFmt w:val="decimal"/>
       <w:lvlText w:val="%1."/>
@@ -10935,52 +11103,106 @@
         <w:ind w:left="540" w:hanging="340"/>
       </w:pPr>
     </w:lvl>
-    <w:lvl w:ilvl="1" w:tplc="A3569910">
+    <w:lvl w:ilvl="1" w:tplc="8DD24A32">
       <w:numFmt w:val="decimal"/>
       <w:lvlText w:val=""/>
       <w:lvlJc w:val="left"/>
     </w:lvl>
-    <w:lvl w:ilvl="2" w:tplc="82D817DC">
+    <w:lvl w:ilvl="2" w:tplc="F3408624">
       <w:numFmt w:val="decimal"/>
       <w:lvlText w:val=""/>
       <w:lvlJc w:val="left"/>
     </w:lvl>
-    <w:lvl w:ilvl="3" w:tplc="C868CA2E">
+    <w:lvl w:ilvl="3" w:tplc="966AED30">
       <w:numFmt w:val="decimal"/>
       <w:lvlText w:val=""/>
       <w:lvlJc w:val="left"/>
     </w:lvl>
-    <w:lvl w:ilvl="4" w:tplc="B9EAD3DE">
+    <w:lvl w:ilvl="4" w:tplc="CB5E8408">
       <w:numFmt w:val="decimal"/>
       <w:lvlText w:val=""/>
       <w:lvlJc w:val="left"/>
     </w:lvl>
-    <w:lvl w:ilvl="5" w:tplc="95264ED4">
+    <w:lvl w:ilvl="5" w:tplc="883042E8">
       <w:numFmt w:val="decimal"/>
       <w:lvlText w:val=""/>
       <w:lvlJc w:val="left"/>
     </w:lvl>
-    <w:lvl w:ilvl="6" w:tplc="9CEA3FCC">
+    <w:lvl w:ilvl="6" w:tplc="33049DFA">
       <w:numFmt w:val="decimal"/>
       <w:lvlText w:val=""/>
       <w:lvlJc w:val="left"/>
     </w:lvl>
-    <w:lvl w:ilvl="7" w:tplc="DD8AA8CA">
+    <w:lvl w:ilvl="7" w:tplc="F55684C0">
       <w:numFmt w:val="decimal"/>
       <w:lvlText w:val=""/>
       <w:lvlJc w:val="left"/>
     </w:lvl>
-    <w:lvl w:ilvl="8" w:tplc="D79ACCFC">
+    <w:lvl w:ilvl="8" w:tplc="4B289A36">
       <w:numFmt w:val="decimal"/>
       <w:lvlText w:val=""/>
       <w:lvlJc w:val="left"/>
     </w:lvl>
   </w:abstractNum>
   <w:abstractNum w:abstractNumId="2" w15:restartNumberingAfterBreak="0">
-    <w:nsid w:val="2E6D45D2"/>
+    <w:nsid w:val="33783D45"/>
     <w:multiLevelType w:val="hybridMultilevel"/>
-    <w:tmpl w:val="9BBC1EDC"/>
-    <w:lvl w:ilvl="0" w:tplc="2E6EB2BC">
+    <w:tmpl w:val="76201104"/>
+    <w:lvl w:ilvl="0" w:tplc="27DA1C5C">
+      <w:start w:val="1"/>
+      <w:numFmt w:val="bullet"/>
+      <w:lvlText w:val="•"/>
+      <w:lvlJc w:val="left"/>
+      <w:pPr>
+        <w:ind w:left="540" w:hanging="300"/>
+      </w:pPr>
+    </w:lvl>
+    <w:lvl w:ilvl="1" w:tplc="67C6ABDA">
+      <w:numFmt w:val="decimal"/>
+      <w:lvlText w:val=""/>
+      <w:lvlJc w:val="left"/>
+    </w:lvl>
+    <w:lvl w:ilvl="2" w:tplc="68285C3E">
+      <w:numFmt w:val="decimal"/>
+      <w:lvlText w:val=""/>
+      <w:lvlJc w:val="left"/>
+    </w:lvl>
+    <w:lvl w:ilvl="3" w:tplc="1924FD54">
+      <w:numFmt w:val="decimal"/>
+      <w:lvlText w:val=""/>
+      <w:lvlJc w:val="left"/>
+    </w:lvl>
+    <w:lvl w:ilvl="4" w:tplc="217ABD38">
+      <w:numFmt w:val="decimal"/>
+      <w:lvlText w:val=""/>
+      <w:lvlJc w:val="left"/>
+    </w:lvl>
+    <w:lvl w:ilvl="5" w:tplc="935A6530">
+      <w:numFmt w:val="decimal"/>
+      <w:lvlText w:val=""/>
+      <w:lvlJc w:val="left"/>
+    </w:lvl>
+    <w:lvl w:ilvl="6" w:tplc="43A223A0">
+      <w:numFmt w:val="decimal"/>
+      <w:lvlText w:val=""/>
+      <w:lvlJc w:val="left"/>
+    </w:lvl>
+    <w:lvl w:ilvl="7" w:tplc="3C063562">
+      <w:numFmt w:val="decimal"/>
+      <w:lvlText w:val=""/>
+      <w:lvlJc w:val="left"/>
+    </w:lvl>
+    <w:lvl w:ilvl="8" w:tplc="50EA827C">
+      <w:numFmt w:val="decimal"/>
+      <w:lvlText w:val=""/>
+      <w:lvlJc w:val="left"/>
+    </w:lvl>
+  </w:abstractNum>
+  <w:abstractNum w:abstractNumId="3" w15:restartNumberingAfterBreak="0">
+    <w:nsid w:val="3A5347E0"/>
+    <w:multiLevelType w:val="hybridMultilevel"/>
+    <w:tmpl w:val="22F67A56"/>
+    <w:lvl w:ilvl="0" w:tplc="BCA0E17E">
       <w:start w:val="1"/>
       <w:numFmt w:val="decimal"/>
       <w:lvlText w:val="%1."/>
@@ -10989,52 +11211,52 @@
         <w:ind w:left="540" w:hanging="340"/>
       </w:pPr>
     </w:lvl>
-    <w:lvl w:ilvl="1" w:tplc="5E64BE78">
+    <w:lvl w:ilvl="1" w:tplc="1E1A30AC">
       <w:numFmt w:val="decimal"/>
       <w:lvlText w:val=""/>
       <w:lvlJc w:val="left"/>
     </w:lvl>
-    <w:lvl w:ilvl="2" w:tplc="70F8349A">
+    <w:lvl w:ilvl="2" w:tplc="8D209506">
       <w:numFmt w:val="decimal"/>
       <w:lvlText w:val=""/>
       <w:lvlJc w:val="left"/>
     </w:lvl>
-    <w:lvl w:ilvl="3" w:tplc="7C763114">
+    <w:lvl w:ilvl="3" w:tplc="85162EAA">
       <w:numFmt w:val="decimal"/>
       <w:lvlText w:val=""/>
       <w:lvlJc w:val="left"/>
     </w:lvl>
-    <w:lvl w:ilvl="4" w:tplc="30D4B214">
+    <w:lvl w:ilvl="4" w:tplc="A39C0DA6">
       <w:numFmt w:val="decimal"/>
       <w:lvlText w:val=""/>
       <w:lvlJc w:val="left"/>
     </w:lvl>
-    <w:lvl w:ilvl="5" w:tplc="5428D6F0">
+    <w:lvl w:ilvl="5" w:tplc="F85C9A3A">
       <w:numFmt w:val="decimal"/>
       <w:lvlText w:val=""/>
       <w:lvlJc w:val="left"/>
     </w:lvl>
-    <w:lvl w:ilvl="6" w:tplc="739EE6BC">
+    <w:lvl w:ilvl="6" w:tplc="430C991C">
       <w:numFmt w:val="decimal"/>
       <w:lvlText w:val=""/>
       <w:lvlJc w:val="left"/>
     </w:lvl>
-    <w:lvl w:ilvl="7" w:tplc="47D67096">
+    <w:lvl w:ilvl="7" w:tplc="6FC4335E">
       <w:numFmt w:val="decimal"/>
       <w:lvlText w:val=""/>
       <w:lvlJc w:val="left"/>
     </w:lvl>
-    <w:lvl w:ilvl="8" w:tplc="9D3232C6">
+    <w:lvl w:ilvl="8" w:tplc="E3943B56">
       <w:numFmt w:val="decimal"/>
       <w:lvlText w:val=""/>
       <w:lvlJc w:val="left"/>
     </w:lvl>
   </w:abstractNum>
-  <w:abstractNum w:abstractNumId="3" w15:restartNumberingAfterBreak="0">
-    <w:nsid w:val="4294781C"/>
+  <w:abstractNum w:abstractNumId="4" w15:restartNumberingAfterBreak="0">
+    <w:nsid w:val="3C315D2F"/>
     <w:multiLevelType w:val="hybridMultilevel"/>
-    <w:tmpl w:val="1BBC806A"/>
-    <w:lvl w:ilvl="0" w:tplc="0A1E97A6">
+    <w:tmpl w:val="2EDE495A"/>
+    <w:lvl w:ilvl="0" w:tplc="5F34DF70">
       <w:start w:val="1"/>
       <w:numFmt w:val="decimal"/>
       <w:lvlText w:val="%1."/>
@@ -11043,52 +11265,52 @@
         <w:ind w:left="540" w:hanging="340"/>
       </w:pPr>
     </w:lvl>
-    <w:lvl w:ilvl="1" w:tplc="54F24BAE">
+    <w:lvl w:ilvl="1" w:tplc="6C1016F8">
       <w:numFmt w:val="decimal"/>
       <w:lvlText w:val=""/>
       <w:lvlJc w:val="left"/>
     </w:lvl>
-    <w:lvl w:ilvl="2" w:tplc="C85278B4">
+    <w:lvl w:ilvl="2" w:tplc="A966508C">
       <w:numFmt w:val="decimal"/>
       <w:lvlText w:val=""/>
       <w:lvlJc w:val="left"/>
     </w:lvl>
-    <w:lvl w:ilvl="3" w:tplc="2E500458">
+    <w:lvl w:ilvl="3" w:tplc="5D3C5E28">
       <w:numFmt w:val="decimal"/>
       <w:lvlText w:val=""/>
       <w:lvlJc w:val="left"/>
     </w:lvl>
-    <w:lvl w:ilvl="4" w:tplc="046CF9BC">
+    <w:lvl w:ilvl="4" w:tplc="7B120836">
       <w:numFmt w:val="decimal"/>
       <w:lvlText w:val=""/>
       <w:lvlJc w:val="left"/>
     </w:lvl>
-    <w:lvl w:ilvl="5" w:tplc="41E8D8E8">
+    <w:lvl w:ilvl="5" w:tplc="78B0539E">
       <w:numFmt w:val="decimal"/>
       <w:lvlText w:val=""/>
       <w:lvlJc w:val="left"/>
     </w:lvl>
-    <w:lvl w:ilvl="6" w:tplc="BC6E3978">
+    <w:lvl w:ilvl="6" w:tplc="2A00BA96">
       <w:numFmt w:val="decimal"/>
       <w:lvlText w:val=""/>
       <w:lvlJc w:val="left"/>
     </w:lvl>
-    <w:lvl w:ilvl="7" w:tplc="19EE1B4C">
+    <w:lvl w:ilvl="7" w:tplc="B7E44F4E">
       <w:numFmt w:val="decimal"/>
       <w:lvlText w:val=""/>
       <w:lvlJc w:val="left"/>
     </w:lvl>
-    <w:lvl w:ilvl="8" w:tplc="A6FA4054">
+    <w:lvl w:ilvl="8" w:tplc="FD10EE3A">
       <w:numFmt w:val="decimal"/>
       <w:lvlText w:val=""/>
       <w:lvlJc w:val="left"/>
     </w:lvl>
   </w:abstractNum>
-  <w:abstractNum w:abstractNumId="4" w15:restartNumberingAfterBreak="0">
-    <w:nsid w:val="431E0E7C"/>
+  <w:abstractNum w:abstractNumId="5" w15:restartNumberingAfterBreak="0">
+    <w:nsid w:val="48DF54CA"/>
     <w:multiLevelType w:val="hybridMultilevel"/>
-    <w:tmpl w:val="BE905510"/>
-    <w:lvl w:ilvl="0" w:tplc="DDBAAC30">
+    <w:tmpl w:val="1256E20E"/>
+    <w:lvl w:ilvl="0" w:tplc="D7D0FDE8">
       <w:start w:val="1"/>
       <w:numFmt w:val="decimal"/>
       <w:lvlText w:val="%1."/>
@@ -11097,160 +11319,52 @@
         <w:ind w:left="540" w:hanging="340"/>
       </w:pPr>
     </w:lvl>
-    <w:lvl w:ilvl="1" w:tplc="405EE840">
+    <w:lvl w:ilvl="1" w:tplc="723A9E98">
       <w:numFmt w:val="decimal"/>
       <w:lvlText w:val=""/>
       <w:lvlJc w:val="left"/>
     </w:lvl>
-    <w:lvl w:ilvl="2" w:tplc="9CE475DE">
+    <w:lvl w:ilvl="2" w:tplc="B1CEAD66">
       <w:numFmt w:val="decimal"/>
       <w:lvlText w:val=""/>
       <w:lvlJc w:val="left"/>
     </w:lvl>
-    <w:lvl w:ilvl="3" w:tplc="588EABD8">
+    <w:lvl w:ilvl="3" w:tplc="A05EC09A">
       <w:numFmt w:val="decimal"/>
       <w:lvlText w:val=""/>
       <w:lvlJc w:val="left"/>
     </w:lvl>
-    <w:lvl w:ilvl="4" w:tplc="33C6994E">
+    <w:lvl w:ilvl="4" w:tplc="7A7A0AE6">
       <w:numFmt w:val="decimal"/>
       <w:lvlText w:val=""/>
       <w:lvlJc w:val="left"/>
     </w:lvl>
-    <w:lvl w:ilvl="5" w:tplc="CD6C3238">
+    <w:lvl w:ilvl="5" w:tplc="6C544D1C">
       <w:numFmt w:val="decimal"/>
       <w:lvlText w:val=""/>
       <w:lvlJc w:val="left"/>
     </w:lvl>
-    <w:lvl w:ilvl="6" w:tplc="119E52DE">
+    <w:lvl w:ilvl="6" w:tplc="C48E179A">
       <w:numFmt w:val="decimal"/>
       <w:lvlText w:val=""/>
       <w:lvlJc w:val="left"/>
     </w:lvl>
-    <w:lvl w:ilvl="7" w:tplc="609C95E8">
+    <w:lvl w:ilvl="7" w:tplc="DE54CFD8">
       <w:numFmt w:val="decimal"/>
       <w:lvlText w:val=""/>
       <w:lvlJc w:val="left"/>
     </w:lvl>
-    <w:lvl w:ilvl="8" w:tplc="85E0487E">
-      <w:numFmt w:val="decimal"/>
-      <w:lvlText w:val=""/>
-      <w:lvlJc w:val="left"/>
-    </w:lvl>
-  </w:abstractNum>
-  <w:abstractNum w:abstractNumId="5" w15:restartNumberingAfterBreak="0">
-    <w:nsid w:val="47EC63DC"/>
-    <w:multiLevelType w:val="hybridMultilevel"/>
-    <w:tmpl w:val="5426A70C"/>
-    <w:lvl w:ilvl="0" w:tplc="1B004764">
-      <w:start w:val="1"/>
-      <w:numFmt w:val="decimal"/>
-      <w:lvlText w:val="%1."/>
-      <w:lvlJc w:val="left"/>
-      <w:pPr>
-        <w:ind w:left="540" w:hanging="340"/>
-      </w:pPr>
-    </w:lvl>
-    <w:lvl w:ilvl="1" w:tplc="4F3AE33C">
-      <w:numFmt w:val="decimal"/>
-      <w:lvlText w:val=""/>
-      <w:lvlJc w:val="left"/>
-    </w:lvl>
-    <w:lvl w:ilvl="2" w:tplc="2B441672">
-      <w:numFmt w:val="decimal"/>
-      <w:lvlText w:val=""/>
-      <w:lvlJc w:val="left"/>
-    </w:lvl>
-    <w:lvl w:ilvl="3" w:tplc="98EAC880">
-      <w:numFmt w:val="decimal"/>
-      <w:lvlText w:val=""/>
-      <w:lvlJc w:val="left"/>
-    </w:lvl>
-    <w:lvl w:ilvl="4" w:tplc="49B4D9F2">
-      <w:numFmt w:val="decimal"/>
-      <w:lvlText w:val=""/>
-      <w:lvlJc w:val="left"/>
-    </w:lvl>
-    <w:lvl w:ilvl="5" w:tplc="CC82364C">
-      <w:numFmt w:val="decimal"/>
-      <w:lvlText w:val=""/>
-      <w:lvlJc w:val="left"/>
-    </w:lvl>
-    <w:lvl w:ilvl="6" w:tplc="48267154">
-      <w:numFmt w:val="decimal"/>
-      <w:lvlText w:val=""/>
-      <w:lvlJc w:val="left"/>
-    </w:lvl>
-    <w:lvl w:ilvl="7" w:tplc="2A54528E">
-      <w:numFmt w:val="decimal"/>
-      <w:lvlText w:val=""/>
-      <w:lvlJc w:val="left"/>
-    </w:lvl>
-    <w:lvl w:ilvl="8" w:tplc="7D885872">
+    <w:lvl w:ilvl="8" w:tplc="459CDF70">
       <w:numFmt w:val="decimal"/>
       <w:lvlText w:val=""/>
       <w:lvlJc w:val="left"/>
     </w:lvl>
   </w:abstractNum>
   <w:abstractNum w:abstractNumId="6" w15:restartNumberingAfterBreak="0">
-    <w:nsid w:val="589B73EC"/>
+    <w:nsid w:val="497D7FAB"/>
     <w:multiLevelType w:val="hybridMultilevel"/>
-    <w:tmpl w:val="02F02AF2"/>
-    <w:lvl w:ilvl="0" w:tplc="D738F90E">
-      <w:start w:val="1"/>
-      <w:numFmt w:val="bullet"/>
-      <w:lvlText w:val="•"/>
-      <w:lvlJc w:val="left"/>
-      <w:pPr>
-        <w:ind w:left="540" w:hanging="300"/>
-      </w:pPr>
-    </w:lvl>
-    <w:lvl w:ilvl="1" w:tplc="51D00664">
-      <w:numFmt w:val="decimal"/>
-      <w:lvlText w:val=""/>
-      <w:lvlJc w:val="left"/>
-    </w:lvl>
-    <w:lvl w:ilvl="2" w:tplc="74DEE222">
-      <w:numFmt w:val="decimal"/>
-      <w:lvlText w:val=""/>
-      <w:lvlJc w:val="left"/>
-    </w:lvl>
-    <w:lvl w:ilvl="3" w:tplc="F01A93C8">
-      <w:numFmt w:val="decimal"/>
-      <w:lvlText w:val=""/>
-      <w:lvlJc w:val="left"/>
-    </w:lvl>
-    <w:lvl w:ilvl="4" w:tplc="D1B48CA4">
-      <w:numFmt w:val="decimal"/>
-      <w:lvlText w:val=""/>
-      <w:lvlJc w:val="left"/>
-    </w:lvl>
-    <w:lvl w:ilvl="5" w:tplc="E15AE18A">
-      <w:numFmt w:val="decimal"/>
-      <w:lvlText w:val=""/>
-      <w:lvlJc w:val="left"/>
-    </w:lvl>
-    <w:lvl w:ilvl="6" w:tplc="E66C399E">
-      <w:numFmt w:val="decimal"/>
-      <w:lvlText w:val=""/>
-      <w:lvlJc w:val="left"/>
-    </w:lvl>
-    <w:lvl w:ilvl="7" w:tplc="EE3ADA46">
-      <w:numFmt w:val="decimal"/>
-      <w:lvlText w:val=""/>
-      <w:lvlJc w:val="left"/>
-    </w:lvl>
-    <w:lvl w:ilvl="8" w:tplc="2E90B89C">
-      <w:numFmt w:val="decimal"/>
-      <w:lvlText w:val=""/>
-      <w:lvlJc w:val="left"/>
-    </w:lvl>
-  </w:abstractNum>
-  <w:abstractNum w:abstractNumId="7" w15:restartNumberingAfterBreak="0">
-    <w:nsid w:val="6B4E5BFA"/>
-    <w:multiLevelType w:val="hybridMultilevel"/>
-    <w:tmpl w:val="5C7466AA"/>
-    <w:lvl w:ilvl="0" w:tplc="2154F2C0">
+    <w:tmpl w:val="13226FF0"/>
+    <w:lvl w:ilvl="0" w:tplc="E8AC8E84">
       <w:start w:val="1"/>
       <w:numFmt w:val="bullet"/>
       <w:lvlText w:val="●"/>
@@ -11259,7 +11373,7 @@
         <w:ind w:left="720" w:hanging="360"/>
       </w:pPr>
     </w:lvl>
-    <w:lvl w:ilvl="1" w:tplc="4126E07A">
+    <w:lvl w:ilvl="1" w:tplc="E4B44CC4">
       <w:start w:val="1"/>
       <w:numFmt w:val="bullet"/>
       <w:lvlText w:val="○"/>
@@ -11268,7 +11382,7 @@
         <w:ind w:left="1440" w:hanging="360"/>
       </w:pPr>
     </w:lvl>
-    <w:lvl w:ilvl="2" w:tplc="3A44AB1A">
+    <w:lvl w:ilvl="2" w:tplc="925658A8">
       <w:start w:val="1"/>
       <w:numFmt w:val="bullet"/>
       <w:lvlText w:val="■"/>
@@ -11277,7 +11391,7 @@
         <w:ind w:left="2160" w:hanging="360"/>
       </w:pPr>
     </w:lvl>
-    <w:lvl w:ilvl="3" w:tplc="786091F2">
+    <w:lvl w:ilvl="3" w:tplc="ABD0B8BA">
       <w:start w:val="1"/>
       <w:numFmt w:val="bullet"/>
       <w:lvlText w:val="●"/>
@@ -11286,7 +11400,7 @@
         <w:ind w:left="2880" w:hanging="360"/>
       </w:pPr>
     </w:lvl>
-    <w:lvl w:ilvl="4" w:tplc="9C5A9226">
+    <w:lvl w:ilvl="4" w:tplc="4D6A3F00">
       <w:start w:val="1"/>
       <w:numFmt w:val="bullet"/>
       <w:lvlText w:val="○"/>
@@ -11295,7 +11409,7 @@
         <w:ind w:left="3600" w:hanging="360"/>
       </w:pPr>
     </w:lvl>
-    <w:lvl w:ilvl="5" w:tplc="46FA796C">
+    <w:lvl w:ilvl="5" w:tplc="40EE3846">
       <w:start w:val="1"/>
       <w:numFmt w:val="bullet"/>
       <w:lvlText w:val="■"/>
@@ -11304,7 +11418,7 @@
         <w:ind w:left="4320" w:hanging="360"/>
       </w:pPr>
     </w:lvl>
-    <w:lvl w:ilvl="6" w:tplc="BA26CBD8">
+    <w:lvl w:ilvl="6" w:tplc="41A4836E">
       <w:start w:val="1"/>
       <w:numFmt w:val="bullet"/>
       <w:lvlText w:val="●"/>
@@ -11313,7 +11427,7 @@
         <w:ind w:left="5040" w:hanging="360"/>
       </w:pPr>
     </w:lvl>
-    <w:lvl w:ilvl="7" w:tplc="A33264AE">
+    <w:lvl w:ilvl="7" w:tplc="A6D82CA2">
       <w:start w:val="1"/>
       <w:numFmt w:val="bullet"/>
       <w:lvlText w:val="●"/>
@@ -11322,7 +11436,7 @@
         <w:ind w:left="5760" w:hanging="360"/>
       </w:pPr>
     </w:lvl>
-    <w:lvl w:ilvl="8" w:tplc="F6780F58">
+    <w:lvl w:ilvl="8" w:tplc="93B89F30">
       <w:start w:val="1"/>
       <w:numFmt w:val="bullet"/>
       <w:lvlText w:val="●"/>
@@ -11332,11 +11446,11 @@
       </w:pPr>
     </w:lvl>
   </w:abstractNum>
-  <w:abstractNum w:abstractNumId="8" w15:restartNumberingAfterBreak="0">
-    <w:nsid w:val="6D7A29FF"/>
+  <w:abstractNum w:abstractNumId="7" w15:restartNumberingAfterBreak="0">
+    <w:nsid w:val="52A8367D"/>
     <w:multiLevelType w:val="hybridMultilevel"/>
-    <w:tmpl w:val="A108388A"/>
-    <w:lvl w:ilvl="0" w:tplc="4D820536">
+    <w:tmpl w:val="1218651E"/>
+    <w:lvl w:ilvl="0" w:tplc="9CEA4C2A">
       <w:start w:val="1"/>
       <w:numFmt w:val="decimal"/>
       <w:lvlText w:val="%1."/>
@@ -11345,91 +11459,145 @@
         <w:ind w:left="540" w:hanging="340"/>
       </w:pPr>
     </w:lvl>
-    <w:lvl w:ilvl="1" w:tplc="63342D36">
+    <w:lvl w:ilvl="1" w:tplc="541653A8">
       <w:numFmt w:val="decimal"/>
       <w:lvlText w:val=""/>
       <w:lvlJc w:val="left"/>
     </w:lvl>
-    <w:lvl w:ilvl="2" w:tplc="D408BFB8">
+    <w:lvl w:ilvl="2" w:tplc="E208CC30">
       <w:numFmt w:val="decimal"/>
       <w:lvlText w:val=""/>
       <w:lvlJc w:val="left"/>
     </w:lvl>
-    <w:lvl w:ilvl="3" w:tplc="A704EC3A">
+    <w:lvl w:ilvl="3" w:tplc="F056BDC2">
       <w:numFmt w:val="decimal"/>
       <w:lvlText w:val=""/>
       <w:lvlJc w:val="left"/>
     </w:lvl>
-    <w:lvl w:ilvl="4" w:tplc="2F4A97E8">
+    <w:lvl w:ilvl="4" w:tplc="40D80652">
       <w:numFmt w:val="decimal"/>
       <w:lvlText w:val=""/>
       <w:lvlJc w:val="left"/>
     </w:lvl>
-    <w:lvl w:ilvl="5" w:tplc="0F42BDE6">
+    <w:lvl w:ilvl="5" w:tplc="D7B6F01E">
       <w:numFmt w:val="decimal"/>
       <w:lvlText w:val=""/>
       <w:lvlJc w:val="left"/>
     </w:lvl>
-    <w:lvl w:ilvl="6" w:tplc="A0C897AE">
+    <w:lvl w:ilvl="6" w:tplc="3A289812">
       <w:numFmt w:val="decimal"/>
       <w:lvlText w:val=""/>
       <w:lvlJc w:val="left"/>
     </w:lvl>
-    <w:lvl w:ilvl="7" w:tplc="78FE1944">
+    <w:lvl w:ilvl="7" w:tplc="8E8289C6">
       <w:numFmt w:val="decimal"/>
       <w:lvlText w:val=""/>
       <w:lvlJc w:val="left"/>
     </w:lvl>
-    <w:lvl w:ilvl="8" w:tplc="96A47DDE">
+    <w:lvl w:ilvl="8" w:tplc="D2D4A7E0">
       <w:numFmt w:val="decimal"/>
       <w:lvlText w:val=""/>
       <w:lvlJc w:val="left"/>
     </w:lvl>
   </w:abstractNum>
-  <w:num w:numId="1" w16cid:durableId="284771550">
+  <w:abstractNum w:abstractNumId="8" w15:restartNumberingAfterBreak="0">
+    <w:nsid w:val="5E0A68DB"/>
+    <w:multiLevelType w:val="hybridMultilevel"/>
+    <w:tmpl w:val="ACDE4006"/>
+    <w:lvl w:ilvl="0" w:tplc="B8089C34">
+      <w:start w:val="1"/>
+      <w:numFmt w:val="decimal"/>
+      <w:lvlText w:val="%1."/>
+      <w:lvlJc w:val="left"/>
+      <w:pPr>
+        <w:ind w:left="540" w:hanging="340"/>
+      </w:pPr>
+    </w:lvl>
+    <w:lvl w:ilvl="1" w:tplc="EDFEB450">
+      <w:numFmt w:val="decimal"/>
+      <w:lvlText w:val=""/>
+      <w:lvlJc w:val="left"/>
+    </w:lvl>
+    <w:lvl w:ilvl="2" w:tplc="0DC6A85E">
+      <w:numFmt w:val="decimal"/>
+      <w:lvlText w:val=""/>
+      <w:lvlJc w:val="left"/>
+    </w:lvl>
+    <w:lvl w:ilvl="3" w:tplc="A11C30D2">
+      <w:numFmt w:val="decimal"/>
+      <w:lvlText w:val=""/>
+      <w:lvlJc w:val="left"/>
+    </w:lvl>
+    <w:lvl w:ilvl="4" w:tplc="70968808">
+      <w:numFmt w:val="decimal"/>
+      <w:lvlText w:val=""/>
+      <w:lvlJc w:val="left"/>
+    </w:lvl>
+    <w:lvl w:ilvl="5" w:tplc="0CC409CA">
+      <w:numFmt w:val="decimal"/>
+      <w:lvlText w:val=""/>
+      <w:lvlJc w:val="left"/>
+    </w:lvl>
+    <w:lvl w:ilvl="6" w:tplc="075CA738">
+      <w:numFmt w:val="decimal"/>
+      <w:lvlText w:val=""/>
+      <w:lvlJc w:val="left"/>
+    </w:lvl>
+    <w:lvl w:ilvl="7" w:tplc="B7941F46">
+      <w:numFmt w:val="decimal"/>
+      <w:lvlText w:val=""/>
+      <w:lvlJc w:val="left"/>
+    </w:lvl>
+    <w:lvl w:ilvl="8" w:tplc="247040CC">
+      <w:numFmt w:val="decimal"/>
+      <w:lvlText w:val=""/>
+      <w:lvlJc w:val="left"/>
+    </w:lvl>
+  </w:abstractNum>
+  <w:num w:numId="1" w16cid:durableId="1257329184">
+    <w:abstractNumId w:val="6"/>
+    <w:lvlOverride w:ilvl="0">
+      <w:startOverride w:val="1"/>
+    </w:lvlOverride>
+  </w:num>
+  <w:num w:numId="2" w16cid:durableId="1603680095">
+    <w:abstractNumId w:val="2"/>
+    <w:lvlOverride w:ilvl="0">
+      <w:startOverride w:val="1"/>
+    </w:lvlOverride>
+  </w:num>
+  <w:num w:numId="3" w16cid:durableId="288903819">
+    <w:abstractNumId w:val="5"/>
+    <w:lvlOverride w:ilvl="0">
+      <w:startOverride w:val="1"/>
+    </w:lvlOverride>
+  </w:num>
+  <w:num w:numId="4" w16cid:durableId="1628273559">
     <w:abstractNumId w:val="7"/>
     <w:lvlOverride w:ilvl="0">
       <w:startOverride w:val="1"/>
     </w:lvlOverride>
   </w:num>
-  <w:num w:numId="2" w16cid:durableId="834303018">
-    <w:abstractNumId w:val="6"/>
+  <w:num w:numId="5" w16cid:durableId="1550221137">
+    <w:abstractNumId w:val="4"/>
     <w:lvlOverride w:ilvl="0">
       <w:startOverride w:val="1"/>
     </w:lvlOverride>
   </w:num>
-  <w:num w:numId="3" w16cid:durableId="273754032">
+  <w:num w:numId="6" w16cid:durableId="139614753">
+    <w:abstractNumId w:val="1"/>
+    <w:lvlOverride w:ilvl="0">
+      <w:startOverride w:val="1"/>
+    </w:lvlOverride>
+  </w:num>
+  <w:num w:numId="7" w16cid:durableId="434666752">
     <w:abstractNumId w:val="0"/>
     <w:lvlOverride w:ilvl="0">
       <w:startOverride w:val="1"/>
     </w:lvlOverride>
   </w:num>
-  <w:num w:numId="4" w16cid:durableId="1697802974">
-    <w:abstractNumId w:val="2"/>
-    <w:lvlOverride w:ilvl="0">
-      <w:startOverride w:val="1"/>
-    </w:lvlOverride>
-  </w:num>
-  <w:num w:numId="5" w16cid:durableId="1693072545">
-    <w:abstractNumId w:val="4"/>
-    <w:lvlOverride w:ilvl="0">
-      <w:startOverride w:val="1"/>
-    </w:lvlOverride>
-  </w:num>
-  <w:num w:numId="6" w16cid:durableId="1973754227">
-    <w:abstractNumId w:val="5"/>
-    <w:lvlOverride w:ilvl="0">
-      <w:startOverride w:val="1"/>
-    </w:lvlOverride>
-  </w:num>
-  <w:num w:numId="7" w16cid:durableId="595212538">
-    <w:abstractNumId w:val="8"/>
-    <w:lvlOverride w:ilvl="0">
-      <w:startOverride w:val="1"/>
-    </w:lvlOverride>
-  </w:num>
-  <w:num w:numId="8" w16cid:durableId="734015203">
-    <w:abstractNumId w:val="1"/>
+  <w:num w:numId="8" w16cid:durableId="467403779">
+    <w:abstractNumId w:val="3"/>
     <w:lvlOverride w:ilvl="0">
       <w:startOverride w:val="1"/>
     </w:lvlOverride>
@@ -12050,7 +12218,7 @@
     <w:autoRedefine/>
     <w:uiPriority w:val="39"/>
     <w:unhideWhenUsed/>
-    <w:rsid w:val="0004525F"/>
+    <w:rsid w:val="000E790A"/>
     <w:pPr>
       <w:spacing w:after="100"/>
     </w:pPr>
@@ -12062,7 +12230,7 @@
     <w:autoRedefine/>
     <w:uiPriority w:val="39"/>
     <w:unhideWhenUsed/>
-    <w:rsid w:val="0004525F"/>
+    <w:rsid w:val="000E790A"/>
     <w:pPr>
       <w:spacing w:after="100"/>
       <w:ind w:left="210"/>

</xml_diff>

<commit_message>
Record Netlify deployment in the change log
Co-Authored-By: Claude Opus 5.5 <noreply@anthropic.com>
</commit_message>
<xml_diff>
--- a/documentation/Deployment and Change Log.docx
+++ b/documentation/Deployment and Change Log.docx
@@ -63,7 +63,7 @@
           <w:left w:w="10" w:type="dxa"/>
           <w:right w:w="10" w:type="dxa"/>
         </w:tblCellMar>
-        <w:tblLook w:val="0000" w:firstRow="0" w:lastRow="0" w:firstColumn="0" w:lastColumn="0" w:noHBand="0" w:noVBand="0"/>
+        <w:tblLook w:val="04A0" w:firstRow="1" w:lastRow="0" w:firstColumn="1" w:lastColumn="0" w:noHBand="0" w:noVBand="1"/>
       </w:tblPr>
       <w:tblGrid>
         <w:gridCol w:w="2791"/>
@@ -193,7 +193,7 @@
               <w:spacing w:after="40"/>
             </w:pPr>
             <w:r>
-              <w:t>1.9</w:t>
+              <w:t>2.0</w:t>
             </w:r>
           </w:p>
         </w:tc>
@@ -485,7 +485,7 @@
               <w:spacing w:after="40"/>
             </w:pPr>
             <w:r>
-              <w:t>Status</w:t>
+              <w:t>Live site</w:t>
             </w:r>
           </w:p>
         </w:tc>
@@ -510,7 +510,16 @@
               <w:spacing w:after="40"/>
             </w:pPr>
             <w:r>
-              <w:t>Built and tested locally. Not yet deployed.</w:t>
+              <w:rPr>
+                <w:rFonts w:ascii="Consolas" w:eastAsia="Consolas" w:hAnsi="Consolas" w:cs="Consolas"/>
+                <w:color w:val="4E11DC"/>
+                <w:sz w:val="19"/>
+                <w:szCs w:val="19"/>
+              </w:rPr>
+              <w:t>https://altura-hertz.netlify.app</w:t>
+            </w:r>
+            <w:r>
+              <w:t xml:space="preserve"> (Netlify project altura-hertz, team Emperial Waste, account ohemengemmanuel104@gmail.com)</w:t>
             </w:r>
           </w:p>
         </w:tc>
@@ -543,6 +552,64 @@
               <w:spacing w:after="40"/>
             </w:pPr>
             <w:r>
+              <w:t>Status</w:t>
+            </w:r>
+          </w:p>
+        </w:tc>
+        <w:tc>
+          <w:tcPr>
+            <w:tcW w:w="6515" w:type="dxa"/>
+            <w:tcBorders>
+              <w:top w:val="single" w:sz="4" w:space="0" w:color="C9C3E6"/>
+              <w:left w:val="single" w:sz="4" w:space="0" w:color="C9C3E6"/>
+              <w:bottom w:val="single" w:sz="4" w:space="0" w:color="C9C3E6"/>
+              <w:right w:val="single" w:sz="4" w:space="0" w:color="C9C3E6"/>
+            </w:tcBorders>
+            <w:tcMar>
+              <w:top w:w="80" w:type="dxa"/>
+              <w:left w:w="110" w:type="dxa"/>
+              <w:bottom w:w="80" w:type="dxa"/>
+              <w:right w:w="110" w:type="dxa"/>
+            </w:tcMar>
+          </w:tcPr>
+          <w:p>
+            <w:pPr>
+              <w:spacing w:after="40"/>
+            </w:pPr>
+            <w:r>
+              <w:t>Live at altura-hertz.netlify.app. Placeholders still to replace before launch.</w:t>
+            </w:r>
+          </w:p>
+        </w:tc>
+      </w:tr>
+      <w:tr>
+        <w:tblPrEx>
+          <w:tblCellMar>
+            <w:top w:w="0" w:type="dxa"/>
+            <w:bottom w:w="0" w:type="dxa"/>
+          </w:tblCellMar>
+        </w:tblPrEx>
+        <w:tc>
+          <w:tcPr>
+            <w:tcW w:w="2791" w:type="dxa"/>
+            <w:tcBorders>
+              <w:top w:val="single" w:sz="4" w:space="0" w:color="C9C3E6"/>
+              <w:left w:val="single" w:sz="4" w:space="0" w:color="C9C3E6"/>
+              <w:bottom w:val="single" w:sz="4" w:space="0" w:color="C9C3E6"/>
+              <w:right w:val="single" w:sz="4" w:space="0" w:color="C9C3E6"/>
+            </w:tcBorders>
+            <w:tcMar>
+              <w:top w:w="80" w:type="dxa"/>
+              <w:left w:w="110" w:type="dxa"/>
+              <w:bottom w:w="80" w:type="dxa"/>
+              <w:right w:w="110" w:type="dxa"/>
+            </w:tcMar>
+          </w:tcPr>
+          <w:p>
+            <w:pPr>
+              <w:spacing w:after="40"/>
+            </w:pPr>
+            <w:r>
               <w:t>Last updated</w:t>
             </w:r>
           </w:p>
@@ -568,7 +635,7 @@
               <w:spacing w:after="40"/>
             </w:pPr>
             <w:r>
-              <w:t>27 September 2026 (pushed to GitHub)</w:t>
+              <w:t>27 September 2026 (live on Netlify)</w:t>
             </w:r>
           </w:p>
         </w:tc>
@@ -596,7 +663,7 @@
     <w:sdt>
       <w:sdtPr>
         <w:alias w:val="Contents"/>
-        <w:id w:val="683254612"/>
+        <w:id w:val="-912934640"/>
       </w:sdtPr>
       <w:sdtEndPr/>
       <w:sdtContent>
@@ -625,7 +692,7 @@
           <w:r>
             <w:fldChar w:fldCharType="separate"/>
           </w:r>
-          <w:hyperlink w:anchor="_Toc241371001" w:history="1">
+          <w:hyperlink w:anchor="_Toc241372015" w:history="1">
             <w:r>
               <w:rPr>
                 <w:rStyle w:val="Hyperlink"/>
@@ -649,7 +716,7 @@
               <w:rPr>
                 <w:noProof/>
               </w:rPr>
-              <w:instrText xml:space="preserve"> PAGEREF _Toc241371001 \h </w:instrText>
+              <w:instrText xml:space="preserve"> PAGEREF _Toc241372015 \h </w:instrText>
             </w:r>
             <w:r>
               <w:rPr>
@@ -692,7 +759,7 @@
               <w14:ligatures w14:val="standardContextual"/>
             </w:rPr>
           </w:pPr>
-          <w:hyperlink w:anchor="_Toc241371002" w:history="1">
+          <w:hyperlink w:anchor="_Toc241372016" w:history="1">
             <w:r>
               <w:rPr>
                 <w:rStyle w:val="Hyperlink"/>
@@ -716,7 +783,7 @@
               <w:rPr>
                 <w:noProof/>
               </w:rPr>
-              <w:instrText xml:space="preserve"> PAGEREF _Toc241371002 \h </w:instrText>
+              <w:instrText xml:space="preserve"> PAGEREF _Toc241372016 \h </w:instrText>
             </w:r>
             <w:r>
               <w:rPr>
@@ -759,7 +826,7 @@
               <w14:ligatures w14:val="standardContextual"/>
             </w:rPr>
           </w:pPr>
-          <w:hyperlink w:anchor="_Toc241371003" w:history="1">
+          <w:hyperlink w:anchor="_Toc241372017" w:history="1">
             <w:r>
               <w:rPr>
                 <w:rStyle w:val="Hyperlink"/>
@@ -783,7 +850,7 @@
               <w:rPr>
                 <w:noProof/>
               </w:rPr>
-              <w:instrText xml:space="preserve"> PAGEREF _Toc241371003 \h </w:instrText>
+              <w:instrText xml:space="preserve"> PAGEREF _Toc241372017 \h </w:instrText>
             </w:r>
             <w:r>
               <w:rPr>
@@ -826,7 +893,7 @@
               <w14:ligatures w14:val="standardContextual"/>
             </w:rPr>
           </w:pPr>
-          <w:hyperlink w:anchor="_Toc241371004" w:history="1">
+          <w:hyperlink w:anchor="_Toc241372018" w:history="1">
             <w:r>
               <w:rPr>
                 <w:rStyle w:val="Hyperlink"/>
@@ -850,7 +917,7 @@
               <w:rPr>
                 <w:noProof/>
               </w:rPr>
-              <w:instrText xml:space="preserve"> PAGEREF _Toc241371004 \h </w:instrText>
+              <w:instrText xml:space="preserve"> PAGEREF _Toc241372018 \h </w:instrText>
             </w:r>
             <w:r>
               <w:rPr>
@@ -893,7 +960,7 @@
               <w14:ligatures w14:val="standardContextual"/>
             </w:rPr>
           </w:pPr>
-          <w:hyperlink w:anchor="_Toc241371005" w:history="1">
+          <w:hyperlink w:anchor="_Toc241372019" w:history="1">
             <w:r>
               <w:rPr>
                 <w:rStyle w:val="Hyperlink"/>
@@ -917,7 +984,7 @@
               <w:rPr>
                 <w:noProof/>
               </w:rPr>
-              <w:instrText xml:space="preserve"> PAGEREF _Toc241371005 \h </w:instrText>
+              <w:instrText xml:space="preserve"> PAGEREF _Toc241372019 \h </w:instrText>
             </w:r>
             <w:r>
               <w:rPr>
@@ -960,7 +1027,7 @@
               <w14:ligatures w14:val="standardContextual"/>
             </w:rPr>
           </w:pPr>
-          <w:hyperlink w:anchor="_Toc241371006" w:history="1">
+          <w:hyperlink w:anchor="_Toc241372020" w:history="1">
             <w:r>
               <w:rPr>
                 <w:rStyle w:val="Hyperlink"/>
@@ -984,7 +1051,7 @@
               <w:rPr>
                 <w:noProof/>
               </w:rPr>
-              <w:instrText xml:space="preserve"> PAGEREF _Toc241371006 \h </w:instrText>
+              <w:instrText xml:space="preserve"> PAGEREF _Toc241372020 \h </w:instrText>
             </w:r>
             <w:r>
               <w:rPr>
@@ -1027,7 +1094,7 @@
               <w14:ligatures w14:val="standardContextual"/>
             </w:rPr>
           </w:pPr>
-          <w:hyperlink w:anchor="_Toc241371007" w:history="1">
+          <w:hyperlink w:anchor="_Toc241372021" w:history="1">
             <w:r>
               <w:rPr>
                 <w:rStyle w:val="Hyperlink"/>
@@ -1051,7 +1118,7 @@
               <w:rPr>
                 <w:noProof/>
               </w:rPr>
-              <w:instrText xml:space="preserve"> PAGEREF _Toc241371007 \h </w:instrText>
+              <w:instrText xml:space="preserve"> PAGEREF _Toc241372021 \h </w:instrText>
             </w:r>
             <w:r>
               <w:rPr>
@@ -1094,7 +1161,7 @@
               <w14:ligatures w14:val="standardContextual"/>
             </w:rPr>
           </w:pPr>
-          <w:hyperlink w:anchor="_Toc241371008" w:history="1">
+          <w:hyperlink w:anchor="_Toc241372022" w:history="1">
             <w:r>
               <w:rPr>
                 <w:rStyle w:val="Hyperlink"/>
@@ -1118,7 +1185,7 @@
               <w:rPr>
                 <w:noProof/>
               </w:rPr>
-              <w:instrText xml:space="preserve"> PAGEREF _Toc241371008 \h </w:instrText>
+              <w:instrText xml:space="preserve"> PAGEREF _Toc241372022 \h </w:instrText>
             </w:r>
             <w:r>
               <w:rPr>
@@ -1161,7 +1228,7 @@
               <w14:ligatures w14:val="standardContextual"/>
             </w:rPr>
           </w:pPr>
-          <w:hyperlink w:anchor="_Toc241371009" w:history="1">
+          <w:hyperlink w:anchor="_Toc241372023" w:history="1">
             <w:r>
               <w:rPr>
                 <w:rStyle w:val="Hyperlink"/>
@@ -1185,7 +1252,7 @@
               <w:rPr>
                 <w:noProof/>
               </w:rPr>
-              <w:instrText xml:space="preserve"> PAGEREF _Toc241371009 \h </w:instrText>
+              <w:instrText xml:space="preserve"> PAGEREF _Toc241372023 \h </w:instrText>
             </w:r>
             <w:r>
               <w:rPr>
@@ -1228,7 +1295,7 @@
               <w14:ligatures w14:val="standardContextual"/>
             </w:rPr>
           </w:pPr>
-          <w:hyperlink w:anchor="_Toc241371010" w:history="1">
+          <w:hyperlink w:anchor="_Toc241372024" w:history="1">
             <w:r>
               <w:rPr>
                 <w:rStyle w:val="Hyperlink"/>
@@ -1252,7 +1319,7 @@
               <w:rPr>
                 <w:noProof/>
               </w:rPr>
-              <w:instrText xml:space="preserve"> PAGEREF _Toc241371010 \h </w:instrText>
+              <w:instrText xml:space="preserve"> PAGEREF _Toc241372024 \h </w:instrText>
             </w:r>
             <w:r>
               <w:rPr>
@@ -1295,7 +1362,7 @@
               <w14:ligatures w14:val="standardContextual"/>
             </w:rPr>
           </w:pPr>
-          <w:hyperlink w:anchor="_Toc241371011" w:history="1">
+          <w:hyperlink w:anchor="_Toc241372025" w:history="1">
             <w:r>
               <w:rPr>
                 <w:rStyle w:val="Hyperlink"/>
@@ -1319,7 +1386,7 @@
               <w:rPr>
                 <w:noProof/>
               </w:rPr>
-              <w:instrText xml:space="preserve"> PAGEREF _Toc241371011 \h </w:instrText>
+              <w:instrText xml:space="preserve"> PAGEREF _Toc241372025 \h </w:instrText>
             </w:r>
             <w:r>
               <w:rPr>
@@ -1362,7 +1429,7 @@
               <w14:ligatures w14:val="standardContextual"/>
             </w:rPr>
           </w:pPr>
-          <w:hyperlink w:anchor="_Toc241371012" w:history="1">
+          <w:hyperlink w:anchor="_Toc241372026" w:history="1">
             <w:r>
               <w:rPr>
                 <w:rStyle w:val="Hyperlink"/>
@@ -1386,7 +1453,7 @@
               <w:rPr>
                 <w:noProof/>
               </w:rPr>
-              <w:instrText xml:space="preserve"> PAGEREF _Toc241371012 \h </w:instrText>
+              <w:instrText xml:space="preserve"> PAGEREF _Toc241372026 \h </w:instrText>
             </w:r>
             <w:r>
               <w:rPr>
@@ -1429,13 +1496,13 @@
               <w14:ligatures w14:val="standardContextual"/>
             </w:rPr>
           </w:pPr>
-          <w:hyperlink w:anchor="_Toc241371013" w:history="1">
+          <w:hyperlink w:anchor="_Toc241372027" w:history="1">
             <w:r>
               <w:rPr>
                 <w:rStyle w:val="Hyperlink"/>
                 <w:noProof/>
               </w:rPr>
-              <w:t>5.2 Option A: Netlify (quickest, free)</w:t>
+              <w:t>5.2 Option A: Netlify (in use)</w:t>
             </w:r>
             <w:r>
               <w:rPr>
@@ -1453,7 +1520,7 @@
               <w:rPr>
                 <w:noProof/>
               </w:rPr>
-              <w:instrText xml:space="preserve"> PAGEREF _Toc241371013 \h </w:instrText>
+              <w:instrText xml:space="preserve"> PAGEREF _Toc241372027 \h </w:instrText>
             </w:r>
             <w:r>
               <w:rPr>
@@ -1496,7 +1563,7 @@
               <w14:ligatures w14:val="standardContextual"/>
             </w:rPr>
           </w:pPr>
-          <w:hyperlink w:anchor="_Toc241371014" w:history="1">
+          <w:hyperlink w:anchor="_Toc241372028" w:history="1">
             <w:r>
               <w:rPr>
                 <w:rStyle w:val="Hyperlink"/>
@@ -1520,7 +1587,7 @@
               <w:rPr>
                 <w:noProof/>
               </w:rPr>
-              <w:instrText xml:space="preserve"> PAGEREF _Toc241371014 \h </w:instrText>
+              <w:instrText xml:space="preserve"> PAGEREF _Toc241372028 \h </w:instrText>
             </w:r>
             <w:r>
               <w:rPr>
@@ -1563,7 +1630,7 @@
               <w14:ligatures w14:val="standardContextual"/>
             </w:rPr>
           </w:pPr>
-          <w:hyperlink w:anchor="_Toc241371015" w:history="1">
+          <w:hyperlink w:anchor="_Toc241372029" w:history="1">
             <w:r>
               <w:rPr>
                 <w:rStyle w:val="Hyperlink"/>
@@ -1587,7 +1654,7 @@
               <w:rPr>
                 <w:noProof/>
               </w:rPr>
-              <w:instrText xml:space="preserve"> PAGEREF _Toc241371015 \h </w:instrText>
+              <w:instrText xml:space="preserve"> PAGEREF _Toc241372029 \h </w:instrText>
             </w:r>
             <w:r>
               <w:rPr>
@@ -1604,7 +1671,7 @@
               <w:rPr>
                 <w:noProof/>
               </w:rPr>
-              <w:t>6</w:t>
+              <w:t>7</w:t>
             </w:r>
             <w:r>
               <w:rPr>
@@ -1630,7 +1697,7 @@
               <w14:ligatures w14:val="standardContextual"/>
             </w:rPr>
           </w:pPr>
-          <w:hyperlink w:anchor="_Toc241371016" w:history="1">
+          <w:hyperlink w:anchor="_Toc241372030" w:history="1">
             <w:r>
               <w:rPr>
                 <w:rStyle w:val="Hyperlink"/>
@@ -1654,7 +1721,7 @@
               <w:rPr>
                 <w:noProof/>
               </w:rPr>
-              <w:instrText xml:space="preserve"> PAGEREF _Toc241371016 \h </w:instrText>
+              <w:instrText xml:space="preserve"> PAGEREF _Toc241372030 \h </w:instrText>
             </w:r>
             <w:r>
               <w:rPr>
@@ -1697,7 +1764,7 @@
               <w14:ligatures w14:val="standardContextual"/>
             </w:rPr>
           </w:pPr>
-          <w:hyperlink w:anchor="_Toc241371017" w:history="1">
+          <w:hyperlink w:anchor="_Toc241372031" w:history="1">
             <w:r>
               <w:rPr>
                 <w:rStyle w:val="Hyperlink"/>
@@ -1721,7 +1788,7 @@
               <w:rPr>
                 <w:noProof/>
               </w:rPr>
-              <w:instrText xml:space="preserve"> PAGEREF _Toc241371017 \h </w:instrText>
+              <w:instrText xml:space="preserve"> PAGEREF _Toc241372031 \h </w:instrText>
             </w:r>
             <w:r>
               <w:rPr>
@@ -1764,7 +1831,7 @@
               <w14:ligatures w14:val="standardContextual"/>
             </w:rPr>
           </w:pPr>
-          <w:hyperlink w:anchor="_Toc241371018" w:history="1">
+          <w:hyperlink w:anchor="_Toc241372032" w:history="1">
             <w:r>
               <w:rPr>
                 <w:rStyle w:val="Hyperlink"/>
@@ -1788,7 +1855,7 @@
               <w:rPr>
                 <w:noProof/>
               </w:rPr>
-              <w:instrText xml:space="preserve"> PAGEREF _Toc241371018 \h </w:instrText>
+              <w:instrText xml:space="preserve"> PAGEREF _Toc241372032 \h </w:instrText>
             </w:r>
             <w:r>
               <w:rPr>
@@ -1831,7 +1898,7 @@
               <w14:ligatures w14:val="standardContextual"/>
             </w:rPr>
           </w:pPr>
-          <w:hyperlink w:anchor="_Toc241371019" w:history="1">
+          <w:hyperlink w:anchor="_Toc241372033" w:history="1">
             <w:r>
               <w:rPr>
                 <w:rStyle w:val="Hyperlink"/>
@@ -1855,7 +1922,7 @@
               <w:rPr>
                 <w:noProof/>
               </w:rPr>
-              <w:instrText xml:space="preserve"> PAGEREF _Toc241371019 \h </w:instrText>
+              <w:instrText xml:space="preserve"> PAGEREF _Toc241372033 \h </w:instrText>
             </w:r>
             <w:r>
               <w:rPr>
@@ -1898,7 +1965,7 @@
               <w14:ligatures w14:val="standardContextual"/>
             </w:rPr>
           </w:pPr>
-          <w:hyperlink w:anchor="_Toc241371020" w:history="1">
+          <w:hyperlink w:anchor="_Toc241372034" w:history="1">
             <w:r>
               <w:rPr>
                 <w:rStyle w:val="Hyperlink"/>
@@ -1922,7 +1989,7 @@
               <w:rPr>
                 <w:noProof/>
               </w:rPr>
-              <w:instrText xml:space="preserve"> PAGEREF _Toc241371020 \h </w:instrText>
+              <w:instrText xml:space="preserve"> PAGEREF _Toc241372034 \h </w:instrText>
             </w:r>
             <w:r>
               <w:rPr>
@@ -1965,7 +2032,7 @@
               <w14:ligatures w14:val="standardContextual"/>
             </w:rPr>
           </w:pPr>
-          <w:hyperlink w:anchor="_Toc241371021" w:history="1">
+          <w:hyperlink w:anchor="_Toc241372035" w:history="1">
             <w:r>
               <w:rPr>
                 <w:rStyle w:val="Hyperlink"/>
@@ -1989,7 +2056,7 @@
               <w:rPr>
                 <w:noProof/>
               </w:rPr>
-              <w:instrText xml:space="preserve"> PAGEREF _Toc241371021 \h </w:instrText>
+              <w:instrText xml:space="preserve"> PAGEREF _Toc241372035 \h </w:instrText>
             </w:r>
             <w:r>
               <w:rPr>
@@ -2006,7 +2073,7 @@
               <w:rPr>
                 <w:noProof/>
               </w:rPr>
-              <w:t>8</w:t>
+              <w:t>9</w:t>
             </w:r>
             <w:r>
               <w:rPr>
@@ -2032,7 +2099,7 @@
               <w14:ligatures w14:val="standardContextual"/>
             </w:rPr>
           </w:pPr>
-          <w:hyperlink w:anchor="_Toc241371022" w:history="1">
+          <w:hyperlink w:anchor="_Toc241372036" w:history="1">
             <w:r>
               <w:rPr>
                 <w:rStyle w:val="Hyperlink"/>
@@ -2056,7 +2123,7 @@
               <w:rPr>
                 <w:noProof/>
               </w:rPr>
-              <w:instrText xml:space="preserve"> PAGEREF _Toc241371022 \h </w:instrText>
+              <w:instrText xml:space="preserve"> PAGEREF _Toc241372036 \h </w:instrText>
             </w:r>
             <w:r>
               <w:rPr>
@@ -2073,7 +2140,7 @@
               <w:rPr>
                 <w:noProof/>
               </w:rPr>
-              <w:t>11</w:t>
+              <w:t>12</w:t>
             </w:r>
             <w:r>
               <w:rPr>
@@ -2099,7 +2166,7 @@
               <w14:ligatures w14:val="standardContextual"/>
             </w:rPr>
           </w:pPr>
-          <w:hyperlink w:anchor="_Toc241371023" w:history="1">
+          <w:hyperlink w:anchor="_Toc241372037" w:history="1">
             <w:r>
               <w:rPr>
                 <w:rStyle w:val="Hyperlink"/>
@@ -2123,7 +2190,7 @@
               <w:rPr>
                 <w:noProof/>
               </w:rPr>
-              <w:instrText xml:space="preserve"> PAGEREF _Toc241371023 \h </w:instrText>
+              <w:instrText xml:space="preserve"> PAGEREF _Toc241372037 \h </w:instrText>
             </w:r>
             <w:r>
               <w:rPr>
@@ -2166,7 +2233,7 @@
       <w:pPr>
         <w:pStyle w:val="Heading1"/>
       </w:pPr>
-      <w:bookmarkStart w:id="0" w:name="_Toc241371001"/>
+      <w:bookmarkStart w:id="0" w:name="_Toc241372015"/>
       <w:r>
         <w:t>1. Project overview</w:t>
       </w:r>
@@ -2216,7 +2283,7 @@
       <w:pPr>
         <w:pStyle w:val="Heading2"/>
       </w:pPr>
-      <w:bookmarkStart w:id="1" w:name="_Toc241371002"/>
+      <w:bookmarkStart w:id="1" w:name="_Toc241372016"/>
       <w:r>
         <w:t>Pages</w:t>
       </w:r>
@@ -2237,7 +2304,7 @@
           <w:left w:w="10" w:type="dxa"/>
           <w:right w:w="10" w:type="dxa"/>
         </w:tblCellMar>
-        <w:tblLook w:val="0000" w:firstRow="0" w:lastRow="0" w:firstColumn="0" w:lastColumn="0" w:noHBand="0" w:noVBand="0"/>
+        <w:tblLook w:val="04A0" w:firstRow="1" w:lastRow="0" w:firstColumn="1" w:lastColumn="0" w:noHBand="0" w:noVBand="1"/>
       </w:tblPr>
       <w:tblGrid>
         <w:gridCol w:w="2419"/>
@@ -2973,7 +3040,7 @@
       <w:pPr>
         <w:pStyle w:val="Heading1"/>
       </w:pPr>
-      <w:bookmarkStart w:id="2" w:name="_Toc241371003"/>
+      <w:bookmarkStart w:id="2" w:name="_Toc241372017"/>
       <w:r>
         <w:t>2. Folder structure</w:t>
       </w:r>
@@ -3014,7 +3081,7 @@
           <w:left w:w="10" w:type="dxa"/>
           <w:right w:w="10" w:type="dxa"/>
         </w:tblCellMar>
-        <w:tblLook w:val="0000" w:firstRow="0" w:lastRow="0" w:firstColumn="0" w:lastColumn="0" w:noHBand="0" w:noVBand="0"/>
+        <w:tblLook w:val="04A0" w:firstRow="1" w:lastRow="0" w:firstColumn="1" w:lastColumn="0" w:noHBand="0" w:noVBand="1"/>
       </w:tblPr>
       <w:tblGrid>
         <w:gridCol w:w="3164"/>
@@ -3951,7 +4018,7 @@
       <w:pPr>
         <w:pStyle w:val="Heading1"/>
       </w:pPr>
-      <w:bookmarkStart w:id="3" w:name="_Toc241371004"/>
+      <w:bookmarkStart w:id="3" w:name="_Toc241372018"/>
       <w:r>
         <w:t>3. How the site works</w:t>
       </w:r>
@@ -3961,7 +4028,7 @@
       <w:pPr>
         <w:pStyle w:val="Heading2"/>
       </w:pPr>
-      <w:bookmarkStart w:id="4" w:name="_Toc241371005"/>
+      <w:bookmarkStart w:id="4" w:name="_Toc241372019"/>
       <w:r>
         <w:t>Design</w:t>
       </w:r>
@@ -4101,7 +4168,7 @@
       <w:pPr>
         <w:pStyle w:val="Heading2"/>
       </w:pPr>
-      <w:bookmarkStart w:id="5" w:name="_Toc241371006"/>
+      <w:bookmarkStart w:id="5" w:name="_Toc241372020"/>
       <w:r>
         <w:t>Pricing</w:t>
       </w:r>
@@ -4142,7 +4209,7 @@
           <w:left w:w="10" w:type="dxa"/>
           <w:right w:w="10" w:type="dxa"/>
         </w:tblCellMar>
-        <w:tblLook w:val="0000" w:firstRow="0" w:lastRow="0" w:firstColumn="0" w:lastColumn="0" w:noHBand="0" w:noVBand="0"/>
+        <w:tblLook w:val="04A0" w:firstRow="1" w:lastRow="0" w:firstColumn="1" w:lastColumn="0" w:noHBand="0" w:noVBand="1"/>
       </w:tblPr>
       <w:tblGrid>
         <w:gridCol w:w="2791"/>
@@ -4551,7 +4618,7 @@
       <w:pPr>
         <w:pStyle w:val="Heading2"/>
       </w:pPr>
-      <w:bookmarkStart w:id="6" w:name="_Toc241371007"/>
+      <w:bookmarkStart w:id="6" w:name="_Toc241372021"/>
       <w:r>
         <w:t>Booking flow</w:t>
       </w:r>
@@ -4638,7 +4705,7 @@
       <w:pPr>
         <w:pStyle w:val="Heading2"/>
       </w:pPr>
-      <w:bookmarkStart w:id="7" w:name="_Toc241371008"/>
+      <w:bookmarkStart w:id="7" w:name="_Toc241372022"/>
       <w:r>
         <w:t>Payments</w:t>
       </w:r>
@@ -4666,7 +4733,7 @@
       <w:pPr>
         <w:pStyle w:val="Heading2"/>
       </w:pPr>
-      <w:bookmarkStart w:id="8" w:name="_Toc241371009"/>
+      <w:bookmarkStart w:id="8" w:name="_Toc241372023"/>
       <w:r>
         <w:t>File uploads</w:t>
       </w:r>
@@ -4684,7 +4751,7 @@
       <w:pPr>
         <w:pStyle w:val="Heading1"/>
       </w:pPr>
-      <w:bookmarkStart w:id="9" w:name="_Toc241371010"/>
+      <w:bookmarkStart w:id="9" w:name="_Toc241372024"/>
       <w:r>
         <w:t>4. Before launch checklist</w:t>
       </w:r>
@@ -4725,7 +4792,7 @@
           <w:left w:w="10" w:type="dxa"/>
           <w:right w:w="10" w:type="dxa"/>
         </w:tblCellMar>
-        <w:tblLook w:val="0000" w:firstRow="0" w:lastRow="0" w:firstColumn="0" w:lastColumn="0" w:noHBand="0" w:noVBand="0"/>
+        <w:tblLook w:val="04A0" w:firstRow="1" w:lastRow="0" w:firstColumn="1" w:lastColumn="0" w:noHBand="0" w:noVBand="1"/>
       </w:tblPr>
       <w:tblGrid>
         <w:gridCol w:w="2791"/>
@@ -6004,7 +6071,7 @@
       <w:pPr>
         <w:pStyle w:val="Heading1"/>
       </w:pPr>
-      <w:bookmarkStart w:id="10" w:name="_Toc241371011"/>
+      <w:bookmarkStart w:id="10" w:name="_Toc241372025"/>
       <w:r>
         <w:t>5. Deployment</w:t>
       </w:r>
@@ -6070,7 +6137,7 @@
       <w:pPr>
         <w:pStyle w:val="Heading2"/>
       </w:pPr>
-      <w:bookmarkStart w:id="11" w:name="_Toc241371012"/>
+      <w:bookmarkStart w:id="11" w:name="_Toc241372026"/>
       <w:r>
         <w:t>5.1 Test on your computer</w:t>
       </w:r>
@@ -6154,11 +6221,138 @@
       <w:pPr>
         <w:pStyle w:val="Heading2"/>
       </w:pPr>
-      <w:bookmarkStart w:id="12" w:name="_Toc241371013"/>
-      <w:r>
-        <w:t>5.2 Option A: Netlify (quickest, free)</w:t>
+      <w:bookmarkStart w:id="12" w:name="_Toc241372027"/>
+      <w:r>
+        <w:t>5.2 Option A: Netlify (in use)</w:t>
       </w:r>
       <w:bookmarkEnd w:id="12"/>
+    </w:p>
+    <w:p>
+      <w:pPr>
+        <w:spacing w:after="120"/>
+      </w:pPr>
+      <w:r>
+        <w:t xml:space="preserve">The site is live on Netlify at </w:t>
+      </w:r>
+      <w:r>
+        <w:rPr>
+          <w:rFonts w:ascii="Consolas" w:eastAsia="Consolas" w:hAnsi="Consolas" w:cs="Consolas"/>
+          <w:color w:val="4E11DC"/>
+          <w:sz w:val="19"/>
+          <w:szCs w:val="19"/>
+        </w:rPr>
+        <w:t>https://altura-hertz.netlify.app</w:t>
+      </w:r>
+      <w:r>
+        <w:t xml:space="preserve">. The project folder is linked to it and </w:t>
+      </w:r>
+      <w:r>
+        <w:rPr>
+          <w:rFonts w:ascii="Consolas" w:eastAsia="Consolas" w:hAnsi="Consolas" w:cs="Consolas"/>
+          <w:color w:val="4E11DC"/>
+          <w:sz w:val="19"/>
+          <w:szCs w:val="19"/>
+        </w:rPr>
+        <w:t>netlify.toml</w:t>
+      </w:r>
+      <w:r>
+        <w:t xml:space="preserve"> at the top of the folder tells Netlify to publish </w:t>
+      </w:r>
+      <w:r>
+        <w:rPr>
+          <w:rFonts w:ascii="Consolas" w:eastAsia="Consolas" w:hAnsi="Consolas" w:cs="Consolas"/>
+          <w:color w:val="4E11DC"/>
+          <w:sz w:val="19"/>
+          <w:szCs w:val="19"/>
+        </w:rPr>
+        <w:t>development</w:t>
+      </w:r>
+      <w:r>
+        <w:t>.</w:t>
+      </w:r>
+    </w:p>
+    <w:p>
+      <w:pPr>
+        <w:spacing w:after="120"/>
+      </w:pPr>
+      <w:r>
+        <w:rPr>
+          <w:b/>
+          <w:bCs/>
+        </w:rPr>
+        <w:t>Updating the live site.</w:t>
+      </w:r>
+      <w:r>
+        <w:t xml:space="preserve"> The easiest route is to connect the GitHub repository in the Netlify dashboard (Project configuration, then Build and deploy, then Link repository). After that, every push to </w:t>
+      </w:r>
+      <w:r>
+        <w:rPr>
+          <w:rFonts w:ascii="Consolas" w:eastAsia="Consolas" w:hAnsi="Consolas" w:cs="Consolas"/>
+          <w:color w:val="4E11DC"/>
+          <w:sz w:val="19"/>
+          <w:szCs w:val="19"/>
+        </w:rPr>
+        <w:t>main</w:t>
+      </w:r>
+      <w:r>
+        <w:t xml:space="preserve"> goes live automatically and anything kept out of GitHub, such as the font-preview trial files, never reaches the site. Without that, deploy from the command line with </w:t>
+      </w:r>
+      <w:r>
+        <w:rPr>
+          <w:rFonts w:ascii="Consolas" w:eastAsia="Consolas" w:hAnsi="Consolas" w:cs="Consolas"/>
+          <w:color w:val="4E11DC"/>
+          <w:sz w:val="19"/>
+          <w:szCs w:val="19"/>
+        </w:rPr>
+        <w:t>npx netlify-cli deploy --prod</w:t>
+      </w:r>
+      <w:r>
+        <w:t xml:space="preserve">, but first move </w:t>
+      </w:r>
+      <w:r>
+        <w:rPr>
+          <w:rFonts w:ascii="Consolas" w:eastAsia="Consolas" w:hAnsi="Consolas" w:cs="Consolas"/>
+          <w:color w:val="4E11DC"/>
+          <w:sz w:val="19"/>
+          <w:szCs w:val="19"/>
+        </w:rPr>
+        <w:t>development/font-preview</w:t>
+      </w:r>
+      <w:r>
+        <w:t xml:space="preserve"> and </w:t>
+      </w:r>
+      <w:r>
+        <w:rPr>
+          <w:rFonts w:ascii="Consolas" w:eastAsia="Consolas" w:hAnsi="Consolas" w:cs="Consolas"/>
+          <w:color w:val="4E11DC"/>
+          <w:sz w:val="19"/>
+          <w:szCs w:val="19"/>
+        </w:rPr>
+        <w:t>development/font-preview.html</w:t>
+      </w:r>
+      <w:r>
+        <w:t xml:space="preserve"> out of the </w:t>
+      </w:r>
+      <w:r>
+        <w:rPr>
+          <w:rFonts w:ascii="Consolas" w:eastAsia="Consolas" w:hAnsi="Consolas" w:cs="Consolas"/>
+          <w:color w:val="4E11DC"/>
+          <w:sz w:val="19"/>
+          <w:szCs w:val="19"/>
+        </w:rPr>
+        <w:t>development</w:t>
+      </w:r>
+      <w:r>
+        <w:t xml:space="preserve"> folder, because a command line deploy uploads everything in the folder.</w:t>
+      </w:r>
+    </w:p>
+    <w:p>
+      <w:pPr>
+        <w:spacing w:after="120"/>
+      </w:pPr>
+      <w:r>
+        <w:t>The steps below are for setting up a Netlify site from scratch.</w:t>
+      </w:r>
     </w:p>
     <w:p>
       <w:pPr>
@@ -6252,7 +6446,7 @@
       <w:pPr>
         <w:pStyle w:val="Heading2"/>
       </w:pPr>
-      <w:bookmarkStart w:id="13" w:name="_Toc241371014"/>
+      <w:bookmarkStart w:id="13" w:name="_Toc241372028"/>
       <w:r>
         <w:t>5.3 Option B: GitHub Pages (free, keeps history)</w:t>
       </w:r>
@@ -6374,7 +6568,7 @@
       <w:pPr>
         <w:pStyle w:val="Heading2"/>
       </w:pPr>
-      <w:bookmarkStart w:id="14" w:name="_Toc241371015"/>
+      <w:bookmarkStart w:id="14" w:name="_Toc241372029"/>
       <w:r>
         <w:t>5.4 Option C: Shared hosting with cPanel</w:t>
       </w:r>
@@ -6483,7 +6677,7 @@
       <w:pPr>
         <w:pStyle w:val="Heading2"/>
       </w:pPr>
-      <w:bookmarkStart w:id="15" w:name="_Toc241371016"/>
+      <w:bookmarkStart w:id="15" w:name="_Toc241372030"/>
       <w:r>
         <w:t>5.5 Connect the booking forms</w:t>
       </w:r>
@@ -6601,7 +6795,7 @@
       <w:pPr>
         <w:pStyle w:val="Heading2"/>
       </w:pPr>
-      <w:bookmarkStart w:id="16" w:name="_Toc241371017"/>
+      <w:bookmarkStart w:id="16" w:name="_Toc241372031"/>
       <w:r>
         <w:t>5.6 Domain and HTTPS</w:t>
       </w:r>
@@ -6661,7 +6855,7 @@
       <w:pPr>
         <w:pStyle w:val="Heading2"/>
       </w:pPr>
-      <w:bookmarkStart w:id="17" w:name="_Toc241371018"/>
+      <w:bookmarkStart w:id="17" w:name="_Toc241372032"/>
       <w:r>
         <w:t>5.7 Checks after every deployment</w:t>
       </w:r>
@@ -6723,7 +6917,7 @@
       <w:pPr>
         <w:pStyle w:val="Heading2"/>
       </w:pPr>
-      <w:bookmarkStart w:id="18" w:name="_Toc241371019"/>
+      <w:bookmarkStart w:id="18" w:name="_Toc241372033"/>
       <w:r>
         <w:t>5.8 Deployment record</w:t>
       </w:r>
@@ -6744,7 +6938,7 @@
           <w:left w:w="10" w:type="dxa"/>
           <w:right w:w="10" w:type="dxa"/>
         </w:tblCellMar>
-        <w:tblLook w:val="0000" w:firstRow="0" w:lastRow="0" w:firstColumn="0" w:lastColumn="0" w:noHBand="0" w:noVBand="0"/>
+        <w:tblLook w:val="04A0" w:firstRow="1" w:lastRow="0" w:firstColumn="1" w:lastColumn="0" w:noHBand="0" w:noVBand="1"/>
       </w:tblPr>
       <w:tblGrid>
         <w:gridCol w:w="728"/>
@@ -6992,7 +7186,7 @@
               <w:spacing w:after="40"/>
             </w:pPr>
             <w:r>
-              <w:t>GitHub repository only: github.com/ohemengemmanuel/Altura-hurtz (branch main). Not yet live on a host.</w:t>
+              <w:t>Netlify: https://altura-hertz.netlify.app (project altura-hertz, team Emperial Waste)</w:t>
             </w:r>
           </w:p>
         </w:tc>
@@ -7017,7 +7211,7 @@
               <w:spacing w:after="40"/>
             </w:pPr>
             <w:r>
-              <w:t>ohemengemmanuel</w:t>
+              <w:t>Emmanuel Ohemeng, via Netlify command line</w:t>
             </w:r>
           </w:p>
         </w:tc>
@@ -7042,7 +7236,7 @@
               <w:spacing w:after="40"/>
             </w:pPr>
             <w:r>
-              <w:t>First push of design, development and documentation folders. The font-preview trial files are excluded by .gitignore because their licences are unconfirmed.</w:t>
+              <w:t>First production deploy. The first upload accidentally included the font-preview trial files; the site was redeployed from a clean copy within minutes and that first deploy was deleted, so the files are no longer reachable. Cache and security headers from netlify.toml confirmed live.</w:t>
             </w:r>
           </w:p>
         </w:tc>
@@ -7074,6 +7268,9 @@
             <w:pPr>
               <w:spacing w:after="40"/>
             </w:pPr>
+            <w:r>
+              <w:t>27 Sep 2026</w:t>
+            </w:r>
           </w:p>
         </w:tc>
         <w:tc>
@@ -7096,6 +7293,9 @@
             <w:pPr>
               <w:spacing w:after="40"/>
             </w:pPr>
+            <w:r>
+              <w:t>1.7.1</w:t>
+            </w:r>
           </w:p>
         </w:tc>
         <w:tc>
@@ -7118,6 +7318,9 @@
             <w:pPr>
               <w:spacing w:after="40"/>
             </w:pPr>
+            <w:r>
+              <w:t>GitHub repository only: github.com/ohemengemmanuel/Altura-hurtz (branch main).</w:t>
+            </w:r>
           </w:p>
         </w:tc>
         <w:tc>
@@ -7140,6 +7343,9 @@
             <w:pPr>
               <w:spacing w:after="40"/>
             </w:pPr>
+            <w:r>
+              <w:t>ohemengemmanuel</w:t>
+            </w:r>
           </w:p>
         </w:tc>
         <w:tc>
@@ -7162,6 +7368,9 @@
             <w:pPr>
               <w:spacing w:after="40"/>
             </w:pPr>
+            <w:r>
+              <w:t>First push of design, development and documentation folders. The font-preview trial files are excluded by .gitignore because their licences are unconfirmed.</w:t>
+            </w:r>
           </w:p>
         </w:tc>
       </w:tr>
@@ -7283,12 +7492,130 @@
           </w:p>
         </w:tc>
       </w:tr>
+      <w:tr>
+        <w:tblPrEx>
+          <w:tblCellMar>
+            <w:top w:w="0" w:type="dxa"/>
+            <w:bottom w:w="0" w:type="dxa"/>
+          </w:tblCellMar>
+        </w:tblPrEx>
+        <w:tc>
+          <w:tcPr>
+            <w:tcW w:w="1302" w:type="dxa"/>
+            <w:tcBorders>
+              <w:top w:val="single" w:sz="4" w:space="0" w:color="C9C3E6"/>
+              <w:left w:val="single" w:sz="4" w:space="0" w:color="C9C3E6"/>
+              <w:bottom w:val="single" w:sz="4" w:space="0" w:color="C9C3E6"/>
+              <w:right w:val="single" w:sz="4" w:space="0" w:color="C9C3E6"/>
+            </w:tcBorders>
+            <w:tcMar>
+              <w:top w:w="80" w:type="dxa"/>
+              <w:left w:w="110" w:type="dxa"/>
+              <w:bottom w:w="80" w:type="dxa"/>
+              <w:right w:w="110" w:type="dxa"/>
+            </w:tcMar>
+          </w:tcPr>
+          <w:p>
+            <w:pPr>
+              <w:spacing w:after="40"/>
+            </w:pPr>
+          </w:p>
+        </w:tc>
+        <w:tc>
+          <w:tcPr>
+            <w:tcW w:w="1116" w:type="dxa"/>
+            <w:tcBorders>
+              <w:top w:val="single" w:sz="4" w:space="0" w:color="C9C3E6"/>
+              <w:left w:val="single" w:sz="4" w:space="0" w:color="C9C3E6"/>
+              <w:bottom w:val="single" w:sz="4" w:space="0" w:color="C9C3E6"/>
+              <w:right w:val="single" w:sz="4" w:space="0" w:color="C9C3E6"/>
+            </w:tcBorders>
+            <w:tcMar>
+              <w:top w:w="80" w:type="dxa"/>
+              <w:left w:w="110" w:type="dxa"/>
+              <w:bottom w:w="80" w:type="dxa"/>
+              <w:right w:w="110" w:type="dxa"/>
+            </w:tcMar>
+          </w:tcPr>
+          <w:p>
+            <w:pPr>
+              <w:spacing w:after="40"/>
+            </w:pPr>
+          </w:p>
+        </w:tc>
+        <w:tc>
+          <w:tcPr>
+            <w:tcW w:w="2791" w:type="dxa"/>
+            <w:tcBorders>
+              <w:top w:val="single" w:sz="4" w:space="0" w:color="C9C3E6"/>
+              <w:left w:val="single" w:sz="4" w:space="0" w:color="C9C3E6"/>
+              <w:bottom w:val="single" w:sz="4" w:space="0" w:color="C9C3E6"/>
+              <w:right w:val="single" w:sz="4" w:space="0" w:color="C9C3E6"/>
+            </w:tcBorders>
+            <w:tcMar>
+              <w:top w:w="80" w:type="dxa"/>
+              <w:left w:w="110" w:type="dxa"/>
+              <w:bottom w:w="80" w:type="dxa"/>
+              <w:right w:w="110" w:type="dxa"/>
+            </w:tcMar>
+          </w:tcPr>
+          <w:p>
+            <w:pPr>
+              <w:spacing w:after="40"/>
+            </w:pPr>
+          </w:p>
+        </w:tc>
+        <w:tc>
+          <w:tcPr>
+            <w:tcW w:w="1488" w:type="dxa"/>
+            <w:tcBorders>
+              <w:top w:val="single" w:sz="4" w:space="0" w:color="C9C3E6"/>
+              <w:left w:val="single" w:sz="4" w:space="0" w:color="C9C3E6"/>
+              <w:bottom w:val="single" w:sz="4" w:space="0" w:color="C9C3E6"/>
+              <w:right w:val="single" w:sz="4" w:space="0" w:color="C9C3E6"/>
+            </w:tcBorders>
+            <w:tcMar>
+              <w:top w:w="80" w:type="dxa"/>
+              <w:left w:w="110" w:type="dxa"/>
+              <w:bottom w:w="80" w:type="dxa"/>
+              <w:right w:w="110" w:type="dxa"/>
+            </w:tcMar>
+          </w:tcPr>
+          <w:p>
+            <w:pPr>
+              <w:spacing w:after="40"/>
+            </w:pPr>
+          </w:p>
+        </w:tc>
+        <w:tc>
+          <w:tcPr>
+            <w:tcW w:w="2609" w:type="dxa"/>
+            <w:tcBorders>
+              <w:top w:val="single" w:sz="4" w:space="0" w:color="C9C3E6"/>
+              <w:left w:val="single" w:sz="4" w:space="0" w:color="C9C3E6"/>
+              <w:bottom w:val="single" w:sz="4" w:space="0" w:color="C9C3E6"/>
+              <w:right w:val="single" w:sz="4" w:space="0" w:color="C9C3E6"/>
+            </w:tcBorders>
+            <w:tcMar>
+              <w:top w:w="80" w:type="dxa"/>
+              <w:left w:w="110" w:type="dxa"/>
+              <w:bottom w:w="80" w:type="dxa"/>
+              <w:right w:w="110" w:type="dxa"/>
+            </w:tcMar>
+          </w:tcPr>
+          <w:p>
+            <w:pPr>
+              <w:spacing w:after="40"/>
+            </w:pPr>
+          </w:p>
+        </w:tc>
+      </w:tr>
     </w:tbl>
     <w:p>
       <w:pPr>
         <w:pStyle w:val="Heading1"/>
       </w:pPr>
-      <w:bookmarkStart w:id="19" w:name="_Toc241371020"/>
+      <w:bookmarkStart w:id="19" w:name="_Toc241372034"/>
       <w:r>
         <w:t>6. Editing guide</w:t>
       </w:r>
@@ -7309,7 +7636,7 @@
           <w:left w:w="10" w:type="dxa"/>
           <w:right w:w="10" w:type="dxa"/>
         </w:tblCellMar>
-        <w:tblLook w:val="0000" w:firstRow="0" w:lastRow="0" w:firstColumn="0" w:lastColumn="0" w:noHBand="0" w:noVBand="0"/>
+        <w:tblLook w:val="04A0" w:firstRow="1" w:lastRow="0" w:firstColumn="1" w:lastColumn="0" w:noHBand="0" w:noVBand="1"/>
       </w:tblPr>
       <w:tblGrid>
         <w:gridCol w:w="2791"/>
@@ -8271,7 +8598,7 @@
       <w:pPr>
         <w:pStyle w:val="Heading1"/>
       </w:pPr>
-      <w:bookmarkStart w:id="20" w:name="_Toc241371021"/>
+      <w:bookmarkStart w:id="20" w:name="_Toc241372035"/>
       <w:r>
         <w:t>7. Change log</w:t>
       </w:r>
@@ -8300,7 +8627,7 @@
           <w:left w:w="10" w:type="dxa"/>
           <w:right w:w="10" w:type="dxa"/>
         </w:tblCellMar>
-        <w:tblLook w:val="0000" w:firstRow="0" w:lastRow="0" w:firstColumn="0" w:lastColumn="0" w:noHBand="0" w:noVBand="0"/>
+        <w:tblLook w:val="04A0" w:firstRow="1" w:lastRow="0" w:firstColumn="1" w:lastColumn="0" w:noHBand="0" w:noVBand="1"/>
       </w:tblPr>
       <w:tblGrid>
         <w:gridCol w:w="1209"/>
@@ -8486,7 +8813,19 @@
               <w:spacing w:after="40"/>
             </w:pPr>
             <w:r>
-              <w:t>Project put under version control and pushed to GitHub at github.com/ohemengemmanuel/Altura-hurtz (branch main). Added a README and a .gitignore. The development/font-preview folder and font-preview.html are kept out of the repository because the trial font licences are unconfirmed.</w:t>
+              <w:t xml:space="preserve">Added </w:t>
+            </w:r>
+            <w:r>
+              <w:rPr>
+                <w:rFonts w:ascii="Consolas" w:eastAsia="Consolas" w:hAnsi="Consolas" w:cs="Consolas"/>
+                <w:color w:val="4E11DC"/>
+                <w:sz w:val="19"/>
+                <w:szCs w:val="19"/>
+              </w:rPr>
+              <w:t>netlify.toml</w:t>
+            </w:r>
+            <w:r>
+              <w:t xml:space="preserve"> (publish folder, one year cache for fonts, one week for images, basic security headers) and deployed to Netlify at https://altura-hertz.netlify.app. The local folder is linked to the Netlify project.</w:t>
             </w:r>
           </w:p>
         </w:tc>
@@ -8569,10 +8908,7 @@
               <w:spacing w:after="40"/>
             </w:pPr>
             <w:r>
-              <w:t>Replaced the round Gain dial with a vertical, metallic fader like a mixing console channel: a brushed aluminium cap with bevelled edges and a grip line, a machined metal slot with a violet fill up to the cap, a dB scale (plus 3, 0, minus 6, minus 12) with 0 dB highlighted, all mounted on a small dark anodised metal plate so the scale stays readable over the meters. Same range and effect as before (minus 12 to plus 3 dB). Controls: drag the cap or click anywhere on the track to jump there, mouse wheel, arrow</w:t>
-            </w:r>
-            <w:r>
-              <w:t xml:space="preserve"> keys, Page Up and Page Down, Home and End, double-click to reset, and touch drag on phones. Tested in Chrome at 1366 and 390 px.</w:t>
+              <w:t>Project put under version control and pushed to GitHub at github.com/ohemengemmanuel/Altura-hurtz (branch main). Added a README and a .gitignore. The development/font-preview folder and font-preview.html are kept out of the repository because the trial font licences are unconfirmed.</w:t>
             </w:r>
           </w:p>
         </w:tc>
@@ -8605,7 +8941,7 @@
               <w:spacing w:after="40"/>
             </w:pPr>
             <w:r>
-              <w:t>1.7.0</w:t>
+              <w:t>1.7.1</w:t>
             </w:r>
           </w:p>
         </w:tc>
@@ -8655,10 +8991,10 @@
               <w:spacing w:after="40"/>
             </w:pPr>
             <w:r>
-              <w:t>Added a Gain dial to the Ready when you are card that sets the height of the meter bars, styled like a plugin knob with a violet value arc and a dB readout. Range minus 12 dB (bars reach about a quarter height) to plus 3 dB (bars clip into the red), starting at 0 dB. Controls: drag up, down or sideways, mouse wheel, arrow keys (0.5 dB), Page Up and Page Down (3 dB), Home and End, and double-click to reset. Works with touch on phones. Announced to screen readers as a slider with its dB value. The dial only c</w:t>
-            </w:r>
-            <w:r>
-              <w:t>hanges two values on the meter bank; the bars keep animating on the graphics card. Tested in Chrome at 1366 and 390 px with mouse drag, double-click and keyboard.</w:t>
+              <w:t>Replaced the round Gain dial with a vertical, metallic fader like a mixing console channel: a brushed aluminium cap with bevelled edges and a grip line, a machined metal slot with a violet fill up to the cap, a dB scale (plus 3, 0, minus 6, minus 12) with 0 dB highlighted, all mounted on a small dark anodised metal plate so the scale stays readable over the meters. Same range and effect as before (minus 12 to plus 3 dB). Controls: drag the cap or click anywhere on the track to jump there, mouse wheel, arrow</w:t>
+            </w:r>
+            <w:r>
+              <w:t xml:space="preserve"> keys, Page Up and Page Down, Home and End, double-click to reset, and touch drag on phones. Tested in Chrome at 1366 and 390 px.</w:t>
             </w:r>
           </w:p>
         </w:tc>
@@ -8691,7 +9027,7 @@
               <w:spacing w:after="40"/>
             </w:pPr>
             <w:r>
-              <w:t>1.6.2</w:t>
+              <w:t>1.7.0</w:t>
             </w:r>
           </w:p>
         </w:tc>
@@ -8741,7 +9077,10 @@
               <w:spacing w:after="40"/>
             </w:pPr>
             <w:r>
-              <w:t>Slowed the meter bank in the Ready when you are card by 25%. Each bar now loops over 3.3 to 4.8 seconds instead of 2.6 to 3.8, with start offsets scaled to match so the bars stay spread out and stereo pairs stay together.</w:t>
+              <w:t>Added a Gain dial to the Ready when you are card that sets the height of the meter bars, styled like a plugin knob with a violet value arc and a dB readout. Range minus 12 dB (bars reach about a quarter height) to plus 3 dB (bars clip into the red), starting at 0 dB. Controls: drag up, down or sideways, mouse wheel, arrow keys (0.5 dB), Page Up and Page Down (3 dB), Home and End, and double-click to reset. Works with touch on phones. Announced to screen readers as a slider with its dB value. The dial only c</w:t>
+            </w:r>
+            <w:r>
+              <w:t>hanges two values on the meter bank; the bars keep animating on the graphics card. Tested in Chrome at 1366 and 390 px with mouse drag, double-click and keyboard.</w:t>
             </w:r>
           </w:p>
         </w:tc>
@@ -8774,7 +9113,7 @@
               <w:spacing w:after="40"/>
             </w:pPr>
             <w:r>
-              <w:t>1.6.1</w:t>
+              <w:t>1.6.2</w:t>
             </w:r>
           </w:p>
         </w:tc>
@@ -8824,10 +9163,7 @@
               <w:spacing w:after="40"/>
             </w:pPr>
             <w:r>
-              <w:t>Replaced the analog VU meters with a digital meter bank in the style of DAW mixer meters: 14 stereo channel strips (28 bars) of LED segments lit ice blue at the bottom, violet in the middle and booth red at the top, with unlit segments faintly visible and a white peak-hold line on each bar. The bank is a background layer that fades into the card: towards the text on the left and down into the card at the bottom on desktop, and at both sides and the bottom on phones where it sits under the buttons. Performan</w:t>
-            </w:r>
-            <w:r>
-              <w:t>ce: segments and colours are static, only a dark cover over unlit segments and the peak line move (transform on the graphics card, no JavaScript per frame), six shared motion patterns are reused with different timing, left and right bars in a pair move together with a small offset, and the bank pauses when off screen. Tested in Chrome at 1366 and 390 px.</w:t>
+              <w:t>Slowed the meter bank in the Ready when you are card by 25%. Each bar now loops over 3.3 to 4.8 seconds instead of 2.6 to 3.8, with start offsets scaled to match so the bars stay spread out and stereo pairs stay together.</w:t>
             </w:r>
           </w:p>
         </w:tc>
@@ -8860,7 +9196,7 @@
               <w:spacing w:after="40"/>
             </w:pPr>
             <w:r>
-              <w:t>1.6.0</w:t>
+              <w:t>1.6.1</w:t>
             </w:r>
           </w:p>
         </w:tc>
@@ -8910,10 +9246,10 @@
               <w:spacing w:after="40"/>
             </w:pPr>
             <w:r>
-              <w:t>Added a pair of analog VU meters (L and R) to the Ready when you are card. Scale from minus 20 to plus 3 VU with the 0 to plus 3 red zone, glowing needles and a red peak light that flashes when a needle reaches the red. Needles follow fixed musical patterns of different lengths so the channels never move in sync. Performance: faces are drawn once as SVG, only the needles and peak lights animate (rotation and opacity, handled by the graphics card with no JavaScript per frame), the meters pause whenever the c</w:t>
-            </w:r>
-            <w:r>
-              <w:t>ard is off screen, and they stay still for visitors with reduced motion on. Tested in Chrome at 1366 and 390 px: running on screen, paused when scrolled away. On phones the meters sit under the buttons.</w:t>
+              <w:t>Replaced the analog VU meters with a digital meter bank in the style of DAW mixer meters: 14 stereo channel strips (28 bars) of LED segments lit ice blue at the bottom, violet in the middle and booth red at the top, with unlit segments faintly visible and a white peak-hold line on each bar. The bank is a background layer that fades into the card: towards the text on the left and down into the card at the bottom on desktop, and at both sides and the bottom on phones where it sits under the buttons. Performan</w:t>
+            </w:r>
+            <w:r>
+              <w:t>ce: segments and colours are static, only a dark cover over unlit segments and the peak line move (transform on the graphics card, no JavaScript per frame), six shared motion patterns are reused with different timing, left and right bars in a pair move together with a small offset, and the bank pauses when off screen. Tested in Chrome at 1366 and 390 px.</w:t>
             </w:r>
           </w:p>
         </w:tc>
@@ -8946,7 +9282,7 @@
               <w:spacing w:after="40"/>
             </w:pPr>
             <w:r>
-              <w:t>1.5.2</w:t>
+              <w:t>1.6.0</w:t>
             </w:r>
           </w:p>
         </w:tc>
@@ -8996,7 +9332,10 @@
               <w:spacing w:after="40"/>
             </w:pPr>
             <w:r>
-              <w:t>On phones and tablets (up to 860 px wide) the studio section heading, The studio / A room built around your voice, now sits on the bottom of the studio photo over a dark fade instead of below it. The description and gear list follow under the photo. Desktop layout is unchanged. The photo and text now fade in together as one block so the heading never shows without its photo.</w:t>
+              <w:t>Added a pair of analog VU meters (L and R) to the Ready when you are card. Scale from minus 20 to plus 3 VU with the 0 to plus 3 red zone, glowing needles and a red peak light that flashes when a needle reaches the red. Needles follow fixed musical patterns of different lengths so the channels never move in sync. Performance: faces are drawn once as SVG, only the needles and peak lights animate (rotation and opacity, handled by the graphics card with no JavaScript per frame), the meters pause whenever the c</w:t>
+            </w:r>
+            <w:r>
+              <w:t>ard is off screen, and they stay still for visitors with reduced motion on. Tested in Chrome at 1366 and 390 px: running on screen, paused when scrolled away. On phones the meters sit under the buttons.</w:t>
             </w:r>
           </w:p>
         </w:tc>
@@ -9029,7 +9368,7 @@
               <w:spacing w:after="40"/>
             </w:pPr>
             <w:r>
-              <w:t>1.5.1</w:t>
+              <w:t>1.5.2</w:t>
             </w:r>
           </w:p>
         </w:tc>
@@ -9079,7 +9418,7 @@
               <w:spacing w:after="40"/>
             </w:pPr>
             <w:r>
-              <w:t>Phone menu button: removed its round border and background in both the closed and open states, so only the equalizer bars (and the X when open) show. The bar bounce and the open and close morph now run 25% slower.</w:t>
+              <w:t>On phones and tablets (up to 860 px wide) the studio section heading, The studio / A room built around your voice, now sits on the bottom of the studio photo over a dark fade instead of below it. The description and gear list follow under the photo. Desktop layout is unchanged. The photo and text now fade in together as one block so the heading never shows without its photo.</w:t>
             </w:r>
           </w:p>
         </w:tc>
@@ -9112,7 +9451,7 @@
               <w:spacing w:after="40"/>
             </w:pPr>
             <w:r>
-              <w:t>1.5.0</w:t>
+              <w:t>1.5.1</w:t>
             </w:r>
           </w:p>
         </w:tc>
@@ -9162,10 +9501,7 @@
               <w:spacing w:after="40"/>
             </w:pPr>
             <w:r>
-              <w:t xml:space="preserve">Added mild animations. Scroll reveal: section headings, service cards, steps, policies, contact details, forms and summaries fade up 14 px as they come into view, with a short stagger inside grids. Only elements that start below the screen are animated, so nothing visible flickers on page load. Home hero: text rises in and the photo settles from a slight zoom, on the first home visit of a browsing session only. Hover: cards lift and their photos zoom slightly, card arrows nudge forward, buttons lift with a </w:t>
-            </w:r>
-            <w:r>
-              <w:t>violet glow, social icons lift. Booking: the estimated total pulses when it changes and the booking summary eases in. Tested in Chrome in real time on four pages: nothing on screen was hidden at load and every element was visible after scrolling.</w:t>
+              <w:t>Phone menu button: removed its round border and background in both the closed and open states, so only the equalizer bars (and the X when open) show. The bar bounce and the open and close morph now run 25% slower.</w:t>
             </w:r>
           </w:p>
         </w:tc>
@@ -9198,7 +9534,7 @@
               <w:spacing w:after="40"/>
             </w:pPr>
             <w:r>
-              <w:t>1.4.2</w:t>
+              <w:t>1.5.0</w:t>
             </w:r>
           </w:p>
         </w:tc>
@@ -9248,7 +9584,10 @@
               <w:spacing w:after="40"/>
             </w:pPr>
             <w:r>
-              <w:t>On phones and small tablets (up to 820 px wide) the round icon to the left of the Altura Hertz wordmark in the header is hidden, leaving the wordmark and the equalizer menu button. Desktop and the footer keep the icon.</w:t>
+              <w:t xml:space="preserve">Added mild animations. Scroll reveal: section headings, service cards, steps, policies, contact details, forms and summaries fade up 14 px as they come into view, with a short stagger inside grids. Only elements that start below the screen are animated, so nothing visible flickers on page load. Home hero: text rises in and the photo settles from a slight zoom, on the first home visit of a browsing session only. Hover: cards lift and their photos zoom slightly, card arrows nudge forward, buttons lift with a </w:t>
+            </w:r>
+            <w:r>
+              <w:t>violet glow, social icons lift. Booking: the estimated total pulses when it changes and the booking summary eases in. Tested in Chrome in real time on four pages: nothing on screen was hidden at load and every element was visible after scrolling.</w:t>
             </w:r>
           </w:p>
         </w:tc>
@@ -9281,7 +9620,7 @@
               <w:spacing w:after="40"/>
             </w:pPr>
             <w:r>
-              <w:t>1.4.1</w:t>
+              <w:t>1.4.2</w:t>
             </w:r>
           </w:p>
         </w:tc>
@@ -9331,7 +9670,7 @@
               <w:spacing w:after="40"/>
             </w:pPr>
             <w:r>
-              <w:t>Halved the space above and below the Choose your session section. Measured before and after: phone 390 x 740 went from 92 to 49 px above and 156 to 78 px below; laptop 1366 x 657 from 67 to 34 px and 177 to 88 px; desktop 1920 x 960 from 163 to 84 px and 273 to 137 px. The section no longer stretches to fill the screen. All five cards still fit on screen when jumping to the section.</w:t>
+              <w:t>On phones and small tablets (up to 820 px wide) the round icon to the left of the Altura Hertz wordmark in the header is hidden, leaving the wordmark and the equalizer menu button. Desktop and the footer keep the icon.</w:t>
             </w:r>
           </w:p>
         </w:tc>
@@ -9364,7 +9703,7 @@
               <w:spacing w:after="40"/>
             </w:pPr>
             <w:r>
-              <w:t>1.4.0</w:t>
+              <w:t>1.4.1</w:t>
             </w:r>
           </w:p>
         </w:tc>
@@ -9414,7 +9753,7 @@
               <w:spacing w:after="40"/>
             </w:pPr>
             <w:r>
-              <w:t>Redesigned the phone menu button as an animated equalizer. Closed, four gradient bars bounce like a level meter. Open, the outer bars drop out, the middle two cross into an X and the button glows violet. The menu now slides down with a staggered reveal of each link, the Book a session button fills the full width, and the menu closes with Escape or a tap outside it.</w:t>
+              <w:t>Halved the space above and below the Choose your session section. Measured before and after: phone 390 x 740 went from 92 to 49 px above and 156 to 78 px below; laptop 1366 x 657 from 67 to 34 px and 177 to 88 px; desktop 1920 x 960 from 163 to 84 px and 273 to 137 px. The section no longer stretches to fill the screen. All five cards still fit on screen when jumping to the section.</w:t>
             </w:r>
           </w:p>
         </w:tc>
@@ -9447,7 +9786,7 @@
               <w:spacing w:after="40"/>
             </w:pPr>
             <w:r>
-              <w:t>1.3.2</w:t>
+              <w:t>1.4.0</w:t>
             </w:r>
           </w:p>
         </w:tc>
@@ -9497,7 +9836,7 @@
               <w:spacing w:after="40"/>
             </w:pPr>
             <w:r>
-              <w:t>Removed the All prices in Ghana cedis note from the footer. Removed the divider lines between sections: under the header, under the hero and page headings, above the footer and above the copyright line.</w:t>
+              <w:t>Redesigned the phone menu button as an animated equalizer. Closed, four gradient bars bounce like a level meter. Open, the outer bars drop out, the middle two cross into an X and the button glows violet. The menu now slides down with a staggered reveal of each link, the Book a session button fills the full width, and the menu closes with Escape or a tap outside it.</w:t>
             </w:r>
           </w:p>
         </w:tc>
@@ -9530,7 +9869,7 @@
               <w:spacing w:after="40"/>
             </w:pPr>
             <w:r>
-              <w:t>1.3.1</w:t>
+              <w:t>1.3.2</w:t>
             </w:r>
           </w:p>
         </w:tc>
@@ -9580,19 +9919,7 @@
               <w:spacing w:after="40"/>
             </w:pPr>
             <w:r>
-              <w:t xml:space="preserve">All six social icons now always show in the footer. Icons whose link is not set yet in </w:t>
-            </w:r>
-            <w:r>
-              <w:rPr>
-                <w:rFonts w:ascii="Consolas" w:eastAsia="Consolas" w:hAnsi="Consolas" w:cs="Consolas"/>
-                <w:color w:val="4E11DC"/>
-                <w:sz w:val="19"/>
-                <w:szCs w:val="19"/>
-              </w:rPr>
-              <w:t>config.js</w:t>
-            </w:r>
-            <w:r>
-              <w:t xml:space="preserve"> stay visible but do nothing when clicked, and show a coming soon tooltip.</w:t>
+              <w:t>Removed the All prices in Ghana cedis note from the footer. Removed the divider lines between sections: under the header, under the hero and page headings, above the footer and above the copyright line.</w:t>
             </w:r>
           </w:p>
         </w:tc>
@@ -9625,7 +9952,7 @@
               <w:spacing w:after="40"/>
             </w:pPr>
             <w:r>
-              <w:t>1.3.0</w:t>
+              <w:t>1.3.1</w:t>
             </w:r>
           </w:p>
         </w:tc>
@@ -9675,7 +10002,7 @@
               <w:spacing w:after="40"/>
             </w:pPr>
             <w:r>
-              <w:t xml:space="preserve">Added a row of social media icons to the footer, modelled on </w:t>
+              <w:t xml:space="preserve">All six social icons now always show in the footer. Icons whose link is not set yet in </w:t>
             </w:r>
             <w:r>
               <w:rPr>
@@ -9684,22 +10011,10 @@
                 <w:sz w:val="19"/>
                 <w:szCs w:val="19"/>
               </w:rPr>
-              <w:t>design/inspo/socials footer.png</w:t>
-            </w:r>
-            <w:r>
-              <w:t xml:space="preserve">: Facebook, Instagram, Threads, YouTube, TikTok and WhatsApp. Icons are white, turn violet on hover, and each only appears once its link is set in </w:t>
-            </w:r>
-            <w:r>
-              <w:rPr>
-                <w:rFonts w:ascii="Consolas" w:eastAsia="Consolas" w:hAnsi="Consolas" w:cs="Consolas"/>
-                <w:color w:val="4E11DC"/>
-                <w:sz w:val="19"/>
-                <w:szCs w:val="19"/>
-              </w:rPr>
               <w:t>config.js</w:t>
             </w:r>
             <w:r>
-              <w:t>. The text links for WhatsApp, Instagram, TikTok and YouTube were removed from the Studio column since the icons replace them.</w:t>
+              <w:t xml:space="preserve"> stay visible but do nothing when clicked, and show a coming soon tooltip.</w:t>
             </w:r>
           </w:p>
         </w:tc>
@@ -9732,7 +10047,7 @@
               <w:spacing w:after="40"/>
             </w:pPr>
             <w:r>
-              <w:t>1.2.1</w:t>
+              <w:t>1.3.0</w:t>
             </w:r>
           </w:p>
         </w:tc>
@@ -9782,7 +10097,31 @@
               <w:spacing w:after="40"/>
             </w:pPr>
             <w:r>
-              <w:t>Removed the Services column from the footer on every page. The footer now shows the studio name and description on the left and the Studio links on the right.</w:t>
+              <w:t xml:space="preserve">Added a row of social media icons to the footer, modelled on </w:t>
+            </w:r>
+            <w:r>
+              <w:rPr>
+                <w:rFonts w:ascii="Consolas" w:eastAsia="Consolas" w:hAnsi="Consolas" w:cs="Consolas"/>
+                <w:color w:val="4E11DC"/>
+                <w:sz w:val="19"/>
+                <w:szCs w:val="19"/>
+              </w:rPr>
+              <w:t>design/inspo/socials footer.png</w:t>
+            </w:r>
+            <w:r>
+              <w:t xml:space="preserve">: Facebook, Instagram, Threads, YouTube, TikTok and WhatsApp. Icons are white, turn violet on hover, and each only appears once its link is set in </w:t>
+            </w:r>
+            <w:r>
+              <w:rPr>
+                <w:rFonts w:ascii="Consolas" w:eastAsia="Consolas" w:hAnsi="Consolas" w:cs="Consolas"/>
+                <w:color w:val="4E11DC"/>
+                <w:sz w:val="19"/>
+                <w:szCs w:val="19"/>
+              </w:rPr>
+              <w:t>config.js</w:t>
+            </w:r>
+            <w:r>
+              <w:t>. The text links for WhatsApp, Instagram, TikTok and YouTube were removed from the Studio column since the icons replace them.</w:t>
             </w:r>
           </w:p>
         </w:tc>
@@ -9815,7 +10154,7 @@
               <w:spacing w:after="40"/>
             </w:pPr>
             <w:r>
-              <w:t>1.2.0</w:t>
+              <w:t>1.2.1</w:t>
             </w:r>
           </w:p>
         </w:tc>
@@ -9865,7 +10204,7 @@
               <w:spacing w:after="40"/>
             </w:pPr>
             <w:r>
-              <w:t>Landing page photo re-exported from the full size original (4032 x 3024) at 1280, 1920, 2560 and 3840 pixels wide with higher quality and light sharpening. The page now loads the size that suits each screen and requests it early, so it is sharp on high resolution laptops and phones. Replaces the single 1920 pixel file.</w:t>
+              <w:t>Removed the Services column from the footer on every page. The footer now shows the studio name and description on the left and the Studio links on the right.</w:t>
             </w:r>
           </w:p>
         </w:tc>
@@ -9898,7 +10237,7 @@
               <w:spacing w:after="40"/>
             </w:pPr>
             <w:r>
-              <w:t>1.1.0</w:t>
+              <w:t>1.2.0</w:t>
             </w:r>
           </w:p>
         </w:tc>
@@ -9948,7 +10287,7 @@
               <w:spacing w:after="40"/>
             </w:pPr>
             <w:r>
-              <w:t>Fixed the flicker when moving between pages: fonts and icons are now bundled with the site and preloaded, the dark background is set before styles load, icons keep a fixed size while loading, and pages fade into each other with the header held still.</w:t>
+              <w:t>Landing page photo re-exported from the full size original (4032 x 3024) at 1280, 1920, 2560 and 3840 pixels wide with higher quality and light sharpening. The page now loads the size that suits each screen and requests it early, so it is sharp on high resolution laptops and phones. Replaces the single 1920 pixel file.</w:t>
             </w:r>
           </w:p>
         </w:tc>
@@ -10031,7 +10370,7 @@
               <w:spacing w:after="40"/>
             </w:pPr>
             <w:r>
-              <w:t>Book a session no longer animates a scroll while the next page is loading. Smooth scrolling now only applies to links within the same page, and the phone menu closes after a tap.</w:t>
+              <w:t>Fixed the flicker when moving between pages: fonts and icons are now bundled with the site and preloaded, the dark background is set before styles load, icons keep a fixed size while loading, and pages fade into each other with the header held still.</w:t>
             </w:r>
           </w:p>
         </w:tc>
@@ -10114,7 +10453,7 @@
               <w:spacing w:after="40"/>
             </w:pPr>
             <w:r>
-              <w:t>Services moved directly under the hero and resized so all five fit in one screen height: one row of five cards on computers (checked at 1366 x 657 and 1920 x 960) and compact rows on tablets and phones (checked at 360 x 640, 390 x 740 and 768 x 900).</w:t>
+              <w:t>Book a session no longer animates a scroll while the next page is loading. Smooth scrolling now only applies to links within the same page, and the phone menu closes after a tap.</w:t>
             </w:r>
           </w:p>
         </w:tc>
@@ -10147,7 +10486,7 @@
               <w:spacing w:after="40"/>
             </w:pPr>
             <w:r>
-              <w:t>1.0.0</w:t>
+              <w:t>1.1.0</w:t>
             </w:r>
           </w:p>
         </w:tc>
@@ -10197,7 +10536,7 @@
               <w:spacing w:after="40"/>
             </w:pPr>
             <w:r>
-              <w:t>Initial website build: seven pages, shared stylesheet, settings file, booking and pricing script, beat catalogue script.</w:t>
+              <w:t>Services moved directly under the hero and resized so all five fit in one screen height: one row of five cards on computers (checked at 1366 x 657 and 1920 x 960) and compact rows on tablets and phones (checked at 360 x 640, 390 x 740 and 768 x 900).</w:t>
             </w:r>
           </w:p>
         </w:tc>
@@ -10280,7 +10619,7 @@
               <w:spacing w:after="40"/>
             </w:pPr>
             <w:r>
-              <w:t>Booking forms for recording + mixing and mastering, recording only and mixing and mastering, with live pricing, discount tables, one title field per track, file or link uploads, payment choice and policy agreement.</w:t>
+              <w:t>Initial website build: seven pages, shared stylesheet, settings file, booking and pricing script, beat catalogue script.</w:t>
             </w:r>
           </w:p>
         </w:tc>
@@ -10363,7 +10702,7 @@
               <w:spacing w:after="40"/>
             </w:pPr>
             <w:r>
-              <w:t>Request forms for custom beats and cover art, and a message form on the Contact page.</w:t>
+              <w:t>Booking forms for recording + mixing and mastering, recording only and mixing and mastering, with live pricing, discount tables, one title field per track, file or link uploads, payment choice and policy agreement.</w:t>
             </w:r>
           </w:p>
         </w:tc>
@@ -10446,7 +10785,7 @@
               <w:spacing w:after="40"/>
             </w:pPr>
             <w:r>
-              <w:t>Booking summary with reference number, sent by WhatsApp or email until a form service is connected.</w:t>
+              <w:t>Request forms for custom beats and cover art, and a message form on the Contact page.</w:t>
             </w:r>
           </w:p>
         </w:tc>
@@ -10529,7 +10868,7 @@
               <w:spacing w:after="40"/>
             </w:pPr>
             <w:r>
-              <w:t>Studio photos converted to WebP. Total image weight reduced from about 13 MB to 540 KB.</w:t>
+              <w:t>Booking summary with reference number, sent by WhatsApp or email until a form service is connected.</w:t>
             </w:r>
           </w:p>
         </w:tc>
@@ -10612,7 +10951,7 @@
               <w:spacing w:after="40"/>
             </w:pPr>
             <w:r>
-              <w:t>Project organised into design, development and documentation folders.</w:t>
+              <w:t>Studio photos converted to WebP. Total image weight reduced from about 13 MB to 540 KB.</w:t>
             </w:r>
           </w:p>
         </w:tc>
@@ -10645,6 +10984,89 @@
               <w:spacing w:after="40"/>
             </w:pPr>
             <w:r>
+              <w:t>1.0.0</w:t>
+            </w:r>
+          </w:p>
+        </w:tc>
+        <w:tc>
+          <w:tcPr>
+            <w:tcW w:w="1582" w:type="dxa"/>
+            <w:tcBorders>
+              <w:top w:val="single" w:sz="4" w:space="0" w:color="C9C3E6"/>
+              <w:left w:val="single" w:sz="4" w:space="0" w:color="C9C3E6"/>
+              <w:bottom w:val="single" w:sz="4" w:space="0" w:color="C9C3E6"/>
+              <w:right w:val="single" w:sz="4" w:space="0" w:color="C9C3E6"/>
+            </w:tcBorders>
+            <w:tcMar>
+              <w:top w:w="80" w:type="dxa"/>
+              <w:left w:w="110" w:type="dxa"/>
+              <w:bottom w:w="80" w:type="dxa"/>
+              <w:right w:w="110" w:type="dxa"/>
+            </w:tcMar>
+          </w:tcPr>
+          <w:p>
+            <w:pPr>
+              <w:spacing w:after="40"/>
+            </w:pPr>
+            <w:r>
+              <w:t>27 Sep 2026</w:t>
+            </w:r>
+          </w:p>
+        </w:tc>
+        <w:tc>
+          <w:tcPr>
+            <w:tcW w:w="6515" w:type="dxa"/>
+            <w:tcBorders>
+              <w:top w:val="single" w:sz="4" w:space="0" w:color="C9C3E6"/>
+              <w:left w:val="single" w:sz="4" w:space="0" w:color="C9C3E6"/>
+              <w:bottom w:val="single" w:sz="4" w:space="0" w:color="C9C3E6"/>
+              <w:right w:val="single" w:sz="4" w:space="0" w:color="C9C3E6"/>
+            </w:tcBorders>
+            <w:tcMar>
+              <w:top w:w="80" w:type="dxa"/>
+              <w:left w:w="110" w:type="dxa"/>
+              <w:bottom w:w="80" w:type="dxa"/>
+              <w:right w:w="110" w:type="dxa"/>
+            </w:tcMar>
+          </w:tcPr>
+          <w:p>
+            <w:pPr>
+              <w:spacing w:after="40"/>
+            </w:pPr>
+            <w:r>
+              <w:t>Project organised into design, development and documentation folders.</w:t>
+            </w:r>
+          </w:p>
+        </w:tc>
+      </w:tr>
+      <w:tr>
+        <w:tblPrEx>
+          <w:tblCellMar>
+            <w:top w:w="0" w:type="dxa"/>
+            <w:bottom w:w="0" w:type="dxa"/>
+          </w:tblCellMar>
+        </w:tblPrEx>
+        <w:tc>
+          <w:tcPr>
+            <w:tcW w:w="1209" w:type="dxa"/>
+            <w:tcBorders>
+              <w:top w:val="single" w:sz="4" w:space="0" w:color="C9C3E6"/>
+              <w:left w:val="single" w:sz="4" w:space="0" w:color="C9C3E6"/>
+              <w:bottom w:val="single" w:sz="4" w:space="0" w:color="C9C3E6"/>
+              <w:right w:val="single" w:sz="4" w:space="0" w:color="C9C3E6"/>
+            </w:tcBorders>
+            <w:tcMar>
+              <w:top w:w="80" w:type="dxa"/>
+              <w:left w:w="110" w:type="dxa"/>
+              <w:bottom w:w="80" w:type="dxa"/>
+              <w:right w:w="110" w:type="dxa"/>
+            </w:tcMar>
+          </w:tcPr>
+          <w:p>
+            <w:pPr>
+              <w:spacing w:after="40"/>
+            </w:pPr>
+            <w:r>
               <w:t>0.1.0</w:t>
             </w:r>
           </w:p>
@@ -10705,7 +11127,7 @@
       <w:pPr>
         <w:pStyle w:val="Heading2"/>
       </w:pPr>
-      <w:bookmarkStart w:id="21" w:name="_Toc241371022"/>
+      <w:bookmarkStart w:id="21" w:name="_Toc241372036"/>
       <w:r>
         <w:t>Decisions made during the build</w:t>
       </w:r>
@@ -10855,7 +11277,7 @@
       <w:pPr>
         <w:pStyle w:val="Heading1"/>
       </w:pPr>
-      <w:bookmarkStart w:id="22" w:name="_Toc241371023"/>
+      <w:bookmarkStart w:id="22" w:name="_Toc241372037"/>
       <w:r>
         <w:t>8. Future improvements</w:t>
       </w:r>
@@ -11037,10 +11459,10 @@
 <file path=word/numbering.xml><?xml version="1.0" encoding="utf-8"?>
 <w:numbering xmlns:wpc="http://schemas.microsoft.com/office/word/2010/wordprocessingCanvas" xmlns:cx="http://schemas.microsoft.com/office/drawing/2014/chartex" xmlns:cx1="http://schemas.microsoft.com/office/drawing/2015/9/8/chartex" xmlns:cx2="http://schemas.microsoft.com/office/drawing/2015/10/21/chartex" xmlns:cx3="http://schemas.microsoft.com/office/drawing/2016/5/9/chartex" xmlns:cx4="http://schemas.microsoft.com/office/drawing/2016/5/10/chartex" xmlns:cx5="http://schemas.microsoft.com/office/drawing/2016/5/11/chartex" xmlns:cx6="http://schemas.microsoft.com/office/drawing/2016/5/12/chartex" xmlns:cx7="http://schemas.microsoft.com/office/drawing/2016/5/13/chartex" xmlns:cx8="http://schemas.microsoft.com/office/drawing/2016/5/14/chartex" xmlns:mc="http://schemas.openxmlformats.org/markup-compatibility/2006" xmlns:aink="http://schemas.microsoft.com/office/drawing/2016/ink" xmlns:am3d="http://schemas.microsoft.com/office/drawing/2017/model3d" xmlns:o="urn:schemas-microsoft-com:office:office" xmlns:oel="http://schemas.microsoft.com/office/2019/extlst" xmlns:r="http://schemas.openxmlformats.org/officeDocument/2006/relationships" xmlns:m="http://schemas.openxmlformats.org/officeDocument/2006/math" xmlns:v="urn:schemas-microsoft-com:vml" xmlns:wp14="http://schemas.microsoft.com/office/word/2010/wordprocessingDrawing" xmlns:wp="http://schemas.openxmlformats.org/drawingml/2006/wordprocessingDrawing" xmlns:w10="urn:schemas-microsoft-com:office:word" xmlns:w="http://schemas.openxmlformats.org/wordprocessingml/2006/main" xmlns:w14="http://schemas.microsoft.com/office/word/2010/wordml" xmlns:w15="http://schemas.microsoft.com/office/word/2012/wordml" xmlns:w16cex="http://schemas.microsoft.com/office/word/2018/wordml/cex" xmlns:w16cid="http://schemas.microsoft.com/office/word/2016/wordml/cid" xmlns:w16="http://schemas.microsoft.com/office/word/2018/wordml" xmlns:w16du="http://schemas.microsoft.com/office/word/2023/wordml/word16du" xmlns:w16sdtdh="http://schemas.microsoft.com/office/word/2020/wordml/sdtdatahash" xmlns:w16sdtfl="http://schemas.microsoft.com/office/word/2024/wordml/sdtformatlock" xmlns:w16se="http://schemas.microsoft.com/office/word/2015/wordml/symex" xmlns:wpg="http://schemas.microsoft.com/office/word/2010/wordprocessingGroup" xmlns:wpi="http://schemas.microsoft.com/office/word/2010/wordprocessingInk" xmlns:wne="http://schemas.microsoft.com/office/word/2006/wordml" xmlns:wps="http://schemas.microsoft.com/office/word/2010/wordprocessingShape" mc:Ignorable="w14 w15 w16se w16cid w16 w16cex w16sdtdh w16sdtfl w16du wp14">
   <w:abstractNum w:abstractNumId="0" w15:restartNumberingAfterBreak="0">
-    <w:nsid w:val="28AB6E65"/>
+    <w:nsid w:val="02FB01C0"/>
     <w:multiLevelType w:val="hybridMultilevel"/>
-    <w:tmpl w:val="C8EA34C2"/>
-    <w:lvl w:ilvl="0" w:tplc="724A0742">
+    <w:tmpl w:val="B766460C"/>
+    <w:lvl w:ilvl="0" w:tplc="A84050D4">
       <w:start w:val="1"/>
       <w:numFmt w:val="decimal"/>
       <w:lvlText w:val="%1."/>
@@ -11049,52 +11471,52 @@
         <w:ind w:left="540" w:hanging="340"/>
       </w:pPr>
     </w:lvl>
-    <w:lvl w:ilvl="1" w:tplc="D5162A84">
+    <w:lvl w:ilvl="1" w:tplc="3B44F64E">
       <w:numFmt w:val="decimal"/>
       <w:lvlText w:val=""/>
       <w:lvlJc w:val="left"/>
     </w:lvl>
-    <w:lvl w:ilvl="2" w:tplc="5DF85A58">
+    <w:lvl w:ilvl="2" w:tplc="B37C1CE4">
       <w:numFmt w:val="decimal"/>
       <w:lvlText w:val=""/>
       <w:lvlJc w:val="left"/>
     </w:lvl>
-    <w:lvl w:ilvl="3" w:tplc="68529A0C">
+    <w:lvl w:ilvl="3" w:tplc="A0D8067A">
       <w:numFmt w:val="decimal"/>
       <w:lvlText w:val=""/>
       <w:lvlJc w:val="left"/>
     </w:lvl>
-    <w:lvl w:ilvl="4" w:tplc="64E88930">
+    <w:lvl w:ilvl="4" w:tplc="C5FCD3BE">
       <w:numFmt w:val="decimal"/>
       <w:lvlText w:val=""/>
       <w:lvlJc w:val="left"/>
     </w:lvl>
-    <w:lvl w:ilvl="5" w:tplc="72B023F2">
+    <w:lvl w:ilvl="5" w:tplc="C08402E2">
       <w:numFmt w:val="decimal"/>
       <w:lvlText w:val=""/>
       <w:lvlJc w:val="left"/>
     </w:lvl>
-    <w:lvl w:ilvl="6" w:tplc="681C52B8">
+    <w:lvl w:ilvl="6" w:tplc="04B2696C">
       <w:numFmt w:val="decimal"/>
       <w:lvlText w:val=""/>
       <w:lvlJc w:val="left"/>
     </w:lvl>
-    <w:lvl w:ilvl="7" w:tplc="B8D6872E">
+    <w:lvl w:ilvl="7" w:tplc="F3E06CF8">
       <w:numFmt w:val="decimal"/>
       <w:lvlText w:val=""/>
       <w:lvlJc w:val="left"/>
     </w:lvl>
-    <w:lvl w:ilvl="8" w:tplc="8C4CB468">
+    <w:lvl w:ilvl="8" w:tplc="E8106E70">
       <w:numFmt w:val="decimal"/>
       <w:lvlText w:val=""/>
       <w:lvlJc w:val="left"/>
     </w:lvl>
   </w:abstractNum>
   <w:abstractNum w:abstractNumId="1" w15:restartNumberingAfterBreak="0">
-    <w:nsid w:val="2F022C07"/>
+    <w:nsid w:val="0EE64172"/>
     <w:multiLevelType w:val="hybridMultilevel"/>
-    <w:tmpl w:val="695AFDCA"/>
-    <w:lvl w:ilvl="0" w:tplc="DFA8B8BC">
+    <w:tmpl w:val="D1A6656C"/>
+    <w:lvl w:ilvl="0" w:tplc="491ABDF8">
       <w:start w:val="1"/>
       <w:numFmt w:val="decimal"/>
       <w:lvlText w:val="%1."/>
@@ -11103,106 +11525,52 @@
         <w:ind w:left="540" w:hanging="340"/>
       </w:pPr>
     </w:lvl>
-    <w:lvl w:ilvl="1" w:tplc="8DD24A32">
+    <w:lvl w:ilvl="1" w:tplc="6D90C3D0">
       <w:numFmt w:val="decimal"/>
       <w:lvlText w:val=""/>
       <w:lvlJc w:val="left"/>
     </w:lvl>
-    <w:lvl w:ilvl="2" w:tplc="F3408624">
+    <w:lvl w:ilvl="2" w:tplc="954ACBCC">
       <w:numFmt w:val="decimal"/>
       <w:lvlText w:val=""/>
       <w:lvlJc w:val="left"/>
     </w:lvl>
-    <w:lvl w:ilvl="3" w:tplc="966AED30">
+    <w:lvl w:ilvl="3" w:tplc="F882545C">
       <w:numFmt w:val="decimal"/>
       <w:lvlText w:val=""/>
       <w:lvlJc w:val="left"/>
     </w:lvl>
-    <w:lvl w:ilvl="4" w:tplc="CB5E8408">
+    <w:lvl w:ilvl="4" w:tplc="E196B548">
       <w:numFmt w:val="decimal"/>
       <w:lvlText w:val=""/>
       <w:lvlJc w:val="left"/>
     </w:lvl>
-    <w:lvl w:ilvl="5" w:tplc="883042E8">
+    <w:lvl w:ilvl="5" w:tplc="FC0E6F68">
       <w:numFmt w:val="decimal"/>
       <w:lvlText w:val=""/>
       <w:lvlJc w:val="left"/>
     </w:lvl>
-    <w:lvl w:ilvl="6" w:tplc="33049DFA">
+    <w:lvl w:ilvl="6" w:tplc="66D4324C">
       <w:numFmt w:val="decimal"/>
       <w:lvlText w:val=""/>
       <w:lvlJc w:val="left"/>
     </w:lvl>
-    <w:lvl w:ilvl="7" w:tplc="F55684C0">
+    <w:lvl w:ilvl="7" w:tplc="10168F58">
       <w:numFmt w:val="decimal"/>
       <w:lvlText w:val=""/>
       <w:lvlJc w:val="left"/>
     </w:lvl>
-    <w:lvl w:ilvl="8" w:tplc="4B289A36">
+    <w:lvl w:ilvl="8" w:tplc="8B4C699E">
       <w:numFmt w:val="decimal"/>
       <w:lvlText w:val=""/>
       <w:lvlJc w:val="left"/>
     </w:lvl>
   </w:abstractNum>
   <w:abstractNum w:abstractNumId="2" w15:restartNumberingAfterBreak="0">
-    <w:nsid w:val="33783D45"/>
+    <w:nsid w:val="22C46ECE"/>
     <w:multiLevelType w:val="hybridMultilevel"/>
-    <w:tmpl w:val="76201104"/>
-    <w:lvl w:ilvl="0" w:tplc="27DA1C5C">
-      <w:start w:val="1"/>
-      <w:numFmt w:val="bullet"/>
-      <w:lvlText w:val="•"/>
-      <w:lvlJc w:val="left"/>
-      <w:pPr>
-        <w:ind w:left="540" w:hanging="300"/>
-      </w:pPr>
-    </w:lvl>
-    <w:lvl w:ilvl="1" w:tplc="67C6ABDA">
-      <w:numFmt w:val="decimal"/>
-      <w:lvlText w:val=""/>
-      <w:lvlJc w:val="left"/>
-    </w:lvl>
-    <w:lvl w:ilvl="2" w:tplc="68285C3E">
-      <w:numFmt w:val="decimal"/>
-      <w:lvlText w:val=""/>
-      <w:lvlJc w:val="left"/>
-    </w:lvl>
-    <w:lvl w:ilvl="3" w:tplc="1924FD54">
-      <w:numFmt w:val="decimal"/>
-      <w:lvlText w:val=""/>
-      <w:lvlJc w:val="left"/>
-    </w:lvl>
-    <w:lvl w:ilvl="4" w:tplc="217ABD38">
-      <w:numFmt w:val="decimal"/>
-      <w:lvlText w:val=""/>
-      <w:lvlJc w:val="left"/>
-    </w:lvl>
-    <w:lvl w:ilvl="5" w:tplc="935A6530">
-      <w:numFmt w:val="decimal"/>
-      <w:lvlText w:val=""/>
-      <w:lvlJc w:val="left"/>
-    </w:lvl>
-    <w:lvl w:ilvl="6" w:tplc="43A223A0">
-      <w:numFmt w:val="decimal"/>
-      <w:lvlText w:val=""/>
-      <w:lvlJc w:val="left"/>
-    </w:lvl>
-    <w:lvl w:ilvl="7" w:tplc="3C063562">
-      <w:numFmt w:val="decimal"/>
-      <w:lvlText w:val=""/>
-      <w:lvlJc w:val="left"/>
-    </w:lvl>
-    <w:lvl w:ilvl="8" w:tplc="50EA827C">
-      <w:numFmt w:val="decimal"/>
-      <w:lvlText w:val=""/>
-      <w:lvlJc w:val="left"/>
-    </w:lvl>
-  </w:abstractNum>
-  <w:abstractNum w:abstractNumId="3" w15:restartNumberingAfterBreak="0">
-    <w:nsid w:val="3A5347E0"/>
-    <w:multiLevelType w:val="hybridMultilevel"/>
-    <w:tmpl w:val="22F67A56"/>
-    <w:lvl w:ilvl="0" w:tplc="BCA0E17E">
+    <w:tmpl w:val="69EC1234"/>
+    <w:lvl w:ilvl="0" w:tplc="C0DC738E">
       <w:start w:val="1"/>
       <w:numFmt w:val="decimal"/>
       <w:lvlText w:val="%1."/>
@@ -11211,52 +11579,52 @@
         <w:ind w:left="540" w:hanging="340"/>
       </w:pPr>
     </w:lvl>
-    <w:lvl w:ilvl="1" w:tplc="1E1A30AC">
+    <w:lvl w:ilvl="1" w:tplc="6AC20786">
       <w:numFmt w:val="decimal"/>
       <w:lvlText w:val=""/>
       <w:lvlJc w:val="left"/>
     </w:lvl>
-    <w:lvl w:ilvl="2" w:tplc="8D209506">
+    <w:lvl w:ilvl="2" w:tplc="165ABDE6">
       <w:numFmt w:val="decimal"/>
       <w:lvlText w:val=""/>
       <w:lvlJc w:val="left"/>
     </w:lvl>
-    <w:lvl w:ilvl="3" w:tplc="85162EAA">
+    <w:lvl w:ilvl="3" w:tplc="AA68FFC6">
       <w:numFmt w:val="decimal"/>
       <w:lvlText w:val=""/>
       <w:lvlJc w:val="left"/>
     </w:lvl>
-    <w:lvl w:ilvl="4" w:tplc="A39C0DA6">
+    <w:lvl w:ilvl="4" w:tplc="E5605AA4">
       <w:numFmt w:val="decimal"/>
       <w:lvlText w:val=""/>
       <w:lvlJc w:val="left"/>
     </w:lvl>
-    <w:lvl w:ilvl="5" w:tplc="F85C9A3A">
+    <w:lvl w:ilvl="5" w:tplc="C9264274">
       <w:numFmt w:val="decimal"/>
       <w:lvlText w:val=""/>
       <w:lvlJc w:val="left"/>
     </w:lvl>
-    <w:lvl w:ilvl="6" w:tplc="430C991C">
+    <w:lvl w:ilvl="6" w:tplc="C962522A">
       <w:numFmt w:val="decimal"/>
       <w:lvlText w:val=""/>
       <w:lvlJc w:val="left"/>
     </w:lvl>
-    <w:lvl w:ilvl="7" w:tplc="6FC4335E">
+    <w:lvl w:ilvl="7" w:tplc="950A217C">
       <w:numFmt w:val="decimal"/>
       <w:lvlText w:val=""/>
       <w:lvlJc w:val="left"/>
     </w:lvl>
-    <w:lvl w:ilvl="8" w:tplc="E3943B56">
+    <w:lvl w:ilvl="8" w:tplc="F3D4AFF8">
       <w:numFmt w:val="decimal"/>
       <w:lvlText w:val=""/>
       <w:lvlJc w:val="left"/>
     </w:lvl>
   </w:abstractNum>
-  <w:abstractNum w:abstractNumId="4" w15:restartNumberingAfterBreak="0">
-    <w:nsid w:val="3C315D2F"/>
+  <w:abstractNum w:abstractNumId="3" w15:restartNumberingAfterBreak="0">
+    <w:nsid w:val="27452B0C"/>
     <w:multiLevelType w:val="hybridMultilevel"/>
-    <w:tmpl w:val="2EDE495A"/>
-    <w:lvl w:ilvl="0" w:tplc="5F34DF70">
+    <w:tmpl w:val="6824B284"/>
+    <w:lvl w:ilvl="0" w:tplc="01BA84F0">
       <w:start w:val="1"/>
       <w:numFmt w:val="decimal"/>
       <w:lvlText w:val="%1."/>
@@ -11265,106 +11633,52 @@
         <w:ind w:left="540" w:hanging="340"/>
       </w:pPr>
     </w:lvl>
-    <w:lvl w:ilvl="1" w:tplc="6C1016F8">
+    <w:lvl w:ilvl="1" w:tplc="92A44B6C">
       <w:numFmt w:val="decimal"/>
       <w:lvlText w:val=""/>
       <w:lvlJc w:val="left"/>
     </w:lvl>
-    <w:lvl w:ilvl="2" w:tplc="A966508C">
+    <w:lvl w:ilvl="2" w:tplc="CA884058">
       <w:numFmt w:val="decimal"/>
       <w:lvlText w:val=""/>
       <w:lvlJc w:val="left"/>
     </w:lvl>
-    <w:lvl w:ilvl="3" w:tplc="5D3C5E28">
+    <w:lvl w:ilvl="3" w:tplc="DFDA2E36">
       <w:numFmt w:val="decimal"/>
       <w:lvlText w:val=""/>
       <w:lvlJc w:val="left"/>
     </w:lvl>
-    <w:lvl w:ilvl="4" w:tplc="7B120836">
+    <w:lvl w:ilvl="4" w:tplc="1FA08D96">
       <w:numFmt w:val="decimal"/>
       <w:lvlText w:val=""/>
       <w:lvlJc w:val="left"/>
     </w:lvl>
-    <w:lvl w:ilvl="5" w:tplc="78B0539E">
+    <w:lvl w:ilvl="5" w:tplc="4A9A7C64">
       <w:numFmt w:val="decimal"/>
       <w:lvlText w:val=""/>
       <w:lvlJc w:val="left"/>
     </w:lvl>
-    <w:lvl w:ilvl="6" w:tplc="2A00BA96">
+    <w:lvl w:ilvl="6" w:tplc="A7A60CFA">
       <w:numFmt w:val="decimal"/>
       <w:lvlText w:val=""/>
       <w:lvlJc w:val="left"/>
     </w:lvl>
-    <w:lvl w:ilvl="7" w:tplc="B7E44F4E">
+    <w:lvl w:ilvl="7" w:tplc="18E09880">
       <w:numFmt w:val="decimal"/>
       <w:lvlText w:val=""/>
       <w:lvlJc w:val="left"/>
     </w:lvl>
-    <w:lvl w:ilvl="8" w:tplc="FD10EE3A">
+    <w:lvl w:ilvl="8" w:tplc="01AC7486">
       <w:numFmt w:val="decimal"/>
       <w:lvlText w:val=""/>
       <w:lvlJc w:val="left"/>
     </w:lvl>
   </w:abstractNum>
-  <w:abstractNum w:abstractNumId="5" w15:restartNumberingAfterBreak="0">
-    <w:nsid w:val="48DF54CA"/>
+  <w:abstractNum w:abstractNumId="4" w15:restartNumberingAfterBreak="0">
+    <w:nsid w:val="4F594149"/>
     <w:multiLevelType w:val="hybridMultilevel"/>
-    <w:tmpl w:val="1256E20E"/>
-    <w:lvl w:ilvl="0" w:tplc="D7D0FDE8">
-      <w:start w:val="1"/>
-      <w:numFmt w:val="decimal"/>
-      <w:lvlText w:val="%1."/>
-      <w:lvlJc w:val="left"/>
-      <w:pPr>
-        <w:ind w:left="540" w:hanging="340"/>
-      </w:pPr>
-    </w:lvl>
-    <w:lvl w:ilvl="1" w:tplc="723A9E98">
-      <w:numFmt w:val="decimal"/>
-      <w:lvlText w:val=""/>
-      <w:lvlJc w:val="left"/>
-    </w:lvl>
-    <w:lvl w:ilvl="2" w:tplc="B1CEAD66">
-      <w:numFmt w:val="decimal"/>
-      <w:lvlText w:val=""/>
-      <w:lvlJc w:val="left"/>
-    </w:lvl>
-    <w:lvl w:ilvl="3" w:tplc="A05EC09A">
-      <w:numFmt w:val="decimal"/>
-      <w:lvlText w:val=""/>
-      <w:lvlJc w:val="left"/>
-    </w:lvl>
-    <w:lvl w:ilvl="4" w:tplc="7A7A0AE6">
-      <w:numFmt w:val="decimal"/>
-      <w:lvlText w:val=""/>
-      <w:lvlJc w:val="left"/>
-    </w:lvl>
-    <w:lvl w:ilvl="5" w:tplc="6C544D1C">
-      <w:numFmt w:val="decimal"/>
-      <w:lvlText w:val=""/>
-      <w:lvlJc w:val="left"/>
-    </w:lvl>
-    <w:lvl w:ilvl="6" w:tplc="C48E179A">
-      <w:numFmt w:val="decimal"/>
-      <w:lvlText w:val=""/>
-      <w:lvlJc w:val="left"/>
-    </w:lvl>
-    <w:lvl w:ilvl="7" w:tplc="DE54CFD8">
-      <w:numFmt w:val="decimal"/>
-      <w:lvlText w:val=""/>
-      <w:lvlJc w:val="left"/>
-    </w:lvl>
-    <w:lvl w:ilvl="8" w:tplc="459CDF70">
-      <w:numFmt w:val="decimal"/>
-      <w:lvlText w:val=""/>
-      <w:lvlJc w:val="left"/>
-    </w:lvl>
-  </w:abstractNum>
-  <w:abstractNum w:abstractNumId="6" w15:restartNumberingAfterBreak="0">
-    <w:nsid w:val="497D7FAB"/>
-    <w:multiLevelType w:val="hybridMultilevel"/>
-    <w:tmpl w:val="13226FF0"/>
-    <w:lvl w:ilvl="0" w:tplc="E8AC8E84">
+    <w:tmpl w:val="C2D4D334"/>
+    <w:lvl w:ilvl="0" w:tplc="F7BECC7C">
       <w:start w:val="1"/>
       <w:numFmt w:val="bullet"/>
       <w:lvlText w:val="●"/>
@@ -11373,7 +11687,7 @@
         <w:ind w:left="720" w:hanging="360"/>
       </w:pPr>
     </w:lvl>
-    <w:lvl w:ilvl="1" w:tplc="E4B44CC4">
+    <w:lvl w:ilvl="1" w:tplc="42702AE6">
       <w:start w:val="1"/>
       <w:numFmt w:val="bullet"/>
       <w:lvlText w:val="○"/>
@@ -11382,7 +11696,7 @@
         <w:ind w:left="1440" w:hanging="360"/>
       </w:pPr>
     </w:lvl>
-    <w:lvl w:ilvl="2" w:tplc="925658A8">
+    <w:lvl w:ilvl="2" w:tplc="27AEBCB2">
       <w:start w:val="1"/>
       <w:numFmt w:val="bullet"/>
       <w:lvlText w:val="■"/>
@@ -11391,7 +11705,7 @@
         <w:ind w:left="2160" w:hanging="360"/>
       </w:pPr>
     </w:lvl>
-    <w:lvl w:ilvl="3" w:tplc="ABD0B8BA">
+    <w:lvl w:ilvl="3" w:tplc="84D8E4FE">
       <w:start w:val="1"/>
       <w:numFmt w:val="bullet"/>
       <w:lvlText w:val="●"/>
@@ -11400,7 +11714,7 @@
         <w:ind w:left="2880" w:hanging="360"/>
       </w:pPr>
     </w:lvl>
-    <w:lvl w:ilvl="4" w:tplc="4D6A3F00">
+    <w:lvl w:ilvl="4" w:tplc="8EC6CC04">
       <w:start w:val="1"/>
       <w:numFmt w:val="bullet"/>
       <w:lvlText w:val="○"/>
@@ -11409,7 +11723,7 @@
         <w:ind w:left="3600" w:hanging="360"/>
       </w:pPr>
     </w:lvl>
-    <w:lvl w:ilvl="5" w:tplc="40EE3846">
+    <w:lvl w:ilvl="5" w:tplc="2E4462CE">
       <w:start w:val="1"/>
       <w:numFmt w:val="bullet"/>
       <w:lvlText w:val="■"/>
@@ -11418,7 +11732,7 @@
         <w:ind w:left="4320" w:hanging="360"/>
       </w:pPr>
     </w:lvl>
-    <w:lvl w:ilvl="6" w:tplc="41A4836E">
+    <w:lvl w:ilvl="6" w:tplc="DFF69098">
       <w:start w:val="1"/>
       <w:numFmt w:val="bullet"/>
       <w:lvlText w:val="●"/>
@@ -11427,7 +11741,7 @@
         <w:ind w:left="5040" w:hanging="360"/>
       </w:pPr>
     </w:lvl>
-    <w:lvl w:ilvl="7" w:tplc="A6D82CA2">
+    <w:lvl w:ilvl="7" w:tplc="900EF3CE">
       <w:start w:val="1"/>
       <w:numFmt w:val="bullet"/>
       <w:lvlText w:val="●"/>
@@ -11436,7 +11750,7 @@
         <w:ind w:left="5760" w:hanging="360"/>
       </w:pPr>
     </w:lvl>
-    <w:lvl w:ilvl="8" w:tplc="93B89F30">
+    <w:lvl w:ilvl="8" w:tplc="CF907A92">
       <w:start w:val="1"/>
       <w:numFmt w:val="bullet"/>
       <w:lvlText w:val="●"/>
@@ -11446,11 +11760,11 @@
       </w:pPr>
     </w:lvl>
   </w:abstractNum>
-  <w:abstractNum w:abstractNumId="7" w15:restartNumberingAfterBreak="0">
-    <w:nsid w:val="52A8367D"/>
+  <w:abstractNum w:abstractNumId="5" w15:restartNumberingAfterBreak="0">
+    <w:nsid w:val="560E22C2"/>
     <w:multiLevelType w:val="hybridMultilevel"/>
-    <w:tmpl w:val="1218651E"/>
-    <w:lvl w:ilvl="0" w:tplc="9CEA4C2A">
+    <w:tmpl w:val="536E37E2"/>
+    <w:lvl w:ilvl="0" w:tplc="27A8DD58">
       <w:start w:val="1"/>
       <w:numFmt w:val="decimal"/>
       <w:lvlText w:val="%1."/>
@@ -11459,52 +11773,52 @@
         <w:ind w:left="540" w:hanging="340"/>
       </w:pPr>
     </w:lvl>
-    <w:lvl w:ilvl="1" w:tplc="541653A8">
+    <w:lvl w:ilvl="1" w:tplc="F9246CA0">
       <w:numFmt w:val="decimal"/>
       <w:lvlText w:val=""/>
       <w:lvlJc w:val="left"/>
     </w:lvl>
-    <w:lvl w:ilvl="2" w:tplc="E208CC30">
+    <w:lvl w:ilvl="2" w:tplc="9BEEA956">
       <w:numFmt w:val="decimal"/>
       <w:lvlText w:val=""/>
       <w:lvlJc w:val="left"/>
     </w:lvl>
-    <w:lvl w:ilvl="3" w:tplc="F056BDC2">
+    <w:lvl w:ilvl="3" w:tplc="DA186738">
       <w:numFmt w:val="decimal"/>
       <w:lvlText w:val=""/>
       <w:lvlJc w:val="left"/>
     </w:lvl>
-    <w:lvl w:ilvl="4" w:tplc="40D80652">
+    <w:lvl w:ilvl="4" w:tplc="6310BA2C">
       <w:numFmt w:val="decimal"/>
       <w:lvlText w:val=""/>
       <w:lvlJc w:val="left"/>
     </w:lvl>
-    <w:lvl w:ilvl="5" w:tplc="D7B6F01E">
+    <w:lvl w:ilvl="5" w:tplc="DCF43D02">
       <w:numFmt w:val="decimal"/>
       <w:lvlText w:val=""/>
       <w:lvlJc w:val="left"/>
     </w:lvl>
-    <w:lvl w:ilvl="6" w:tplc="3A289812">
+    <w:lvl w:ilvl="6" w:tplc="0588A63E">
       <w:numFmt w:val="decimal"/>
       <w:lvlText w:val=""/>
       <w:lvlJc w:val="left"/>
     </w:lvl>
-    <w:lvl w:ilvl="7" w:tplc="8E8289C6">
+    <w:lvl w:ilvl="7" w:tplc="35DE102A">
       <w:numFmt w:val="decimal"/>
       <w:lvlText w:val=""/>
       <w:lvlJc w:val="left"/>
     </w:lvl>
-    <w:lvl w:ilvl="8" w:tplc="D2D4A7E0">
+    <w:lvl w:ilvl="8" w:tplc="79AEA410">
       <w:numFmt w:val="decimal"/>
       <w:lvlText w:val=""/>
       <w:lvlJc w:val="left"/>
     </w:lvl>
   </w:abstractNum>
-  <w:abstractNum w:abstractNumId="8" w15:restartNumberingAfterBreak="0">
-    <w:nsid w:val="5E0A68DB"/>
+  <w:abstractNum w:abstractNumId="6" w15:restartNumberingAfterBreak="0">
+    <w:nsid w:val="677D04E5"/>
     <w:multiLevelType w:val="hybridMultilevel"/>
-    <w:tmpl w:val="ACDE4006"/>
-    <w:lvl w:ilvl="0" w:tplc="B8089C34">
+    <w:tmpl w:val="C87826F8"/>
+    <w:lvl w:ilvl="0" w:tplc="4D705506">
       <w:start w:val="1"/>
       <w:numFmt w:val="decimal"/>
       <w:lvlText w:val="%1."/>
@@ -11513,91 +11827,199 @@
         <w:ind w:left="540" w:hanging="340"/>
       </w:pPr>
     </w:lvl>
-    <w:lvl w:ilvl="1" w:tplc="EDFEB450">
+    <w:lvl w:ilvl="1" w:tplc="246CA5C4">
       <w:numFmt w:val="decimal"/>
       <w:lvlText w:val=""/>
       <w:lvlJc w:val="left"/>
     </w:lvl>
-    <w:lvl w:ilvl="2" w:tplc="0DC6A85E">
+    <w:lvl w:ilvl="2" w:tplc="EFECBD40">
       <w:numFmt w:val="decimal"/>
       <w:lvlText w:val=""/>
       <w:lvlJc w:val="left"/>
     </w:lvl>
-    <w:lvl w:ilvl="3" w:tplc="A11C30D2">
+    <w:lvl w:ilvl="3" w:tplc="F7DA297C">
       <w:numFmt w:val="decimal"/>
       <w:lvlText w:val=""/>
       <w:lvlJc w:val="left"/>
     </w:lvl>
-    <w:lvl w:ilvl="4" w:tplc="70968808">
+    <w:lvl w:ilvl="4" w:tplc="F07669AE">
       <w:numFmt w:val="decimal"/>
       <w:lvlText w:val=""/>
       <w:lvlJc w:val="left"/>
     </w:lvl>
-    <w:lvl w:ilvl="5" w:tplc="0CC409CA">
+    <w:lvl w:ilvl="5" w:tplc="D318C2D8">
       <w:numFmt w:val="decimal"/>
       <w:lvlText w:val=""/>
       <w:lvlJc w:val="left"/>
     </w:lvl>
-    <w:lvl w:ilvl="6" w:tplc="075CA738">
+    <w:lvl w:ilvl="6" w:tplc="5E64C054">
       <w:numFmt w:val="decimal"/>
       <w:lvlText w:val=""/>
       <w:lvlJc w:val="left"/>
     </w:lvl>
-    <w:lvl w:ilvl="7" w:tplc="B7941F46">
+    <w:lvl w:ilvl="7" w:tplc="DBBC7388">
       <w:numFmt w:val="decimal"/>
       <w:lvlText w:val=""/>
       <w:lvlJc w:val="left"/>
     </w:lvl>
-    <w:lvl w:ilvl="8" w:tplc="247040CC">
+    <w:lvl w:ilvl="8" w:tplc="873A5EFC">
       <w:numFmt w:val="decimal"/>
       <w:lvlText w:val=""/>
       <w:lvlJc w:val="left"/>
     </w:lvl>
   </w:abstractNum>
-  <w:num w:numId="1" w16cid:durableId="1257329184">
+  <w:abstractNum w:abstractNumId="7" w15:restartNumberingAfterBreak="0">
+    <w:nsid w:val="6B184216"/>
+    <w:multiLevelType w:val="hybridMultilevel"/>
+    <w:tmpl w:val="FD2C37C4"/>
+    <w:lvl w:ilvl="0" w:tplc="B7DAA778">
+      <w:start w:val="1"/>
+      <w:numFmt w:val="decimal"/>
+      <w:lvlText w:val="%1."/>
+      <w:lvlJc w:val="left"/>
+      <w:pPr>
+        <w:ind w:left="540" w:hanging="340"/>
+      </w:pPr>
+    </w:lvl>
+    <w:lvl w:ilvl="1" w:tplc="244E4ED2">
+      <w:numFmt w:val="decimal"/>
+      <w:lvlText w:val=""/>
+      <w:lvlJc w:val="left"/>
+    </w:lvl>
+    <w:lvl w:ilvl="2" w:tplc="5074E5B6">
+      <w:numFmt w:val="decimal"/>
+      <w:lvlText w:val=""/>
+      <w:lvlJc w:val="left"/>
+    </w:lvl>
+    <w:lvl w:ilvl="3" w:tplc="1BAA883A">
+      <w:numFmt w:val="decimal"/>
+      <w:lvlText w:val=""/>
+      <w:lvlJc w:val="left"/>
+    </w:lvl>
+    <w:lvl w:ilvl="4" w:tplc="AF92E1D2">
+      <w:numFmt w:val="decimal"/>
+      <w:lvlText w:val=""/>
+      <w:lvlJc w:val="left"/>
+    </w:lvl>
+    <w:lvl w:ilvl="5" w:tplc="EC32C08E">
+      <w:numFmt w:val="decimal"/>
+      <w:lvlText w:val=""/>
+      <w:lvlJc w:val="left"/>
+    </w:lvl>
+    <w:lvl w:ilvl="6" w:tplc="ACBAE316">
+      <w:numFmt w:val="decimal"/>
+      <w:lvlText w:val=""/>
+      <w:lvlJc w:val="left"/>
+    </w:lvl>
+    <w:lvl w:ilvl="7" w:tplc="7C44CE14">
+      <w:numFmt w:val="decimal"/>
+      <w:lvlText w:val=""/>
+      <w:lvlJc w:val="left"/>
+    </w:lvl>
+    <w:lvl w:ilvl="8" w:tplc="72D02A36">
+      <w:numFmt w:val="decimal"/>
+      <w:lvlText w:val=""/>
+      <w:lvlJc w:val="left"/>
+    </w:lvl>
+  </w:abstractNum>
+  <w:abstractNum w:abstractNumId="8" w15:restartNumberingAfterBreak="0">
+    <w:nsid w:val="6D7B43A6"/>
+    <w:multiLevelType w:val="hybridMultilevel"/>
+    <w:tmpl w:val="F2509A46"/>
+    <w:lvl w:ilvl="0" w:tplc="F13E5638">
+      <w:start w:val="1"/>
+      <w:numFmt w:val="bullet"/>
+      <w:lvlText w:val="•"/>
+      <w:lvlJc w:val="left"/>
+      <w:pPr>
+        <w:ind w:left="540" w:hanging="300"/>
+      </w:pPr>
+    </w:lvl>
+    <w:lvl w:ilvl="1" w:tplc="F3FE0D82">
+      <w:numFmt w:val="decimal"/>
+      <w:lvlText w:val=""/>
+      <w:lvlJc w:val="left"/>
+    </w:lvl>
+    <w:lvl w:ilvl="2" w:tplc="86C82D3E">
+      <w:numFmt w:val="decimal"/>
+      <w:lvlText w:val=""/>
+      <w:lvlJc w:val="left"/>
+    </w:lvl>
+    <w:lvl w:ilvl="3" w:tplc="116CCE16">
+      <w:numFmt w:val="decimal"/>
+      <w:lvlText w:val=""/>
+      <w:lvlJc w:val="left"/>
+    </w:lvl>
+    <w:lvl w:ilvl="4" w:tplc="A1C0BF54">
+      <w:numFmt w:val="decimal"/>
+      <w:lvlText w:val=""/>
+      <w:lvlJc w:val="left"/>
+    </w:lvl>
+    <w:lvl w:ilvl="5" w:tplc="7054CF56">
+      <w:numFmt w:val="decimal"/>
+      <w:lvlText w:val=""/>
+      <w:lvlJc w:val="left"/>
+    </w:lvl>
+    <w:lvl w:ilvl="6" w:tplc="C5C46CBA">
+      <w:numFmt w:val="decimal"/>
+      <w:lvlText w:val=""/>
+      <w:lvlJc w:val="left"/>
+    </w:lvl>
+    <w:lvl w:ilvl="7" w:tplc="806C36FC">
+      <w:numFmt w:val="decimal"/>
+      <w:lvlText w:val=""/>
+      <w:lvlJc w:val="left"/>
+    </w:lvl>
+    <w:lvl w:ilvl="8" w:tplc="F168D2FA">
+      <w:numFmt w:val="decimal"/>
+      <w:lvlText w:val=""/>
+      <w:lvlJc w:val="left"/>
+    </w:lvl>
+  </w:abstractNum>
+  <w:num w:numId="1" w16cid:durableId="1494377256">
+    <w:abstractNumId w:val="4"/>
+    <w:lvlOverride w:ilvl="0">
+      <w:startOverride w:val="1"/>
+    </w:lvlOverride>
+  </w:num>
+  <w:num w:numId="2" w16cid:durableId="421992038">
+    <w:abstractNumId w:val="8"/>
+    <w:lvlOverride w:ilvl="0">
+      <w:startOverride w:val="1"/>
+    </w:lvlOverride>
+  </w:num>
+  <w:num w:numId="3" w16cid:durableId="1338381238">
+    <w:abstractNumId w:val="0"/>
+    <w:lvlOverride w:ilvl="0">
+      <w:startOverride w:val="1"/>
+    </w:lvlOverride>
+  </w:num>
+  <w:num w:numId="4" w16cid:durableId="1277298730">
     <w:abstractNumId w:val="6"/>
     <w:lvlOverride w:ilvl="0">
       <w:startOverride w:val="1"/>
     </w:lvlOverride>
   </w:num>
-  <w:num w:numId="2" w16cid:durableId="1603680095">
+  <w:num w:numId="5" w16cid:durableId="646251789">
+    <w:abstractNumId w:val="5"/>
+    <w:lvlOverride w:ilvl="0">
+      <w:startOverride w:val="1"/>
+    </w:lvlOverride>
+  </w:num>
+  <w:num w:numId="6" w16cid:durableId="478349004">
     <w:abstractNumId w:val="2"/>
     <w:lvlOverride w:ilvl="0">
       <w:startOverride w:val="1"/>
     </w:lvlOverride>
   </w:num>
-  <w:num w:numId="3" w16cid:durableId="288903819">
-    <w:abstractNumId w:val="5"/>
+  <w:num w:numId="7" w16cid:durableId="1374234844">
+    <w:abstractNumId w:val="3"/>
     <w:lvlOverride w:ilvl="0">
       <w:startOverride w:val="1"/>
     </w:lvlOverride>
   </w:num>
-  <w:num w:numId="4" w16cid:durableId="1628273559">
-    <w:abstractNumId w:val="7"/>
-    <w:lvlOverride w:ilvl="0">
-      <w:startOverride w:val="1"/>
-    </w:lvlOverride>
-  </w:num>
-  <w:num w:numId="5" w16cid:durableId="1550221137">
-    <w:abstractNumId w:val="4"/>
-    <w:lvlOverride w:ilvl="0">
-      <w:startOverride w:val="1"/>
-    </w:lvlOverride>
-  </w:num>
-  <w:num w:numId="6" w16cid:durableId="139614753">
+  <w:num w:numId="8" w16cid:durableId="1117020766">
     <w:abstractNumId w:val="1"/>
-    <w:lvlOverride w:ilvl="0">
-      <w:startOverride w:val="1"/>
-    </w:lvlOverride>
-  </w:num>
-  <w:num w:numId="7" w16cid:durableId="434666752">
-    <w:abstractNumId w:val="0"/>
-    <w:lvlOverride w:ilvl="0">
-      <w:startOverride w:val="1"/>
-    </w:lvlOverride>
-  </w:num>
-  <w:num w:numId="8" w16cid:durableId="467403779">
-    <w:abstractNumId w:val="3"/>
     <w:lvlOverride w:ilvl="0">
       <w:startOverride w:val="1"/>
     </w:lvlOverride>
@@ -12218,7 +12640,7 @@
     <w:autoRedefine/>
     <w:uiPriority w:val="39"/>
     <w:unhideWhenUsed/>
-    <w:rsid w:val="000E790A"/>
+    <w:rsid w:val="00092874"/>
     <w:pPr>
       <w:spacing w:after="100"/>
     </w:pPr>
@@ -12230,7 +12652,7 @@
     <w:autoRedefine/>
     <w:uiPriority w:val="39"/>
     <w:unhideWhenUsed/>
-    <w:rsid w:val="000E790A"/>
+    <w:rsid w:val="00092874"/>
     <w:pPr>
       <w:spacing w:after="100"/>
       <w:ind w:left="210"/>

</xml_diff>

<commit_message>
Website v1.13.2: Inter headings, split nav, meters and layout polish
- All headings in Inter (bundled); logo keeps Syne
- Desktop nav transparent over the hero, split into two rounded pills after scrolling
- White meter bank blended into the home hero
- Single note pattern in the hero Book a session button
- Smaller buttons, smaller card prices, card links aligned to the bottom, card icons without circles
- More spacious layout, 1.7x space below Choose your session
- Deployment and change log updated

Co-Authored-By: Claude Opus 5.5 <noreply@anthropic.com>
</commit_message>
<xml_diff>
--- a/documentation/Deployment and Change Log.docx
+++ b/documentation/Deployment and Change Log.docx
@@ -63,7 +63,7 @@
           <w:left w:w="10" w:type="dxa"/>
           <w:right w:w="10" w:type="dxa"/>
         </w:tblCellMar>
-        <w:tblLook w:val="04A0" w:firstRow="1" w:lastRow="0" w:firstColumn="1" w:lastColumn="0" w:noHBand="0" w:noVBand="1"/>
+        <w:tblLook w:val="0000" w:firstRow="0" w:lastRow="0" w:firstColumn="0" w:lastColumn="0" w:noHBand="0" w:noVBand="0"/>
       </w:tblPr>
       <w:tblGrid>
         <w:gridCol w:w="2791"/>
@@ -193,7 +193,7 @@
               <w:spacing w:after="40"/>
             </w:pPr>
             <w:r>
-              <w:t>2.0</w:t>
+              <w:t>2.4</w:t>
             </w:r>
           </w:p>
         </w:tc>
@@ -251,7 +251,7 @@
               <w:spacing w:after="40"/>
             </w:pPr>
             <w:r>
-              <w:t>1.7.1</w:t>
+              <w:t>1.13.2</w:t>
             </w:r>
           </w:p>
         </w:tc>
@@ -635,7 +635,7 @@
               <w:spacing w:after="40"/>
             </w:pPr>
             <w:r>
-              <w:t>27 September 2026 (live on Netlify)</w:t>
+              <w:t>27 September 2026 (1.13.2 deployed)</w:t>
             </w:r>
           </w:p>
         </w:tc>
@@ -663,7 +663,7 @@
     <w:sdt>
       <w:sdtPr>
         <w:alias w:val="Contents"/>
-        <w:id w:val="-912934640"/>
+        <w:id w:val="-1078508726"/>
       </w:sdtPr>
       <w:sdtEndPr/>
       <w:sdtContent>
@@ -692,7 +692,7 @@
           <w:r>
             <w:fldChar w:fldCharType="separate"/>
           </w:r>
-          <w:hyperlink w:anchor="_Toc241372015" w:history="1">
+          <w:hyperlink w:anchor="_Toc241375882" w:history="1">
             <w:r>
               <w:rPr>
                 <w:rStyle w:val="Hyperlink"/>
@@ -716,7 +716,7 @@
               <w:rPr>
                 <w:noProof/>
               </w:rPr>
-              <w:instrText xml:space="preserve"> PAGEREF _Toc241372015 \h </w:instrText>
+              <w:instrText xml:space="preserve"> PAGEREF _Toc241375882 \h </w:instrText>
             </w:r>
             <w:r>
               <w:rPr>
@@ -759,7 +759,7 @@
               <w14:ligatures w14:val="standardContextual"/>
             </w:rPr>
           </w:pPr>
-          <w:hyperlink w:anchor="_Toc241372016" w:history="1">
+          <w:hyperlink w:anchor="_Toc241375883" w:history="1">
             <w:r>
               <w:rPr>
                 <w:rStyle w:val="Hyperlink"/>
@@ -783,7 +783,7 @@
               <w:rPr>
                 <w:noProof/>
               </w:rPr>
-              <w:instrText xml:space="preserve"> PAGEREF _Toc241372016 \h </w:instrText>
+              <w:instrText xml:space="preserve"> PAGEREF _Toc241375883 \h </w:instrText>
             </w:r>
             <w:r>
               <w:rPr>
@@ -826,7 +826,7 @@
               <w14:ligatures w14:val="standardContextual"/>
             </w:rPr>
           </w:pPr>
-          <w:hyperlink w:anchor="_Toc241372017" w:history="1">
+          <w:hyperlink w:anchor="_Toc241375884" w:history="1">
             <w:r>
               <w:rPr>
                 <w:rStyle w:val="Hyperlink"/>
@@ -850,7 +850,7 @@
               <w:rPr>
                 <w:noProof/>
               </w:rPr>
-              <w:instrText xml:space="preserve"> PAGEREF _Toc241372017 \h </w:instrText>
+              <w:instrText xml:space="preserve"> PAGEREF _Toc241375884 \h </w:instrText>
             </w:r>
             <w:r>
               <w:rPr>
@@ -893,7 +893,7 @@
               <w14:ligatures w14:val="standardContextual"/>
             </w:rPr>
           </w:pPr>
-          <w:hyperlink w:anchor="_Toc241372018" w:history="1">
+          <w:hyperlink w:anchor="_Toc241375885" w:history="1">
             <w:r>
               <w:rPr>
                 <w:rStyle w:val="Hyperlink"/>
@@ -917,7 +917,7 @@
               <w:rPr>
                 <w:noProof/>
               </w:rPr>
-              <w:instrText xml:space="preserve"> PAGEREF _Toc241372018 \h </w:instrText>
+              <w:instrText xml:space="preserve"> PAGEREF _Toc241375885 \h </w:instrText>
             </w:r>
             <w:r>
               <w:rPr>
@@ -960,7 +960,7 @@
               <w14:ligatures w14:val="standardContextual"/>
             </w:rPr>
           </w:pPr>
-          <w:hyperlink w:anchor="_Toc241372019" w:history="1">
+          <w:hyperlink w:anchor="_Toc241375886" w:history="1">
             <w:r>
               <w:rPr>
                 <w:rStyle w:val="Hyperlink"/>
@@ -984,7 +984,7 @@
               <w:rPr>
                 <w:noProof/>
               </w:rPr>
-              <w:instrText xml:space="preserve"> PAGEREF _Toc241372019 \h </w:instrText>
+              <w:instrText xml:space="preserve"> PAGEREF _Toc241375886 \h </w:instrText>
             </w:r>
             <w:r>
               <w:rPr>
@@ -1027,7 +1027,7 @@
               <w14:ligatures w14:val="standardContextual"/>
             </w:rPr>
           </w:pPr>
-          <w:hyperlink w:anchor="_Toc241372020" w:history="1">
+          <w:hyperlink w:anchor="_Toc241375887" w:history="1">
             <w:r>
               <w:rPr>
                 <w:rStyle w:val="Hyperlink"/>
@@ -1051,7 +1051,7 @@
               <w:rPr>
                 <w:noProof/>
               </w:rPr>
-              <w:instrText xml:space="preserve"> PAGEREF _Toc241372020 \h </w:instrText>
+              <w:instrText xml:space="preserve"> PAGEREF _Toc241375887 \h </w:instrText>
             </w:r>
             <w:r>
               <w:rPr>
@@ -1094,7 +1094,7 @@
               <w14:ligatures w14:val="standardContextual"/>
             </w:rPr>
           </w:pPr>
-          <w:hyperlink w:anchor="_Toc241372021" w:history="1">
+          <w:hyperlink w:anchor="_Toc241375888" w:history="1">
             <w:r>
               <w:rPr>
                 <w:rStyle w:val="Hyperlink"/>
@@ -1118,7 +1118,7 @@
               <w:rPr>
                 <w:noProof/>
               </w:rPr>
-              <w:instrText xml:space="preserve"> PAGEREF _Toc241372021 \h </w:instrText>
+              <w:instrText xml:space="preserve"> PAGEREF _Toc241375888 \h </w:instrText>
             </w:r>
             <w:r>
               <w:rPr>
@@ -1161,7 +1161,7 @@
               <w14:ligatures w14:val="standardContextual"/>
             </w:rPr>
           </w:pPr>
-          <w:hyperlink w:anchor="_Toc241372022" w:history="1">
+          <w:hyperlink w:anchor="_Toc241375889" w:history="1">
             <w:r>
               <w:rPr>
                 <w:rStyle w:val="Hyperlink"/>
@@ -1185,7 +1185,7 @@
               <w:rPr>
                 <w:noProof/>
               </w:rPr>
-              <w:instrText xml:space="preserve"> PAGEREF _Toc241372022 \h </w:instrText>
+              <w:instrText xml:space="preserve"> PAGEREF _Toc241375889 \h </w:instrText>
             </w:r>
             <w:r>
               <w:rPr>
@@ -1228,7 +1228,7 @@
               <w14:ligatures w14:val="standardContextual"/>
             </w:rPr>
           </w:pPr>
-          <w:hyperlink w:anchor="_Toc241372023" w:history="1">
+          <w:hyperlink w:anchor="_Toc241375890" w:history="1">
             <w:r>
               <w:rPr>
                 <w:rStyle w:val="Hyperlink"/>
@@ -1252,7 +1252,7 @@
               <w:rPr>
                 <w:noProof/>
               </w:rPr>
-              <w:instrText xml:space="preserve"> PAGEREF _Toc241372023 \h </w:instrText>
+              <w:instrText xml:space="preserve"> PAGEREF _Toc241375890 \h </w:instrText>
             </w:r>
             <w:r>
               <w:rPr>
@@ -1295,7 +1295,7 @@
               <w14:ligatures w14:val="standardContextual"/>
             </w:rPr>
           </w:pPr>
-          <w:hyperlink w:anchor="_Toc241372024" w:history="1">
+          <w:hyperlink w:anchor="_Toc241375891" w:history="1">
             <w:r>
               <w:rPr>
                 <w:rStyle w:val="Hyperlink"/>
@@ -1319,7 +1319,7 @@
               <w:rPr>
                 <w:noProof/>
               </w:rPr>
-              <w:instrText xml:space="preserve"> PAGEREF _Toc241372024 \h </w:instrText>
+              <w:instrText xml:space="preserve"> PAGEREF _Toc241375891 \h </w:instrText>
             </w:r>
             <w:r>
               <w:rPr>
@@ -1362,7 +1362,7 @@
               <w14:ligatures w14:val="standardContextual"/>
             </w:rPr>
           </w:pPr>
-          <w:hyperlink w:anchor="_Toc241372025" w:history="1">
+          <w:hyperlink w:anchor="_Toc241375892" w:history="1">
             <w:r>
               <w:rPr>
                 <w:rStyle w:val="Hyperlink"/>
@@ -1386,7 +1386,7 @@
               <w:rPr>
                 <w:noProof/>
               </w:rPr>
-              <w:instrText xml:space="preserve"> PAGEREF _Toc241372025 \h </w:instrText>
+              <w:instrText xml:space="preserve"> PAGEREF _Toc241375892 \h </w:instrText>
             </w:r>
             <w:r>
               <w:rPr>
@@ -1429,7 +1429,7 @@
               <w14:ligatures w14:val="standardContextual"/>
             </w:rPr>
           </w:pPr>
-          <w:hyperlink w:anchor="_Toc241372026" w:history="1">
+          <w:hyperlink w:anchor="_Toc241375893" w:history="1">
             <w:r>
               <w:rPr>
                 <w:rStyle w:val="Hyperlink"/>
@@ -1453,7 +1453,7 @@
               <w:rPr>
                 <w:noProof/>
               </w:rPr>
-              <w:instrText xml:space="preserve"> PAGEREF _Toc241372026 \h </w:instrText>
+              <w:instrText xml:space="preserve"> PAGEREF _Toc241375893 \h </w:instrText>
             </w:r>
             <w:r>
               <w:rPr>
@@ -1496,7 +1496,7 @@
               <w14:ligatures w14:val="standardContextual"/>
             </w:rPr>
           </w:pPr>
-          <w:hyperlink w:anchor="_Toc241372027" w:history="1">
+          <w:hyperlink w:anchor="_Toc241375894" w:history="1">
             <w:r>
               <w:rPr>
                 <w:rStyle w:val="Hyperlink"/>
@@ -1520,7 +1520,7 @@
               <w:rPr>
                 <w:noProof/>
               </w:rPr>
-              <w:instrText xml:space="preserve"> PAGEREF _Toc241372027 \h </w:instrText>
+              <w:instrText xml:space="preserve"> PAGEREF _Toc241375894 \h </w:instrText>
             </w:r>
             <w:r>
               <w:rPr>
@@ -1563,7 +1563,7 @@
               <w14:ligatures w14:val="standardContextual"/>
             </w:rPr>
           </w:pPr>
-          <w:hyperlink w:anchor="_Toc241372028" w:history="1">
+          <w:hyperlink w:anchor="_Toc241375895" w:history="1">
             <w:r>
               <w:rPr>
                 <w:rStyle w:val="Hyperlink"/>
@@ -1587,7 +1587,7 @@
               <w:rPr>
                 <w:noProof/>
               </w:rPr>
-              <w:instrText xml:space="preserve"> PAGEREF _Toc241372028 \h </w:instrText>
+              <w:instrText xml:space="preserve"> PAGEREF _Toc241375895 \h </w:instrText>
             </w:r>
             <w:r>
               <w:rPr>
@@ -1630,7 +1630,7 @@
               <w14:ligatures w14:val="standardContextual"/>
             </w:rPr>
           </w:pPr>
-          <w:hyperlink w:anchor="_Toc241372029" w:history="1">
+          <w:hyperlink w:anchor="_Toc241375896" w:history="1">
             <w:r>
               <w:rPr>
                 <w:rStyle w:val="Hyperlink"/>
@@ -1654,7 +1654,7 @@
               <w:rPr>
                 <w:noProof/>
               </w:rPr>
-              <w:instrText xml:space="preserve"> PAGEREF _Toc241372029 \h </w:instrText>
+              <w:instrText xml:space="preserve"> PAGEREF _Toc241375896 \h </w:instrText>
             </w:r>
             <w:r>
               <w:rPr>
@@ -1697,7 +1697,7 @@
               <w14:ligatures w14:val="standardContextual"/>
             </w:rPr>
           </w:pPr>
-          <w:hyperlink w:anchor="_Toc241372030" w:history="1">
+          <w:hyperlink w:anchor="_Toc241375897" w:history="1">
             <w:r>
               <w:rPr>
                 <w:rStyle w:val="Hyperlink"/>
@@ -1721,7 +1721,7 @@
               <w:rPr>
                 <w:noProof/>
               </w:rPr>
-              <w:instrText xml:space="preserve"> PAGEREF _Toc241372030 \h </w:instrText>
+              <w:instrText xml:space="preserve"> PAGEREF _Toc241375897 \h </w:instrText>
             </w:r>
             <w:r>
               <w:rPr>
@@ -1764,7 +1764,7 @@
               <w14:ligatures w14:val="standardContextual"/>
             </w:rPr>
           </w:pPr>
-          <w:hyperlink w:anchor="_Toc241372031" w:history="1">
+          <w:hyperlink w:anchor="_Toc241375898" w:history="1">
             <w:r>
               <w:rPr>
                 <w:rStyle w:val="Hyperlink"/>
@@ -1788,7 +1788,7 @@
               <w:rPr>
                 <w:noProof/>
               </w:rPr>
-              <w:instrText xml:space="preserve"> PAGEREF _Toc241372031 \h </w:instrText>
+              <w:instrText xml:space="preserve"> PAGEREF _Toc241375898 \h </w:instrText>
             </w:r>
             <w:r>
               <w:rPr>
@@ -1831,7 +1831,7 @@
               <w14:ligatures w14:val="standardContextual"/>
             </w:rPr>
           </w:pPr>
-          <w:hyperlink w:anchor="_Toc241372032" w:history="1">
+          <w:hyperlink w:anchor="_Toc241375899" w:history="1">
             <w:r>
               <w:rPr>
                 <w:rStyle w:val="Hyperlink"/>
@@ -1855,7 +1855,7 @@
               <w:rPr>
                 <w:noProof/>
               </w:rPr>
-              <w:instrText xml:space="preserve"> PAGEREF _Toc241372032 \h </w:instrText>
+              <w:instrText xml:space="preserve"> PAGEREF _Toc241375899 \h </w:instrText>
             </w:r>
             <w:r>
               <w:rPr>
@@ -1898,7 +1898,7 @@
               <w14:ligatures w14:val="standardContextual"/>
             </w:rPr>
           </w:pPr>
-          <w:hyperlink w:anchor="_Toc241372033" w:history="1">
+          <w:hyperlink w:anchor="_Toc241375900" w:history="1">
             <w:r>
               <w:rPr>
                 <w:rStyle w:val="Hyperlink"/>
@@ -1922,7 +1922,7 @@
               <w:rPr>
                 <w:noProof/>
               </w:rPr>
-              <w:instrText xml:space="preserve"> PAGEREF _Toc241372033 \h </w:instrText>
+              <w:instrText xml:space="preserve"> PAGEREF _Toc241375900 \h </w:instrText>
             </w:r>
             <w:r>
               <w:rPr>
@@ -1965,7 +1965,7 @@
               <w14:ligatures w14:val="standardContextual"/>
             </w:rPr>
           </w:pPr>
-          <w:hyperlink w:anchor="_Toc241372034" w:history="1">
+          <w:hyperlink w:anchor="_Toc241375901" w:history="1">
             <w:r>
               <w:rPr>
                 <w:rStyle w:val="Hyperlink"/>
@@ -1989,7 +1989,7 @@
               <w:rPr>
                 <w:noProof/>
               </w:rPr>
-              <w:instrText xml:space="preserve"> PAGEREF _Toc241372034 \h </w:instrText>
+              <w:instrText xml:space="preserve"> PAGEREF _Toc241375901 \h </w:instrText>
             </w:r>
             <w:r>
               <w:rPr>
@@ -2032,7 +2032,7 @@
               <w14:ligatures w14:val="standardContextual"/>
             </w:rPr>
           </w:pPr>
-          <w:hyperlink w:anchor="_Toc241372035" w:history="1">
+          <w:hyperlink w:anchor="_Toc241375902" w:history="1">
             <w:r>
               <w:rPr>
                 <w:rStyle w:val="Hyperlink"/>
@@ -2056,7 +2056,7 @@
               <w:rPr>
                 <w:noProof/>
               </w:rPr>
-              <w:instrText xml:space="preserve"> PAGEREF _Toc241372035 \h </w:instrText>
+              <w:instrText xml:space="preserve"> PAGEREF _Toc241375902 \h </w:instrText>
             </w:r>
             <w:r>
               <w:rPr>
@@ -2099,7 +2099,7 @@
               <w14:ligatures w14:val="standardContextual"/>
             </w:rPr>
           </w:pPr>
-          <w:hyperlink w:anchor="_Toc241372036" w:history="1">
+          <w:hyperlink w:anchor="_Toc241375903" w:history="1">
             <w:r>
               <w:rPr>
                 <w:rStyle w:val="Hyperlink"/>
@@ -2123,7 +2123,7 @@
               <w:rPr>
                 <w:noProof/>
               </w:rPr>
-              <w:instrText xml:space="preserve"> PAGEREF _Toc241372036 \h </w:instrText>
+              <w:instrText xml:space="preserve"> PAGEREF _Toc241375903 \h </w:instrText>
             </w:r>
             <w:r>
               <w:rPr>
@@ -2140,7 +2140,7 @@
               <w:rPr>
                 <w:noProof/>
               </w:rPr>
-              <w:t>12</w:t>
+              <w:t>14</w:t>
             </w:r>
             <w:r>
               <w:rPr>
@@ -2166,7 +2166,7 @@
               <w14:ligatures w14:val="standardContextual"/>
             </w:rPr>
           </w:pPr>
-          <w:hyperlink w:anchor="_Toc241372037" w:history="1">
+          <w:hyperlink w:anchor="_Toc241375904" w:history="1">
             <w:r>
               <w:rPr>
                 <w:rStyle w:val="Hyperlink"/>
@@ -2190,7 +2190,7 @@
               <w:rPr>
                 <w:noProof/>
               </w:rPr>
-              <w:instrText xml:space="preserve"> PAGEREF _Toc241372037 \h </w:instrText>
+              <w:instrText xml:space="preserve"> PAGEREF _Toc241375904 \h </w:instrText>
             </w:r>
             <w:r>
               <w:rPr>
@@ -2207,7 +2207,7 @@
               <w:rPr>
                 <w:noProof/>
               </w:rPr>
-              <w:t>12</w:t>
+              <w:t>15</w:t>
             </w:r>
             <w:r>
               <w:rPr>
@@ -2233,7 +2233,7 @@
       <w:pPr>
         <w:pStyle w:val="Heading1"/>
       </w:pPr>
-      <w:bookmarkStart w:id="0" w:name="_Toc241372015"/>
+      <w:bookmarkStart w:id="0" w:name="_Toc241375882"/>
       <w:r>
         <w:t>1. Project overview</w:t>
       </w:r>
@@ -2283,7 +2283,7 @@
       <w:pPr>
         <w:pStyle w:val="Heading2"/>
       </w:pPr>
-      <w:bookmarkStart w:id="1" w:name="_Toc241372016"/>
+      <w:bookmarkStart w:id="1" w:name="_Toc241375883"/>
       <w:r>
         <w:t>Pages</w:t>
       </w:r>
@@ -2304,7 +2304,7 @@
           <w:left w:w="10" w:type="dxa"/>
           <w:right w:w="10" w:type="dxa"/>
         </w:tblCellMar>
-        <w:tblLook w:val="04A0" w:firstRow="1" w:lastRow="0" w:firstColumn="1" w:lastColumn="0" w:noHBand="0" w:noVBand="1"/>
+        <w:tblLook w:val="0000" w:firstRow="0" w:lastRow="0" w:firstColumn="0" w:lastColumn="0" w:noHBand="0" w:noVBand="0"/>
       </w:tblPr>
       <w:tblGrid>
         <w:gridCol w:w="2419"/>
@@ -3040,7 +3040,7 @@
       <w:pPr>
         <w:pStyle w:val="Heading1"/>
       </w:pPr>
-      <w:bookmarkStart w:id="2" w:name="_Toc241372017"/>
+      <w:bookmarkStart w:id="2" w:name="_Toc241375884"/>
       <w:r>
         <w:t>2. Folder structure</w:t>
       </w:r>
@@ -3081,7 +3081,7 @@
           <w:left w:w="10" w:type="dxa"/>
           <w:right w:w="10" w:type="dxa"/>
         </w:tblCellMar>
-        <w:tblLook w:val="04A0" w:firstRow="1" w:lastRow="0" w:firstColumn="1" w:lastColumn="0" w:noHBand="0" w:noVBand="1"/>
+        <w:tblLook w:val="0000" w:firstRow="0" w:lastRow="0" w:firstColumn="0" w:lastColumn="0" w:noHBand="0" w:noVBand="0"/>
       </w:tblPr>
       <w:tblGrid>
         <w:gridCol w:w="3164"/>
@@ -3634,7 +3634,7 @@
               <w:spacing w:after="40"/>
             </w:pPr>
             <w:r>
-              <w:t>Syne, DM Sans, DM Mono and a Material Symbols file cut down to the icons the site uses.</w:t>
+              <w:t>Inter, Syne, DM Sans, DM Mono and a Material Symbols file cut down to the icons the site uses.</w:t>
             </w:r>
           </w:p>
         </w:tc>
@@ -4018,7 +4018,7 @@
       <w:pPr>
         <w:pStyle w:val="Heading1"/>
       </w:pPr>
-      <w:bookmarkStart w:id="3" w:name="_Toc241372018"/>
+      <w:bookmarkStart w:id="3" w:name="_Toc241375885"/>
       <w:r>
         <w:t>3. How the site works</w:t>
       </w:r>
@@ -4028,7 +4028,7 @@
       <w:pPr>
         <w:pStyle w:val="Heading2"/>
       </w:pPr>
-      <w:bookmarkStart w:id="4" w:name="_Toc241372019"/>
+      <w:bookmarkStart w:id="4" w:name="_Toc241375886"/>
       <w:r>
         <w:t>Design</w:t>
       </w:r>
@@ -4057,7 +4057,7 @@
         <w:spacing w:after="60"/>
       </w:pPr>
       <w:r>
-        <w:t>Typefaces from Google Fonts, bundled with the site: Syne for headings, DM Sans for text, DM Mono for prices and labels.</w:t>
+        <w:t>Typefaces from Google Fonts, bundled with the site: Inter for all headings, Syne for the logo, DM Sans for text, and DM Mono for prices and labels.</w:t>
       </w:r>
     </w:p>
     <w:p>
@@ -4148,7 +4148,7 @@
         <w:spacing w:after="60"/>
       </w:pPr>
       <w:r>
-        <w:t>Moving between pages fades smoothly in Chrome and Edge while the header stays still. Fonts and icons load from the site itself, so nothing flickers or jumps while a page opens.</w:t>
+        <w:t>The home page hero has a second meter bank on the right, lit only in shades of white and blended into the studio photo so only lit segments glow. It fades towards the headline and is fainter on phones.</w:t>
       </w:r>
     </w:p>
     <w:p>
@@ -4161,6 +4161,19 @@
         <w:spacing w:after="60"/>
       </w:pPr>
       <w:r>
+        <w:t>Moving between pages fades smoothly in Chrome and Edge while the header stays still. Fonts and icons load from the site itself, so nothing flickers or jumps while a page opens.</w:t>
+      </w:r>
+    </w:p>
+    <w:p>
+      <w:pPr>
+        <w:pStyle w:val="ListParagraph"/>
+        <w:numPr>
+          <w:ilvl w:val="0"/>
+          <w:numId w:val="2"/>
+        </w:numPr>
+        <w:spacing w:after="60"/>
+      </w:pPr>
+      <w:r>
         <w:t>Layout works from phone width up to wide desktop screens.</w:t>
       </w:r>
     </w:p>
@@ -4168,7 +4181,7 @@
       <w:pPr>
         <w:pStyle w:val="Heading2"/>
       </w:pPr>
-      <w:bookmarkStart w:id="5" w:name="_Toc241372020"/>
+      <w:bookmarkStart w:id="5" w:name="_Toc241375887"/>
       <w:r>
         <w:t>Pricing</w:t>
       </w:r>
@@ -4209,7 +4222,7 @@
           <w:left w:w="10" w:type="dxa"/>
           <w:right w:w="10" w:type="dxa"/>
         </w:tblCellMar>
-        <w:tblLook w:val="04A0" w:firstRow="1" w:lastRow="0" w:firstColumn="1" w:lastColumn="0" w:noHBand="0" w:noVBand="1"/>
+        <w:tblLook w:val="0000" w:firstRow="0" w:lastRow="0" w:firstColumn="0" w:lastColumn="0" w:noHBand="0" w:noVBand="0"/>
       </w:tblPr>
       <w:tblGrid>
         <w:gridCol w:w="2791"/>
@@ -4618,7 +4631,7 @@
       <w:pPr>
         <w:pStyle w:val="Heading2"/>
       </w:pPr>
-      <w:bookmarkStart w:id="6" w:name="_Toc241372021"/>
+      <w:bookmarkStart w:id="6" w:name="_Toc241375888"/>
       <w:r>
         <w:t>Booking flow</w:t>
       </w:r>
@@ -4705,7 +4718,7 @@
       <w:pPr>
         <w:pStyle w:val="Heading2"/>
       </w:pPr>
-      <w:bookmarkStart w:id="7" w:name="_Toc241372022"/>
+      <w:bookmarkStart w:id="7" w:name="_Toc241375889"/>
       <w:r>
         <w:t>Payments</w:t>
       </w:r>
@@ -4733,7 +4746,7 @@
       <w:pPr>
         <w:pStyle w:val="Heading2"/>
       </w:pPr>
-      <w:bookmarkStart w:id="8" w:name="_Toc241372023"/>
+      <w:bookmarkStart w:id="8" w:name="_Toc241375890"/>
       <w:r>
         <w:t>File uploads</w:t>
       </w:r>
@@ -4751,7 +4764,7 @@
       <w:pPr>
         <w:pStyle w:val="Heading1"/>
       </w:pPr>
-      <w:bookmarkStart w:id="9" w:name="_Toc241372024"/>
+      <w:bookmarkStart w:id="9" w:name="_Toc241375891"/>
       <w:r>
         <w:t>4. Before launch checklist</w:t>
       </w:r>
@@ -4792,7 +4805,7 @@
           <w:left w:w="10" w:type="dxa"/>
           <w:right w:w="10" w:type="dxa"/>
         </w:tblCellMar>
-        <w:tblLook w:val="04A0" w:firstRow="1" w:lastRow="0" w:firstColumn="1" w:lastColumn="0" w:noHBand="0" w:noVBand="1"/>
+        <w:tblLook w:val="0000" w:firstRow="0" w:lastRow="0" w:firstColumn="0" w:lastColumn="0" w:noHBand="0" w:noVBand="0"/>
       </w:tblPr>
       <w:tblGrid>
         <w:gridCol w:w="2791"/>
@@ -6071,7 +6084,7 @@
       <w:pPr>
         <w:pStyle w:val="Heading1"/>
       </w:pPr>
-      <w:bookmarkStart w:id="10" w:name="_Toc241372025"/>
+      <w:bookmarkStart w:id="10" w:name="_Toc241375892"/>
       <w:r>
         <w:t>5. Deployment</w:t>
       </w:r>
@@ -6137,7 +6150,7 @@
       <w:pPr>
         <w:pStyle w:val="Heading2"/>
       </w:pPr>
-      <w:bookmarkStart w:id="11" w:name="_Toc241372026"/>
+      <w:bookmarkStart w:id="11" w:name="_Toc241375893"/>
       <w:r>
         <w:t>5.1 Test on your computer</w:t>
       </w:r>
@@ -6221,7 +6234,7 @@
       <w:pPr>
         <w:pStyle w:val="Heading2"/>
       </w:pPr>
-      <w:bookmarkStart w:id="12" w:name="_Toc241372027"/>
+      <w:bookmarkStart w:id="12" w:name="_Toc241375894"/>
       <w:r>
         <w:t>5.2 Option A: Netlify (in use)</w:t>
       </w:r>
@@ -6446,7 +6459,7 @@
       <w:pPr>
         <w:pStyle w:val="Heading2"/>
       </w:pPr>
-      <w:bookmarkStart w:id="13" w:name="_Toc241372028"/>
+      <w:bookmarkStart w:id="13" w:name="_Toc241375895"/>
       <w:r>
         <w:t>5.3 Option B: GitHub Pages (free, keeps history)</w:t>
       </w:r>
@@ -6568,7 +6581,7 @@
       <w:pPr>
         <w:pStyle w:val="Heading2"/>
       </w:pPr>
-      <w:bookmarkStart w:id="14" w:name="_Toc241372029"/>
+      <w:bookmarkStart w:id="14" w:name="_Toc241375896"/>
       <w:r>
         <w:t>5.4 Option C: Shared hosting with cPanel</w:t>
       </w:r>
@@ -6677,7 +6690,7 @@
       <w:pPr>
         <w:pStyle w:val="Heading2"/>
       </w:pPr>
-      <w:bookmarkStart w:id="15" w:name="_Toc241372030"/>
+      <w:bookmarkStart w:id="15" w:name="_Toc241375897"/>
       <w:r>
         <w:t>5.5 Connect the booking forms</w:t>
       </w:r>
@@ -6795,7 +6808,7 @@
       <w:pPr>
         <w:pStyle w:val="Heading2"/>
       </w:pPr>
-      <w:bookmarkStart w:id="16" w:name="_Toc241372031"/>
+      <w:bookmarkStart w:id="16" w:name="_Toc241375898"/>
       <w:r>
         <w:t>5.6 Domain and HTTPS</w:t>
       </w:r>
@@ -6855,7 +6868,7 @@
       <w:pPr>
         <w:pStyle w:val="Heading2"/>
       </w:pPr>
-      <w:bookmarkStart w:id="17" w:name="_Toc241372032"/>
+      <w:bookmarkStart w:id="17" w:name="_Toc241375899"/>
       <w:r>
         <w:t>5.7 Checks after every deployment</w:t>
       </w:r>
@@ -6917,7 +6930,7 @@
       <w:pPr>
         <w:pStyle w:val="Heading2"/>
       </w:pPr>
-      <w:bookmarkStart w:id="18" w:name="_Toc241372033"/>
+      <w:bookmarkStart w:id="18" w:name="_Toc241375900"/>
       <w:r>
         <w:t>5.8 Deployment record</w:t>
       </w:r>
@@ -6938,7 +6951,7 @@
           <w:left w:w="10" w:type="dxa"/>
           <w:right w:w="10" w:type="dxa"/>
         </w:tblCellMar>
-        <w:tblLook w:val="04A0" w:firstRow="1" w:lastRow="0" w:firstColumn="1" w:lastColumn="0" w:noHBand="0" w:noVBand="1"/>
+        <w:tblLook w:val="0000" w:firstRow="0" w:lastRow="0" w:firstColumn="0" w:lastColumn="0" w:noHBand="0" w:noVBand="0"/>
       </w:tblPr>
       <w:tblGrid>
         <w:gridCol w:w="728"/>
@@ -7161,7 +7174,7 @@
               <w:spacing w:after="40"/>
             </w:pPr>
             <w:r>
-              <w:t>1.7.1</w:t>
+              <w:t>1.13.2</w:t>
             </w:r>
           </w:p>
         </w:tc>
@@ -7186,7 +7199,7 @@
               <w:spacing w:after="40"/>
             </w:pPr>
             <w:r>
-              <w:t>Netlify: https://altura-hertz.netlify.app (project altura-hertz, team Emperial Waste)</w:t>
+              <w:t>Netlify: https://altura-hertz.netlify.app, and GitHub branch main</w:t>
             </w:r>
           </w:p>
         </w:tc>
@@ -7236,7 +7249,7 @@
               <w:spacing w:after="40"/>
             </w:pPr>
             <w:r>
-              <w:t>First production deploy. The first upload accidentally included the font-preview trial files; the site was redeployed from a clean copy within minutes and that first deploy was deleted, so the files are no longer reachable. Cache and security headers from netlify.toml confirmed live.</w:t>
+              <w:t>Deploys every change from 1.8.0 to 1.13.2: Inter headings, smaller buttons, split nav with pills, more spacious layout, note pattern on the hero button, white hero meters, card tweaks. Deployed from a clean copy of development/ without the font-preview files.</w:t>
             </w:r>
           </w:p>
         </w:tc>
@@ -7319,7 +7332,7 @@
               <w:spacing w:after="40"/>
             </w:pPr>
             <w:r>
-              <w:t>GitHub repository only: github.com/ohemengemmanuel/Altura-hurtz (branch main).</w:t>
+              <w:t>Netlify: https://altura-hertz.netlify.app (project altura-hertz, team Emperial Waste)</w:t>
             </w:r>
           </w:p>
         </w:tc>
@@ -7344,7 +7357,7 @@
               <w:spacing w:after="40"/>
             </w:pPr>
             <w:r>
-              <w:t>ohemengemmanuel</w:t>
+              <w:t>Emmanuel Ohemeng, via Netlify command line</w:t>
             </w:r>
           </w:p>
         </w:tc>
@@ -7369,7 +7382,7 @@
               <w:spacing w:after="40"/>
             </w:pPr>
             <w:r>
-              <w:t>First push of design, development and documentation folders. The font-preview trial files are excluded by .gitignore because their licences are unconfirmed.</w:t>
+              <w:t>First production deploy. The first upload accidentally included the font-preview trial files; the site was redeployed from a clean copy within minutes and that first deploy was deleted, so the files are no longer reachable. Cache and security headers from netlify.toml confirmed live.</w:t>
             </w:r>
           </w:p>
         </w:tc>
@@ -7401,6 +7414,9 @@
             <w:pPr>
               <w:spacing w:after="40"/>
             </w:pPr>
+            <w:r>
+              <w:t>27 Sep 2026</w:t>
+            </w:r>
           </w:p>
         </w:tc>
         <w:tc>
@@ -7423,6 +7439,9 @@
             <w:pPr>
               <w:spacing w:after="40"/>
             </w:pPr>
+            <w:r>
+              <w:t>1.7.1</w:t>
+            </w:r>
           </w:p>
         </w:tc>
         <w:tc>
@@ -7445,6 +7464,9 @@
             <w:pPr>
               <w:spacing w:after="40"/>
             </w:pPr>
+            <w:r>
+              <w:t>GitHub repository only: github.com/ohemengemmanuel/Altura-hurtz (branch main).</w:t>
+            </w:r>
           </w:p>
         </w:tc>
         <w:tc>
@@ -7467,6 +7489,9 @@
             <w:pPr>
               <w:spacing w:after="40"/>
             </w:pPr>
+            <w:r>
+              <w:t>ohemengemmanuel</w:t>
+            </w:r>
           </w:p>
         </w:tc>
         <w:tc>
@@ -7489,6 +7514,9 @@
             <w:pPr>
               <w:spacing w:after="40"/>
             </w:pPr>
+            <w:r>
+              <w:t>First push of design, development and documentation folders. The font-preview trial files are excluded by .gitignore because their licences are unconfirmed.</w:t>
+            </w:r>
           </w:p>
         </w:tc>
       </w:tr>
@@ -7610,12 +7638,130 @@
           </w:p>
         </w:tc>
       </w:tr>
+      <w:tr>
+        <w:tblPrEx>
+          <w:tblCellMar>
+            <w:top w:w="0" w:type="dxa"/>
+            <w:bottom w:w="0" w:type="dxa"/>
+          </w:tblCellMar>
+        </w:tblPrEx>
+        <w:tc>
+          <w:tcPr>
+            <w:tcW w:w="1302" w:type="dxa"/>
+            <w:tcBorders>
+              <w:top w:val="single" w:sz="4" w:space="0" w:color="C9C3E6"/>
+              <w:left w:val="single" w:sz="4" w:space="0" w:color="C9C3E6"/>
+              <w:bottom w:val="single" w:sz="4" w:space="0" w:color="C9C3E6"/>
+              <w:right w:val="single" w:sz="4" w:space="0" w:color="C9C3E6"/>
+            </w:tcBorders>
+            <w:tcMar>
+              <w:top w:w="80" w:type="dxa"/>
+              <w:left w:w="110" w:type="dxa"/>
+              <w:bottom w:w="80" w:type="dxa"/>
+              <w:right w:w="110" w:type="dxa"/>
+            </w:tcMar>
+          </w:tcPr>
+          <w:p>
+            <w:pPr>
+              <w:spacing w:after="40"/>
+            </w:pPr>
+          </w:p>
+        </w:tc>
+        <w:tc>
+          <w:tcPr>
+            <w:tcW w:w="1116" w:type="dxa"/>
+            <w:tcBorders>
+              <w:top w:val="single" w:sz="4" w:space="0" w:color="C9C3E6"/>
+              <w:left w:val="single" w:sz="4" w:space="0" w:color="C9C3E6"/>
+              <w:bottom w:val="single" w:sz="4" w:space="0" w:color="C9C3E6"/>
+              <w:right w:val="single" w:sz="4" w:space="0" w:color="C9C3E6"/>
+            </w:tcBorders>
+            <w:tcMar>
+              <w:top w:w="80" w:type="dxa"/>
+              <w:left w:w="110" w:type="dxa"/>
+              <w:bottom w:w="80" w:type="dxa"/>
+              <w:right w:w="110" w:type="dxa"/>
+            </w:tcMar>
+          </w:tcPr>
+          <w:p>
+            <w:pPr>
+              <w:spacing w:after="40"/>
+            </w:pPr>
+          </w:p>
+        </w:tc>
+        <w:tc>
+          <w:tcPr>
+            <w:tcW w:w="2791" w:type="dxa"/>
+            <w:tcBorders>
+              <w:top w:val="single" w:sz="4" w:space="0" w:color="C9C3E6"/>
+              <w:left w:val="single" w:sz="4" w:space="0" w:color="C9C3E6"/>
+              <w:bottom w:val="single" w:sz="4" w:space="0" w:color="C9C3E6"/>
+              <w:right w:val="single" w:sz="4" w:space="0" w:color="C9C3E6"/>
+            </w:tcBorders>
+            <w:tcMar>
+              <w:top w:w="80" w:type="dxa"/>
+              <w:left w:w="110" w:type="dxa"/>
+              <w:bottom w:w="80" w:type="dxa"/>
+              <w:right w:w="110" w:type="dxa"/>
+            </w:tcMar>
+          </w:tcPr>
+          <w:p>
+            <w:pPr>
+              <w:spacing w:after="40"/>
+            </w:pPr>
+          </w:p>
+        </w:tc>
+        <w:tc>
+          <w:tcPr>
+            <w:tcW w:w="1488" w:type="dxa"/>
+            <w:tcBorders>
+              <w:top w:val="single" w:sz="4" w:space="0" w:color="C9C3E6"/>
+              <w:left w:val="single" w:sz="4" w:space="0" w:color="C9C3E6"/>
+              <w:bottom w:val="single" w:sz="4" w:space="0" w:color="C9C3E6"/>
+              <w:right w:val="single" w:sz="4" w:space="0" w:color="C9C3E6"/>
+            </w:tcBorders>
+            <w:tcMar>
+              <w:top w:w="80" w:type="dxa"/>
+              <w:left w:w="110" w:type="dxa"/>
+              <w:bottom w:w="80" w:type="dxa"/>
+              <w:right w:w="110" w:type="dxa"/>
+            </w:tcMar>
+          </w:tcPr>
+          <w:p>
+            <w:pPr>
+              <w:spacing w:after="40"/>
+            </w:pPr>
+          </w:p>
+        </w:tc>
+        <w:tc>
+          <w:tcPr>
+            <w:tcW w:w="2609" w:type="dxa"/>
+            <w:tcBorders>
+              <w:top w:val="single" w:sz="4" w:space="0" w:color="C9C3E6"/>
+              <w:left w:val="single" w:sz="4" w:space="0" w:color="C9C3E6"/>
+              <w:bottom w:val="single" w:sz="4" w:space="0" w:color="C9C3E6"/>
+              <w:right w:val="single" w:sz="4" w:space="0" w:color="C9C3E6"/>
+            </w:tcBorders>
+            <w:tcMar>
+              <w:top w:w="80" w:type="dxa"/>
+              <w:left w:w="110" w:type="dxa"/>
+              <w:bottom w:w="80" w:type="dxa"/>
+              <w:right w:w="110" w:type="dxa"/>
+            </w:tcMar>
+          </w:tcPr>
+          <w:p>
+            <w:pPr>
+              <w:spacing w:after="40"/>
+            </w:pPr>
+          </w:p>
+        </w:tc>
+      </w:tr>
     </w:tbl>
     <w:p>
       <w:pPr>
         <w:pStyle w:val="Heading1"/>
       </w:pPr>
-      <w:bookmarkStart w:id="19" w:name="_Toc241372034"/>
+      <w:bookmarkStart w:id="19" w:name="_Toc241375901"/>
       <w:r>
         <w:t>6. Editing guide</w:t>
       </w:r>
@@ -7636,7 +7782,7 @@
           <w:left w:w="10" w:type="dxa"/>
           <w:right w:w="10" w:type="dxa"/>
         </w:tblCellMar>
-        <w:tblLook w:val="04A0" w:firstRow="1" w:lastRow="0" w:firstColumn="1" w:lastColumn="0" w:noHBand="0" w:noVBand="1"/>
+        <w:tblLook w:val="0000" w:firstRow="0" w:lastRow="0" w:firstColumn="0" w:lastColumn="0" w:noHBand="0" w:noVBand="0"/>
       </w:tblPr>
       <w:tblGrid>
         <w:gridCol w:w="2791"/>
@@ -8598,7 +8744,7 @@
       <w:pPr>
         <w:pStyle w:val="Heading1"/>
       </w:pPr>
-      <w:bookmarkStart w:id="20" w:name="_Toc241372035"/>
+      <w:bookmarkStart w:id="20" w:name="_Toc241375902"/>
       <w:r>
         <w:t>7. Change log</w:t>
       </w:r>
@@ -8627,7 +8773,7 @@
           <w:left w:w="10" w:type="dxa"/>
           <w:right w:w="10" w:type="dxa"/>
         </w:tblCellMar>
-        <w:tblLook w:val="04A0" w:firstRow="1" w:lastRow="0" w:firstColumn="1" w:lastColumn="0" w:noHBand="0" w:noVBand="1"/>
+        <w:tblLook w:val="0000" w:firstRow="0" w:lastRow="0" w:firstColumn="0" w:lastColumn="0" w:noHBand="0" w:noVBand="0"/>
       </w:tblPr>
       <w:tblGrid>
         <w:gridCol w:w="1209"/>
@@ -8763,7 +8909,7 @@
               <w:spacing w:after="40"/>
             </w:pPr>
             <w:r>
-              <w:t>1.7.1</w:t>
+              <w:t>1.13.2</w:t>
             </w:r>
           </w:p>
         </w:tc>
@@ -8813,19 +8959,7 @@
               <w:spacing w:after="40"/>
             </w:pPr>
             <w:r>
-              <w:t xml:space="preserve">Added </w:t>
-            </w:r>
-            <w:r>
-              <w:rPr>
-                <w:rFonts w:ascii="Consolas" w:eastAsia="Consolas" w:hAnsi="Consolas" w:cs="Consolas"/>
-                <w:color w:val="4E11DC"/>
-                <w:sz w:val="19"/>
-                <w:szCs w:val="19"/>
-              </w:rPr>
-              <w:t>netlify.toml</w:t>
-            </w:r>
-            <w:r>
-              <w:t xml:space="preserve"> (publish folder, one year cache for fonts, one week for images, basic security headers) and deployed to Netlify at https://altura-hertz.netlify.app. The local folder is linked to the Netlify project.</w:t>
+              <w:t>Removed the dark circle behind the icons on the Choose your session cards. The white icons now sit directly on the card images, slightly larger (22 px), with a soft shadow so they stay readable on bright images. Deployed to Netlify with 1.13.2.</w:t>
             </w:r>
           </w:p>
         </w:tc>
@@ -8858,7 +8992,7 @@
               <w:spacing w:after="40"/>
             </w:pPr>
             <w:r>
-              <w:t>1.7.1</w:t>
+              <w:t>1.13.1</w:t>
             </w:r>
           </w:p>
         </w:tc>
@@ -8908,7 +9042,7 @@
               <w:spacing w:after="40"/>
             </w:pPr>
             <w:r>
-              <w:t>Project put under version control and pushed to GitHub at github.com/ohemengemmanuel/Altura-hurtz (branch main). Added a README and a .gitignore. The development/font-preview folder and font-preview.html are kept out of the repository because the trial font licences are unconfirmed.</w:t>
+              <w:t>Increased the space below the Choose your session section by 1.7 times. Measured before and after: phone 390 x 740 from 92 to 156 px, laptop 1366 x 657 from 102 to 173 px, desktop 1920 x 960 from 151 to 257 px. The space above the section is unchanged. Deployed to Netlify with 1.13.2.</w:t>
             </w:r>
           </w:p>
         </w:tc>
@@ -8941,7 +9075,7 @@
               <w:spacing w:after="40"/>
             </w:pPr>
             <w:r>
-              <w:t>1.7.1</w:t>
+              <w:t>1.13.0</w:t>
             </w:r>
           </w:p>
         </w:tc>
@@ -8991,10 +9125,10 @@
               <w:spacing w:after="40"/>
             </w:pPr>
             <w:r>
-              <w:t>Replaced the round Gain dial with a vertical, metallic fader like a mixing console channel: a brushed aluminium cap with bevelled edges and a grip line, a machined metal slot with a violet fill up to the cap, a dB scale (plus 3, 0, minus 6, minus 12) with 0 dB highlighted, all mounted on a small dark anodised metal plate so the scale stays readable over the meters. Same range and effect as before (minus 12 to plus 3 dB). Controls: drag the cap or click anywhere on the track to jump there, mouse wheel, arrow</w:t>
-            </w:r>
-            <w:r>
-              <w:t xml:space="preserve"> keys, Page Up and Page Down, Home and End, double-click to reset, and touch drag on phones. Tested in Chrome at 1366 and 390 px.</w:t>
+              <w:t>Added a white meter bank to the right side of the home page hero: 12 stereo strips using the same bars and motion as the Ready when you are meters, but lit only in shades of white (soft grey at the bottom to bright white at the top, white peak lines). It blends into the photo with a screen blend, so unlit segments disappear and lit ones glow, and it fades out towards the headline, under the nav and at the bottom. Desktop opacity 42%; on phones 6 strips at 20% opacity so the headline stays clear. Pauses when</w:t>
+            </w:r>
+            <w:r>
+              <w:t xml:space="preserve"> scrolled off screen. Deployed to Netlify with 1.13.2.</w:t>
             </w:r>
           </w:p>
         </w:tc>
@@ -9027,7 +9161,7 @@
               <w:spacing w:after="40"/>
             </w:pPr>
             <w:r>
-              <w:t>1.7.0</w:t>
+              <w:t>1.12.4</w:t>
             </w:r>
           </w:p>
         </w:tc>
@@ -9077,10 +9211,7 @@
               <w:spacing w:after="40"/>
             </w:pPr>
             <w:r>
-              <w:t>Added a Gain dial to the Ready when you are card that sets the height of the meter bars, styled like a plugin knob with a violet value arc and a dB readout. Range minus 12 dB (bars reach about a quarter height) to plus 3 dB (bars clip into the red), starting at 0 dB. Controls: drag up, down or sideways, mouse wheel, arrow keys (0.5 dB), Page Up and Page Down (3 dB), Home and End, and double-click to reset. Works with touch on phones. Announced to screen readers as a slider with its dB value. The dial only c</w:t>
-            </w:r>
-            <w:r>
-              <w:t>hanges two values on the meter bank; the bars keep animating on the graphics card. Tested in Chrome at 1366 and 390 px with mouse drag, double-click and keyboard.</w:t>
+              <w:t>Made the note pattern in the hero Book a session button more transparent: note opacity halved from 26% to 13%, so it reads as a subtle texture. Deployed to Netlify with 1.13.2.</w:t>
             </w:r>
           </w:p>
         </w:tc>
@@ -9113,7 +9244,7 @@
               <w:spacing w:after="40"/>
             </w:pPr>
             <w:r>
-              <w:t>1.6.2</w:t>
+              <w:t>1.12.3</w:t>
             </w:r>
           </w:p>
         </w:tc>
@@ -9163,7 +9294,7 @@
               <w:spacing w:after="40"/>
             </w:pPr>
             <w:r>
-              <w:t>Slowed the meter bank in the Ready when you are card by 25%. Each bar now loops over 3.3 to 4.8 seconds instead of 2.6 to 3.8, with start offsets scaled to match so the bars stay spread out and stereo pairs stay together.</w:t>
+              <w:t>Simplified the hero Book a session button pattern: one upright eighth note only (no upside down pairs, no diamonds), repeated in neat staggered rows with each row shifted half a step, about 12 px between notes instead of about 7 px. Still glides sideways on hover. Deployed to Netlify with 1.13.2.</w:t>
             </w:r>
           </w:p>
         </w:tc>
@@ -9196,7 +9327,7 @@
               <w:spacing w:after="40"/>
             </w:pPr>
             <w:r>
-              <w:t>1.6.1</w:t>
+              <w:t>1.12.2</w:t>
             </w:r>
           </w:p>
         </w:tc>
@@ -9246,10 +9377,7 @@
               <w:spacing w:after="40"/>
             </w:pPr>
             <w:r>
-              <w:t>Replaced the analog VU meters with a digital meter bank in the style of DAW mixer meters: 14 stereo channel strips (28 bars) of LED segments lit ice blue at the bottom, violet in the middle and booth red at the top, with unlit segments faintly visible and a white peak-hold line on each bar. The bank is a background layer that fades into the card: towards the text on the left and down into the card at the bottom on desktop, and at both sides and the bottom on phones where it sits under the buttons. Performan</w:t>
-            </w:r>
-            <w:r>
-              <w:t>ce: segments and colours are static, only a dark cover over unlit segments and the peak line move (transform on the graphics card, no JavaScript per frame), six shared motion patterns are reused with different timing, left and right bars in a pair move together with a small offset, and the bank pauses when off screen. Tested in Chrome at 1366 and 390 px.</w:t>
+              <w:t>Replaced the notation pattern in the hero Book a session button with a small monogram style pattern: tiny single eighth notes in a tight 14 px diagonal checker, alternating upright and upside down, with small diamonds between them, repeated over the whole button in the manner of a luxury fashion monogram. No staff lines or beamed notes. The pattern glides sideways on hover (off for reduced motion). Deployed to Netlify with 1.13.2.</w:t>
             </w:r>
           </w:p>
         </w:tc>
@@ -9282,7 +9410,7 @@
               <w:spacing w:after="40"/>
             </w:pPr>
             <w:r>
-              <w:t>1.6.0</w:t>
+              <w:t>1.12.1</w:t>
             </w:r>
           </w:p>
         </w:tc>
@@ -9332,10 +9460,7 @@
               <w:spacing w:after="40"/>
             </w:pPr>
             <w:r>
-              <w:t>Added a pair of analog VU meters (L and R) to the Ready when you are card. Scale from minus 20 to plus 3 VU with the 0 to plus 3 red zone, glowing needles and a red peak light that flashes when a needle reaches the red. Needles follow fixed musical patterns of different lengths so the channels never move in sync. Performance: faces are drawn once as SVG, only the needles and peak lights animate (rotation and opacity, handled by the graphics card with no JavaScript per frame), the meters pause whenever the c</w:t>
-            </w:r>
-            <w:r>
-              <w:t>ard is off screen, and they stay still for visitors with reduced motion on. Tested in Chrome at 1366 and 390 px: running on screen, paused when scrolled away. On phones the meters sit under the buttons.</w:t>
+              <w:t>Added a faint musical notation pattern (five staff lines with beamed eighth notes, a quarter note and a half note) inside the violet Book a session button in the home page hero. The notes are drawn as simple shapes embedded in the stylesheet, not music symbol characters. On hover the button lightens and the score scrolls slowly sideways; the scrolling is off for visitors with reduced motion. Deployed to Netlify with 1.13.2.</w:t>
             </w:r>
           </w:p>
         </w:tc>
@@ -9368,7 +9493,7 @@
               <w:spacing w:after="40"/>
             </w:pPr>
             <w:r>
-              <w:t>1.5.2</w:t>
+              <w:t>1.12.0</w:t>
             </w:r>
           </w:p>
         </w:tc>
@@ -9418,7 +9543,10 @@
               <w:spacing w:after="40"/>
             </w:pPr>
             <w:r>
-              <w:t>On phones and tablets (up to 860 px wide) the studio section heading, The studio / A room built around your voice, now sits on the bottom of the studio photo over a dark fade instead of below it. The description and gear list follow under the photo. Desktop layout is unchanged. The photo and text now fade in together as one block so the heading never shows without its photo.</w:t>
+              <w:t>Made the site more spacious (roughly 15 to 25% more room): side margins 16 to 32 px became 20 to 48 px; space between sections 64 to 110 px became 80 to 136 px; body line spacing 1.6 to 1.68; larger gaps under section headings and between service cards, steps, policies, contact tiles, form fields and the booking form and summary; roomier card, form, summary, contact tile, Ready when you are card and footer padding. The spacing above and below Choose your session was left as set in 1.4.1. All five services s</w:t>
+            </w:r>
+            <w:r>
+              <w:t>till fit on one screen, checked at 360 x 640, 390 x 740, 768 x 900, 1366 x 657 and 1920 x 960. Deployed to Netlify with 1.13.2.</w:t>
             </w:r>
           </w:p>
         </w:tc>
@@ -9451,7 +9579,7 @@
               <w:spacing w:after="40"/>
             </w:pPr>
             <w:r>
-              <w:t>1.5.1</w:t>
+              <w:t>1.11.2</w:t>
             </w:r>
           </w:p>
         </w:tc>
@@ -9501,7 +9629,7 @@
               <w:spacing w:after="40"/>
             </w:pPr>
             <w:r>
-              <w:t>Phone menu button: removed its round border and background in both the closed and open states, so only the equalizer bars (and the X when open) show. The bar bounce and the open and close morph now run 25% slower.</w:t>
+              <w:t>Desktop nav: once the page scrolls past the hero, the logo on the left now gets the same rounded dark pill as the links on the right (same colour, blur, border and shadow, fading in at the same moment). Both pills are 42.4 px tall and aligned. Over the hero both sides stay transparent. The glow behind the logo text was removed since the pill now keeps it readable. Deployed to Netlify with 1.13.2.</w:t>
             </w:r>
           </w:p>
         </w:tc>
@@ -9534,7 +9662,7 @@
               <w:spacing w:after="40"/>
             </w:pPr>
             <w:r>
-              <w:t>1.5.0</w:t>
+              <w:t>1.11.1</w:t>
             </w:r>
           </w:p>
         </w:tc>
@@ -9584,10 +9712,7 @@
               <w:spacing w:after="40"/>
             </w:pPr>
             <w:r>
-              <w:t xml:space="preserve">Added mild animations. Scroll reveal: section headings, service cards, steps, policies, contact details, forms and summaries fade up 14 px as they come into view, with a short stagger inside grids. Only elements that start below the screen are animated, so nothing visible flickers on page load. Home hero: text rises in and the photo settles from a slight zoom, on the first home visit of a browsing session only. Hover: cards lift and their photos zoom slightly, card arrows nudge forward, buttons lift with a </w:t>
-            </w:r>
-            <w:r>
-              <w:t>violet glow, social icons lift. Booking: the estimated total pulses when it changes and the booking summary eases in. Tested in Chrome in real time on four pages: nothing on screen was hidden at load and every element was visible after scrolling.</w:t>
+              <w:t>Prices on the Choose your session cards are 15% smaller: 13 to 11.05 px on desktop, 12.5 to 10.6 px on the compact phone cards. The first card price now fits on one line. Deployed to Netlify with 1.13.2.</w:t>
             </w:r>
           </w:p>
         </w:tc>
@@ -9620,7 +9745,7 @@
               <w:spacing w:after="40"/>
             </w:pPr>
             <w:r>
-              <w:t>1.4.2</w:t>
+              <w:t>1.11.0</w:t>
             </w:r>
           </w:p>
         </w:tc>
@@ -9670,7 +9795,7 @@
               <w:spacing w:after="40"/>
             </w:pPr>
             <w:r>
-              <w:t>On phones and small tablets (up to 820 px wide) the round icon to the left of the Altura Hertz wordmark in the header is hidden, leaving the wordmark and the equalizer menu button. Desktop and the footer keep the icon.</w:t>
+              <w:t>All headings now use Inter: page headings (h1, weight 800), section headings (h2, weight 800), card and panel titles (h3, weight 700) and the form section titles. Letter spacing tightened slightly to suit Inter at large sizes. The logo keeps Syne. Inter is bundled (about 130 KB, including accented letters and the cedi sign) and preloaded on every page. Boldonse is no longer used, so its files and preload were removed. Deployed to Netlify with 1.13.2.</w:t>
             </w:r>
           </w:p>
         </w:tc>
@@ -9703,7 +9828,7 @@
               <w:spacing w:after="40"/>
             </w:pPr>
             <w:r>
-              <w:t>1.4.1</w:t>
+              <w:t>1.10.0</w:t>
             </w:r>
           </w:p>
         </w:tc>
@@ -9753,7 +9878,7 @@
               <w:spacing w:after="40"/>
             </w:pPr>
             <w:r>
-              <w:t>Halved the space above and below the Choose your session section. Measured before and after: phone 390 x 740 went from 92 to 49 px above and 156 to 78 px below; laptop 1366 x 657 from 67 to 34 px and 177 to 88 px; desktop 1920 x 960 from 163 to 84 px and 273 to 137 px. The section no longer stretches to fill the screen. All five cards still fit on screen when jumping to the section.</w:t>
+              <w:t>The main heading (h1) on every page now uses Boldonse, with line spacing 1.45 for its tall letters; inner page headings are sized 26 to 48 px. Section headings (h2) and the logo keep Syne. Boldonse is now preloaded on every page. On the Choose your session cards, the action links (Book this session, Book recording, Send your project, Request a beat, Request artwork) now sit at the bottom of each card so they line up across all five. Deployed to Netlify with 1.13.2.</w:t>
             </w:r>
           </w:p>
         </w:tc>
@@ -9786,7 +9911,7 @@
               <w:spacing w:after="40"/>
             </w:pPr>
             <w:r>
-              <w:t>1.4.0</w:t>
+              <w:t>1.9.0</w:t>
             </w:r>
           </w:p>
         </w:tc>
@@ -9836,7 +9961,7 @@
               <w:spacing w:after="40"/>
             </w:pPr>
             <w:r>
-              <w:t>Redesigned the phone menu button as an animated equalizer. Closed, four gradient bars bounce like a level meter. Open, the outer bars drop out, the middle two cross into an X and the button glows violet. The menu now slides down with a staggered reveal of each link, the Book a session button fills the full width, and the menu closes with Escape or a tap outside it.</w:t>
+              <w:t>Desktop split navigation. Over the hero photo the whole nav is transparent. Once the page scrolls past the hero, the right side (Home, Purchase Beats, Contact Us and Book a session) sits in a rounded dark pill with a light blur that fades in, while the logo on the left keeps no background. A soft dark glow behind the logo lettering keeps it readable over content. Phones keep the solid bar. Tested in Chrome on the home page and a booking page. Deployed to Netlify with 1.13.2.</w:t>
             </w:r>
           </w:p>
         </w:tc>
@@ -9869,7 +9994,7 @@
               <w:spacing w:after="40"/>
             </w:pPr>
             <w:r>
-              <w:t>1.3.2</w:t>
+              <w:t>1.8.3</w:t>
             </w:r>
           </w:p>
         </w:tc>
@@ -9919,7 +10044,7 @@
               <w:spacing w:after="40"/>
             </w:pPr>
             <w:r>
-              <w:t>Removed the All prices in Ghana cedis note from the footer. Removed the divider lines between sections: under the header, under the hero and page headings, above the footer and above the copyright line.</w:t>
+              <w:t>Desktop (wider than 820 px): the navigation bar has no background or blur, and the hero photo on every page now extends up behind it so the nav floats over the image. A soft dark fade across the top 150 px of the photo keeps the nav links readable over bright areas. The nav stays fixed at the top and remains transparent while scrolling, so it sits directly over page content further down. Phones keep the solid bar because the dropdown menu needs it. Deployed to Netlify with 1.13.2.</w:t>
             </w:r>
           </w:p>
         </w:tc>
@@ -9952,7 +10077,7 @@
               <w:spacing w:after="40"/>
             </w:pPr>
             <w:r>
-              <w:t>1.3.1</w:t>
+              <w:t>1.8.2</w:t>
             </w:r>
           </w:p>
         </w:tc>
@@ -10002,19 +10127,7 @@
               <w:spacing w:after="40"/>
             </w:pPr>
             <w:r>
-              <w:t xml:space="preserve">All six social icons now always show in the footer. Icons whose link is not set yet in </w:t>
-            </w:r>
-            <w:r>
-              <w:rPr>
-                <w:rFonts w:ascii="Consolas" w:eastAsia="Consolas" w:hAnsi="Consolas" w:cs="Consolas"/>
-                <w:color w:val="4E11DC"/>
-                <w:sz w:val="19"/>
-                <w:szCs w:val="19"/>
-              </w:rPr>
-              <w:t>config.js</w:t>
-            </w:r>
-            <w:r>
-              <w:t xml:space="preserve"> stay visible but do nothing when clicked, and show a coming soon tooltip.</w:t>
+              <w:t>Made the two home page hero buttons (Book a session and Purchase beats) 15% smaller than the other site buttons: text 14 to 11.9 px, icons 18 to 15.3 px, padding 10 x 18 to 8.5 x 15.3 px. They are now about 36 px tall. Other buttons are unchanged. Deployed to Netlify with 1.13.2.</w:t>
             </w:r>
           </w:p>
         </w:tc>
@@ -10047,7 +10160,7 @@
               <w:spacing w:after="40"/>
             </w:pPr>
             <w:r>
-              <w:t>1.3.0</w:t>
+              <w:t>1.8.1</w:t>
             </w:r>
           </w:p>
         </w:tc>
@@ -10097,31 +10210,7 @@
               <w:spacing w:after="40"/>
             </w:pPr>
             <w:r>
-              <w:t xml:space="preserve">Added a row of social media icons to the footer, modelled on </w:t>
-            </w:r>
-            <w:r>
-              <w:rPr>
-                <w:rFonts w:ascii="Consolas" w:eastAsia="Consolas" w:hAnsi="Consolas" w:cs="Consolas"/>
-                <w:color w:val="4E11DC"/>
-                <w:sz w:val="19"/>
-                <w:szCs w:val="19"/>
-              </w:rPr>
-              <w:t>design/inspo/socials footer.png</w:t>
-            </w:r>
-            <w:r>
-              <w:t xml:space="preserve">: Facebook, Instagram, Threads, YouTube, TikTok and WhatsApp. Icons are white, turn violet on hover, and each only appears once its link is set in </w:t>
-            </w:r>
-            <w:r>
-              <w:rPr>
-                <w:rFonts w:ascii="Consolas" w:eastAsia="Consolas" w:hAnsi="Consolas" w:cs="Consolas"/>
-                <w:color w:val="4E11DC"/>
-                <w:sz w:val="19"/>
-                <w:szCs w:val="19"/>
-              </w:rPr>
-              <w:t>config.js</w:t>
-            </w:r>
-            <w:r>
-              <w:t>. The text links for WhatsApp, Instagram, TikTok and YouTube were removed from the Studio column since the icons replace them.</w:t>
+              <w:t>Made every button slightly smaller: text 15 to 14 px, icons 20 to 18 px, padding 12 x 22 to 10 x 18 px (navigation button 9 x 18 to 8 x 16 px). Buttons are now about 42 px tall. On phones the two hero buttons now sit side by side. Deployed to Netlify with 1.13.2.</w:t>
             </w:r>
           </w:p>
         </w:tc>
@@ -10154,7 +10243,7 @@
               <w:spacing w:after="40"/>
             </w:pPr>
             <w:r>
-              <w:t>1.2.1</w:t>
+              <w:t>1.8.0</w:t>
             </w:r>
           </w:p>
         </w:tc>
@@ -10204,7 +10293,7 @@
               <w:spacing w:after="40"/>
             </w:pPr>
             <w:r>
-              <w:t>Removed the Services column from the footer on every page. The footer now shows the studio name and description on the left and the Studio links on the right.</w:t>
+              <w:t>Home page hero headline (Elevate your sound with us.) now uses Boldonse, a Google font under the SIL Open Font License, bundled with the site (about 36 KB) and preloaded on the home page so it shows without a flash. Line spacing set to 1.45 to suit its tall letters. The logo in the navigation and every other heading keep Syne. Deployed to Netlify with 1.13.2.</w:t>
             </w:r>
           </w:p>
         </w:tc>
@@ -10237,7 +10326,7 @@
               <w:spacing w:after="40"/>
             </w:pPr>
             <w:r>
-              <w:t>1.2.0</w:t>
+              <w:t>1.7.1</w:t>
             </w:r>
           </w:p>
         </w:tc>
@@ -10287,7 +10376,19 @@
               <w:spacing w:after="40"/>
             </w:pPr>
             <w:r>
-              <w:t>Landing page photo re-exported from the full size original (4032 x 3024) at 1280, 1920, 2560 and 3840 pixels wide with higher quality and light sharpening. The page now loads the size that suits each screen and requests it early, so it is sharp on high resolution laptops and phones. Replaces the single 1920 pixel file.</w:t>
+              <w:t xml:space="preserve">Added </w:t>
+            </w:r>
+            <w:r>
+              <w:rPr>
+                <w:rFonts w:ascii="Consolas" w:eastAsia="Consolas" w:hAnsi="Consolas" w:cs="Consolas"/>
+                <w:color w:val="4E11DC"/>
+                <w:sz w:val="19"/>
+                <w:szCs w:val="19"/>
+              </w:rPr>
+              <w:t>netlify.toml</w:t>
+            </w:r>
+            <w:r>
+              <w:t xml:space="preserve"> (publish folder, one year cache for fonts, one week for images, basic security headers) and deployed to Netlify at https://altura-hertz.netlify.app. The local folder is linked to the Netlify project.</w:t>
             </w:r>
           </w:p>
         </w:tc>
@@ -10320,7 +10421,7 @@
               <w:spacing w:after="40"/>
             </w:pPr>
             <w:r>
-              <w:t>1.1.0</w:t>
+              <w:t>1.7.1</w:t>
             </w:r>
           </w:p>
         </w:tc>
@@ -10370,7 +10471,7 @@
               <w:spacing w:after="40"/>
             </w:pPr>
             <w:r>
-              <w:t>Fixed the flicker when moving between pages: fonts and icons are now bundled with the site and preloaded, the dark background is set before styles load, icons keep a fixed size while loading, and pages fade into each other with the header held still.</w:t>
+              <w:t>Project put under version control and pushed to GitHub at github.com/ohemengemmanuel/Altura-hurtz (branch main). Added a README and a .gitignore. The development/font-preview folder and font-preview.html are kept out of the repository because the trial font licences are unconfirmed.</w:t>
             </w:r>
           </w:p>
         </w:tc>
@@ -10403,7 +10504,7 @@
               <w:spacing w:after="40"/>
             </w:pPr>
             <w:r>
-              <w:t>1.1.0</w:t>
+              <w:t>1.7.1</w:t>
             </w:r>
           </w:p>
         </w:tc>
@@ -10453,7 +10554,10 @@
               <w:spacing w:after="40"/>
             </w:pPr>
             <w:r>
-              <w:t>Book a session no longer animates a scroll while the next page is loading. Smooth scrolling now only applies to links within the same page, and the phone menu closes after a tap.</w:t>
+              <w:t>Replaced the round Gain dial with a vertical, metallic fader like a mixing console channel: a brushed aluminium cap with bevelled edges and a grip line, a machined metal slot with a violet fill up to the cap, a dB scale (plus 3, 0, minus 6, minus 12) with 0 dB highlighted, all mounted on a small dark anodised metal plate so the scale stays readable over the meters. Same range and effect as before (minus 12 to plus 3 dB). Controls: drag the cap or click anywhere on the track to jump there, mouse wheel, arrow</w:t>
+            </w:r>
+            <w:r>
+              <w:t xml:space="preserve"> keys, Page Up and Page Down, Home and End, double-click to reset, and touch drag on phones. Tested in Chrome at 1366 and 390 px.</w:t>
             </w:r>
           </w:p>
         </w:tc>
@@ -10486,7 +10590,7 @@
               <w:spacing w:after="40"/>
             </w:pPr>
             <w:r>
-              <w:t>1.1.0</w:t>
+              <w:t>1.7.0</w:t>
             </w:r>
           </w:p>
         </w:tc>
@@ -10536,7 +10640,10 @@
               <w:spacing w:after="40"/>
             </w:pPr>
             <w:r>
-              <w:t>Services moved directly under the hero and resized so all five fit in one screen height: one row of five cards on computers (checked at 1366 x 657 and 1920 x 960) and compact rows on tablets and phones (checked at 360 x 640, 390 x 740 and 768 x 900).</w:t>
+              <w:t>Added a Gain dial to the Ready when you are card that sets the height of the meter bars, styled like a plugin knob with a violet value arc and a dB readout. Range minus 12 dB (bars reach about a quarter height) to plus 3 dB (bars clip into the red), starting at 0 dB. Controls: drag up, down or sideways, mouse wheel, arrow keys (0.5 dB), Page Up and Page Down (3 dB), Home and End, and double-click to reset. Works with touch on phones. Announced to screen readers as a slider with its dB value. The dial only c</w:t>
+            </w:r>
+            <w:r>
+              <w:t>hanges two values on the meter bank; the bars keep animating on the graphics card. Tested in Chrome at 1366 and 390 px with mouse drag, double-click and keyboard.</w:t>
             </w:r>
           </w:p>
         </w:tc>
@@ -10569,7 +10676,7 @@
               <w:spacing w:after="40"/>
             </w:pPr>
             <w:r>
-              <w:t>1.0.0</w:t>
+              <w:t>1.6.2</w:t>
             </w:r>
           </w:p>
         </w:tc>
@@ -10619,7 +10726,7 @@
               <w:spacing w:after="40"/>
             </w:pPr>
             <w:r>
-              <w:t>Initial website build: seven pages, shared stylesheet, settings file, booking and pricing script, beat catalogue script.</w:t>
+              <w:t>Slowed the meter bank in the Ready when you are card by 25%. Each bar now loops over 3.3 to 4.8 seconds instead of 2.6 to 3.8, with start offsets scaled to match so the bars stay spread out and stereo pairs stay together.</w:t>
             </w:r>
           </w:p>
         </w:tc>
@@ -10652,7 +10759,7 @@
               <w:spacing w:after="40"/>
             </w:pPr>
             <w:r>
-              <w:t>1.0.0</w:t>
+              <w:t>1.6.1</w:t>
             </w:r>
           </w:p>
         </w:tc>
@@ -10702,7 +10809,10 @@
               <w:spacing w:after="40"/>
             </w:pPr>
             <w:r>
-              <w:t>Booking forms for recording + mixing and mastering, recording only and mixing and mastering, with live pricing, discount tables, one title field per track, file or link uploads, payment choice and policy agreement.</w:t>
+              <w:t>Replaced the analog VU meters with a digital meter bank in the style of DAW mixer meters: 14 stereo channel strips (28 bars) of LED segments lit ice blue at the bottom, violet in the middle and booth red at the top, with unlit segments faintly visible and a white peak-hold line on each bar. The bank is a background layer that fades into the card: towards the text on the left and down into the card at the bottom on desktop, and at both sides and the bottom on phones where it sits under the buttons. Performan</w:t>
+            </w:r>
+            <w:r>
+              <w:t>ce: segments and colours are static, only a dark cover over unlit segments and the peak line move (transform on the graphics card, no JavaScript per frame), six shared motion patterns are reused with different timing, left and right bars in a pair move together with a small offset, and the bank pauses when off screen. Tested in Chrome at 1366 and 390 px.</w:t>
             </w:r>
           </w:p>
         </w:tc>
@@ -10735,7 +10845,7 @@
               <w:spacing w:after="40"/>
             </w:pPr>
             <w:r>
-              <w:t>1.0.0</w:t>
+              <w:t>1.6.0</w:t>
             </w:r>
           </w:p>
         </w:tc>
@@ -10785,7 +10895,10 @@
               <w:spacing w:after="40"/>
             </w:pPr>
             <w:r>
-              <w:t>Request forms for custom beats and cover art, and a message form on the Contact page.</w:t>
+              <w:t>Added a pair of analog VU meters (L and R) to the Ready when you are card. Scale from minus 20 to plus 3 VU with the 0 to plus 3 red zone, glowing needles and a red peak light that flashes when a needle reaches the red. Needles follow fixed musical patterns of different lengths so the channels never move in sync. Performance: faces are drawn once as SVG, only the needles and peak lights animate (rotation and opacity, handled by the graphics card with no JavaScript per frame), the meters pause whenever the c</w:t>
+            </w:r>
+            <w:r>
+              <w:t>ard is off screen, and they stay still for visitors with reduced motion on. Tested in Chrome at 1366 and 390 px: running on screen, paused when scrolled away. On phones the meters sit under the buttons.</w:t>
             </w:r>
           </w:p>
         </w:tc>
@@ -10818,7 +10931,7 @@
               <w:spacing w:after="40"/>
             </w:pPr>
             <w:r>
-              <w:t>1.0.0</w:t>
+              <w:t>1.5.2</w:t>
             </w:r>
           </w:p>
         </w:tc>
@@ -10868,7 +10981,7 @@
               <w:spacing w:after="40"/>
             </w:pPr>
             <w:r>
-              <w:t>Booking summary with reference number, sent by WhatsApp or email until a form service is connected.</w:t>
+              <w:t>On phones and tablets (up to 860 px wide) the studio section heading, The studio / A room built around your voice, now sits on the bottom of the studio photo over a dark fade instead of below it. The description and gear list follow under the photo. Desktop layout is unchanged. The photo and text now fade in together as one block so the heading never shows without its photo.</w:t>
             </w:r>
           </w:p>
         </w:tc>
@@ -10901,7 +11014,7 @@
               <w:spacing w:after="40"/>
             </w:pPr>
             <w:r>
-              <w:t>1.0.0</w:t>
+              <w:t>1.5.1</w:t>
             </w:r>
           </w:p>
         </w:tc>
@@ -10951,7 +11064,7 @@
               <w:spacing w:after="40"/>
             </w:pPr>
             <w:r>
-              <w:t>Studio photos converted to WebP. Total image weight reduced from about 13 MB to 540 KB.</w:t>
+              <w:t>Phone menu button: removed its round border and background in both the closed and open states, so only the equalizer bars (and the X when open) show. The bar bounce and the open and close morph now run 25% slower.</w:t>
             </w:r>
           </w:p>
         </w:tc>
@@ -10984,7 +11097,7 @@
               <w:spacing w:after="40"/>
             </w:pPr>
             <w:r>
-              <w:t>1.0.0</w:t>
+              <w:t>1.5.0</w:t>
             </w:r>
           </w:p>
         </w:tc>
@@ -11034,7 +11147,10 @@
               <w:spacing w:after="40"/>
             </w:pPr>
             <w:r>
-              <w:t>Project organised into design, development and documentation folders.</w:t>
+              <w:t xml:space="preserve">Added mild animations. Scroll reveal: section headings, service cards, steps, policies, contact details, forms and summaries fade up 14 px as they come into view, with a short stagger inside grids. Only elements that start below the screen are animated, so nothing visible flickers on page load. Home hero: text rises in and the photo settles from a slight zoom, on the first home visit of a browsing session only. Hover: cards lift and their photos zoom slightly, card arrows nudge forward, buttons lift with a </w:t>
+            </w:r>
+            <w:r>
+              <w:t>violet glow, social icons lift. Booking: the estimated total pulses when it changes and the booking summary eases in. Tested in Chrome in real time on four pages: nothing on screen was hidden at load and every element was visible after scrolling.</w:t>
             </w:r>
           </w:p>
         </w:tc>
@@ -11067,6 +11183,1453 @@
               <w:spacing w:after="40"/>
             </w:pPr>
             <w:r>
+              <w:t>1.4.2</w:t>
+            </w:r>
+          </w:p>
+        </w:tc>
+        <w:tc>
+          <w:tcPr>
+            <w:tcW w:w="1582" w:type="dxa"/>
+            <w:tcBorders>
+              <w:top w:val="single" w:sz="4" w:space="0" w:color="C9C3E6"/>
+              <w:left w:val="single" w:sz="4" w:space="0" w:color="C9C3E6"/>
+              <w:bottom w:val="single" w:sz="4" w:space="0" w:color="C9C3E6"/>
+              <w:right w:val="single" w:sz="4" w:space="0" w:color="C9C3E6"/>
+            </w:tcBorders>
+            <w:tcMar>
+              <w:top w:w="80" w:type="dxa"/>
+              <w:left w:w="110" w:type="dxa"/>
+              <w:bottom w:w="80" w:type="dxa"/>
+              <w:right w:w="110" w:type="dxa"/>
+            </w:tcMar>
+          </w:tcPr>
+          <w:p>
+            <w:pPr>
+              <w:spacing w:after="40"/>
+            </w:pPr>
+            <w:r>
+              <w:t>27 Sep 2026</w:t>
+            </w:r>
+          </w:p>
+        </w:tc>
+        <w:tc>
+          <w:tcPr>
+            <w:tcW w:w="6515" w:type="dxa"/>
+            <w:tcBorders>
+              <w:top w:val="single" w:sz="4" w:space="0" w:color="C9C3E6"/>
+              <w:left w:val="single" w:sz="4" w:space="0" w:color="C9C3E6"/>
+              <w:bottom w:val="single" w:sz="4" w:space="0" w:color="C9C3E6"/>
+              <w:right w:val="single" w:sz="4" w:space="0" w:color="C9C3E6"/>
+            </w:tcBorders>
+            <w:tcMar>
+              <w:top w:w="80" w:type="dxa"/>
+              <w:left w:w="110" w:type="dxa"/>
+              <w:bottom w:w="80" w:type="dxa"/>
+              <w:right w:w="110" w:type="dxa"/>
+            </w:tcMar>
+          </w:tcPr>
+          <w:p>
+            <w:pPr>
+              <w:spacing w:after="40"/>
+            </w:pPr>
+            <w:r>
+              <w:t>On phones and small tablets (up to 820 px wide) the round icon to the left of the Altura Hertz wordmark in the header is hidden, leaving the wordmark and the equalizer menu button. Desktop and the footer keep the icon.</w:t>
+            </w:r>
+          </w:p>
+        </w:tc>
+      </w:tr>
+      <w:tr>
+        <w:tblPrEx>
+          <w:tblCellMar>
+            <w:top w:w="0" w:type="dxa"/>
+            <w:bottom w:w="0" w:type="dxa"/>
+          </w:tblCellMar>
+        </w:tblPrEx>
+        <w:tc>
+          <w:tcPr>
+            <w:tcW w:w="1209" w:type="dxa"/>
+            <w:tcBorders>
+              <w:top w:val="single" w:sz="4" w:space="0" w:color="C9C3E6"/>
+              <w:left w:val="single" w:sz="4" w:space="0" w:color="C9C3E6"/>
+              <w:bottom w:val="single" w:sz="4" w:space="0" w:color="C9C3E6"/>
+              <w:right w:val="single" w:sz="4" w:space="0" w:color="C9C3E6"/>
+            </w:tcBorders>
+            <w:tcMar>
+              <w:top w:w="80" w:type="dxa"/>
+              <w:left w:w="110" w:type="dxa"/>
+              <w:bottom w:w="80" w:type="dxa"/>
+              <w:right w:w="110" w:type="dxa"/>
+            </w:tcMar>
+          </w:tcPr>
+          <w:p>
+            <w:pPr>
+              <w:spacing w:after="40"/>
+            </w:pPr>
+            <w:r>
+              <w:t>1.4.1</w:t>
+            </w:r>
+          </w:p>
+        </w:tc>
+        <w:tc>
+          <w:tcPr>
+            <w:tcW w:w="1582" w:type="dxa"/>
+            <w:tcBorders>
+              <w:top w:val="single" w:sz="4" w:space="0" w:color="C9C3E6"/>
+              <w:left w:val="single" w:sz="4" w:space="0" w:color="C9C3E6"/>
+              <w:bottom w:val="single" w:sz="4" w:space="0" w:color="C9C3E6"/>
+              <w:right w:val="single" w:sz="4" w:space="0" w:color="C9C3E6"/>
+            </w:tcBorders>
+            <w:tcMar>
+              <w:top w:w="80" w:type="dxa"/>
+              <w:left w:w="110" w:type="dxa"/>
+              <w:bottom w:w="80" w:type="dxa"/>
+              <w:right w:w="110" w:type="dxa"/>
+            </w:tcMar>
+          </w:tcPr>
+          <w:p>
+            <w:pPr>
+              <w:spacing w:after="40"/>
+            </w:pPr>
+            <w:r>
+              <w:t>27 Sep 2026</w:t>
+            </w:r>
+          </w:p>
+        </w:tc>
+        <w:tc>
+          <w:tcPr>
+            <w:tcW w:w="6515" w:type="dxa"/>
+            <w:tcBorders>
+              <w:top w:val="single" w:sz="4" w:space="0" w:color="C9C3E6"/>
+              <w:left w:val="single" w:sz="4" w:space="0" w:color="C9C3E6"/>
+              <w:bottom w:val="single" w:sz="4" w:space="0" w:color="C9C3E6"/>
+              <w:right w:val="single" w:sz="4" w:space="0" w:color="C9C3E6"/>
+            </w:tcBorders>
+            <w:tcMar>
+              <w:top w:w="80" w:type="dxa"/>
+              <w:left w:w="110" w:type="dxa"/>
+              <w:bottom w:w="80" w:type="dxa"/>
+              <w:right w:w="110" w:type="dxa"/>
+            </w:tcMar>
+          </w:tcPr>
+          <w:p>
+            <w:pPr>
+              <w:spacing w:after="40"/>
+            </w:pPr>
+            <w:r>
+              <w:t>Halved the space above and below the Choose your session section. Measured before and after: phone 390 x 740 went from 92 to 49 px above and 156 to 78 px below; laptop 1366 x 657 from 67 to 34 px and 177 to 88 px; desktop 1920 x 960 from 163 to 84 px and 273 to 137 px. The section no longer stretches to fill the screen. All five cards still fit on screen when jumping to the section.</w:t>
+            </w:r>
+          </w:p>
+        </w:tc>
+      </w:tr>
+      <w:tr>
+        <w:tblPrEx>
+          <w:tblCellMar>
+            <w:top w:w="0" w:type="dxa"/>
+            <w:bottom w:w="0" w:type="dxa"/>
+          </w:tblCellMar>
+        </w:tblPrEx>
+        <w:tc>
+          <w:tcPr>
+            <w:tcW w:w="1209" w:type="dxa"/>
+            <w:tcBorders>
+              <w:top w:val="single" w:sz="4" w:space="0" w:color="C9C3E6"/>
+              <w:left w:val="single" w:sz="4" w:space="0" w:color="C9C3E6"/>
+              <w:bottom w:val="single" w:sz="4" w:space="0" w:color="C9C3E6"/>
+              <w:right w:val="single" w:sz="4" w:space="0" w:color="C9C3E6"/>
+            </w:tcBorders>
+            <w:tcMar>
+              <w:top w:w="80" w:type="dxa"/>
+              <w:left w:w="110" w:type="dxa"/>
+              <w:bottom w:w="80" w:type="dxa"/>
+              <w:right w:w="110" w:type="dxa"/>
+            </w:tcMar>
+          </w:tcPr>
+          <w:p>
+            <w:pPr>
+              <w:spacing w:after="40"/>
+            </w:pPr>
+            <w:r>
+              <w:t>1.4.0</w:t>
+            </w:r>
+          </w:p>
+        </w:tc>
+        <w:tc>
+          <w:tcPr>
+            <w:tcW w:w="1582" w:type="dxa"/>
+            <w:tcBorders>
+              <w:top w:val="single" w:sz="4" w:space="0" w:color="C9C3E6"/>
+              <w:left w:val="single" w:sz="4" w:space="0" w:color="C9C3E6"/>
+              <w:bottom w:val="single" w:sz="4" w:space="0" w:color="C9C3E6"/>
+              <w:right w:val="single" w:sz="4" w:space="0" w:color="C9C3E6"/>
+            </w:tcBorders>
+            <w:tcMar>
+              <w:top w:w="80" w:type="dxa"/>
+              <w:left w:w="110" w:type="dxa"/>
+              <w:bottom w:w="80" w:type="dxa"/>
+              <w:right w:w="110" w:type="dxa"/>
+            </w:tcMar>
+          </w:tcPr>
+          <w:p>
+            <w:pPr>
+              <w:spacing w:after="40"/>
+            </w:pPr>
+            <w:r>
+              <w:t>27 Sep 2026</w:t>
+            </w:r>
+          </w:p>
+        </w:tc>
+        <w:tc>
+          <w:tcPr>
+            <w:tcW w:w="6515" w:type="dxa"/>
+            <w:tcBorders>
+              <w:top w:val="single" w:sz="4" w:space="0" w:color="C9C3E6"/>
+              <w:left w:val="single" w:sz="4" w:space="0" w:color="C9C3E6"/>
+              <w:bottom w:val="single" w:sz="4" w:space="0" w:color="C9C3E6"/>
+              <w:right w:val="single" w:sz="4" w:space="0" w:color="C9C3E6"/>
+            </w:tcBorders>
+            <w:tcMar>
+              <w:top w:w="80" w:type="dxa"/>
+              <w:left w:w="110" w:type="dxa"/>
+              <w:bottom w:w="80" w:type="dxa"/>
+              <w:right w:w="110" w:type="dxa"/>
+            </w:tcMar>
+          </w:tcPr>
+          <w:p>
+            <w:pPr>
+              <w:spacing w:after="40"/>
+            </w:pPr>
+            <w:r>
+              <w:t>Redesigned the phone menu button as an animated equalizer. Closed, four gradient bars bounce like a level meter. Open, the outer bars drop out, the middle two cross into an X and the button glows violet. The menu now slides down with a staggered reveal of each link, the Book a session button fills the full width, and the menu closes with Escape or a tap outside it.</w:t>
+            </w:r>
+          </w:p>
+        </w:tc>
+      </w:tr>
+      <w:tr>
+        <w:tblPrEx>
+          <w:tblCellMar>
+            <w:top w:w="0" w:type="dxa"/>
+            <w:bottom w:w="0" w:type="dxa"/>
+          </w:tblCellMar>
+        </w:tblPrEx>
+        <w:tc>
+          <w:tcPr>
+            <w:tcW w:w="1209" w:type="dxa"/>
+            <w:tcBorders>
+              <w:top w:val="single" w:sz="4" w:space="0" w:color="C9C3E6"/>
+              <w:left w:val="single" w:sz="4" w:space="0" w:color="C9C3E6"/>
+              <w:bottom w:val="single" w:sz="4" w:space="0" w:color="C9C3E6"/>
+              <w:right w:val="single" w:sz="4" w:space="0" w:color="C9C3E6"/>
+            </w:tcBorders>
+            <w:tcMar>
+              <w:top w:w="80" w:type="dxa"/>
+              <w:left w:w="110" w:type="dxa"/>
+              <w:bottom w:w="80" w:type="dxa"/>
+              <w:right w:w="110" w:type="dxa"/>
+            </w:tcMar>
+          </w:tcPr>
+          <w:p>
+            <w:pPr>
+              <w:spacing w:after="40"/>
+            </w:pPr>
+            <w:r>
+              <w:t>1.3.2</w:t>
+            </w:r>
+          </w:p>
+        </w:tc>
+        <w:tc>
+          <w:tcPr>
+            <w:tcW w:w="1582" w:type="dxa"/>
+            <w:tcBorders>
+              <w:top w:val="single" w:sz="4" w:space="0" w:color="C9C3E6"/>
+              <w:left w:val="single" w:sz="4" w:space="0" w:color="C9C3E6"/>
+              <w:bottom w:val="single" w:sz="4" w:space="0" w:color="C9C3E6"/>
+              <w:right w:val="single" w:sz="4" w:space="0" w:color="C9C3E6"/>
+            </w:tcBorders>
+            <w:tcMar>
+              <w:top w:w="80" w:type="dxa"/>
+              <w:left w:w="110" w:type="dxa"/>
+              <w:bottom w:w="80" w:type="dxa"/>
+              <w:right w:w="110" w:type="dxa"/>
+            </w:tcMar>
+          </w:tcPr>
+          <w:p>
+            <w:pPr>
+              <w:spacing w:after="40"/>
+            </w:pPr>
+            <w:r>
+              <w:t>27 Sep 2026</w:t>
+            </w:r>
+          </w:p>
+        </w:tc>
+        <w:tc>
+          <w:tcPr>
+            <w:tcW w:w="6515" w:type="dxa"/>
+            <w:tcBorders>
+              <w:top w:val="single" w:sz="4" w:space="0" w:color="C9C3E6"/>
+              <w:left w:val="single" w:sz="4" w:space="0" w:color="C9C3E6"/>
+              <w:bottom w:val="single" w:sz="4" w:space="0" w:color="C9C3E6"/>
+              <w:right w:val="single" w:sz="4" w:space="0" w:color="C9C3E6"/>
+            </w:tcBorders>
+            <w:tcMar>
+              <w:top w:w="80" w:type="dxa"/>
+              <w:left w:w="110" w:type="dxa"/>
+              <w:bottom w:w="80" w:type="dxa"/>
+              <w:right w:w="110" w:type="dxa"/>
+            </w:tcMar>
+          </w:tcPr>
+          <w:p>
+            <w:pPr>
+              <w:spacing w:after="40"/>
+            </w:pPr>
+            <w:r>
+              <w:t>Removed the All prices in Ghana cedis note from the footer. Removed the divider lines between sections: under the header, under the hero and page headings, above the footer and above the copyright line.</w:t>
+            </w:r>
+          </w:p>
+        </w:tc>
+      </w:tr>
+      <w:tr>
+        <w:tblPrEx>
+          <w:tblCellMar>
+            <w:top w:w="0" w:type="dxa"/>
+            <w:bottom w:w="0" w:type="dxa"/>
+          </w:tblCellMar>
+        </w:tblPrEx>
+        <w:tc>
+          <w:tcPr>
+            <w:tcW w:w="1209" w:type="dxa"/>
+            <w:tcBorders>
+              <w:top w:val="single" w:sz="4" w:space="0" w:color="C9C3E6"/>
+              <w:left w:val="single" w:sz="4" w:space="0" w:color="C9C3E6"/>
+              <w:bottom w:val="single" w:sz="4" w:space="0" w:color="C9C3E6"/>
+              <w:right w:val="single" w:sz="4" w:space="0" w:color="C9C3E6"/>
+            </w:tcBorders>
+            <w:tcMar>
+              <w:top w:w="80" w:type="dxa"/>
+              <w:left w:w="110" w:type="dxa"/>
+              <w:bottom w:w="80" w:type="dxa"/>
+              <w:right w:w="110" w:type="dxa"/>
+            </w:tcMar>
+          </w:tcPr>
+          <w:p>
+            <w:pPr>
+              <w:spacing w:after="40"/>
+            </w:pPr>
+            <w:r>
+              <w:t>1.3.1</w:t>
+            </w:r>
+          </w:p>
+        </w:tc>
+        <w:tc>
+          <w:tcPr>
+            <w:tcW w:w="1582" w:type="dxa"/>
+            <w:tcBorders>
+              <w:top w:val="single" w:sz="4" w:space="0" w:color="C9C3E6"/>
+              <w:left w:val="single" w:sz="4" w:space="0" w:color="C9C3E6"/>
+              <w:bottom w:val="single" w:sz="4" w:space="0" w:color="C9C3E6"/>
+              <w:right w:val="single" w:sz="4" w:space="0" w:color="C9C3E6"/>
+            </w:tcBorders>
+            <w:tcMar>
+              <w:top w:w="80" w:type="dxa"/>
+              <w:left w:w="110" w:type="dxa"/>
+              <w:bottom w:w="80" w:type="dxa"/>
+              <w:right w:w="110" w:type="dxa"/>
+            </w:tcMar>
+          </w:tcPr>
+          <w:p>
+            <w:pPr>
+              <w:spacing w:after="40"/>
+            </w:pPr>
+            <w:r>
+              <w:t>27 Sep 2026</w:t>
+            </w:r>
+          </w:p>
+        </w:tc>
+        <w:tc>
+          <w:tcPr>
+            <w:tcW w:w="6515" w:type="dxa"/>
+            <w:tcBorders>
+              <w:top w:val="single" w:sz="4" w:space="0" w:color="C9C3E6"/>
+              <w:left w:val="single" w:sz="4" w:space="0" w:color="C9C3E6"/>
+              <w:bottom w:val="single" w:sz="4" w:space="0" w:color="C9C3E6"/>
+              <w:right w:val="single" w:sz="4" w:space="0" w:color="C9C3E6"/>
+            </w:tcBorders>
+            <w:tcMar>
+              <w:top w:w="80" w:type="dxa"/>
+              <w:left w:w="110" w:type="dxa"/>
+              <w:bottom w:w="80" w:type="dxa"/>
+              <w:right w:w="110" w:type="dxa"/>
+            </w:tcMar>
+          </w:tcPr>
+          <w:p>
+            <w:pPr>
+              <w:spacing w:after="40"/>
+            </w:pPr>
+            <w:r>
+              <w:t xml:space="preserve">All six social icons now always show in the footer. Icons whose link is not set yet in </w:t>
+            </w:r>
+            <w:r>
+              <w:rPr>
+                <w:rFonts w:ascii="Consolas" w:eastAsia="Consolas" w:hAnsi="Consolas" w:cs="Consolas"/>
+                <w:color w:val="4E11DC"/>
+                <w:sz w:val="19"/>
+                <w:szCs w:val="19"/>
+              </w:rPr>
+              <w:t>config.js</w:t>
+            </w:r>
+            <w:r>
+              <w:t xml:space="preserve"> stay visible but do nothing when clicked, and show a coming soon tooltip.</w:t>
+            </w:r>
+          </w:p>
+        </w:tc>
+      </w:tr>
+      <w:tr>
+        <w:tblPrEx>
+          <w:tblCellMar>
+            <w:top w:w="0" w:type="dxa"/>
+            <w:bottom w:w="0" w:type="dxa"/>
+          </w:tblCellMar>
+        </w:tblPrEx>
+        <w:tc>
+          <w:tcPr>
+            <w:tcW w:w="1209" w:type="dxa"/>
+            <w:tcBorders>
+              <w:top w:val="single" w:sz="4" w:space="0" w:color="C9C3E6"/>
+              <w:left w:val="single" w:sz="4" w:space="0" w:color="C9C3E6"/>
+              <w:bottom w:val="single" w:sz="4" w:space="0" w:color="C9C3E6"/>
+              <w:right w:val="single" w:sz="4" w:space="0" w:color="C9C3E6"/>
+            </w:tcBorders>
+            <w:tcMar>
+              <w:top w:w="80" w:type="dxa"/>
+              <w:left w:w="110" w:type="dxa"/>
+              <w:bottom w:w="80" w:type="dxa"/>
+              <w:right w:w="110" w:type="dxa"/>
+            </w:tcMar>
+          </w:tcPr>
+          <w:p>
+            <w:pPr>
+              <w:spacing w:after="40"/>
+            </w:pPr>
+            <w:r>
+              <w:t>1.3.0</w:t>
+            </w:r>
+          </w:p>
+        </w:tc>
+        <w:tc>
+          <w:tcPr>
+            <w:tcW w:w="1582" w:type="dxa"/>
+            <w:tcBorders>
+              <w:top w:val="single" w:sz="4" w:space="0" w:color="C9C3E6"/>
+              <w:left w:val="single" w:sz="4" w:space="0" w:color="C9C3E6"/>
+              <w:bottom w:val="single" w:sz="4" w:space="0" w:color="C9C3E6"/>
+              <w:right w:val="single" w:sz="4" w:space="0" w:color="C9C3E6"/>
+            </w:tcBorders>
+            <w:tcMar>
+              <w:top w:w="80" w:type="dxa"/>
+              <w:left w:w="110" w:type="dxa"/>
+              <w:bottom w:w="80" w:type="dxa"/>
+              <w:right w:w="110" w:type="dxa"/>
+            </w:tcMar>
+          </w:tcPr>
+          <w:p>
+            <w:pPr>
+              <w:spacing w:after="40"/>
+            </w:pPr>
+            <w:r>
+              <w:t>27 Sep 2026</w:t>
+            </w:r>
+          </w:p>
+        </w:tc>
+        <w:tc>
+          <w:tcPr>
+            <w:tcW w:w="6515" w:type="dxa"/>
+            <w:tcBorders>
+              <w:top w:val="single" w:sz="4" w:space="0" w:color="C9C3E6"/>
+              <w:left w:val="single" w:sz="4" w:space="0" w:color="C9C3E6"/>
+              <w:bottom w:val="single" w:sz="4" w:space="0" w:color="C9C3E6"/>
+              <w:right w:val="single" w:sz="4" w:space="0" w:color="C9C3E6"/>
+            </w:tcBorders>
+            <w:tcMar>
+              <w:top w:w="80" w:type="dxa"/>
+              <w:left w:w="110" w:type="dxa"/>
+              <w:bottom w:w="80" w:type="dxa"/>
+              <w:right w:w="110" w:type="dxa"/>
+            </w:tcMar>
+          </w:tcPr>
+          <w:p>
+            <w:pPr>
+              <w:spacing w:after="40"/>
+            </w:pPr>
+            <w:r>
+              <w:t xml:space="preserve">Added a row of social media icons to the footer, modelled on </w:t>
+            </w:r>
+            <w:r>
+              <w:rPr>
+                <w:rFonts w:ascii="Consolas" w:eastAsia="Consolas" w:hAnsi="Consolas" w:cs="Consolas"/>
+                <w:color w:val="4E11DC"/>
+                <w:sz w:val="19"/>
+                <w:szCs w:val="19"/>
+              </w:rPr>
+              <w:t>design/inspo/socials footer.png</w:t>
+            </w:r>
+            <w:r>
+              <w:t xml:space="preserve">: Facebook, Instagram, Threads, YouTube, TikTok and WhatsApp. Icons are white, turn violet on hover, and each only appears once its link is set in </w:t>
+            </w:r>
+            <w:r>
+              <w:rPr>
+                <w:rFonts w:ascii="Consolas" w:eastAsia="Consolas" w:hAnsi="Consolas" w:cs="Consolas"/>
+                <w:color w:val="4E11DC"/>
+                <w:sz w:val="19"/>
+                <w:szCs w:val="19"/>
+              </w:rPr>
+              <w:t>config.js</w:t>
+            </w:r>
+            <w:r>
+              <w:t>. The text links for WhatsApp, Instagram, TikTok and YouTube were removed from the Studio column since the icons replace them.</w:t>
+            </w:r>
+          </w:p>
+        </w:tc>
+      </w:tr>
+      <w:tr>
+        <w:tblPrEx>
+          <w:tblCellMar>
+            <w:top w:w="0" w:type="dxa"/>
+            <w:bottom w:w="0" w:type="dxa"/>
+          </w:tblCellMar>
+        </w:tblPrEx>
+        <w:tc>
+          <w:tcPr>
+            <w:tcW w:w="1209" w:type="dxa"/>
+            <w:tcBorders>
+              <w:top w:val="single" w:sz="4" w:space="0" w:color="C9C3E6"/>
+              <w:left w:val="single" w:sz="4" w:space="0" w:color="C9C3E6"/>
+              <w:bottom w:val="single" w:sz="4" w:space="0" w:color="C9C3E6"/>
+              <w:right w:val="single" w:sz="4" w:space="0" w:color="C9C3E6"/>
+            </w:tcBorders>
+            <w:tcMar>
+              <w:top w:w="80" w:type="dxa"/>
+              <w:left w:w="110" w:type="dxa"/>
+              <w:bottom w:w="80" w:type="dxa"/>
+              <w:right w:w="110" w:type="dxa"/>
+            </w:tcMar>
+          </w:tcPr>
+          <w:p>
+            <w:pPr>
+              <w:spacing w:after="40"/>
+            </w:pPr>
+            <w:r>
+              <w:t>1.2.1</w:t>
+            </w:r>
+          </w:p>
+        </w:tc>
+        <w:tc>
+          <w:tcPr>
+            <w:tcW w:w="1582" w:type="dxa"/>
+            <w:tcBorders>
+              <w:top w:val="single" w:sz="4" w:space="0" w:color="C9C3E6"/>
+              <w:left w:val="single" w:sz="4" w:space="0" w:color="C9C3E6"/>
+              <w:bottom w:val="single" w:sz="4" w:space="0" w:color="C9C3E6"/>
+              <w:right w:val="single" w:sz="4" w:space="0" w:color="C9C3E6"/>
+            </w:tcBorders>
+            <w:tcMar>
+              <w:top w:w="80" w:type="dxa"/>
+              <w:left w:w="110" w:type="dxa"/>
+              <w:bottom w:w="80" w:type="dxa"/>
+              <w:right w:w="110" w:type="dxa"/>
+            </w:tcMar>
+          </w:tcPr>
+          <w:p>
+            <w:pPr>
+              <w:spacing w:after="40"/>
+            </w:pPr>
+            <w:r>
+              <w:t>27 Sep 2026</w:t>
+            </w:r>
+          </w:p>
+        </w:tc>
+        <w:tc>
+          <w:tcPr>
+            <w:tcW w:w="6515" w:type="dxa"/>
+            <w:tcBorders>
+              <w:top w:val="single" w:sz="4" w:space="0" w:color="C9C3E6"/>
+              <w:left w:val="single" w:sz="4" w:space="0" w:color="C9C3E6"/>
+              <w:bottom w:val="single" w:sz="4" w:space="0" w:color="C9C3E6"/>
+              <w:right w:val="single" w:sz="4" w:space="0" w:color="C9C3E6"/>
+            </w:tcBorders>
+            <w:tcMar>
+              <w:top w:w="80" w:type="dxa"/>
+              <w:left w:w="110" w:type="dxa"/>
+              <w:bottom w:w="80" w:type="dxa"/>
+              <w:right w:w="110" w:type="dxa"/>
+            </w:tcMar>
+          </w:tcPr>
+          <w:p>
+            <w:pPr>
+              <w:spacing w:after="40"/>
+            </w:pPr>
+            <w:r>
+              <w:t>Removed the Services column from the footer on every page. The footer now shows the studio name and description on the left and the Studio links on the right.</w:t>
+            </w:r>
+          </w:p>
+        </w:tc>
+      </w:tr>
+      <w:tr>
+        <w:tblPrEx>
+          <w:tblCellMar>
+            <w:top w:w="0" w:type="dxa"/>
+            <w:bottom w:w="0" w:type="dxa"/>
+          </w:tblCellMar>
+        </w:tblPrEx>
+        <w:tc>
+          <w:tcPr>
+            <w:tcW w:w="1209" w:type="dxa"/>
+            <w:tcBorders>
+              <w:top w:val="single" w:sz="4" w:space="0" w:color="C9C3E6"/>
+              <w:left w:val="single" w:sz="4" w:space="0" w:color="C9C3E6"/>
+              <w:bottom w:val="single" w:sz="4" w:space="0" w:color="C9C3E6"/>
+              <w:right w:val="single" w:sz="4" w:space="0" w:color="C9C3E6"/>
+            </w:tcBorders>
+            <w:tcMar>
+              <w:top w:w="80" w:type="dxa"/>
+              <w:left w:w="110" w:type="dxa"/>
+              <w:bottom w:w="80" w:type="dxa"/>
+              <w:right w:w="110" w:type="dxa"/>
+            </w:tcMar>
+          </w:tcPr>
+          <w:p>
+            <w:pPr>
+              <w:spacing w:after="40"/>
+            </w:pPr>
+            <w:r>
+              <w:t>1.2.0</w:t>
+            </w:r>
+          </w:p>
+        </w:tc>
+        <w:tc>
+          <w:tcPr>
+            <w:tcW w:w="1582" w:type="dxa"/>
+            <w:tcBorders>
+              <w:top w:val="single" w:sz="4" w:space="0" w:color="C9C3E6"/>
+              <w:left w:val="single" w:sz="4" w:space="0" w:color="C9C3E6"/>
+              <w:bottom w:val="single" w:sz="4" w:space="0" w:color="C9C3E6"/>
+              <w:right w:val="single" w:sz="4" w:space="0" w:color="C9C3E6"/>
+            </w:tcBorders>
+            <w:tcMar>
+              <w:top w:w="80" w:type="dxa"/>
+              <w:left w:w="110" w:type="dxa"/>
+              <w:bottom w:w="80" w:type="dxa"/>
+              <w:right w:w="110" w:type="dxa"/>
+            </w:tcMar>
+          </w:tcPr>
+          <w:p>
+            <w:pPr>
+              <w:spacing w:after="40"/>
+            </w:pPr>
+            <w:r>
+              <w:t>27 Sep 2026</w:t>
+            </w:r>
+          </w:p>
+        </w:tc>
+        <w:tc>
+          <w:tcPr>
+            <w:tcW w:w="6515" w:type="dxa"/>
+            <w:tcBorders>
+              <w:top w:val="single" w:sz="4" w:space="0" w:color="C9C3E6"/>
+              <w:left w:val="single" w:sz="4" w:space="0" w:color="C9C3E6"/>
+              <w:bottom w:val="single" w:sz="4" w:space="0" w:color="C9C3E6"/>
+              <w:right w:val="single" w:sz="4" w:space="0" w:color="C9C3E6"/>
+            </w:tcBorders>
+            <w:tcMar>
+              <w:top w:w="80" w:type="dxa"/>
+              <w:left w:w="110" w:type="dxa"/>
+              <w:bottom w:w="80" w:type="dxa"/>
+              <w:right w:w="110" w:type="dxa"/>
+            </w:tcMar>
+          </w:tcPr>
+          <w:p>
+            <w:pPr>
+              <w:spacing w:after="40"/>
+            </w:pPr>
+            <w:r>
+              <w:t>Landing page photo re-exported from the full size original (4032 x 3024) at 1280, 1920, 2560 and 3840 pixels wide with higher quality and light sharpening. The page now loads the size that suits each screen and requests it early, so it is sharp on high resolution laptops and phones. Replaces the single 1920 pixel file.</w:t>
+            </w:r>
+          </w:p>
+        </w:tc>
+      </w:tr>
+      <w:tr>
+        <w:tblPrEx>
+          <w:tblCellMar>
+            <w:top w:w="0" w:type="dxa"/>
+            <w:bottom w:w="0" w:type="dxa"/>
+          </w:tblCellMar>
+        </w:tblPrEx>
+        <w:tc>
+          <w:tcPr>
+            <w:tcW w:w="1209" w:type="dxa"/>
+            <w:tcBorders>
+              <w:top w:val="single" w:sz="4" w:space="0" w:color="C9C3E6"/>
+              <w:left w:val="single" w:sz="4" w:space="0" w:color="C9C3E6"/>
+              <w:bottom w:val="single" w:sz="4" w:space="0" w:color="C9C3E6"/>
+              <w:right w:val="single" w:sz="4" w:space="0" w:color="C9C3E6"/>
+            </w:tcBorders>
+            <w:tcMar>
+              <w:top w:w="80" w:type="dxa"/>
+              <w:left w:w="110" w:type="dxa"/>
+              <w:bottom w:w="80" w:type="dxa"/>
+              <w:right w:w="110" w:type="dxa"/>
+            </w:tcMar>
+          </w:tcPr>
+          <w:p>
+            <w:pPr>
+              <w:spacing w:after="40"/>
+            </w:pPr>
+            <w:r>
+              <w:t>1.1.0</w:t>
+            </w:r>
+          </w:p>
+        </w:tc>
+        <w:tc>
+          <w:tcPr>
+            <w:tcW w:w="1582" w:type="dxa"/>
+            <w:tcBorders>
+              <w:top w:val="single" w:sz="4" w:space="0" w:color="C9C3E6"/>
+              <w:left w:val="single" w:sz="4" w:space="0" w:color="C9C3E6"/>
+              <w:bottom w:val="single" w:sz="4" w:space="0" w:color="C9C3E6"/>
+              <w:right w:val="single" w:sz="4" w:space="0" w:color="C9C3E6"/>
+            </w:tcBorders>
+            <w:tcMar>
+              <w:top w:w="80" w:type="dxa"/>
+              <w:left w:w="110" w:type="dxa"/>
+              <w:bottom w:w="80" w:type="dxa"/>
+              <w:right w:w="110" w:type="dxa"/>
+            </w:tcMar>
+          </w:tcPr>
+          <w:p>
+            <w:pPr>
+              <w:spacing w:after="40"/>
+            </w:pPr>
+            <w:r>
+              <w:t>27 Sep 2026</w:t>
+            </w:r>
+          </w:p>
+        </w:tc>
+        <w:tc>
+          <w:tcPr>
+            <w:tcW w:w="6515" w:type="dxa"/>
+            <w:tcBorders>
+              <w:top w:val="single" w:sz="4" w:space="0" w:color="C9C3E6"/>
+              <w:left w:val="single" w:sz="4" w:space="0" w:color="C9C3E6"/>
+              <w:bottom w:val="single" w:sz="4" w:space="0" w:color="C9C3E6"/>
+              <w:right w:val="single" w:sz="4" w:space="0" w:color="C9C3E6"/>
+            </w:tcBorders>
+            <w:tcMar>
+              <w:top w:w="80" w:type="dxa"/>
+              <w:left w:w="110" w:type="dxa"/>
+              <w:bottom w:w="80" w:type="dxa"/>
+              <w:right w:w="110" w:type="dxa"/>
+            </w:tcMar>
+          </w:tcPr>
+          <w:p>
+            <w:pPr>
+              <w:spacing w:after="40"/>
+            </w:pPr>
+            <w:r>
+              <w:t>Fixed the flicker when moving between pages: fonts and icons are now bundled with the site and preloaded, the dark background is set before styles load, icons keep a fixed size while loading, and pages fade into each other with the header held still.</w:t>
+            </w:r>
+          </w:p>
+        </w:tc>
+      </w:tr>
+      <w:tr>
+        <w:tblPrEx>
+          <w:tblCellMar>
+            <w:top w:w="0" w:type="dxa"/>
+            <w:bottom w:w="0" w:type="dxa"/>
+          </w:tblCellMar>
+        </w:tblPrEx>
+        <w:tc>
+          <w:tcPr>
+            <w:tcW w:w="1209" w:type="dxa"/>
+            <w:tcBorders>
+              <w:top w:val="single" w:sz="4" w:space="0" w:color="C9C3E6"/>
+              <w:left w:val="single" w:sz="4" w:space="0" w:color="C9C3E6"/>
+              <w:bottom w:val="single" w:sz="4" w:space="0" w:color="C9C3E6"/>
+              <w:right w:val="single" w:sz="4" w:space="0" w:color="C9C3E6"/>
+            </w:tcBorders>
+            <w:tcMar>
+              <w:top w:w="80" w:type="dxa"/>
+              <w:left w:w="110" w:type="dxa"/>
+              <w:bottom w:w="80" w:type="dxa"/>
+              <w:right w:w="110" w:type="dxa"/>
+            </w:tcMar>
+          </w:tcPr>
+          <w:p>
+            <w:pPr>
+              <w:spacing w:after="40"/>
+            </w:pPr>
+            <w:r>
+              <w:t>1.1.0</w:t>
+            </w:r>
+          </w:p>
+        </w:tc>
+        <w:tc>
+          <w:tcPr>
+            <w:tcW w:w="1582" w:type="dxa"/>
+            <w:tcBorders>
+              <w:top w:val="single" w:sz="4" w:space="0" w:color="C9C3E6"/>
+              <w:left w:val="single" w:sz="4" w:space="0" w:color="C9C3E6"/>
+              <w:bottom w:val="single" w:sz="4" w:space="0" w:color="C9C3E6"/>
+              <w:right w:val="single" w:sz="4" w:space="0" w:color="C9C3E6"/>
+            </w:tcBorders>
+            <w:tcMar>
+              <w:top w:w="80" w:type="dxa"/>
+              <w:left w:w="110" w:type="dxa"/>
+              <w:bottom w:w="80" w:type="dxa"/>
+              <w:right w:w="110" w:type="dxa"/>
+            </w:tcMar>
+          </w:tcPr>
+          <w:p>
+            <w:pPr>
+              <w:spacing w:after="40"/>
+            </w:pPr>
+            <w:r>
+              <w:t>27 Sep 2026</w:t>
+            </w:r>
+          </w:p>
+        </w:tc>
+        <w:tc>
+          <w:tcPr>
+            <w:tcW w:w="6515" w:type="dxa"/>
+            <w:tcBorders>
+              <w:top w:val="single" w:sz="4" w:space="0" w:color="C9C3E6"/>
+              <w:left w:val="single" w:sz="4" w:space="0" w:color="C9C3E6"/>
+              <w:bottom w:val="single" w:sz="4" w:space="0" w:color="C9C3E6"/>
+              <w:right w:val="single" w:sz="4" w:space="0" w:color="C9C3E6"/>
+            </w:tcBorders>
+            <w:tcMar>
+              <w:top w:w="80" w:type="dxa"/>
+              <w:left w:w="110" w:type="dxa"/>
+              <w:bottom w:w="80" w:type="dxa"/>
+              <w:right w:w="110" w:type="dxa"/>
+            </w:tcMar>
+          </w:tcPr>
+          <w:p>
+            <w:pPr>
+              <w:spacing w:after="40"/>
+            </w:pPr>
+            <w:r>
+              <w:t>Book a session no longer animates a scroll while the next page is loading. Smooth scrolling now only applies to links within the same page, and the phone menu closes after a tap.</w:t>
+            </w:r>
+          </w:p>
+        </w:tc>
+      </w:tr>
+      <w:tr>
+        <w:tblPrEx>
+          <w:tblCellMar>
+            <w:top w:w="0" w:type="dxa"/>
+            <w:bottom w:w="0" w:type="dxa"/>
+          </w:tblCellMar>
+        </w:tblPrEx>
+        <w:tc>
+          <w:tcPr>
+            <w:tcW w:w="1209" w:type="dxa"/>
+            <w:tcBorders>
+              <w:top w:val="single" w:sz="4" w:space="0" w:color="C9C3E6"/>
+              <w:left w:val="single" w:sz="4" w:space="0" w:color="C9C3E6"/>
+              <w:bottom w:val="single" w:sz="4" w:space="0" w:color="C9C3E6"/>
+              <w:right w:val="single" w:sz="4" w:space="0" w:color="C9C3E6"/>
+            </w:tcBorders>
+            <w:tcMar>
+              <w:top w:w="80" w:type="dxa"/>
+              <w:left w:w="110" w:type="dxa"/>
+              <w:bottom w:w="80" w:type="dxa"/>
+              <w:right w:w="110" w:type="dxa"/>
+            </w:tcMar>
+          </w:tcPr>
+          <w:p>
+            <w:pPr>
+              <w:spacing w:after="40"/>
+            </w:pPr>
+            <w:r>
+              <w:t>1.1.0</w:t>
+            </w:r>
+          </w:p>
+        </w:tc>
+        <w:tc>
+          <w:tcPr>
+            <w:tcW w:w="1582" w:type="dxa"/>
+            <w:tcBorders>
+              <w:top w:val="single" w:sz="4" w:space="0" w:color="C9C3E6"/>
+              <w:left w:val="single" w:sz="4" w:space="0" w:color="C9C3E6"/>
+              <w:bottom w:val="single" w:sz="4" w:space="0" w:color="C9C3E6"/>
+              <w:right w:val="single" w:sz="4" w:space="0" w:color="C9C3E6"/>
+            </w:tcBorders>
+            <w:tcMar>
+              <w:top w:w="80" w:type="dxa"/>
+              <w:left w:w="110" w:type="dxa"/>
+              <w:bottom w:w="80" w:type="dxa"/>
+              <w:right w:w="110" w:type="dxa"/>
+            </w:tcMar>
+          </w:tcPr>
+          <w:p>
+            <w:pPr>
+              <w:spacing w:after="40"/>
+            </w:pPr>
+            <w:r>
+              <w:t>27 Sep 2026</w:t>
+            </w:r>
+          </w:p>
+        </w:tc>
+        <w:tc>
+          <w:tcPr>
+            <w:tcW w:w="6515" w:type="dxa"/>
+            <w:tcBorders>
+              <w:top w:val="single" w:sz="4" w:space="0" w:color="C9C3E6"/>
+              <w:left w:val="single" w:sz="4" w:space="0" w:color="C9C3E6"/>
+              <w:bottom w:val="single" w:sz="4" w:space="0" w:color="C9C3E6"/>
+              <w:right w:val="single" w:sz="4" w:space="0" w:color="C9C3E6"/>
+            </w:tcBorders>
+            <w:tcMar>
+              <w:top w:w="80" w:type="dxa"/>
+              <w:left w:w="110" w:type="dxa"/>
+              <w:bottom w:w="80" w:type="dxa"/>
+              <w:right w:w="110" w:type="dxa"/>
+            </w:tcMar>
+          </w:tcPr>
+          <w:p>
+            <w:pPr>
+              <w:spacing w:after="40"/>
+            </w:pPr>
+            <w:r>
+              <w:t>Services moved directly under the hero and resized so all five fit in one screen height: one row of five cards on computers (checked at 1366 x 657 and 1920 x 960) and compact rows on tablets and phones (checked at 360 x 640, 390 x 740 and 768 x 900).</w:t>
+            </w:r>
+          </w:p>
+        </w:tc>
+      </w:tr>
+      <w:tr>
+        <w:tblPrEx>
+          <w:tblCellMar>
+            <w:top w:w="0" w:type="dxa"/>
+            <w:bottom w:w="0" w:type="dxa"/>
+          </w:tblCellMar>
+        </w:tblPrEx>
+        <w:tc>
+          <w:tcPr>
+            <w:tcW w:w="1209" w:type="dxa"/>
+            <w:tcBorders>
+              <w:top w:val="single" w:sz="4" w:space="0" w:color="C9C3E6"/>
+              <w:left w:val="single" w:sz="4" w:space="0" w:color="C9C3E6"/>
+              <w:bottom w:val="single" w:sz="4" w:space="0" w:color="C9C3E6"/>
+              <w:right w:val="single" w:sz="4" w:space="0" w:color="C9C3E6"/>
+            </w:tcBorders>
+            <w:tcMar>
+              <w:top w:w="80" w:type="dxa"/>
+              <w:left w:w="110" w:type="dxa"/>
+              <w:bottom w:w="80" w:type="dxa"/>
+              <w:right w:w="110" w:type="dxa"/>
+            </w:tcMar>
+          </w:tcPr>
+          <w:p>
+            <w:pPr>
+              <w:spacing w:after="40"/>
+            </w:pPr>
+            <w:r>
+              <w:t>1.0.0</w:t>
+            </w:r>
+          </w:p>
+        </w:tc>
+        <w:tc>
+          <w:tcPr>
+            <w:tcW w:w="1582" w:type="dxa"/>
+            <w:tcBorders>
+              <w:top w:val="single" w:sz="4" w:space="0" w:color="C9C3E6"/>
+              <w:left w:val="single" w:sz="4" w:space="0" w:color="C9C3E6"/>
+              <w:bottom w:val="single" w:sz="4" w:space="0" w:color="C9C3E6"/>
+              <w:right w:val="single" w:sz="4" w:space="0" w:color="C9C3E6"/>
+            </w:tcBorders>
+            <w:tcMar>
+              <w:top w:w="80" w:type="dxa"/>
+              <w:left w:w="110" w:type="dxa"/>
+              <w:bottom w:w="80" w:type="dxa"/>
+              <w:right w:w="110" w:type="dxa"/>
+            </w:tcMar>
+          </w:tcPr>
+          <w:p>
+            <w:pPr>
+              <w:spacing w:after="40"/>
+            </w:pPr>
+            <w:r>
+              <w:t>27 Sep 2026</w:t>
+            </w:r>
+          </w:p>
+        </w:tc>
+        <w:tc>
+          <w:tcPr>
+            <w:tcW w:w="6515" w:type="dxa"/>
+            <w:tcBorders>
+              <w:top w:val="single" w:sz="4" w:space="0" w:color="C9C3E6"/>
+              <w:left w:val="single" w:sz="4" w:space="0" w:color="C9C3E6"/>
+              <w:bottom w:val="single" w:sz="4" w:space="0" w:color="C9C3E6"/>
+              <w:right w:val="single" w:sz="4" w:space="0" w:color="C9C3E6"/>
+            </w:tcBorders>
+            <w:tcMar>
+              <w:top w:w="80" w:type="dxa"/>
+              <w:left w:w="110" w:type="dxa"/>
+              <w:bottom w:w="80" w:type="dxa"/>
+              <w:right w:w="110" w:type="dxa"/>
+            </w:tcMar>
+          </w:tcPr>
+          <w:p>
+            <w:pPr>
+              <w:spacing w:after="40"/>
+            </w:pPr>
+            <w:r>
+              <w:t>Initial website build: seven pages, shared stylesheet, settings file, booking and pricing script, beat catalogue script.</w:t>
+            </w:r>
+          </w:p>
+        </w:tc>
+      </w:tr>
+      <w:tr>
+        <w:tblPrEx>
+          <w:tblCellMar>
+            <w:top w:w="0" w:type="dxa"/>
+            <w:bottom w:w="0" w:type="dxa"/>
+          </w:tblCellMar>
+        </w:tblPrEx>
+        <w:tc>
+          <w:tcPr>
+            <w:tcW w:w="1209" w:type="dxa"/>
+            <w:tcBorders>
+              <w:top w:val="single" w:sz="4" w:space="0" w:color="C9C3E6"/>
+              <w:left w:val="single" w:sz="4" w:space="0" w:color="C9C3E6"/>
+              <w:bottom w:val="single" w:sz="4" w:space="0" w:color="C9C3E6"/>
+              <w:right w:val="single" w:sz="4" w:space="0" w:color="C9C3E6"/>
+            </w:tcBorders>
+            <w:tcMar>
+              <w:top w:w="80" w:type="dxa"/>
+              <w:left w:w="110" w:type="dxa"/>
+              <w:bottom w:w="80" w:type="dxa"/>
+              <w:right w:w="110" w:type="dxa"/>
+            </w:tcMar>
+          </w:tcPr>
+          <w:p>
+            <w:pPr>
+              <w:spacing w:after="40"/>
+            </w:pPr>
+            <w:r>
+              <w:t>1.0.0</w:t>
+            </w:r>
+          </w:p>
+        </w:tc>
+        <w:tc>
+          <w:tcPr>
+            <w:tcW w:w="1582" w:type="dxa"/>
+            <w:tcBorders>
+              <w:top w:val="single" w:sz="4" w:space="0" w:color="C9C3E6"/>
+              <w:left w:val="single" w:sz="4" w:space="0" w:color="C9C3E6"/>
+              <w:bottom w:val="single" w:sz="4" w:space="0" w:color="C9C3E6"/>
+              <w:right w:val="single" w:sz="4" w:space="0" w:color="C9C3E6"/>
+            </w:tcBorders>
+            <w:tcMar>
+              <w:top w:w="80" w:type="dxa"/>
+              <w:left w:w="110" w:type="dxa"/>
+              <w:bottom w:w="80" w:type="dxa"/>
+              <w:right w:w="110" w:type="dxa"/>
+            </w:tcMar>
+          </w:tcPr>
+          <w:p>
+            <w:pPr>
+              <w:spacing w:after="40"/>
+            </w:pPr>
+            <w:r>
+              <w:t>27 Sep 2026</w:t>
+            </w:r>
+          </w:p>
+        </w:tc>
+        <w:tc>
+          <w:tcPr>
+            <w:tcW w:w="6515" w:type="dxa"/>
+            <w:tcBorders>
+              <w:top w:val="single" w:sz="4" w:space="0" w:color="C9C3E6"/>
+              <w:left w:val="single" w:sz="4" w:space="0" w:color="C9C3E6"/>
+              <w:bottom w:val="single" w:sz="4" w:space="0" w:color="C9C3E6"/>
+              <w:right w:val="single" w:sz="4" w:space="0" w:color="C9C3E6"/>
+            </w:tcBorders>
+            <w:tcMar>
+              <w:top w:w="80" w:type="dxa"/>
+              <w:left w:w="110" w:type="dxa"/>
+              <w:bottom w:w="80" w:type="dxa"/>
+              <w:right w:w="110" w:type="dxa"/>
+            </w:tcMar>
+          </w:tcPr>
+          <w:p>
+            <w:pPr>
+              <w:spacing w:after="40"/>
+            </w:pPr>
+            <w:r>
+              <w:t>Booking forms for recording + mixing and mastering, recording only and mixing and mastering, with live pricing, discount tables, one title field per track, file or link uploads, payment choice and policy agreement.</w:t>
+            </w:r>
+          </w:p>
+        </w:tc>
+      </w:tr>
+      <w:tr>
+        <w:tblPrEx>
+          <w:tblCellMar>
+            <w:top w:w="0" w:type="dxa"/>
+            <w:bottom w:w="0" w:type="dxa"/>
+          </w:tblCellMar>
+        </w:tblPrEx>
+        <w:tc>
+          <w:tcPr>
+            <w:tcW w:w="1209" w:type="dxa"/>
+            <w:tcBorders>
+              <w:top w:val="single" w:sz="4" w:space="0" w:color="C9C3E6"/>
+              <w:left w:val="single" w:sz="4" w:space="0" w:color="C9C3E6"/>
+              <w:bottom w:val="single" w:sz="4" w:space="0" w:color="C9C3E6"/>
+              <w:right w:val="single" w:sz="4" w:space="0" w:color="C9C3E6"/>
+            </w:tcBorders>
+            <w:tcMar>
+              <w:top w:w="80" w:type="dxa"/>
+              <w:left w:w="110" w:type="dxa"/>
+              <w:bottom w:w="80" w:type="dxa"/>
+              <w:right w:w="110" w:type="dxa"/>
+            </w:tcMar>
+          </w:tcPr>
+          <w:p>
+            <w:pPr>
+              <w:spacing w:after="40"/>
+            </w:pPr>
+            <w:r>
+              <w:t>1.0.0</w:t>
+            </w:r>
+          </w:p>
+        </w:tc>
+        <w:tc>
+          <w:tcPr>
+            <w:tcW w:w="1582" w:type="dxa"/>
+            <w:tcBorders>
+              <w:top w:val="single" w:sz="4" w:space="0" w:color="C9C3E6"/>
+              <w:left w:val="single" w:sz="4" w:space="0" w:color="C9C3E6"/>
+              <w:bottom w:val="single" w:sz="4" w:space="0" w:color="C9C3E6"/>
+              <w:right w:val="single" w:sz="4" w:space="0" w:color="C9C3E6"/>
+            </w:tcBorders>
+            <w:tcMar>
+              <w:top w:w="80" w:type="dxa"/>
+              <w:left w:w="110" w:type="dxa"/>
+              <w:bottom w:w="80" w:type="dxa"/>
+              <w:right w:w="110" w:type="dxa"/>
+            </w:tcMar>
+          </w:tcPr>
+          <w:p>
+            <w:pPr>
+              <w:spacing w:after="40"/>
+            </w:pPr>
+            <w:r>
+              <w:t>27 Sep 2026</w:t>
+            </w:r>
+          </w:p>
+        </w:tc>
+        <w:tc>
+          <w:tcPr>
+            <w:tcW w:w="6515" w:type="dxa"/>
+            <w:tcBorders>
+              <w:top w:val="single" w:sz="4" w:space="0" w:color="C9C3E6"/>
+              <w:left w:val="single" w:sz="4" w:space="0" w:color="C9C3E6"/>
+              <w:bottom w:val="single" w:sz="4" w:space="0" w:color="C9C3E6"/>
+              <w:right w:val="single" w:sz="4" w:space="0" w:color="C9C3E6"/>
+            </w:tcBorders>
+            <w:tcMar>
+              <w:top w:w="80" w:type="dxa"/>
+              <w:left w:w="110" w:type="dxa"/>
+              <w:bottom w:w="80" w:type="dxa"/>
+              <w:right w:w="110" w:type="dxa"/>
+            </w:tcMar>
+          </w:tcPr>
+          <w:p>
+            <w:pPr>
+              <w:spacing w:after="40"/>
+            </w:pPr>
+            <w:r>
+              <w:t>Request forms for custom beats and cover art, and a message form on the Contact page.</w:t>
+            </w:r>
+          </w:p>
+        </w:tc>
+      </w:tr>
+      <w:tr>
+        <w:tblPrEx>
+          <w:tblCellMar>
+            <w:top w:w="0" w:type="dxa"/>
+            <w:bottom w:w="0" w:type="dxa"/>
+          </w:tblCellMar>
+        </w:tblPrEx>
+        <w:tc>
+          <w:tcPr>
+            <w:tcW w:w="1209" w:type="dxa"/>
+            <w:tcBorders>
+              <w:top w:val="single" w:sz="4" w:space="0" w:color="C9C3E6"/>
+              <w:left w:val="single" w:sz="4" w:space="0" w:color="C9C3E6"/>
+              <w:bottom w:val="single" w:sz="4" w:space="0" w:color="C9C3E6"/>
+              <w:right w:val="single" w:sz="4" w:space="0" w:color="C9C3E6"/>
+            </w:tcBorders>
+            <w:tcMar>
+              <w:top w:w="80" w:type="dxa"/>
+              <w:left w:w="110" w:type="dxa"/>
+              <w:bottom w:w="80" w:type="dxa"/>
+              <w:right w:w="110" w:type="dxa"/>
+            </w:tcMar>
+          </w:tcPr>
+          <w:p>
+            <w:pPr>
+              <w:spacing w:after="40"/>
+            </w:pPr>
+            <w:r>
+              <w:t>1.0.0</w:t>
+            </w:r>
+          </w:p>
+        </w:tc>
+        <w:tc>
+          <w:tcPr>
+            <w:tcW w:w="1582" w:type="dxa"/>
+            <w:tcBorders>
+              <w:top w:val="single" w:sz="4" w:space="0" w:color="C9C3E6"/>
+              <w:left w:val="single" w:sz="4" w:space="0" w:color="C9C3E6"/>
+              <w:bottom w:val="single" w:sz="4" w:space="0" w:color="C9C3E6"/>
+              <w:right w:val="single" w:sz="4" w:space="0" w:color="C9C3E6"/>
+            </w:tcBorders>
+            <w:tcMar>
+              <w:top w:w="80" w:type="dxa"/>
+              <w:left w:w="110" w:type="dxa"/>
+              <w:bottom w:w="80" w:type="dxa"/>
+              <w:right w:w="110" w:type="dxa"/>
+            </w:tcMar>
+          </w:tcPr>
+          <w:p>
+            <w:pPr>
+              <w:spacing w:after="40"/>
+            </w:pPr>
+            <w:r>
+              <w:t>27 Sep 2026</w:t>
+            </w:r>
+          </w:p>
+        </w:tc>
+        <w:tc>
+          <w:tcPr>
+            <w:tcW w:w="6515" w:type="dxa"/>
+            <w:tcBorders>
+              <w:top w:val="single" w:sz="4" w:space="0" w:color="C9C3E6"/>
+              <w:left w:val="single" w:sz="4" w:space="0" w:color="C9C3E6"/>
+              <w:bottom w:val="single" w:sz="4" w:space="0" w:color="C9C3E6"/>
+              <w:right w:val="single" w:sz="4" w:space="0" w:color="C9C3E6"/>
+            </w:tcBorders>
+            <w:tcMar>
+              <w:top w:w="80" w:type="dxa"/>
+              <w:left w:w="110" w:type="dxa"/>
+              <w:bottom w:w="80" w:type="dxa"/>
+              <w:right w:w="110" w:type="dxa"/>
+            </w:tcMar>
+          </w:tcPr>
+          <w:p>
+            <w:pPr>
+              <w:spacing w:after="40"/>
+            </w:pPr>
+            <w:r>
+              <w:t>Booking summary with reference number, sent by WhatsApp or email until a form service is connected.</w:t>
+            </w:r>
+          </w:p>
+        </w:tc>
+      </w:tr>
+      <w:tr>
+        <w:tblPrEx>
+          <w:tblCellMar>
+            <w:top w:w="0" w:type="dxa"/>
+            <w:bottom w:w="0" w:type="dxa"/>
+          </w:tblCellMar>
+        </w:tblPrEx>
+        <w:tc>
+          <w:tcPr>
+            <w:tcW w:w="1209" w:type="dxa"/>
+            <w:tcBorders>
+              <w:top w:val="single" w:sz="4" w:space="0" w:color="C9C3E6"/>
+              <w:left w:val="single" w:sz="4" w:space="0" w:color="C9C3E6"/>
+              <w:bottom w:val="single" w:sz="4" w:space="0" w:color="C9C3E6"/>
+              <w:right w:val="single" w:sz="4" w:space="0" w:color="C9C3E6"/>
+            </w:tcBorders>
+            <w:tcMar>
+              <w:top w:w="80" w:type="dxa"/>
+              <w:left w:w="110" w:type="dxa"/>
+              <w:bottom w:w="80" w:type="dxa"/>
+              <w:right w:w="110" w:type="dxa"/>
+            </w:tcMar>
+          </w:tcPr>
+          <w:p>
+            <w:pPr>
+              <w:spacing w:after="40"/>
+            </w:pPr>
+            <w:r>
+              <w:t>1.0.0</w:t>
+            </w:r>
+          </w:p>
+        </w:tc>
+        <w:tc>
+          <w:tcPr>
+            <w:tcW w:w="1582" w:type="dxa"/>
+            <w:tcBorders>
+              <w:top w:val="single" w:sz="4" w:space="0" w:color="C9C3E6"/>
+              <w:left w:val="single" w:sz="4" w:space="0" w:color="C9C3E6"/>
+              <w:bottom w:val="single" w:sz="4" w:space="0" w:color="C9C3E6"/>
+              <w:right w:val="single" w:sz="4" w:space="0" w:color="C9C3E6"/>
+            </w:tcBorders>
+            <w:tcMar>
+              <w:top w:w="80" w:type="dxa"/>
+              <w:left w:w="110" w:type="dxa"/>
+              <w:bottom w:w="80" w:type="dxa"/>
+              <w:right w:w="110" w:type="dxa"/>
+            </w:tcMar>
+          </w:tcPr>
+          <w:p>
+            <w:pPr>
+              <w:spacing w:after="40"/>
+            </w:pPr>
+            <w:r>
+              <w:t>27 Sep 2026</w:t>
+            </w:r>
+          </w:p>
+        </w:tc>
+        <w:tc>
+          <w:tcPr>
+            <w:tcW w:w="6515" w:type="dxa"/>
+            <w:tcBorders>
+              <w:top w:val="single" w:sz="4" w:space="0" w:color="C9C3E6"/>
+              <w:left w:val="single" w:sz="4" w:space="0" w:color="C9C3E6"/>
+              <w:bottom w:val="single" w:sz="4" w:space="0" w:color="C9C3E6"/>
+              <w:right w:val="single" w:sz="4" w:space="0" w:color="C9C3E6"/>
+            </w:tcBorders>
+            <w:tcMar>
+              <w:top w:w="80" w:type="dxa"/>
+              <w:left w:w="110" w:type="dxa"/>
+              <w:bottom w:w="80" w:type="dxa"/>
+              <w:right w:w="110" w:type="dxa"/>
+            </w:tcMar>
+          </w:tcPr>
+          <w:p>
+            <w:pPr>
+              <w:spacing w:after="40"/>
+            </w:pPr>
+            <w:r>
+              <w:t>Studio photos converted to WebP. Total image weight reduced from about 13 MB to 540 KB.</w:t>
+            </w:r>
+          </w:p>
+        </w:tc>
+      </w:tr>
+      <w:tr>
+        <w:tblPrEx>
+          <w:tblCellMar>
+            <w:top w:w="0" w:type="dxa"/>
+            <w:bottom w:w="0" w:type="dxa"/>
+          </w:tblCellMar>
+        </w:tblPrEx>
+        <w:tc>
+          <w:tcPr>
+            <w:tcW w:w="1209" w:type="dxa"/>
+            <w:tcBorders>
+              <w:top w:val="single" w:sz="4" w:space="0" w:color="C9C3E6"/>
+              <w:left w:val="single" w:sz="4" w:space="0" w:color="C9C3E6"/>
+              <w:bottom w:val="single" w:sz="4" w:space="0" w:color="C9C3E6"/>
+              <w:right w:val="single" w:sz="4" w:space="0" w:color="C9C3E6"/>
+            </w:tcBorders>
+            <w:tcMar>
+              <w:top w:w="80" w:type="dxa"/>
+              <w:left w:w="110" w:type="dxa"/>
+              <w:bottom w:w="80" w:type="dxa"/>
+              <w:right w:w="110" w:type="dxa"/>
+            </w:tcMar>
+          </w:tcPr>
+          <w:p>
+            <w:pPr>
+              <w:spacing w:after="40"/>
+            </w:pPr>
+            <w:r>
+              <w:t>1.0.0</w:t>
+            </w:r>
+          </w:p>
+        </w:tc>
+        <w:tc>
+          <w:tcPr>
+            <w:tcW w:w="1582" w:type="dxa"/>
+            <w:tcBorders>
+              <w:top w:val="single" w:sz="4" w:space="0" w:color="C9C3E6"/>
+              <w:left w:val="single" w:sz="4" w:space="0" w:color="C9C3E6"/>
+              <w:bottom w:val="single" w:sz="4" w:space="0" w:color="C9C3E6"/>
+              <w:right w:val="single" w:sz="4" w:space="0" w:color="C9C3E6"/>
+            </w:tcBorders>
+            <w:tcMar>
+              <w:top w:w="80" w:type="dxa"/>
+              <w:left w:w="110" w:type="dxa"/>
+              <w:bottom w:w="80" w:type="dxa"/>
+              <w:right w:w="110" w:type="dxa"/>
+            </w:tcMar>
+          </w:tcPr>
+          <w:p>
+            <w:pPr>
+              <w:spacing w:after="40"/>
+            </w:pPr>
+            <w:r>
+              <w:t>27 Sep 2026</w:t>
+            </w:r>
+          </w:p>
+        </w:tc>
+        <w:tc>
+          <w:tcPr>
+            <w:tcW w:w="6515" w:type="dxa"/>
+            <w:tcBorders>
+              <w:top w:val="single" w:sz="4" w:space="0" w:color="C9C3E6"/>
+              <w:left w:val="single" w:sz="4" w:space="0" w:color="C9C3E6"/>
+              <w:bottom w:val="single" w:sz="4" w:space="0" w:color="C9C3E6"/>
+              <w:right w:val="single" w:sz="4" w:space="0" w:color="C9C3E6"/>
+            </w:tcBorders>
+            <w:tcMar>
+              <w:top w:w="80" w:type="dxa"/>
+              <w:left w:w="110" w:type="dxa"/>
+              <w:bottom w:w="80" w:type="dxa"/>
+              <w:right w:w="110" w:type="dxa"/>
+            </w:tcMar>
+          </w:tcPr>
+          <w:p>
+            <w:pPr>
+              <w:spacing w:after="40"/>
+            </w:pPr>
+            <w:r>
+              <w:t>Project organised into design, development and documentation folders.</w:t>
+            </w:r>
+          </w:p>
+        </w:tc>
+      </w:tr>
+      <w:tr>
+        <w:tblPrEx>
+          <w:tblCellMar>
+            <w:top w:w="0" w:type="dxa"/>
+            <w:bottom w:w="0" w:type="dxa"/>
+          </w:tblCellMar>
+        </w:tblPrEx>
+        <w:tc>
+          <w:tcPr>
+            <w:tcW w:w="1209" w:type="dxa"/>
+            <w:tcBorders>
+              <w:top w:val="single" w:sz="4" w:space="0" w:color="C9C3E6"/>
+              <w:left w:val="single" w:sz="4" w:space="0" w:color="C9C3E6"/>
+              <w:bottom w:val="single" w:sz="4" w:space="0" w:color="C9C3E6"/>
+              <w:right w:val="single" w:sz="4" w:space="0" w:color="C9C3E6"/>
+            </w:tcBorders>
+            <w:tcMar>
+              <w:top w:w="80" w:type="dxa"/>
+              <w:left w:w="110" w:type="dxa"/>
+              <w:bottom w:w="80" w:type="dxa"/>
+              <w:right w:w="110" w:type="dxa"/>
+            </w:tcMar>
+          </w:tcPr>
+          <w:p>
+            <w:pPr>
+              <w:spacing w:after="40"/>
+            </w:pPr>
+            <w:r>
               <w:t>0.1.0</w:t>
             </w:r>
           </w:p>
@@ -11127,7 +12690,7 @@
       <w:pPr>
         <w:pStyle w:val="Heading2"/>
       </w:pPr>
-      <w:bookmarkStart w:id="21" w:name="_Toc241372036"/>
+      <w:bookmarkStart w:id="21" w:name="_Toc241375903"/>
       <w:r>
         <w:t>Decisions made during the build</w:t>
       </w:r>
@@ -11277,7 +12840,7 @@
       <w:pPr>
         <w:pStyle w:val="Heading1"/>
       </w:pPr>
-      <w:bookmarkStart w:id="22" w:name="_Toc241372037"/>
+      <w:bookmarkStart w:id="22" w:name="_Toc241375904"/>
       <w:r>
         <w:t>8. Future improvements</w:t>
       </w:r>
@@ -11459,10 +13022,10 @@
 <file path=word/numbering.xml><?xml version="1.0" encoding="utf-8"?>
 <w:numbering xmlns:wpc="http://schemas.microsoft.com/office/word/2010/wordprocessingCanvas" xmlns:cx="http://schemas.microsoft.com/office/drawing/2014/chartex" xmlns:cx1="http://schemas.microsoft.com/office/drawing/2015/9/8/chartex" xmlns:cx2="http://schemas.microsoft.com/office/drawing/2015/10/21/chartex" xmlns:cx3="http://schemas.microsoft.com/office/drawing/2016/5/9/chartex" xmlns:cx4="http://schemas.microsoft.com/office/drawing/2016/5/10/chartex" xmlns:cx5="http://schemas.microsoft.com/office/drawing/2016/5/11/chartex" xmlns:cx6="http://schemas.microsoft.com/office/drawing/2016/5/12/chartex" xmlns:cx7="http://schemas.microsoft.com/office/drawing/2016/5/13/chartex" xmlns:cx8="http://schemas.microsoft.com/office/drawing/2016/5/14/chartex" xmlns:mc="http://schemas.openxmlformats.org/markup-compatibility/2006" xmlns:aink="http://schemas.microsoft.com/office/drawing/2016/ink" xmlns:am3d="http://schemas.microsoft.com/office/drawing/2017/model3d" xmlns:o="urn:schemas-microsoft-com:office:office" xmlns:oel="http://schemas.microsoft.com/office/2019/extlst" xmlns:r="http://schemas.openxmlformats.org/officeDocument/2006/relationships" xmlns:m="http://schemas.openxmlformats.org/officeDocument/2006/math" xmlns:v="urn:schemas-microsoft-com:vml" xmlns:wp14="http://schemas.microsoft.com/office/word/2010/wordprocessingDrawing" xmlns:wp="http://schemas.openxmlformats.org/drawingml/2006/wordprocessingDrawing" xmlns:w10="urn:schemas-microsoft-com:office:word" xmlns:w="http://schemas.openxmlformats.org/wordprocessingml/2006/main" xmlns:w14="http://schemas.microsoft.com/office/word/2010/wordml" xmlns:w15="http://schemas.microsoft.com/office/word/2012/wordml" xmlns:w16cex="http://schemas.microsoft.com/office/word/2018/wordml/cex" xmlns:w16cid="http://schemas.microsoft.com/office/word/2016/wordml/cid" xmlns:w16="http://schemas.microsoft.com/office/word/2018/wordml" xmlns:w16du="http://schemas.microsoft.com/office/word/2023/wordml/word16du" xmlns:w16sdtdh="http://schemas.microsoft.com/office/word/2020/wordml/sdtdatahash" xmlns:w16sdtfl="http://schemas.microsoft.com/office/word/2024/wordml/sdtformatlock" xmlns:w16se="http://schemas.microsoft.com/office/word/2015/wordml/symex" xmlns:wpg="http://schemas.microsoft.com/office/word/2010/wordprocessingGroup" xmlns:wpi="http://schemas.microsoft.com/office/word/2010/wordprocessingInk" xmlns:wne="http://schemas.microsoft.com/office/word/2006/wordml" xmlns:wps="http://schemas.microsoft.com/office/word/2010/wordprocessingShape" mc:Ignorable="w14 w15 w16se w16cid w16 w16cex w16sdtdh w16sdtfl w16du wp14">
   <w:abstractNum w:abstractNumId="0" w15:restartNumberingAfterBreak="0">
-    <w:nsid w:val="02FB01C0"/>
+    <w:nsid w:val="06680485"/>
     <w:multiLevelType w:val="hybridMultilevel"/>
-    <w:tmpl w:val="B766460C"/>
-    <w:lvl w:ilvl="0" w:tplc="A84050D4">
+    <w:tmpl w:val="39664B32"/>
+    <w:lvl w:ilvl="0" w:tplc="40D493F0">
       <w:start w:val="1"/>
       <w:numFmt w:val="decimal"/>
       <w:lvlText w:val="%1."/>
@@ -11471,52 +13034,106 @@
         <w:ind w:left="540" w:hanging="340"/>
       </w:pPr>
     </w:lvl>
-    <w:lvl w:ilvl="1" w:tplc="3B44F64E">
+    <w:lvl w:ilvl="1" w:tplc="D24A00A6">
       <w:numFmt w:val="decimal"/>
       <w:lvlText w:val=""/>
       <w:lvlJc w:val="left"/>
     </w:lvl>
-    <w:lvl w:ilvl="2" w:tplc="B37C1CE4">
+    <w:lvl w:ilvl="2" w:tplc="322E76C8">
       <w:numFmt w:val="decimal"/>
       <w:lvlText w:val=""/>
       <w:lvlJc w:val="left"/>
     </w:lvl>
-    <w:lvl w:ilvl="3" w:tplc="A0D8067A">
+    <w:lvl w:ilvl="3" w:tplc="55AAE264">
       <w:numFmt w:val="decimal"/>
       <w:lvlText w:val=""/>
       <w:lvlJc w:val="left"/>
     </w:lvl>
-    <w:lvl w:ilvl="4" w:tplc="C5FCD3BE">
+    <w:lvl w:ilvl="4" w:tplc="A83C96D8">
       <w:numFmt w:val="decimal"/>
       <w:lvlText w:val=""/>
       <w:lvlJc w:val="left"/>
     </w:lvl>
-    <w:lvl w:ilvl="5" w:tplc="C08402E2">
+    <w:lvl w:ilvl="5" w:tplc="4426E3B6">
       <w:numFmt w:val="decimal"/>
       <w:lvlText w:val=""/>
       <w:lvlJc w:val="left"/>
     </w:lvl>
-    <w:lvl w:ilvl="6" w:tplc="04B2696C">
+    <w:lvl w:ilvl="6" w:tplc="4FC21AE4">
       <w:numFmt w:val="decimal"/>
       <w:lvlText w:val=""/>
       <w:lvlJc w:val="left"/>
     </w:lvl>
-    <w:lvl w:ilvl="7" w:tplc="F3E06CF8">
+    <w:lvl w:ilvl="7" w:tplc="02748C20">
       <w:numFmt w:val="decimal"/>
       <w:lvlText w:val=""/>
       <w:lvlJc w:val="left"/>
     </w:lvl>
-    <w:lvl w:ilvl="8" w:tplc="E8106E70">
+    <w:lvl w:ilvl="8" w:tplc="13E8F426">
       <w:numFmt w:val="decimal"/>
       <w:lvlText w:val=""/>
       <w:lvlJc w:val="left"/>
     </w:lvl>
   </w:abstractNum>
   <w:abstractNum w:abstractNumId="1" w15:restartNumberingAfterBreak="0">
-    <w:nsid w:val="0EE64172"/>
+    <w:nsid w:val="0DF92924"/>
     <w:multiLevelType w:val="hybridMultilevel"/>
-    <w:tmpl w:val="D1A6656C"/>
-    <w:lvl w:ilvl="0" w:tplc="491ABDF8">
+    <w:tmpl w:val="E6C24EBA"/>
+    <w:lvl w:ilvl="0" w:tplc="C9F454AC">
+      <w:start w:val="1"/>
+      <w:numFmt w:val="bullet"/>
+      <w:lvlText w:val="•"/>
+      <w:lvlJc w:val="left"/>
+      <w:pPr>
+        <w:ind w:left="540" w:hanging="300"/>
+      </w:pPr>
+    </w:lvl>
+    <w:lvl w:ilvl="1" w:tplc="B7E67358">
+      <w:numFmt w:val="decimal"/>
+      <w:lvlText w:val=""/>
+      <w:lvlJc w:val="left"/>
+    </w:lvl>
+    <w:lvl w:ilvl="2" w:tplc="843442AA">
+      <w:numFmt w:val="decimal"/>
+      <w:lvlText w:val=""/>
+      <w:lvlJc w:val="left"/>
+    </w:lvl>
+    <w:lvl w:ilvl="3" w:tplc="EA484A9C">
+      <w:numFmt w:val="decimal"/>
+      <w:lvlText w:val=""/>
+      <w:lvlJc w:val="left"/>
+    </w:lvl>
+    <w:lvl w:ilvl="4" w:tplc="D3201CC6">
+      <w:numFmt w:val="decimal"/>
+      <w:lvlText w:val=""/>
+      <w:lvlJc w:val="left"/>
+    </w:lvl>
+    <w:lvl w:ilvl="5" w:tplc="2A263704">
+      <w:numFmt w:val="decimal"/>
+      <w:lvlText w:val=""/>
+      <w:lvlJc w:val="left"/>
+    </w:lvl>
+    <w:lvl w:ilvl="6" w:tplc="0116E23C">
+      <w:numFmt w:val="decimal"/>
+      <w:lvlText w:val=""/>
+      <w:lvlJc w:val="left"/>
+    </w:lvl>
+    <w:lvl w:ilvl="7" w:tplc="A1E20428">
+      <w:numFmt w:val="decimal"/>
+      <w:lvlText w:val=""/>
+      <w:lvlJc w:val="left"/>
+    </w:lvl>
+    <w:lvl w:ilvl="8" w:tplc="C5365F34">
+      <w:numFmt w:val="decimal"/>
+      <w:lvlText w:val=""/>
+      <w:lvlJc w:val="left"/>
+    </w:lvl>
+  </w:abstractNum>
+  <w:abstractNum w:abstractNumId="2" w15:restartNumberingAfterBreak="0">
+    <w:nsid w:val="119701C3"/>
+    <w:multiLevelType w:val="hybridMultilevel"/>
+    <w:tmpl w:val="A5344574"/>
+    <w:lvl w:ilvl="0" w:tplc="D130B422">
       <w:start w:val="1"/>
       <w:numFmt w:val="decimal"/>
       <w:lvlText w:val="%1."/>
@@ -11525,160 +13142,52 @@
         <w:ind w:left="540" w:hanging="340"/>
       </w:pPr>
     </w:lvl>
-    <w:lvl w:ilvl="1" w:tplc="6D90C3D0">
+    <w:lvl w:ilvl="1" w:tplc="FB326F18">
       <w:numFmt w:val="decimal"/>
       <w:lvlText w:val=""/>
       <w:lvlJc w:val="left"/>
     </w:lvl>
-    <w:lvl w:ilvl="2" w:tplc="954ACBCC">
+    <w:lvl w:ilvl="2" w:tplc="6C9C1AFA">
       <w:numFmt w:val="decimal"/>
       <w:lvlText w:val=""/>
       <w:lvlJc w:val="left"/>
     </w:lvl>
-    <w:lvl w:ilvl="3" w:tplc="F882545C">
+    <w:lvl w:ilvl="3" w:tplc="6E5AE656">
       <w:numFmt w:val="decimal"/>
       <w:lvlText w:val=""/>
       <w:lvlJc w:val="left"/>
     </w:lvl>
-    <w:lvl w:ilvl="4" w:tplc="E196B548">
+    <w:lvl w:ilvl="4" w:tplc="3036D06C">
       <w:numFmt w:val="decimal"/>
       <w:lvlText w:val=""/>
       <w:lvlJc w:val="left"/>
     </w:lvl>
-    <w:lvl w:ilvl="5" w:tplc="FC0E6F68">
+    <w:lvl w:ilvl="5" w:tplc="408CB516">
       <w:numFmt w:val="decimal"/>
       <w:lvlText w:val=""/>
       <w:lvlJc w:val="left"/>
     </w:lvl>
-    <w:lvl w:ilvl="6" w:tplc="66D4324C">
+    <w:lvl w:ilvl="6" w:tplc="B9E04A14">
       <w:numFmt w:val="decimal"/>
       <w:lvlText w:val=""/>
       <w:lvlJc w:val="left"/>
     </w:lvl>
-    <w:lvl w:ilvl="7" w:tplc="10168F58">
+    <w:lvl w:ilvl="7" w:tplc="7424F5FA">
       <w:numFmt w:val="decimal"/>
       <w:lvlText w:val=""/>
       <w:lvlJc w:val="left"/>
     </w:lvl>
-    <w:lvl w:ilvl="8" w:tplc="8B4C699E">
-      <w:numFmt w:val="decimal"/>
-      <w:lvlText w:val=""/>
-      <w:lvlJc w:val="left"/>
-    </w:lvl>
-  </w:abstractNum>
-  <w:abstractNum w:abstractNumId="2" w15:restartNumberingAfterBreak="0">
-    <w:nsid w:val="22C46ECE"/>
-    <w:multiLevelType w:val="hybridMultilevel"/>
-    <w:tmpl w:val="69EC1234"/>
-    <w:lvl w:ilvl="0" w:tplc="C0DC738E">
-      <w:start w:val="1"/>
-      <w:numFmt w:val="decimal"/>
-      <w:lvlText w:val="%1."/>
-      <w:lvlJc w:val="left"/>
-      <w:pPr>
-        <w:ind w:left="540" w:hanging="340"/>
-      </w:pPr>
-    </w:lvl>
-    <w:lvl w:ilvl="1" w:tplc="6AC20786">
-      <w:numFmt w:val="decimal"/>
-      <w:lvlText w:val=""/>
-      <w:lvlJc w:val="left"/>
-    </w:lvl>
-    <w:lvl w:ilvl="2" w:tplc="165ABDE6">
-      <w:numFmt w:val="decimal"/>
-      <w:lvlText w:val=""/>
-      <w:lvlJc w:val="left"/>
-    </w:lvl>
-    <w:lvl w:ilvl="3" w:tplc="AA68FFC6">
-      <w:numFmt w:val="decimal"/>
-      <w:lvlText w:val=""/>
-      <w:lvlJc w:val="left"/>
-    </w:lvl>
-    <w:lvl w:ilvl="4" w:tplc="E5605AA4">
-      <w:numFmt w:val="decimal"/>
-      <w:lvlText w:val=""/>
-      <w:lvlJc w:val="left"/>
-    </w:lvl>
-    <w:lvl w:ilvl="5" w:tplc="C9264274">
-      <w:numFmt w:val="decimal"/>
-      <w:lvlText w:val=""/>
-      <w:lvlJc w:val="left"/>
-    </w:lvl>
-    <w:lvl w:ilvl="6" w:tplc="C962522A">
-      <w:numFmt w:val="decimal"/>
-      <w:lvlText w:val=""/>
-      <w:lvlJc w:val="left"/>
-    </w:lvl>
-    <w:lvl w:ilvl="7" w:tplc="950A217C">
-      <w:numFmt w:val="decimal"/>
-      <w:lvlText w:val=""/>
-      <w:lvlJc w:val="left"/>
-    </w:lvl>
-    <w:lvl w:ilvl="8" w:tplc="F3D4AFF8">
+    <w:lvl w:ilvl="8" w:tplc="127A2C74">
       <w:numFmt w:val="decimal"/>
       <w:lvlText w:val=""/>
       <w:lvlJc w:val="left"/>
     </w:lvl>
   </w:abstractNum>
   <w:abstractNum w:abstractNumId="3" w15:restartNumberingAfterBreak="0">
-    <w:nsid w:val="27452B0C"/>
+    <w:nsid w:val="18DC5FED"/>
     <w:multiLevelType w:val="hybridMultilevel"/>
-    <w:tmpl w:val="6824B284"/>
-    <w:lvl w:ilvl="0" w:tplc="01BA84F0">
-      <w:start w:val="1"/>
-      <w:numFmt w:val="decimal"/>
-      <w:lvlText w:val="%1."/>
-      <w:lvlJc w:val="left"/>
-      <w:pPr>
-        <w:ind w:left="540" w:hanging="340"/>
-      </w:pPr>
-    </w:lvl>
-    <w:lvl w:ilvl="1" w:tplc="92A44B6C">
-      <w:numFmt w:val="decimal"/>
-      <w:lvlText w:val=""/>
-      <w:lvlJc w:val="left"/>
-    </w:lvl>
-    <w:lvl w:ilvl="2" w:tplc="CA884058">
-      <w:numFmt w:val="decimal"/>
-      <w:lvlText w:val=""/>
-      <w:lvlJc w:val="left"/>
-    </w:lvl>
-    <w:lvl w:ilvl="3" w:tplc="DFDA2E36">
-      <w:numFmt w:val="decimal"/>
-      <w:lvlText w:val=""/>
-      <w:lvlJc w:val="left"/>
-    </w:lvl>
-    <w:lvl w:ilvl="4" w:tplc="1FA08D96">
-      <w:numFmt w:val="decimal"/>
-      <w:lvlText w:val=""/>
-      <w:lvlJc w:val="left"/>
-    </w:lvl>
-    <w:lvl w:ilvl="5" w:tplc="4A9A7C64">
-      <w:numFmt w:val="decimal"/>
-      <w:lvlText w:val=""/>
-      <w:lvlJc w:val="left"/>
-    </w:lvl>
-    <w:lvl w:ilvl="6" w:tplc="A7A60CFA">
-      <w:numFmt w:val="decimal"/>
-      <w:lvlText w:val=""/>
-      <w:lvlJc w:val="left"/>
-    </w:lvl>
-    <w:lvl w:ilvl="7" w:tplc="18E09880">
-      <w:numFmt w:val="decimal"/>
-      <w:lvlText w:val=""/>
-      <w:lvlJc w:val="left"/>
-    </w:lvl>
-    <w:lvl w:ilvl="8" w:tplc="01AC7486">
-      <w:numFmt w:val="decimal"/>
-      <w:lvlText w:val=""/>
-      <w:lvlJc w:val="left"/>
-    </w:lvl>
-  </w:abstractNum>
-  <w:abstractNum w:abstractNumId="4" w15:restartNumberingAfterBreak="0">
-    <w:nsid w:val="4F594149"/>
-    <w:multiLevelType w:val="hybridMultilevel"/>
-    <w:tmpl w:val="C2D4D334"/>
-    <w:lvl w:ilvl="0" w:tplc="F7BECC7C">
+    <w:tmpl w:val="89EA73BA"/>
+    <w:lvl w:ilvl="0" w:tplc="46DA6A06">
       <w:start w:val="1"/>
       <w:numFmt w:val="bullet"/>
       <w:lvlText w:val="●"/>
@@ -11687,7 +13196,7 @@
         <w:ind w:left="720" w:hanging="360"/>
       </w:pPr>
     </w:lvl>
-    <w:lvl w:ilvl="1" w:tplc="42702AE6">
+    <w:lvl w:ilvl="1" w:tplc="CEEE3442">
       <w:start w:val="1"/>
       <w:numFmt w:val="bullet"/>
       <w:lvlText w:val="○"/>
@@ -11696,7 +13205,7 @@
         <w:ind w:left="1440" w:hanging="360"/>
       </w:pPr>
     </w:lvl>
-    <w:lvl w:ilvl="2" w:tplc="27AEBCB2">
+    <w:lvl w:ilvl="2" w:tplc="1BCCDCAE">
       <w:start w:val="1"/>
       <w:numFmt w:val="bullet"/>
       <w:lvlText w:val="■"/>
@@ -11705,7 +13214,7 @@
         <w:ind w:left="2160" w:hanging="360"/>
       </w:pPr>
     </w:lvl>
-    <w:lvl w:ilvl="3" w:tplc="84D8E4FE">
+    <w:lvl w:ilvl="3" w:tplc="A7887B82">
       <w:start w:val="1"/>
       <w:numFmt w:val="bullet"/>
       <w:lvlText w:val="●"/>
@@ -11714,7 +13223,7 @@
         <w:ind w:left="2880" w:hanging="360"/>
       </w:pPr>
     </w:lvl>
-    <w:lvl w:ilvl="4" w:tplc="8EC6CC04">
+    <w:lvl w:ilvl="4" w:tplc="B8DC4048">
       <w:start w:val="1"/>
       <w:numFmt w:val="bullet"/>
       <w:lvlText w:val="○"/>
@@ -11723,7 +13232,7 @@
         <w:ind w:left="3600" w:hanging="360"/>
       </w:pPr>
     </w:lvl>
-    <w:lvl w:ilvl="5" w:tplc="2E4462CE">
+    <w:lvl w:ilvl="5" w:tplc="890292F2">
       <w:start w:val="1"/>
       <w:numFmt w:val="bullet"/>
       <w:lvlText w:val="■"/>
@@ -11732,7 +13241,7 @@
         <w:ind w:left="4320" w:hanging="360"/>
       </w:pPr>
     </w:lvl>
-    <w:lvl w:ilvl="6" w:tplc="DFF69098">
+    <w:lvl w:ilvl="6" w:tplc="C3A898F8">
       <w:start w:val="1"/>
       <w:numFmt w:val="bullet"/>
       <w:lvlText w:val="●"/>
@@ -11741,7 +13250,7 @@
         <w:ind w:left="5040" w:hanging="360"/>
       </w:pPr>
     </w:lvl>
-    <w:lvl w:ilvl="7" w:tplc="900EF3CE">
+    <w:lvl w:ilvl="7" w:tplc="C9CC117A">
       <w:start w:val="1"/>
       <w:numFmt w:val="bullet"/>
       <w:lvlText w:val="●"/>
@@ -11750,7 +13259,7 @@
         <w:ind w:left="5760" w:hanging="360"/>
       </w:pPr>
     </w:lvl>
-    <w:lvl w:ilvl="8" w:tplc="CF907A92">
+    <w:lvl w:ilvl="8" w:tplc="DA0CBFD6">
       <w:start w:val="1"/>
       <w:numFmt w:val="bullet"/>
       <w:lvlText w:val="●"/>
@@ -11760,11 +13269,11 @@
       </w:pPr>
     </w:lvl>
   </w:abstractNum>
-  <w:abstractNum w:abstractNumId="5" w15:restartNumberingAfterBreak="0">
-    <w:nsid w:val="560E22C2"/>
+  <w:abstractNum w:abstractNumId="4" w15:restartNumberingAfterBreak="0">
+    <w:nsid w:val="1E916753"/>
     <w:multiLevelType w:val="hybridMultilevel"/>
-    <w:tmpl w:val="536E37E2"/>
-    <w:lvl w:ilvl="0" w:tplc="27A8DD58">
+    <w:tmpl w:val="45064332"/>
+    <w:lvl w:ilvl="0" w:tplc="20BE98FC">
       <w:start w:val="1"/>
       <w:numFmt w:val="decimal"/>
       <w:lvlText w:val="%1."/>
@@ -11773,52 +13282,52 @@
         <w:ind w:left="540" w:hanging="340"/>
       </w:pPr>
     </w:lvl>
-    <w:lvl w:ilvl="1" w:tplc="F9246CA0">
+    <w:lvl w:ilvl="1" w:tplc="835CF3BA">
       <w:numFmt w:val="decimal"/>
       <w:lvlText w:val=""/>
       <w:lvlJc w:val="left"/>
     </w:lvl>
-    <w:lvl w:ilvl="2" w:tplc="9BEEA956">
+    <w:lvl w:ilvl="2" w:tplc="A6049770">
       <w:numFmt w:val="decimal"/>
       <w:lvlText w:val=""/>
       <w:lvlJc w:val="left"/>
     </w:lvl>
-    <w:lvl w:ilvl="3" w:tplc="DA186738">
+    <w:lvl w:ilvl="3" w:tplc="07F82A2E">
       <w:numFmt w:val="decimal"/>
       <w:lvlText w:val=""/>
       <w:lvlJc w:val="left"/>
     </w:lvl>
-    <w:lvl w:ilvl="4" w:tplc="6310BA2C">
+    <w:lvl w:ilvl="4" w:tplc="A6A80F4C">
       <w:numFmt w:val="decimal"/>
       <w:lvlText w:val=""/>
       <w:lvlJc w:val="left"/>
     </w:lvl>
-    <w:lvl w:ilvl="5" w:tplc="DCF43D02">
+    <w:lvl w:ilvl="5" w:tplc="20CCA0EE">
       <w:numFmt w:val="decimal"/>
       <w:lvlText w:val=""/>
       <w:lvlJc w:val="left"/>
     </w:lvl>
-    <w:lvl w:ilvl="6" w:tplc="0588A63E">
+    <w:lvl w:ilvl="6" w:tplc="6E1A6B82">
       <w:numFmt w:val="decimal"/>
       <w:lvlText w:val=""/>
       <w:lvlJc w:val="left"/>
     </w:lvl>
-    <w:lvl w:ilvl="7" w:tplc="35DE102A">
+    <w:lvl w:ilvl="7" w:tplc="CC74FB22">
       <w:numFmt w:val="decimal"/>
       <w:lvlText w:val=""/>
       <w:lvlJc w:val="left"/>
     </w:lvl>
-    <w:lvl w:ilvl="8" w:tplc="79AEA410">
+    <w:lvl w:ilvl="8" w:tplc="0DEA4794">
       <w:numFmt w:val="decimal"/>
       <w:lvlText w:val=""/>
       <w:lvlJc w:val="left"/>
     </w:lvl>
   </w:abstractNum>
-  <w:abstractNum w:abstractNumId="6" w15:restartNumberingAfterBreak="0">
-    <w:nsid w:val="677D04E5"/>
+  <w:abstractNum w:abstractNumId="5" w15:restartNumberingAfterBreak="0">
+    <w:nsid w:val="31EC5EC7"/>
     <w:multiLevelType w:val="hybridMultilevel"/>
-    <w:tmpl w:val="C87826F8"/>
-    <w:lvl w:ilvl="0" w:tplc="4D705506">
+    <w:tmpl w:val="7B8AC5F0"/>
+    <w:lvl w:ilvl="0" w:tplc="2C88E3EC">
       <w:start w:val="1"/>
       <w:numFmt w:val="decimal"/>
       <w:lvlText w:val="%1."/>
@@ -11827,52 +13336,52 @@
         <w:ind w:left="540" w:hanging="340"/>
       </w:pPr>
     </w:lvl>
-    <w:lvl w:ilvl="1" w:tplc="246CA5C4">
+    <w:lvl w:ilvl="1" w:tplc="5A280F94">
       <w:numFmt w:val="decimal"/>
       <w:lvlText w:val=""/>
       <w:lvlJc w:val="left"/>
     </w:lvl>
-    <w:lvl w:ilvl="2" w:tplc="EFECBD40">
+    <w:lvl w:ilvl="2" w:tplc="E342FBE8">
       <w:numFmt w:val="decimal"/>
       <w:lvlText w:val=""/>
       <w:lvlJc w:val="left"/>
     </w:lvl>
-    <w:lvl w:ilvl="3" w:tplc="F7DA297C">
+    <w:lvl w:ilvl="3" w:tplc="95402242">
       <w:numFmt w:val="decimal"/>
       <w:lvlText w:val=""/>
       <w:lvlJc w:val="left"/>
     </w:lvl>
-    <w:lvl w:ilvl="4" w:tplc="F07669AE">
+    <w:lvl w:ilvl="4" w:tplc="B770E02C">
       <w:numFmt w:val="decimal"/>
       <w:lvlText w:val=""/>
       <w:lvlJc w:val="left"/>
     </w:lvl>
-    <w:lvl w:ilvl="5" w:tplc="D318C2D8">
+    <w:lvl w:ilvl="5" w:tplc="868ADB72">
       <w:numFmt w:val="decimal"/>
       <w:lvlText w:val=""/>
       <w:lvlJc w:val="left"/>
     </w:lvl>
-    <w:lvl w:ilvl="6" w:tplc="5E64C054">
+    <w:lvl w:ilvl="6" w:tplc="43CEB436">
       <w:numFmt w:val="decimal"/>
       <w:lvlText w:val=""/>
       <w:lvlJc w:val="left"/>
     </w:lvl>
-    <w:lvl w:ilvl="7" w:tplc="DBBC7388">
+    <w:lvl w:ilvl="7" w:tplc="1B1A1578">
       <w:numFmt w:val="decimal"/>
       <w:lvlText w:val=""/>
       <w:lvlJc w:val="left"/>
     </w:lvl>
-    <w:lvl w:ilvl="8" w:tplc="873A5EFC">
+    <w:lvl w:ilvl="8" w:tplc="11B6E8A8">
       <w:numFmt w:val="decimal"/>
       <w:lvlText w:val=""/>
       <w:lvlJc w:val="left"/>
     </w:lvl>
   </w:abstractNum>
-  <w:abstractNum w:abstractNumId="7" w15:restartNumberingAfterBreak="0">
-    <w:nsid w:val="6B184216"/>
+  <w:abstractNum w:abstractNumId="6" w15:restartNumberingAfterBreak="0">
+    <w:nsid w:val="451B6DBA"/>
     <w:multiLevelType w:val="hybridMultilevel"/>
-    <w:tmpl w:val="FD2C37C4"/>
-    <w:lvl w:ilvl="0" w:tplc="B7DAA778">
+    <w:tmpl w:val="8A5C576A"/>
+    <w:lvl w:ilvl="0" w:tplc="FC587CFE">
       <w:start w:val="1"/>
       <w:numFmt w:val="decimal"/>
       <w:lvlText w:val="%1."/>
@@ -11881,145 +13390,199 @@
         <w:ind w:left="540" w:hanging="340"/>
       </w:pPr>
     </w:lvl>
-    <w:lvl w:ilvl="1" w:tplc="244E4ED2">
+    <w:lvl w:ilvl="1" w:tplc="934C4DBA">
       <w:numFmt w:val="decimal"/>
       <w:lvlText w:val=""/>
       <w:lvlJc w:val="left"/>
     </w:lvl>
-    <w:lvl w:ilvl="2" w:tplc="5074E5B6">
+    <w:lvl w:ilvl="2" w:tplc="5096051E">
       <w:numFmt w:val="decimal"/>
       <w:lvlText w:val=""/>
       <w:lvlJc w:val="left"/>
     </w:lvl>
-    <w:lvl w:ilvl="3" w:tplc="1BAA883A">
+    <w:lvl w:ilvl="3" w:tplc="B3F09424">
       <w:numFmt w:val="decimal"/>
       <w:lvlText w:val=""/>
       <w:lvlJc w:val="left"/>
     </w:lvl>
-    <w:lvl w:ilvl="4" w:tplc="AF92E1D2">
+    <w:lvl w:ilvl="4" w:tplc="B3E04FCE">
       <w:numFmt w:val="decimal"/>
       <w:lvlText w:val=""/>
       <w:lvlJc w:val="left"/>
     </w:lvl>
-    <w:lvl w:ilvl="5" w:tplc="EC32C08E">
+    <w:lvl w:ilvl="5" w:tplc="1982F84C">
       <w:numFmt w:val="decimal"/>
       <w:lvlText w:val=""/>
       <w:lvlJc w:val="left"/>
     </w:lvl>
-    <w:lvl w:ilvl="6" w:tplc="ACBAE316">
+    <w:lvl w:ilvl="6" w:tplc="FE2A21A6">
       <w:numFmt w:val="decimal"/>
       <w:lvlText w:val=""/>
       <w:lvlJc w:val="left"/>
     </w:lvl>
-    <w:lvl w:ilvl="7" w:tplc="7C44CE14">
+    <w:lvl w:ilvl="7" w:tplc="2F86B636">
       <w:numFmt w:val="decimal"/>
       <w:lvlText w:val=""/>
       <w:lvlJc w:val="left"/>
     </w:lvl>
-    <w:lvl w:ilvl="8" w:tplc="72D02A36">
+    <w:lvl w:ilvl="8" w:tplc="A68268C2">
+      <w:numFmt w:val="decimal"/>
+      <w:lvlText w:val=""/>
+      <w:lvlJc w:val="left"/>
+    </w:lvl>
+  </w:abstractNum>
+  <w:abstractNum w:abstractNumId="7" w15:restartNumberingAfterBreak="0">
+    <w:nsid w:val="69802E67"/>
+    <w:multiLevelType w:val="hybridMultilevel"/>
+    <w:tmpl w:val="B98230CE"/>
+    <w:lvl w:ilvl="0" w:tplc="A21CB8A8">
+      <w:start w:val="1"/>
+      <w:numFmt w:val="decimal"/>
+      <w:lvlText w:val="%1."/>
+      <w:lvlJc w:val="left"/>
+      <w:pPr>
+        <w:ind w:left="540" w:hanging="340"/>
+      </w:pPr>
+    </w:lvl>
+    <w:lvl w:ilvl="1" w:tplc="97D2C484">
+      <w:numFmt w:val="decimal"/>
+      <w:lvlText w:val=""/>
+      <w:lvlJc w:val="left"/>
+    </w:lvl>
+    <w:lvl w:ilvl="2" w:tplc="7AE29772">
+      <w:numFmt w:val="decimal"/>
+      <w:lvlText w:val=""/>
+      <w:lvlJc w:val="left"/>
+    </w:lvl>
+    <w:lvl w:ilvl="3" w:tplc="920C58D2">
+      <w:numFmt w:val="decimal"/>
+      <w:lvlText w:val=""/>
+      <w:lvlJc w:val="left"/>
+    </w:lvl>
+    <w:lvl w:ilvl="4" w:tplc="D9D422C6">
+      <w:numFmt w:val="decimal"/>
+      <w:lvlText w:val=""/>
+      <w:lvlJc w:val="left"/>
+    </w:lvl>
+    <w:lvl w:ilvl="5" w:tplc="830278A6">
+      <w:numFmt w:val="decimal"/>
+      <w:lvlText w:val=""/>
+      <w:lvlJc w:val="left"/>
+    </w:lvl>
+    <w:lvl w:ilvl="6" w:tplc="D98A34EC">
+      <w:numFmt w:val="decimal"/>
+      <w:lvlText w:val=""/>
+      <w:lvlJc w:val="left"/>
+    </w:lvl>
+    <w:lvl w:ilvl="7" w:tplc="CD023E28">
+      <w:numFmt w:val="decimal"/>
+      <w:lvlText w:val=""/>
+      <w:lvlJc w:val="left"/>
+    </w:lvl>
+    <w:lvl w:ilvl="8" w:tplc="D32A73FA">
       <w:numFmt w:val="decimal"/>
       <w:lvlText w:val=""/>
       <w:lvlJc w:val="left"/>
     </w:lvl>
   </w:abstractNum>
   <w:abstractNum w:abstractNumId="8" w15:restartNumberingAfterBreak="0">
-    <w:nsid w:val="6D7B43A6"/>
+    <w:nsid w:val="69B349B9"/>
     <w:multiLevelType w:val="hybridMultilevel"/>
-    <w:tmpl w:val="F2509A46"/>
-    <w:lvl w:ilvl="0" w:tplc="F13E5638">
+    <w:tmpl w:val="E646D15E"/>
+    <w:lvl w:ilvl="0" w:tplc="9218474A">
       <w:start w:val="1"/>
-      <w:numFmt w:val="bullet"/>
-      <w:lvlText w:val="•"/>
+      <w:numFmt w:val="decimal"/>
+      <w:lvlText w:val="%1."/>
       <w:lvlJc w:val="left"/>
       <w:pPr>
-        <w:ind w:left="540" w:hanging="300"/>
+        <w:ind w:left="540" w:hanging="340"/>
       </w:pPr>
     </w:lvl>
-    <w:lvl w:ilvl="1" w:tplc="F3FE0D82">
+    <w:lvl w:ilvl="1" w:tplc="6D106E76">
       <w:numFmt w:val="decimal"/>
       <w:lvlText w:val=""/>
       <w:lvlJc w:val="left"/>
     </w:lvl>
-    <w:lvl w:ilvl="2" w:tplc="86C82D3E">
+    <w:lvl w:ilvl="2" w:tplc="2618CC1A">
       <w:numFmt w:val="decimal"/>
       <w:lvlText w:val=""/>
       <w:lvlJc w:val="left"/>
     </w:lvl>
-    <w:lvl w:ilvl="3" w:tplc="116CCE16">
+    <w:lvl w:ilvl="3" w:tplc="7AEC0C14">
       <w:numFmt w:val="decimal"/>
       <w:lvlText w:val=""/>
       <w:lvlJc w:val="left"/>
     </w:lvl>
-    <w:lvl w:ilvl="4" w:tplc="A1C0BF54">
+    <w:lvl w:ilvl="4" w:tplc="DF88E5DE">
       <w:numFmt w:val="decimal"/>
       <w:lvlText w:val=""/>
       <w:lvlJc w:val="left"/>
     </w:lvl>
-    <w:lvl w:ilvl="5" w:tplc="7054CF56">
+    <w:lvl w:ilvl="5" w:tplc="121E8A8C">
       <w:numFmt w:val="decimal"/>
       <w:lvlText w:val=""/>
       <w:lvlJc w:val="left"/>
     </w:lvl>
-    <w:lvl w:ilvl="6" w:tplc="C5C46CBA">
+    <w:lvl w:ilvl="6" w:tplc="886E697C">
       <w:numFmt w:val="decimal"/>
       <w:lvlText w:val=""/>
       <w:lvlJc w:val="left"/>
     </w:lvl>
-    <w:lvl w:ilvl="7" w:tplc="806C36FC">
+    <w:lvl w:ilvl="7" w:tplc="28DCE57C">
       <w:numFmt w:val="decimal"/>
       <w:lvlText w:val=""/>
       <w:lvlJc w:val="left"/>
     </w:lvl>
-    <w:lvl w:ilvl="8" w:tplc="F168D2FA">
+    <w:lvl w:ilvl="8" w:tplc="42BCB10A">
       <w:numFmt w:val="decimal"/>
       <w:lvlText w:val=""/>
       <w:lvlJc w:val="left"/>
     </w:lvl>
   </w:abstractNum>
-  <w:num w:numId="1" w16cid:durableId="1494377256">
+  <w:num w:numId="1" w16cid:durableId="1658610888">
+    <w:abstractNumId w:val="3"/>
+    <w:lvlOverride w:ilvl="0">
+      <w:startOverride w:val="1"/>
+    </w:lvlOverride>
+  </w:num>
+  <w:num w:numId="2" w16cid:durableId="2047439293">
+    <w:abstractNumId w:val="1"/>
+    <w:lvlOverride w:ilvl="0">
+      <w:startOverride w:val="1"/>
+    </w:lvlOverride>
+  </w:num>
+  <w:num w:numId="3" w16cid:durableId="370620373">
+    <w:abstractNumId w:val="2"/>
+    <w:lvlOverride w:ilvl="0">
+      <w:startOverride w:val="1"/>
+    </w:lvlOverride>
+  </w:num>
+  <w:num w:numId="4" w16cid:durableId="293799430">
     <w:abstractNumId w:val="4"/>
     <w:lvlOverride w:ilvl="0">
       <w:startOverride w:val="1"/>
     </w:lvlOverride>
   </w:num>
-  <w:num w:numId="2" w16cid:durableId="421992038">
-    <w:abstractNumId w:val="8"/>
-    <w:lvlOverride w:ilvl="0">
-      <w:startOverride w:val="1"/>
-    </w:lvlOverride>
-  </w:num>
-  <w:num w:numId="3" w16cid:durableId="1338381238">
+  <w:num w:numId="5" w16cid:durableId="365757656">
     <w:abstractNumId w:val="0"/>
     <w:lvlOverride w:ilvl="0">
       <w:startOverride w:val="1"/>
     </w:lvlOverride>
   </w:num>
-  <w:num w:numId="4" w16cid:durableId="1277298730">
+  <w:num w:numId="6" w16cid:durableId="1299803863">
     <w:abstractNumId w:val="6"/>
     <w:lvlOverride w:ilvl="0">
       <w:startOverride w:val="1"/>
     </w:lvlOverride>
   </w:num>
-  <w:num w:numId="5" w16cid:durableId="646251789">
+  <w:num w:numId="7" w16cid:durableId="1953586731">
     <w:abstractNumId w:val="5"/>
     <w:lvlOverride w:ilvl="0">
       <w:startOverride w:val="1"/>
     </w:lvlOverride>
   </w:num>
-  <w:num w:numId="6" w16cid:durableId="478349004">
-    <w:abstractNumId w:val="2"/>
-    <w:lvlOverride w:ilvl="0">
-      <w:startOverride w:val="1"/>
-    </w:lvlOverride>
-  </w:num>
-  <w:num w:numId="7" w16cid:durableId="1374234844">
-    <w:abstractNumId w:val="3"/>
-    <w:lvlOverride w:ilvl="0">
-      <w:startOverride w:val="1"/>
-    </w:lvlOverride>
-  </w:num>
-  <w:num w:numId="8" w16cid:durableId="1117020766">
-    <w:abstractNumId w:val="1"/>
+  <w:num w:numId="8" w16cid:durableId="1273246878">
+    <w:abstractNumId w:val="7"/>
     <w:lvlOverride w:ilvl="0">
       <w:startOverride w:val="1"/>
     </w:lvlOverride>
@@ -12640,7 +14203,7 @@
     <w:autoRedefine/>
     <w:uiPriority w:val="39"/>
     <w:unhideWhenUsed/>
-    <w:rsid w:val="00092874"/>
+    <w:rsid w:val="00085EF7"/>
     <w:pPr>
       <w:spacing w:after="100"/>
     </w:pPr>
@@ -12652,7 +14215,7 @@
     <w:autoRedefine/>
     <w:uiPriority w:val="39"/>
     <w:unhideWhenUsed/>
-    <w:rsid w:val="00092874"/>
+    <w:rsid w:val="00085EF7"/>
     <w:pPr>
       <w:spacing w:after="100"/>
       <w:ind w:left="210"/>

</xml_diff>

<commit_message>
Move bookings to Supabase and add the studio dashboard
Booking forms now save to Supabase (bookings table + private
booking-files bucket) instead of only producing a WhatsApp/email
summary, which remains the fallback when saving fails.

- supabase/schema.sql: tables, row level security (visitors can only
  submit, staff can read/update), spam limits, upload rules
- supabase/email-alerts.sql: emails the studio about each new booking
  via Resend, API key kept in Supabase Vault
- studio.html + js/studio.js: staff sign-in, live booking list,
  schedule with overlap warnings, status tracking, notes, file downloads
- Icon font subset regenerated for the dashboard icons
- Also includes pending site work: payment logos, cover art images,
  CTA background video, page updates and secret patterns in .gitignore

Co-Authored-By: Claude Opus 5.5 <noreply@anthropic.com>
</commit_message>
<xml_diff>
--- a/documentation/Deployment and Change Log.docx
+++ b/documentation/Deployment and Change Log.docx
@@ -193,7 +193,7 @@
               <w:spacing w:after="40"/>
             </w:pPr>
             <w:r>
-              <w:t>2.4</w:t>
+              <w:t xml:space="preserve">2.5</w:t>
             </w:r>
           </w:p>
         </w:tc>
@@ -251,7 +251,7 @@
               <w:spacing w:after="40"/>
             </w:pPr>
             <w:r>
-              <w:t>1.13.2</w:t>
+              <w:t xml:space="preserve">1.15.0</w:t>
             </w:r>
           </w:p>
         </w:tc>
@@ -309,7 +309,7 @@
               <w:spacing w:after="40"/>
             </w:pPr>
             <w:r>
-              <w:t>27 September 2026</w:t>
+              <w:t xml:space="preserve">29 September 2026</w:t>
             </w:r>
           </w:p>
         </w:tc>
@@ -577,7 +577,7 @@
               <w:spacing w:after="40"/>
             </w:pPr>
             <w:r>
-              <w:t>Live at altura-hertz.netlify.app. Placeholders still to replace before launch.</w:t>
+              <w:t xml:space="preserve">Live at altura-hertz.netlify.app (1.13.2). Versions 1.14.0 to 1.14.3 are on GitHub; 1.15.0 is on this computer only and not yet deployed. Placeholders still to replace before launch.</w:t>
             </w:r>
           </w:p>
         </w:tc>
@@ -635,7 +635,7 @@
               <w:spacing w:after="40"/>
             </w:pPr>
             <w:r>
-              <w:t>27 September 2026 (1.13.2 deployed)</w:t>
+              <w:t xml:space="preserve">29 September 2026 (1.15.0 documented, not yet deployed)</w:t>
             </w:r>
           </w:p>
         </w:tc>
@@ -685,11 +685,7 @@
           </w:pPr>
           <w:r>
             <w:fldChar w:fldCharType="begin"/>
-          </w:r>
-          <w:r>
             <w:instrText>TOC \h \o "1-2"</w:instrText>
-          </w:r>
-          <w:r>
             <w:fldChar w:fldCharType="separate"/>
           </w:r>
           <w:hyperlink w:anchor="_Toc241375882" w:history="1">
@@ -705,40 +701,10 @@
                 <w:noProof/>
               </w:rPr>
               <w:tab/>
-            </w:r>
-            <w:r>
-              <w:rPr>
-                <w:noProof/>
-              </w:rPr>
               <w:fldChar w:fldCharType="begin"/>
-            </w:r>
-            <w:r>
-              <w:rPr>
-                <w:noProof/>
-              </w:rPr>
               <w:instrText xml:space="preserve"> PAGEREF _Toc241375882 \h </w:instrText>
-            </w:r>
-            <w:r>
-              <w:rPr>
-                <w:noProof/>
-              </w:rPr>
-            </w:r>
-            <w:r>
-              <w:rPr>
-                <w:noProof/>
-              </w:rPr>
               <w:fldChar w:fldCharType="separate"/>
-            </w:r>
-            <w:r>
-              <w:rPr>
-                <w:noProof/>
-              </w:rPr>
               <w:t>3</w:t>
-            </w:r>
-            <w:r>
-              <w:rPr>
-                <w:noProof/>
-              </w:rPr>
               <w:fldChar w:fldCharType="end"/>
             </w:r>
           </w:hyperlink>
@@ -772,40 +738,10 @@
                 <w:noProof/>
               </w:rPr>
               <w:tab/>
-            </w:r>
-            <w:r>
-              <w:rPr>
-                <w:noProof/>
-              </w:rPr>
               <w:fldChar w:fldCharType="begin"/>
-            </w:r>
-            <w:r>
-              <w:rPr>
-                <w:noProof/>
-              </w:rPr>
               <w:instrText xml:space="preserve"> PAGEREF _Toc241375883 \h </w:instrText>
-            </w:r>
-            <w:r>
-              <w:rPr>
-                <w:noProof/>
-              </w:rPr>
-            </w:r>
-            <w:r>
-              <w:rPr>
-                <w:noProof/>
-              </w:rPr>
               <w:fldChar w:fldCharType="separate"/>
-            </w:r>
-            <w:r>
-              <w:rPr>
-                <w:noProof/>
-              </w:rPr>
               <w:t>3</w:t>
-            </w:r>
-            <w:r>
-              <w:rPr>
-                <w:noProof/>
-              </w:rPr>
               <w:fldChar w:fldCharType="end"/>
             </w:r>
           </w:hyperlink>
@@ -839,40 +775,10 @@
                 <w:noProof/>
               </w:rPr>
               <w:tab/>
-            </w:r>
-            <w:r>
-              <w:rPr>
-                <w:noProof/>
-              </w:rPr>
               <w:fldChar w:fldCharType="begin"/>
-            </w:r>
-            <w:r>
-              <w:rPr>
-                <w:noProof/>
-              </w:rPr>
               <w:instrText xml:space="preserve"> PAGEREF _Toc241375884 \h </w:instrText>
-            </w:r>
-            <w:r>
-              <w:rPr>
-                <w:noProof/>
-              </w:rPr>
-            </w:r>
-            <w:r>
-              <w:rPr>
-                <w:noProof/>
-              </w:rPr>
               <w:fldChar w:fldCharType="separate"/>
-            </w:r>
-            <w:r>
-              <w:rPr>
-                <w:noProof/>
-              </w:rPr>
               <w:t>3</w:t>
-            </w:r>
-            <w:r>
-              <w:rPr>
-                <w:noProof/>
-              </w:rPr>
               <w:fldChar w:fldCharType="end"/>
             </w:r>
           </w:hyperlink>
@@ -906,40 +812,10 @@
                 <w:noProof/>
               </w:rPr>
               <w:tab/>
-            </w:r>
-            <w:r>
-              <w:rPr>
-                <w:noProof/>
-              </w:rPr>
               <w:fldChar w:fldCharType="begin"/>
-            </w:r>
-            <w:r>
-              <w:rPr>
-                <w:noProof/>
-              </w:rPr>
               <w:instrText xml:space="preserve"> PAGEREF _Toc241375885 \h </w:instrText>
-            </w:r>
-            <w:r>
-              <w:rPr>
-                <w:noProof/>
-              </w:rPr>
-            </w:r>
-            <w:r>
-              <w:rPr>
-                <w:noProof/>
-              </w:rPr>
               <w:fldChar w:fldCharType="separate"/>
-            </w:r>
-            <w:r>
-              <w:rPr>
-                <w:noProof/>
-              </w:rPr>
               <w:t>4</w:t>
-            </w:r>
-            <w:r>
-              <w:rPr>
-                <w:noProof/>
-              </w:rPr>
               <w:fldChar w:fldCharType="end"/>
             </w:r>
           </w:hyperlink>
@@ -973,40 +849,10 @@
                 <w:noProof/>
               </w:rPr>
               <w:tab/>
-            </w:r>
-            <w:r>
-              <w:rPr>
-                <w:noProof/>
-              </w:rPr>
               <w:fldChar w:fldCharType="begin"/>
-            </w:r>
-            <w:r>
-              <w:rPr>
-                <w:noProof/>
-              </w:rPr>
               <w:instrText xml:space="preserve"> PAGEREF _Toc241375886 \h </w:instrText>
-            </w:r>
-            <w:r>
-              <w:rPr>
-                <w:noProof/>
-              </w:rPr>
-            </w:r>
-            <w:r>
-              <w:rPr>
-                <w:noProof/>
-              </w:rPr>
               <w:fldChar w:fldCharType="separate"/>
-            </w:r>
-            <w:r>
-              <w:rPr>
-                <w:noProof/>
-              </w:rPr>
               <w:t>4</w:t>
-            </w:r>
-            <w:r>
-              <w:rPr>
-                <w:noProof/>
-              </w:rPr>
               <w:fldChar w:fldCharType="end"/>
             </w:r>
           </w:hyperlink>
@@ -1040,40 +886,10 @@
                 <w:noProof/>
               </w:rPr>
               <w:tab/>
-            </w:r>
-            <w:r>
-              <w:rPr>
-                <w:noProof/>
-              </w:rPr>
               <w:fldChar w:fldCharType="begin"/>
-            </w:r>
-            <w:r>
-              <w:rPr>
-                <w:noProof/>
-              </w:rPr>
               <w:instrText xml:space="preserve"> PAGEREF _Toc241375887 \h </w:instrText>
-            </w:r>
-            <w:r>
-              <w:rPr>
-                <w:noProof/>
-              </w:rPr>
-            </w:r>
-            <w:r>
-              <w:rPr>
-                <w:noProof/>
-              </w:rPr>
               <w:fldChar w:fldCharType="separate"/>
-            </w:r>
-            <w:r>
-              <w:rPr>
-                <w:noProof/>
-              </w:rPr>
               <w:t>4</w:t>
-            </w:r>
-            <w:r>
-              <w:rPr>
-                <w:noProof/>
-              </w:rPr>
               <w:fldChar w:fldCharType="end"/>
             </w:r>
           </w:hyperlink>
@@ -1107,40 +923,10 @@
                 <w:noProof/>
               </w:rPr>
               <w:tab/>
-            </w:r>
-            <w:r>
-              <w:rPr>
-                <w:noProof/>
-              </w:rPr>
               <w:fldChar w:fldCharType="begin"/>
-            </w:r>
-            <w:r>
-              <w:rPr>
-                <w:noProof/>
-              </w:rPr>
               <w:instrText xml:space="preserve"> PAGEREF _Toc241375888 \h </w:instrText>
-            </w:r>
-            <w:r>
-              <w:rPr>
-                <w:noProof/>
-              </w:rPr>
-            </w:r>
-            <w:r>
-              <w:rPr>
-                <w:noProof/>
-              </w:rPr>
               <w:fldChar w:fldCharType="separate"/>
-            </w:r>
-            <w:r>
-              <w:rPr>
-                <w:noProof/>
-              </w:rPr>
               <w:t>5</w:t>
-            </w:r>
-            <w:r>
-              <w:rPr>
-                <w:noProof/>
-              </w:rPr>
               <w:fldChar w:fldCharType="end"/>
             </w:r>
           </w:hyperlink>
@@ -1174,40 +960,10 @@
                 <w:noProof/>
               </w:rPr>
               <w:tab/>
-            </w:r>
-            <w:r>
-              <w:rPr>
-                <w:noProof/>
-              </w:rPr>
               <w:fldChar w:fldCharType="begin"/>
-            </w:r>
-            <w:r>
-              <w:rPr>
-                <w:noProof/>
-              </w:rPr>
               <w:instrText xml:space="preserve"> PAGEREF _Toc241375889 \h </w:instrText>
-            </w:r>
-            <w:r>
-              <w:rPr>
-                <w:noProof/>
-              </w:rPr>
-            </w:r>
-            <w:r>
-              <w:rPr>
-                <w:noProof/>
-              </w:rPr>
               <w:fldChar w:fldCharType="separate"/>
-            </w:r>
-            <w:r>
-              <w:rPr>
-                <w:noProof/>
-              </w:rPr>
               <w:t>5</w:t>
-            </w:r>
-            <w:r>
-              <w:rPr>
-                <w:noProof/>
-              </w:rPr>
               <w:fldChar w:fldCharType="end"/>
             </w:r>
           </w:hyperlink>
@@ -1241,40 +997,10 @@
                 <w:noProof/>
               </w:rPr>
               <w:tab/>
-            </w:r>
-            <w:r>
-              <w:rPr>
-                <w:noProof/>
-              </w:rPr>
               <w:fldChar w:fldCharType="begin"/>
-            </w:r>
-            <w:r>
-              <w:rPr>
-                <w:noProof/>
-              </w:rPr>
               <w:instrText xml:space="preserve"> PAGEREF _Toc241375890 \h </w:instrText>
-            </w:r>
-            <w:r>
-              <w:rPr>
-                <w:noProof/>
-              </w:rPr>
-            </w:r>
-            <w:r>
-              <w:rPr>
-                <w:noProof/>
-              </w:rPr>
               <w:fldChar w:fldCharType="separate"/>
-            </w:r>
-            <w:r>
-              <w:rPr>
-                <w:noProof/>
-              </w:rPr>
               <w:t>5</w:t>
-            </w:r>
-            <w:r>
-              <w:rPr>
-                <w:noProof/>
-              </w:rPr>
               <w:fldChar w:fldCharType="end"/>
             </w:r>
           </w:hyperlink>
@@ -1308,40 +1034,10 @@
                 <w:noProof/>
               </w:rPr>
               <w:tab/>
-            </w:r>
-            <w:r>
-              <w:rPr>
-                <w:noProof/>
-              </w:rPr>
               <w:fldChar w:fldCharType="begin"/>
-            </w:r>
-            <w:r>
-              <w:rPr>
-                <w:noProof/>
-              </w:rPr>
               <w:instrText xml:space="preserve"> PAGEREF _Toc241375891 \h </w:instrText>
-            </w:r>
-            <w:r>
-              <w:rPr>
-                <w:noProof/>
-              </w:rPr>
-            </w:r>
-            <w:r>
-              <w:rPr>
-                <w:noProof/>
-              </w:rPr>
               <w:fldChar w:fldCharType="separate"/>
-            </w:r>
-            <w:r>
-              <w:rPr>
-                <w:noProof/>
-              </w:rPr>
               <w:t>5</w:t>
-            </w:r>
-            <w:r>
-              <w:rPr>
-                <w:noProof/>
-              </w:rPr>
               <w:fldChar w:fldCharType="end"/>
             </w:r>
           </w:hyperlink>
@@ -1375,40 +1071,10 @@
                 <w:noProof/>
               </w:rPr>
               <w:tab/>
-            </w:r>
-            <w:r>
-              <w:rPr>
-                <w:noProof/>
-              </w:rPr>
               <w:fldChar w:fldCharType="begin"/>
-            </w:r>
-            <w:r>
-              <w:rPr>
-                <w:noProof/>
-              </w:rPr>
               <w:instrText xml:space="preserve"> PAGEREF _Toc241375892 \h </w:instrText>
-            </w:r>
-            <w:r>
-              <w:rPr>
-                <w:noProof/>
-              </w:rPr>
-            </w:r>
-            <w:r>
-              <w:rPr>
-                <w:noProof/>
-              </w:rPr>
               <w:fldChar w:fldCharType="separate"/>
-            </w:r>
-            <w:r>
-              <w:rPr>
-                <w:noProof/>
-              </w:rPr>
               <w:t>6</w:t>
-            </w:r>
-            <w:r>
-              <w:rPr>
-                <w:noProof/>
-              </w:rPr>
               <w:fldChar w:fldCharType="end"/>
             </w:r>
           </w:hyperlink>
@@ -1442,40 +1108,10 @@
                 <w:noProof/>
               </w:rPr>
               <w:tab/>
-            </w:r>
-            <w:r>
-              <w:rPr>
-                <w:noProof/>
-              </w:rPr>
               <w:fldChar w:fldCharType="begin"/>
-            </w:r>
-            <w:r>
-              <w:rPr>
-                <w:noProof/>
-              </w:rPr>
               <w:instrText xml:space="preserve"> PAGEREF _Toc241375893 \h </w:instrText>
-            </w:r>
-            <w:r>
-              <w:rPr>
-                <w:noProof/>
-              </w:rPr>
-            </w:r>
-            <w:r>
-              <w:rPr>
-                <w:noProof/>
-              </w:rPr>
               <w:fldChar w:fldCharType="separate"/>
-            </w:r>
-            <w:r>
-              <w:rPr>
-                <w:noProof/>
-              </w:rPr>
               <w:t>6</w:t>
-            </w:r>
-            <w:r>
-              <w:rPr>
-                <w:noProof/>
-              </w:rPr>
               <w:fldChar w:fldCharType="end"/>
             </w:r>
           </w:hyperlink>
@@ -1509,40 +1145,10 @@
                 <w:noProof/>
               </w:rPr>
               <w:tab/>
-            </w:r>
-            <w:r>
-              <w:rPr>
-                <w:noProof/>
-              </w:rPr>
               <w:fldChar w:fldCharType="begin"/>
-            </w:r>
-            <w:r>
-              <w:rPr>
-                <w:noProof/>
-              </w:rPr>
               <w:instrText xml:space="preserve"> PAGEREF _Toc241375894 \h </w:instrText>
-            </w:r>
-            <w:r>
-              <w:rPr>
-                <w:noProof/>
-              </w:rPr>
-            </w:r>
-            <w:r>
-              <w:rPr>
-                <w:noProof/>
-              </w:rPr>
               <w:fldChar w:fldCharType="separate"/>
-            </w:r>
-            <w:r>
-              <w:rPr>
-                <w:noProof/>
-              </w:rPr>
               <w:t>6</w:t>
-            </w:r>
-            <w:r>
-              <w:rPr>
-                <w:noProof/>
-              </w:rPr>
               <w:fldChar w:fldCharType="end"/>
             </w:r>
           </w:hyperlink>
@@ -1576,40 +1182,10 @@
                 <w:noProof/>
               </w:rPr>
               <w:tab/>
-            </w:r>
-            <w:r>
-              <w:rPr>
-                <w:noProof/>
-              </w:rPr>
               <w:fldChar w:fldCharType="begin"/>
-            </w:r>
-            <w:r>
-              <w:rPr>
-                <w:noProof/>
-              </w:rPr>
               <w:instrText xml:space="preserve"> PAGEREF _Toc241375895 \h </w:instrText>
-            </w:r>
-            <w:r>
-              <w:rPr>
-                <w:noProof/>
-              </w:rPr>
-            </w:r>
-            <w:r>
-              <w:rPr>
-                <w:noProof/>
-              </w:rPr>
               <w:fldChar w:fldCharType="separate"/>
-            </w:r>
-            <w:r>
-              <w:rPr>
-                <w:noProof/>
-              </w:rPr>
               <w:t>6</w:t>
-            </w:r>
-            <w:r>
-              <w:rPr>
-                <w:noProof/>
-              </w:rPr>
               <w:fldChar w:fldCharType="end"/>
             </w:r>
           </w:hyperlink>
@@ -1643,40 +1219,10 @@
                 <w:noProof/>
               </w:rPr>
               <w:tab/>
-            </w:r>
-            <w:r>
-              <w:rPr>
-                <w:noProof/>
-              </w:rPr>
               <w:fldChar w:fldCharType="begin"/>
-            </w:r>
-            <w:r>
-              <w:rPr>
-                <w:noProof/>
-              </w:rPr>
               <w:instrText xml:space="preserve"> PAGEREF _Toc241375896 \h </w:instrText>
-            </w:r>
-            <w:r>
-              <w:rPr>
-                <w:noProof/>
-              </w:rPr>
-            </w:r>
-            <w:r>
-              <w:rPr>
-                <w:noProof/>
-              </w:rPr>
               <w:fldChar w:fldCharType="separate"/>
-            </w:r>
-            <w:r>
-              <w:rPr>
-                <w:noProof/>
-              </w:rPr>
               <w:t>7</w:t>
-            </w:r>
-            <w:r>
-              <w:rPr>
-                <w:noProof/>
-              </w:rPr>
               <w:fldChar w:fldCharType="end"/>
             </w:r>
           </w:hyperlink>
@@ -1710,40 +1256,10 @@
                 <w:noProof/>
               </w:rPr>
               <w:tab/>
-            </w:r>
-            <w:r>
-              <w:rPr>
-                <w:noProof/>
-              </w:rPr>
               <w:fldChar w:fldCharType="begin"/>
-            </w:r>
-            <w:r>
-              <w:rPr>
-                <w:noProof/>
-              </w:rPr>
               <w:instrText xml:space="preserve"> PAGEREF _Toc241375897 \h </w:instrText>
-            </w:r>
-            <w:r>
-              <w:rPr>
-                <w:noProof/>
-              </w:rPr>
-            </w:r>
-            <w:r>
-              <w:rPr>
-                <w:noProof/>
-              </w:rPr>
               <w:fldChar w:fldCharType="separate"/>
-            </w:r>
-            <w:r>
-              <w:rPr>
-                <w:noProof/>
-              </w:rPr>
               <w:t>7</w:t>
-            </w:r>
-            <w:r>
-              <w:rPr>
-                <w:noProof/>
-              </w:rPr>
               <w:fldChar w:fldCharType="end"/>
             </w:r>
           </w:hyperlink>
@@ -1777,40 +1293,10 @@
                 <w:noProof/>
               </w:rPr>
               <w:tab/>
-            </w:r>
-            <w:r>
-              <w:rPr>
-                <w:noProof/>
-              </w:rPr>
               <w:fldChar w:fldCharType="begin"/>
-            </w:r>
-            <w:r>
-              <w:rPr>
-                <w:noProof/>
-              </w:rPr>
               <w:instrText xml:space="preserve"> PAGEREF _Toc241375898 \h </w:instrText>
-            </w:r>
-            <w:r>
-              <w:rPr>
-                <w:noProof/>
-              </w:rPr>
-            </w:r>
-            <w:r>
-              <w:rPr>
-                <w:noProof/>
-              </w:rPr>
               <w:fldChar w:fldCharType="separate"/>
-            </w:r>
-            <w:r>
-              <w:rPr>
-                <w:noProof/>
-              </w:rPr>
               <w:t>7</w:t>
-            </w:r>
-            <w:r>
-              <w:rPr>
-                <w:noProof/>
-              </w:rPr>
               <w:fldChar w:fldCharType="end"/>
             </w:r>
           </w:hyperlink>
@@ -1844,40 +1330,10 @@
                 <w:noProof/>
               </w:rPr>
               <w:tab/>
-            </w:r>
-            <w:r>
-              <w:rPr>
-                <w:noProof/>
-              </w:rPr>
               <w:fldChar w:fldCharType="begin"/>
-            </w:r>
-            <w:r>
-              <w:rPr>
-                <w:noProof/>
-              </w:rPr>
               <w:instrText xml:space="preserve"> PAGEREF _Toc241375899 \h </w:instrText>
-            </w:r>
-            <w:r>
-              <w:rPr>
-                <w:noProof/>
-              </w:rPr>
-            </w:r>
-            <w:r>
-              <w:rPr>
-                <w:noProof/>
-              </w:rPr>
               <w:fldChar w:fldCharType="separate"/>
-            </w:r>
-            <w:r>
-              <w:rPr>
-                <w:noProof/>
-              </w:rPr>
               <w:t>7</w:t>
-            </w:r>
-            <w:r>
-              <w:rPr>
-                <w:noProof/>
-              </w:rPr>
               <w:fldChar w:fldCharType="end"/>
             </w:r>
           </w:hyperlink>
@@ -1911,40 +1367,10 @@
                 <w:noProof/>
               </w:rPr>
               <w:tab/>
-            </w:r>
-            <w:r>
-              <w:rPr>
-                <w:noProof/>
-              </w:rPr>
               <w:fldChar w:fldCharType="begin"/>
-            </w:r>
-            <w:r>
-              <w:rPr>
-                <w:noProof/>
-              </w:rPr>
               <w:instrText xml:space="preserve"> PAGEREF _Toc241375900 \h </w:instrText>
-            </w:r>
-            <w:r>
-              <w:rPr>
-                <w:noProof/>
-              </w:rPr>
-            </w:r>
-            <w:r>
-              <w:rPr>
-                <w:noProof/>
-              </w:rPr>
               <w:fldChar w:fldCharType="separate"/>
-            </w:r>
-            <w:r>
-              <w:rPr>
-                <w:noProof/>
-              </w:rPr>
               <w:t>7</w:t>
-            </w:r>
-            <w:r>
-              <w:rPr>
-                <w:noProof/>
-              </w:rPr>
               <w:fldChar w:fldCharType="end"/>
             </w:r>
           </w:hyperlink>
@@ -1978,40 +1404,10 @@
                 <w:noProof/>
               </w:rPr>
               <w:tab/>
-            </w:r>
-            <w:r>
-              <w:rPr>
-                <w:noProof/>
-              </w:rPr>
               <w:fldChar w:fldCharType="begin"/>
-            </w:r>
-            <w:r>
-              <w:rPr>
-                <w:noProof/>
-              </w:rPr>
               <w:instrText xml:space="preserve"> PAGEREF _Toc241375901 \h </w:instrText>
-            </w:r>
-            <w:r>
-              <w:rPr>
-                <w:noProof/>
-              </w:rPr>
-            </w:r>
-            <w:r>
-              <w:rPr>
-                <w:noProof/>
-              </w:rPr>
               <w:fldChar w:fldCharType="separate"/>
-            </w:r>
-            <w:r>
-              <w:rPr>
-                <w:noProof/>
-              </w:rPr>
               <w:t>8</w:t>
-            </w:r>
-            <w:r>
-              <w:rPr>
-                <w:noProof/>
-              </w:rPr>
               <w:fldChar w:fldCharType="end"/>
             </w:r>
           </w:hyperlink>
@@ -2045,40 +1441,10 @@
                 <w:noProof/>
               </w:rPr>
               <w:tab/>
-            </w:r>
-            <w:r>
-              <w:rPr>
-                <w:noProof/>
-              </w:rPr>
               <w:fldChar w:fldCharType="begin"/>
-            </w:r>
-            <w:r>
-              <w:rPr>
-                <w:noProof/>
-              </w:rPr>
               <w:instrText xml:space="preserve"> PAGEREF _Toc241375902 \h </w:instrText>
-            </w:r>
-            <w:r>
-              <w:rPr>
-                <w:noProof/>
-              </w:rPr>
-            </w:r>
-            <w:r>
-              <w:rPr>
-                <w:noProof/>
-              </w:rPr>
               <w:fldChar w:fldCharType="separate"/>
-            </w:r>
-            <w:r>
-              <w:rPr>
-                <w:noProof/>
-              </w:rPr>
               <w:t>9</w:t>
-            </w:r>
-            <w:r>
-              <w:rPr>
-                <w:noProof/>
-              </w:rPr>
               <w:fldChar w:fldCharType="end"/>
             </w:r>
           </w:hyperlink>
@@ -2112,40 +1478,10 @@
                 <w:noProof/>
               </w:rPr>
               <w:tab/>
-            </w:r>
-            <w:r>
-              <w:rPr>
-                <w:noProof/>
-              </w:rPr>
               <w:fldChar w:fldCharType="begin"/>
-            </w:r>
-            <w:r>
-              <w:rPr>
-                <w:noProof/>
-              </w:rPr>
               <w:instrText xml:space="preserve"> PAGEREF _Toc241375903 \h </w:instrText>
-            </w:r>
-            <w:r>
-              <w:rPr>
-                <w:noProof/>
-              </w:rPr>
-            </w:r>
-            <w:r>
-              <w:rPr>
-                <w:noProof/>
-              </w:rPr>
               <w:fldChar w:fldCharType="separate"/>
-            </w:r>
-            <w:r>
-              <w:rPr>
-                <w:noProof/>
-              </w:rPr>
               <w:t>14</w:t>
-            </w:r>
-            <w:r>
-              <w:rPr>
-                <w:noProof/>
-              </w:rPr>
               <w:fldChar w:fldCharType="end"/>
             </w:r>
           </w:hyperlink>
@@ -2179,40 +1515,10 @@
                 <w:noProof/>
               </w:rPr>
               <w:tab/>
-            </w:r>
-            <w:r>
-              <w:rPr>
-                <w:noProof/>
-              </w:rPr>
               <w:fldChar w:fldCharType="begin"/>
-            </w:r>
-            <w:r>
-              <w:rPr>
-                <w:noProof/>
-              </w:rPr>
               <w:instrText xml:space="preserve"> PAGEREF _Toc241375904 \h </w:instrText>
-            </w:r>
-            <w:r>
-              <w:rPr>
-                <w:noProof/>
-              </w:rPr>
-            </w:r>
-            <w:r>
-              <w:rPr>
-                <w:noProof/>
-              </w:rPr>
               <w:fldChar w:fldCharType="separate"/>
-            </w:r>
-            <w:r>
-              <w:rPr>
-                <w:noProof/>
-              </w:rPr>
               <w:t>15</w:t>
-            </w:r>
-            <w:r>
-              <w:rPr>
-                <w:noProof/>
-              </w:rPr>
               <w:fldChar w:fldCharType="end"/>
             </w:r>
           </w:hyperlink>
@@ -2496,7 +1802,7 @@
               <w:spacing w:after="40"/>
             </w:pPr>
             <w:r>
-              <w:t>Hero photo and tagline, studio introduction, the five services, how booking works, studio policies.</w:t>
+              <w:t xml:space="preserve">Hero photo, tagline and Book a session button, the five services (each card opens its page), studio introduction and gear, how booking works, studio policies with an interactive mixing deck, and the Ready when you are card.</w:t>
             </w:r>
           </w:p>
         </w:tc>
@@ -2674,7 +1980,7 @@
               <w:spacing w:after="40"/>
             </w:pPr>
             <w:r>
-              <w:t>Booking form priced by the hour. Client receives full WAV stems.</w:t>
+              <w:t xml:space="preserve">Booking form priced by the hour. No track count; instrumental upload is optional. Client receives full WAV stems.</w:t>
             </w:r>
           </w:p>
         </w:tc>
@@ -2763,7 +2069,7 @@
               <w:spacing w:after="40"/>
             </w:pPr>
             <w:r>
-              <w:t>Project submission with stems upload, priced per track.</w:t>
+              <w:t xml:space="preserve">Project submission with stems upload (file or link), priced per track.</w:t>
             </w:r>
           </w:p>
         </w:tc>
@@ -4109,7 +3415,7 @@
         <w:spacing w:after="60"/>
       </w:pPr>
       <w:r>
-        <w:t>On phones and small tablets the menu button is an equalizer: four violet bars that bounce like a level meter. The button has no border or background, just the bars. Tapping it crosses two bars into an X and the menu slides down with each link fading in one after the other. The animation stops for visitors who have reduced motion turned on.</w:t>
+        <w:t xml:space="preserve">On phones and small tablets the menu button is an equalizer turned on its side: four flat bars that all start from the same line on the left and grow to the right like a level meter. Each bar is full length at its peak and shrinks back to its own resting length, with the middle two resting longest. The button has no border or background, just the bars. Tapping it crosses two bars into an X and the menu slides down with each link fading in one after the other. The animation stops for visitors who have reduced motion turned on.</w:t>
       </w:r>
     </w:p>
     <w:p>
@@ -4175,6 +3481,58 @@
       </w:pPr>
       <w:r>
         <w:t>Layout works from phone width up to wide desktop screens.</w:t>
+      </w:r>
+    </w:p>
+    <w:p>
+      <w:pPr>
+        <w:pStyle w:val="ListParagraph"/>
+        <w:numPr>
+          <w:ilvl w:val="0"/>
+          <w:numId w:val="2"/>
+        </w:numPr>
+        <w:spacing w:after="60"/>
+      </w:pPr>
+      <w:r>
+        <w:t xml:space="preserve">Desktop navigation: every item (Home, Purchase Beats, Contact Us, Book a session) has an icon. Once the page scrolls past the hero and the dark pill appears, the labels fold away and only the icons remain, and the logo folds the same way.</w:t>
+      </w:r>
+    </w:p>
+    <w:p>
+      <w:pPr>
+        <w:pStyle w:val="ListParagraph"/>
+        <w:numPr>
+          <w:ilvl w:val="0"/>
+          <w:numId w:val="2"/>
+        </w:numPr>
+        <w:spacing w:after="60"/>
+      </w:pPr>
+      <w:r>
+        <w:t xml:space="preserve">The home page sections have their own backdrops. The studio section is tinted and its photo dissolves into a blurred, darkened copy of itself behind the text. Studio policies has a portrait background video and a tilted seven channel mixing deck whose faders can be dragged, scrolled or moved with the arrow keys. The How booking works and Studio policies headings carry small violet icon badges.</w:t>
+      </w:r>
+    </w:p>
+    <w:p>
+      <w:pPr>
+        <w:pStyle w:val="ListParagraph"/>
+        <w:numPr>
+          <w:ilvl w:val="0"/>
+          <w:numId w:val="2"/>
+        </w:numPr>
+        <w:spacing w:after="60"/>
+      </w:pPr>
+      <w:r>
+        <w:t xml:space="preserve">The Ready when you are card plays a background video under a violet overlay. Both background videos only load and play while they are on screen.</w:t>
+      </w:r>
+    </w:p>
+    <w:p>
+      <w:pPr>
+        <w:pStyle w:val="ListParagraph"/>
+        <w:numPr>
+          <w:ilvl w:val="0"/>
+          <w:numId w:val="2"/>
+        </w:numPr>
+        <w:spacing w:after="60"/>
+      </w:pPr>
+      <w:r>
+        <w:t xml:space="preserve">The Recording only page hero photo sits further right and is less zoomed in, with its left edge fading into the background on desktop.</w:t>
       </w:r>
     </w:p>
     <w:p>
@@ -4408,23 +3766,7 @@
               <w:spacing w:after="40"/>
             </w:pPr>
             <w:r>
-              <w:t>3 to 4 hours: 10%</w:t>
-            </w:r>
-          </w:p>
-          <w:p>
-            <w:pPr>
-              <w:spacing w:after="40"/>
-            </w:pPr>
-            <w:r>
-              <w:t>5 to 7 hours: 15%</w:t>
-            </w:r>
-          </w:p>
-          <w:p>
-            <w:pPr>
-              <w:spacing w:after="40"/>
-            </w:pPr>
-            <w:r>
-              <w:t>8 or more hours: 20%</w:t>
+              <w:t xml:space="preserve">2 or more hours: 10%</w:t>
             </w:r>
           </w:p>
         </w:tc>
@@ -4660,19 +4002,7 @@
         <w:spacing w:after="60"/>
       </w:pPr>
       <w:r>
-        <w:t xml:space="preserve">The form creates a booking summary with a reference number such as </w:t>
-      </w:r>
-      <w:r>
-        <w:rPr>
-          <w:rFonts w:ascii="Consolas" w:eastAsia="Consolas" w:hAnsi="Consolas" w:cs="Consolas"/>
-          <w:color w:val="4E11DC"/>
-          <w:sz w:val="19"/>
-          <w:szCs w:val="19"/>
-        </w:rPr>
-        <w:t>AH-260927-K4TZ</w:t>
-      </w:r>
-      <w:r>
-        <w:t>.</w:t>
+        <w:t xml:space="preserve">Recording sessions start between 11:00 and 22:00 and must end by the 23:00 closing time. The hours field caps itself at the time left before closing, and at 6 hours at most.</w:t>
       </w:r>
     </w:p>
     <w:p>
@@ -4685,7 +4015,19 @@
         <w:spacing w:after="60"/>
       </w:pPr>
       <w:r>
-        <w:t>If a form service is connected (section 5.5), the request and files are sent to it and the client sees a confirmation.</w:t>
+        <w:t xml:space="preserve">The form creates a booking summary with a reference number such as </w:t>
+      </w:r>
+      <w:r>
+        <w:rPr>
+          <w:rFonts w:ascii="Consolas" w:eastAsia="Consolas" w:hAnsi="Consolas" w:cs="Consolas"/>
+          <w:color w:val="4E11DC"/>
+          <w:sz w:val="19"/>
+          <w:szCs w:val="19"/>
+        </w:rPr>
+        <w:t>AH-260927-K4TZ</w:t>
+      </w:r>
+      <w:r>
+        <w:t>.</w:t>
       </w:r>
     </w:p>
     <w:p>
@@ -4698,7 +4040,7 @@
         <w:spacing w:after="60"/>
       </w:pPr>
       <w:r>
-        <w:t>If no form service is connected, the client gets buttons to send the summary on WhatsApp or by email, or to copy it.</w:t>
+        <w:t>If a form service is connected (section 5.5), the request and files are sent to it and the client sees a confirmation.</w:t>
       </w:r>
     </w:p>
     <w:p>
@@ -4711,6 +4053,19 @@
         <w:spacing w:after="60"/>
       </w:pPr>
       <w:r>
+        <w:t>If no form service is connected, the client gets buttons to send the summary on WhatsApp or by email, or to copy it.</w:t>
+      </w:r>
+    </w:p>
+    <w:p>
+      <w:pPr>
+        <w:pStyle w:val="ListParagraph"/>
+        <w:numPr>
+          <w:ilvl w:val="0"/>
+          <w:numId w:val="3"/>
+        </w:numPr>
+        <w:spacing w:after="60"/>
+      </w:pPr>
+      <w:r>
         <w:t>The studio confirms the time slot and sends payment details for the chosen method.</w:t>
       </w:r>
     </w:p>
@@ -4729,17 +4084,17 @@
         <w:spacing w:after="120"/>
       </w:pPr>
       <w:r>
-        <w:t xml:space="preserve">Clients choose MTN MoMo, Telecel Cash, AT Money, card or bank transfer, or pay at the studio. </w:t>
+        <w:t xml:space="preserve">Clients choose MTN MoMo, Telecel Cash, or card or bank transfer. MTN MoMo and Telecel Cash show the networks' own logos; card or bank transfer shows the Material Symbols bank icon (account_balance). AT Money and pay at the studio were removed. The Payment section on every booking form states that all payments are NON-REFUNDABLE, in bold, underlined rose text. No money is taken online yet. The studio sends payment details when confirming. Online payment (for example Paystack, which supports Ghana mobile money and cards) needs a small server or a Paystack payment link and is listed as a future step.</w:t>
       </w:r>
       <w:r>
         <w:rPr>
           <w:b/>
           <w:bCs/>
         </w:rPr>
-        <w:t>No money is taken online yet.</w:t>
-      </w:r>
-      <w:r>
-        <w:t xml:space="preserve"> The studio sends payment details when confirming. Online payment (for example Paystack, which supports Ghana mobile money and cards) needs a small server or a Paystack payment link and is listed as a future step.</w:t>
+        <w:t/>
+      </w:r>
+      <w:r>
+        <w:t/>
       </w:r>
     </w:p>
     <w:p>
@@ -4757,7 +4112,7 @@
         <w:spacing w:after="120"/>
       </w:pPr>
       <w:r>
-        <w:t>Each upload field also accepts a link (Google Drive, WeTransfer, Dropbox), and the client must give a file or a link. Stems are often too large to send through a form, so the link is usually the practical option. Uploaded files are only sent when a form service is connected.</w:t>
+        <w:t xml:space="preserve">Mixing and mastering: the stems archive is required and can be a file or a link (Google Drive, WeTransfer, Dropbox), since stems are often too large for a form. Recording + mixing and mastering: instrumentals are required as MP3 or WAV files; the link option was removed. Recording only: the instrumental upload is optional, but any files added must be MP3 or WAV. Track titles on the two mixing forms are optional. Uploaded files are only sent when a form service is connected.</w:t>
       </w:r>
     </w:p>
     <w:p>
@@ -5368,7 +4723,7 @@
               <w:spacing w:after="40"/>
             </w:pPr>
             <w:r>
-              <w:t>Monday to Sunday, 10:00 to 22:00</w:t>
+              <w:t xml:space="preserve">Monday to Sunday, 11:00 to 23:00</w:t>
             </w:r>
           </w:p>
         </w:tc>
@@ -5460,7 +4815,7 @@
               <w:spacing w:after="40"/>
             </w:pPr>
             <w:r>
-              <w:t>10:00 to 20:00, hourly</w:t>
+              <w:t xml:space="preserve">11:00 to 22:00, hourly. Sessions end by closingTime (23:00) and last at most maxSessionHours (6).</w:t>
             </w:r>
           </w:p>
         </w:tc>
@@ -5644,7 +4999,7 @@
               <w:spacing w:after="40"/>
             </w:pPr>
             <w:r>
-              <w:t>Placeholder tiers in section 3</w:t>
+              <w:t xml:space="preserve">Placeholder tiers in section 3 (recording now 10% from 2 hours)</w:t>
             </w:r>
           </w:p>
         </w:tc>
@@ -8288,7 +7643,7 @@
               <w:spacing w:after="40"/>
             </w:pPr>
             <w:r>
-              <w:t xml:space="preserve">Edit </w:t>
+              <w:t xml:space="preserve">Edit paymentMethods in js/config.js. Give each method either a logo (an image path in assets/img, shown at 32 px) or an icon (a Google Material Symbols name from fonts.google.com/icons, which must be in the icon font, see Add a new icon).</w:t>
             </w:r>
             <w:r>
               <w:rPr>
@@ -8297,10 +7652,10 @@
                 <w:sz w:val="19"/>
                 <w:szCs w:val="19"/>
               </w:rPr>
-              <w:t>paymentMethods</w:t>
-            </w:r>
-            <w:r>
-              <w:t xml:space="preserve"> in </w:t>
+              <w:t/>
+            </w:r>
+            <w:r>
+              <w:t/>
             </w:r>
             <w:r>
               <w:rPr>
@@ -8309,10 +7664,10 @@
                 <w:sz w:val="19"/>
                 <w:szCs w:val="19"/>
               </w:rPr>
-              <w:t>js/config.js</w:t>
-            </w:r>
-            <w:r>
-              <w:t xml:space="preserve">. Icons use Google Material Symbols names from </w:t>
+              <w:t/>
+            </w:r>
+            <w:r>
+              <w:t/>
             </w:r>
             <w:r>
               <w:rPr>
@@ -8321,10 +7676,10 @@
                 <w:sz w:val="19"/>
                 <w:szCs w:val="19"/>
               </w:rPr>
-              <w:t>fonts.google.com/icons</w:t>
-            </w:r>
-            <w:r>
-              <w:t>.</w:t>
+              <w:t/>
+            </w:r>
+            <w:r>
+              <w:t/>
             </w:r>
           </w:p>
         </w:tc>
@@ -8686,7 +8041,7 @@
               <w:spacing w:after="40"/>
             </w:pPr>
             <w:r>
-              <w:t xml:space="preserve">The icon font only contains the icons in use. Find the icon name at </w:t>
+              <w:t xml:space="preserve">The icon font only contains the icons in use. Find the icon name at fonts.google.com/icons, add it to the icon_names list in the Google Fonts link noted at the top of css/fonts.css, download the new file and replace assets/fonts/material-symbols-rounded-300-400.woff2. Always keep that list in step with the font: the font is rebuilt from the list, so an icon missing from the list disappears the next time anyone adds one. A missing icon shows as a blank square.</w:t>
             </w:r>
             <w:r>
               <w:rPr>
@@ -8695,10 +8050,10 @@
                 <w:sz w:val="19"/>
                 <w:szCs w:val="19"/>
               </w:rPr>
-              <w:t>fonts.google.com/icons</w:t>
-            </w:r>
-            <w:r>
-              <w:t xml:space="preserve">, add it to the </w:t>
+              <w:t/>
+            </w:r>
+            <w:r>
+              <w:t/>
             </w:r>
             <w:r>
               <w:rPr>
@@ -8707,10 +8062,10 @@
                 <w:sz w:val="19"/>
                 <w:szCs w:val="19"/>
               </w:rPr>
-              <w:t>icon_names</w:t>
-            </w:r>
-            <w:r>
-              <w:t xml:space="preserve"> list in the Google Fonts link noted at the top of </w:t>
+              <w:t/>
+            </w:r>
+            <w:r>
+              <w:t/>
             </w:r>
             <w:r>
               <w:rPr>
@@ -8719,10 +8074,10 @@
                 <w:sz w:val="19"/>
                 <w:szCs w:val="19"/>
               </w:rPr>
-              <w:t>css/fonts.css</w:t>
-            </w:r>
-            <w:r>
-              <w:t xml:space="preserve">, download the new file and replace </w:t>
+              <w:t/>
+            </w:r>
+            <w:r>
+              <w:t/>
             </w:r>
             <w:r>
               <w:rPr>
@@ -8731,10 +8086,10 @@
                 <w:sz w:val="19"/>
                 <w:szCs w:val="19"/>
               </w:rPr>
-              <w:t>assets/fonts/material-symbols-rounded-300-400.woff2</w:t>
-            </w:r>
-            <w:r>
-              <w:t>. A missing icon shows as a blank square.</w:t>
+              <w:t/>
+            </w:r>
+            <w:r>
+              <w:t/>
             </w:r>
           </w:p>
         </w:tc>
@@ -8909,7 +8264,7 @@
               <w:spacing w:after="40"/>
             </w:pPr>
             <w:r>
-              <w:t>1.13.2</w:t>
+              <w:t xml:space="preserve">1.15.0</w:t>
             </w:r>
           </w:p>
         </w:tc>
@@ -8934,7 +8289,7 @@
               <w:spacing w:after="40"/>
             </w:pPr>
             <w:r>
-              <w:t>27 Sep 2026</w:t>
+              <w:t xml:space="preserve">29 Sep 2026</w:t>
             </w:r>
           </w:p>
         </w:tc>
@@ -8959,7 +8314,7 @@
               <w:spacing w:after="40"/>
             </w:pPr>
             <w:r>
-              <w:t>Removed the dark circle behind the icons on the Choose your session cards. The white icons now sit directly on the card images, slightly larger (22 px), with a soft shadow so they stay readable on bright images. Deployed to Netlify with 1.13.2.</w:t>
+              <w:t xml:space="preserve">Fixed the How booking works and Studio policies section icons (floor and gavel) showing as blank squares. They were in the font from 1.14.3 but missing from the icon_names list in css/fonts.css, so the rebuild for the bank icon dropped them. Both are now in the list and the font, and every icon used on the site was checked against the font. Not yet deployed.</w:t>
             </w:r>
           </w:p>
         </w:tc>
@@ -8992,7 +8347,7 @@
               <w:spacing w:after="40"/>
             </w:pPr>
             <w:r>
-              <w:t>1.13.1</w:t>
+              <w:t xml:space="preserve">1.15.0</w:t>
             </w:r>
           </w:p>
         </w:tc>
@@ -9017,7 +8372,7 @@
               <w:spacing w:after="40"/>
             </w:pPr>
             <w:r>
-              <w:t>27 Sep 2026</w:t>
+              <w:t xml:space="preserve">29 Sep 2026</w:t>
             </w:r>
           </w:p>
         </w:tc>
@@ -9042,7 +8397,7 @@
               <w:spacing w:after="40"/>
             </w:pPr>
             <w:r>
-              <w:t>Increased the space below the Choose your session section by 1.7 times. Measured before and after: phone 390 x 740 from 92 to 156 px, laptop 1366 x 657 from 102 to 173 px, desktop 1920 x 960 from 151 to 257 px. The space above the section is unchanged. Deployed to Netlify with 1.13.2.</w:t>
+              <w:t xml:space="preserve">Phone menu button turned 90 degrees so the equalizer bars lie flat, all starting from the same line on the left. Every bar now grows to full length at its peak and shrinks back to its own resting length (the middle two rest longest), instead of bouncing around fixed short heights. The X when open is unchanged. Not yet deployed.</w:t>
             </w:r>
           </w:p>
         </w:tc>
@@ -9075,7 +8430,7 @@
               <w:spacing w:after="40"/>
             </w:pPr>
             <w:r>
-              <w:t>1.13.0</w:t>
+              <w:t xml:space="preserve">1.15.0</w:t>
             </w:r>
           </w:p>
         </w:tc>
@@ -9100,7 +8455,7 @@
               <w:spacing w:after="40"/>
             </w:pPr>
             <w:r>
-              <w:t>27 Sep 2026</w:t>
+              <w:t xml:space="preserve">29 Sep 2026</w:t>
             </w:r>
           </w:p>
         </w:tc>
@@ -9125,10 +8480,7 @@
               <w:spacing w:after="40"/>
             </w:pPr>
             <w:r>
-              <w:t>Added a white meter bank to the right side of the home page hero: 12 stereo strips using the same bars and motion as the Ready when you are meters, but lit only in shades of white (soft grey at the bottom to bright white at the top, white peak lines). It blends into the photo with a screen blend, so unlit segments disappear and lit ones glow, and it fades out towards the headline, under the nav and at the bottom. Desktop opacity 42%; on phones 6 strips at 20% opacity so the headline stays clear. Pauses when</w:t>
-            </w:r>
-            <w:r>
-              <w:t xml:space="preserve"> scrolled off screen. Deployed to Netlify with 1.13.2.</w:t>
+              <w:t xml:space="preserve">Booking forms: payment choices cut to MTN MoMo, Telecel Cash, and card or bank transfer (AT Money and pay at the studio removed). MTN and Telecel show their logos (assets/img/pay-mtn.webp, pay-telecel.webp); card or bank transfer uses the account_balance icon, added to the icon font in place of credit_card. The Payment note on all three booking forms now ends with All payments are NON-REFUNDABLE, bold, underlined and in rose (#ee5a95, class no-refund). Not yet deployed.</w:t>
             </w:r>
           </w:p>
         </w:tc>
@@ -9161,7 +8513,7 @@
               <w:spacing w:after="40"/>
             </w:pPr>
             <w:r>
-              <w:t>1.12.4</w:t>
+              <w:t xml:space="preserve">1.15.0</w:t>
             </w:r>
           </w:p>
         </w:tc>
@@ -9186,7 +8538,7 @@
               <w:spacing w:after="40"/>
             </w:pPr>
             <w:r>
-              <w:t>27 Sep 2026</w:t>
+              <w:t xml:space="preserve">29 Sep 2026</w:t>
             </w:r>
           </w:p>
         </w:tc>
@@ -9211,7 +8563,7 @@
               <w:spacing w:after="40"/>
             </w:pPr>
             <w:r>
-              <w:t>Made the note pattern in the hero Book a session button more transparent: note opacity halved from 26% to 13%, so it reads as a subtle texture. Deployed to Netlify with 1.13.2.</w:t>
+              <w:t xml:space="preserve">Recording only form: removed the Track info section (number of tracks and track titles). The instrumental upload stays, now optional and in its own Instrumentals section; files added must still be MP3 or WAV. The instrumental link field was removed here and on Recording + mixing and mastering. Track titles on the mixing forms are optional. The hero photo sits further right, less zoomed in, with its left edge faded on desktop. Not yet deployed.</w:t>
             </w:r>
           </w:p>
         </w:tc>
@@ -9244,7 +8596,7 @@
               <w:spacing w:after="40"/>
             </w:pPr>
             <w:r>
-              <w:t>1.12.3</w:t>
+              <w:t xml:space="preserve">1.15.0</w:t>
             </w:r>
           </w:p>
         </w:tc>
@@ -9269,7 +8621,7 @@
               <w:spacing w:after="40"/>
             </w:pPr>
             <w:r>
-              <w:t>27 Sep 2026</w:t>
+              <w:t xml:space="preserve">29 Sep 2026</w:t>
             </w:r>
           </w:p>
         </w:tc>
@@ -9294,7 +8646,7 @@
               <w:spacing w:after="40"/>
             </w:pPr>
             <w:r>
-              <w:t>Simplified the hero Book a session button pattern: one upright eighth note only (no upside down pairs, no diamonds), repeated in neat staggered rows with each row shifted half a step, about 12 px between notes instead of about 7 px. Still glides sideways on hover. Deployed to Netlify with 1.13.2.</w:t>
+              <w:t xml:space="preserve">Sessions: opening hours 11:00 to 23:00, start times 11:00 to 22:00, sessions must end by 23:00 (new closingTime setting) and last at most 6 hours; the hours field caps itself at the time left. Recording discount is now 10% from 2 hours (was 10, 15 and 20% from 3, 5 and 8 hours). Not yet deployed.</w:t>
             </w:r>
           </w:p>
         </w:tc>
@@ -9327,7 +8679,7 @@
               <w:spacing w:after="40"/>
             </w:pPr>
             <w:r>
-              <w:t>1.12.2</w:t>
+              <w:t xml:space="preserve">1.15.0</w:t>
             </w:r>
           </w:p>
         </w:tc>
@@ -9352,7 +8704,7 @@
               <w:spacing w:after="40"/>
             </w:pPr>
             <w:r>
-              <w:t>27 Sep 2026</w:t>
+              <w:t xml:space="preserve">29 Sep 2026</w:t>
             </w:r>
           </w:p>
         </w:tc>
@@ -9377,7 +8729,7 @@
               <w:spacing w:after="40"/>
             </w:pPr>
             <w:r>
-              <w:t>Replaced the notation pattern in the hero Book a session button with a small monogram style pattern: tiny single eighth notes in a tight 14 px diagonal checker, alternating upright and upside down, with small diamonds between them, repeated over the whole button in the manner of a luxury fashion monogram. No staff lines or beamed notes. The pattern glides sideways on hover (off for reduced motion). Deployed to Netlify with 1.13.2.</w:t>
+              <w:t xml:space="preserve">Content: Mixing and mastering heading now reads Upload your music for mixing and mastering, and its intro Send us your project stems and we'll send it back to you mixed and mastered. Home page: services section renamed Services with a new intro, and the cards no longer show prices or action links; the hero Purchase beats button was removed; studio gear now lists the Lauten Audio LA-320 V2 microphone, Apollo Twin interface, KRK monitors, and FL Studio + Cubase + Logic Pro + LUNA. The Ready when you are card has a background video (assets/video/cta-bg.mp4) under a violet overlay. Contact page hero and first section tightened. Not yet deployed.</w:t>
             </w:r>
           </w:p>
         </w:tc>
@@ -9410,7 +8762,7 @@
               <w:spacing w:after="40"/>
             </w:pPr>
             <w:r>
-              <w:t>1.12.1</w:t>
+              <w:t xml:space="preserve">1.14.3</w:t>
             </w:r>
           </w:p>
         </w:tc>
@@ -9435,7 +8787,7 @@
               <w:spacing w:after="40"/>
             </w:pPr>
             <w:r>
-              <w:t>27 Sep 2026</w:t>
+              <w:t xml:space="preserve">27 Sep 2026</w:t>
             </w:r>
           </w:p>
         </w:tc>
@@ -9460,7 +8812,7 @@
               <w:spacing w:after="40"/>
             </w:pPr>
             <w:r>
-              <w:t>Added a faint musical notation pattern (five staff lines with beamed eighth notes, a quarter note and a half note) inside the violet Book a session button in the home page hero. The notes are drawn as simple shapes embedded in the stylesheet, not music symbol characters. On hover the button lightens and the score scrolls slowly sideways; the scrolling is off for visitors with reduced motion. Deployed to Netlify with 1.13.2.</w:t>
+              <w:t xml:space="preserve">Violet icon badges on the How booking works (floor) and Studio policies (gavel) headings. Studio policies background videos only load and play while on screen. Page hero images given fixed width and height to stop layout shift. Removed the eyebrow label from the home page hero. On GitHub (ed71af1).</w:t>
             </w:r>
           </w:p>
         </w:tc>
@@ -9493,7 +8845,7 @@
               <w:spacing w:after="40"/>
             </w:pPr>
             <w:r>
-              <w:t>1.12.0</w:t>
+              <w:t xml:space="preserve">1.14.2</w:t>
             </w:r>
           </w:p>
         </w:tc>
@@ -9518,7 +8870,7 @@
               <w:spacing w:after="40"/>
             </w:pPr>
             <w:r>
-              <w:t>27 Sep 2026</w:t>
+              <w:t xml:space="preserve">27 Sep 2026</w:t>
             </w:r>
           </w:p>
         </w:tc>
@@ -9543,10 +8895,7 @@
               <w:spacing w:after="40"/>
             </w:pPr>
             <w:r>
-              <w:t>Made the site more spacious (roughly 15 to 25% more room): side margins 16 to 32 px became 20 to 48 px; space between sections 64 to 110 px became 80 to 136 px; body line spacing 1.6 to 1.68; larger gaps under section headings and between service cards, steps, policies, contact tiles, form fields and the booking form and summary; roomier card, form, summary, contact tile, Ready when you are card and footer padding. The spacing above and below Choose your session was left as set in 1.4.1. All five services s</w:t>
-            </w:r>
-            <w:r>
-              <w:t>till fit on one screen, checked at 360 x 640, 390 x 740, 768 x 900, 1366 x 657 and 1920 x 960. Deployed to Netlify with 1.13.2.</w:t>
+              <w:t xml:space="preserve">Desktop navigation items got icons (home, shopping_cart, call, event_available). When the scrolled pill appears, the labels fold away leaving only the icons, and the logo folds the same way. The home icon was added to the icon font. On GitHub (78771ad).</w:t>
             </w:r>
           </w:p>
         </w:tc>
@@ -9579,7 +8928,7 @@
               <w:spacing w:after="40"/>
             </w:pPr>
             <w:r>
-              <w:t>1.11.2</w:t>
+              <w:t xml:space="preserve">1.14.1</w:t>
             </w:r>
           </w:p>
         </w:tc>
@@ -9604,7 +8953,7 @@
               <w:spacing w:after="40"/>
             </w:pPr>
             <w:r>
-              <w:t>27 Sep 2026</w:t>
+              <w:t xml:space="preserve">27 Sep 2026</w:t>
             </w:r>
           </w:p>
         </w:tc>
@@ -9629,7 +8978,7 @@
               <w:spacing w:after="40"/>
             </w:pPr>
             <w:r>
-              <w:t>Desktop nav: once the page scrolls past the hero, the logo on the left now gets the same rounded dark pill as the links on the right (same colour, blur, border and shadow, fading in at the same moment). Both pills are 42.4 px tall and aligned. Over the hero both sides stay transparent. The glow behind the logo text was removed since the pill now keeps it readable. Deployed to Netlify with 1.13.2.</w:t>
+              <w:t xml:space="preserve">The studio section photo now dissolves into the section through a blurred, darkened, edge-feathered copy of itself behind the text. The sharp photo card is unchanged. On GitHub (552298a).</w:t>
             </w:r>
           </w:p>
         </w:tc>
@@ -9662,7 +9011,7 @@
               <w:spacing w:after="40"/>
             </w:pPr>
             <w:r>
-              <w:t>1.11.1</w:t>
+              <w:t xml:space="preserve">1.14.0</w:t>
             </w:r>
           </w:p>
         </w:tc>
@@ -9687,7 +9036,7 @@
               <w:spacing w:after="40"/>
             </w:pPr>
             <w:r>
-              <w:t>27 Sep 2026</w:t>
+              <w:t xml:space="preserve">27 Sep 2026</w:t>
             </w:r>
           </w:p>
         </w:tc>
@@ -9712,7 +9061,7 @@
               <w:spacing w:after="40"/>
             </w:pPr>
             <w:r>
-              <w:t>Prices on the Choose your session cards are 15% smaller: 13 to 11.05 px on desktop, 12.5 to 10.6 px on the compact phone cards. The first card price now fits on one line. Deployed to Netlify with 1.13.2.</w:t>
+              <w:t xml:space="preserve">Home page sections given their own backdrops: The studio and Studio policies are tinted, with spacing fixed where the colour changes exposed tight padding. Studio policies gained a tilted seven channel mixing deck (faders, knobs, ports and a signal meter; faders work by drag, click, wheel and arrow keys, double-click resets) and a portrait background video (assets/video/policies-bg.mp4). On GitHub (4a6bf78).</w:t>
             </w:r>
           </w:p>
         </w:tc>
@@ -9745,7 +9094,7 @@
               <w:spacing w:after="40"/>
             </w:pPr>
             <w:r>
-              <w:t>1.11.0</w:t>
+              <w:t>1.13.2</w:t>
             </w:r>
           </w:p>
         </w:tc>
@@ -9795,7 +9144,7 @@
               <w:spacing w:after="40"/>
             </w:pPr>
             <w:r>
-              <w:t>All headings now use Inter: page headings (h1, weight 800), section headings (h2, weight 800), card and panel titles (h3, weight 700) and the form section titles. Letter spacing tightened slightly to suit Inter at large sizes. The logo keeps Syne. Inter is bundled (about 130 KB, including accented letters and the cedi sign) and preloaded on every page. Boldonse is no longer used, so its files and preload were removed. Deployed to Netlify with 1.13.2.</w:t>
+              <w:t>Removed the dark circle behind the icons on the Choose your session cards. The white icons now sit directly on the card images, slightly larger (22 px), with a soft shadow so they stay readable on bright images. Deployed to Netlify with 1.13.2.</w:t>
             </w:r>
           </w:p>
         </w:tc>
@@ -9828,7 +9177,7 @@
               <w:spacing w:after="40"/>
             </w:pPr>
             <w:r>
-              <w:t>1.10.0</w:t>
+              <w:t>1.13.1</w:t>
             </w:r>
           </w:p>
         </w:tc>
@@ -9878,7 +9227,7 @@
               <w:spacing w:after="40"/>
             </w:pPr>
             <w:r>
-              <w:t>The main heading (h1) on every page now uses Boldonse, with line spacing 1.45 for its tall letters; inner page headings are sized 26 to 48 px. Section headings (h2) and the logo keep Syne. Boldonse is now preloaded on every page. On the Choose your session cards, the action links (Book this session, Book recording, Send your project, Request a beat, Request artwork) now sit at the bottom of each card so they line up across all five. Deployed to Netlify with 1.13.2.</w:t>
+              <w:t>Increased the space below the Choose your session section by 1.7 times. Measured before and after: phone 390 x 740 from 92 to 156 px, laptop 1366 x 657 from 102 to 173 px, desktop 1920 x 960 from 151 to 257 px. The space above the section is unchanged. Deployed to Netlify with 1.13.2.</w:t>
             </w:r>
           </w:p>
         </w:tc>
@@ -9911,7 +9260,7 @@
               <w:spacing w:after="40"/>
             </w:pPr>
             <w:r>
-              <w:t>1.9.0</w:t>
+              <w:t>1.13.0</w:t>
             </w:r>
           </w:p>
         </w:tc>
@@ -9961,7 +9310,7 @@
               <w:spacing w:after="40"/>
             </w:pPr>
             <w:r>
-              <w:t>Desktop split navigation. Over the hero photo the whole nav is transparent. Once the page scrolls past the hero, the right side (Home, Purchase Beats, Contact Us and Book a session) sits in a rounded dark pill with a light blur that fades in, while the logo on the left keeps no background. A soft dark glow behind the logo lettering keeps it readable over content. Phones keep the solid bar. Tested in Chrome on the home page and a booking page. Deployed to Netlify with 1.13.2.</w:t>
+              <w:t xml:space="preserve">Added a white meter bank to the right side of the home page hero: 12 stereo strips using the same bars and motion as the Ready when you are meters, but lit only in shades of white (soft grey at the bottom to bright white at the top, white peak lines). It blends into the photo with a screen blend, so unlit segments disappear and lit ones glow, and it fades out towards the headline, under the nav and at the bottom. Desktop opacity 42%; on phones 6 strips at 20% opacity so the headline stays clear. Pauses when scrolled off screen. Deployed to Netlify with 1.13.2.</w:t>
             </w:r>
           </w:p>
         </w:tc>
@@ -9994,7 +9343,7 @@
               <w:spacing w:after="40"/>
             </w:pPr>
             <w:r>
-              <w:t>1.8.3</w:t>
+              <w:t>1.12.4</w:t>
             </w:r>
           </w:p>
         </w:tc>
@@ -10044,7 +9393,7 @@
               <w:spacing w:after="40"/>
             </w:pPr>
             <w:r>
-              <w:t>Desktop (wider than 820 px): the navigation bar has no background or blur, and the hero photo on every page now extends up behind it so the nav floats over the image. A soft dark fade across the top 150 px of the photo keeps the nav links readable over bright areas. The nav stays fixed at the top and remains transparent while scrolling, so it sits directly over page content further down. Phones keep the solid bar because the dropdown menu needs it. Deployed to Netlify with 1.13.2.</w:t>
+              <w:t>Made the note pattern in the hero Book a session button more transparent: note opacity halved from 26% to 13%, so it reads as a subtle texture. Deployed to Netlify with 1.13.2.</w:t>
             </w:r>
           </w:p>
         </w:tc>
@@ -10077,7 +9426,7 @@
               <w:spacing w:after="40"/>
             </w:pPr>
             <w:r>
-              <w:t>1.8.2</w:t>
+              <w:t>1.12.3</w:t>
             </w:r>
           </w:p>
         </w:tc>
@@ -10127,7 +9476,7 @@
               <w:spacing w:after="40"/>
             </w:pPr>
             <w:r>
-              <w:t>Made the two home page hero buttons (Book a session and Purchase beats) 15% smaller than the other site buttons: text 14 to 11.9 px, icons 18 to 15.3 px, padding 10 x 18 to 8.5 x 15.3 px. They are now about 36 px tall. Other buttons are unchanged. Deployed to Netlify with 1.13.2.</w:t>
+              <w:t>Simplified the hero Book a session button pattern: one upright eighth note only (no upside down pairs, no diamonds), repeated in neat staggered rows with each row shifted half a step, about 12 px between notes instead of about 7 px. Still glides sideways on hover. Deployed to Netlify with 1.13.2.</w:t>
             </w:r>
           </w:p>
         </w:tc>
@@ -10160,7 +9509,7 @@
               <w:spacing w:after="40"/>
             </w:pPr>
             <w:r>
-              <w:t>1.8.1</w:t>
+              <w:t>1.12.2</w:t>
             </w:r>
           </w:p>
         </w:tc>
@@ -10210,7 +9559,7 @@
               <w:spacing w:after="40"/>
             </w:pPr>
             <w:r>
-              <w:t>Made every button slightly smaller: text 15 to 14 px, icons 20 to 18 px, padding 12 x 22 to 10 x 18 px (navigation button 9 x 18 to 8 x 16 px). Buttons are now about 42 px tall. On phones the two hero buttons now sit side by side. Deployed to Netlify with 1.13.2.</w:t>
+              <w:t>Replaced the notation pattern in the hero Book a session button with a small monogram style pattern: tiny single eighth notes in a tight 14 px diagonal checker, alternating upright and upside down, with small diamonds between them, repeated over the whole button in the manner of a luxury fashion monogram. No staff lines or beamed notes. The pattern glides sideways on hover (off for reduced motion). Deployed to Netlify with 1.13.2.</w:t>
             </w:r>
           </w:p>
         </w:tc>
@@ -10243,7 +9592,7 @@
               <w:spacing w:after="40"/>
             </w:pPr>
             <w:r>
-              <w:t>1.8.0</w:t>
+              <w:t>1.12.1</w:t>
             </w:r>
           </w:p>
         </w:tc>
@@ -10293,7 +9642,7 @@
               <w:spacing w:after="40"/>
             </w:pPr>
             <w:r>
-              <w:t>Home page hero headline (Elevate your sound with us.) now uses Boldonse, a Google font under the SIL Open Font License, bundled with the site (about 36 KB) and preloaded on the home page so it shows without a flash. Line spacing set to 1.45 to suit its tall letters. The logo in the navigation and every other heading keep Syne. Deployed to Netlify with 1.13.2.</w:t>
+              <w:t>Added a faint musical notation pattern (five staff lines with beamed eighth notes, a quarter note and a half note) inside the violet Book a session button in the home page hero. The notes are drawn as simple shapes embedded in the stylesheet, not music symbol characters. On hover the button lightens and the score scrolls slowly sideways; the scrolling is off for visitors with reduced motion. Deployed to Netlify with 1.13.2.</w:t>
             </w:r>
           </w:p>
         </w:tc>
@@ -10326,7 +9675,7 @@
               <w:spacing w:after="40"/>
             </w:pPr>
             <w:r>
-              <w:t>1.7.1</w:t>
+              <w:t>1.12.0</w:t>
             </w:r>
           </w:p>
         </w:tc>
@@ -10376,19 +9725,7 @@
               <w:spacing w:after="40"/>
             </w:pPr>
             <w:r>
-              <w:t xml:space="preserve">Added </w:t>
-            </w:r>
-            <w:r>
-              <w:rPr>
-                <w:rFonts w:ascii="Consolas" w:eastAsia="Consolas" w:hAnsi="Consolas" w:cs="Consolas"/>
-                <w:color w:val="4E11DC"/>
-                <w:sz w:val="19"/>
-                <w:szCs w:val="19"/>
-              </w:rPr>
-              <w:t>netlify.toml</w:t>
-            </w:r>
-            <w:r>
-              <w:t xml:space="preserve"> (publish folder, one year cache for fonts, one week for images, basic security headers) and deployed to Netlify at https://altura-hertz.netlify.app. The local folder is linked to the Netlify project.</w:t>
+              <w:t>Made the site more spacious (roughly 15 to 25% more room): side margins 16 to 32 px became 20 to 48 px; space between sections 64 to 110 px became 80 to 136 px; body line spacing 1.6 to 1.68; larger gaps under section headings and between service cards, steps, policies, contact tiles, form fields and the booking form and summary; roomier card, form, summary, contact tile, Ready when you are card and footer padding. The spacing above and below Choose your session was left as set in 1.4.1. All five services still fit on one screen, checked at 360 x 640, 390 x 740, 768 x 900, 1366 x 657 and 1920 x 960. Deployed to Netlify with 1.13.2.</w:t>
             </w:r>
           </w:p>
         </w:tc>
@@ -10421,7 +9758,7 @@
               <w:spacing w:after="40"/>
             </w:pPr>
             <w:r>
-              <w:t>1.7.1</w:t>
+              <w:t>1.11.2</w:t>
             </w:r>
           </w:p>
         </w:tc>
@@ -10471,7 +9808,7 @@
               <w:spacing w:after="40"/>
             </w:pPr>
             <w:r>
-              <w:t>Project put under version control and pushed to GitHub at github.com/ohemengemmanuel/Altura-hurtz (branch main). Added a README and a .gitignore. The development/font-preview folder and font-preview.html are kept out of the repository because the trial font licences are unconfirmed.</w:t>
+              <w:t>Desktop nav: once the page scrolls past the hero, the logo on the left now gets the same rounded dark pill as the links on the right (same colour, blur, border and shadow, fading in at the same moment). Both pills are 42.4 px tall and aligned. Over the hero both sides stay transparent. The glow behind the logo text was removed since the pill now keeps it readable. Deployed to Netlify with 1.13.2.</w:t>
             </w:r>
           </w:p>
         </w:tc>
@@ -10504,7 +9841,7 @@
               <w:spacing w:after="40"/>
             </w:pPr>
             <w:r>
-              <w:t>1.7.1</w:t>
+              <w:t>1.11.1</w:t>
             </w:r>
           </w:p>
         </w:tc>
@@ -10554,10 +9891,7 @@
               <w:spacing w:after="40"/>
             </w:pPr>
             <w:r>
-              <w:t>Replaced the round Gain dial with a vertical, metallic fader like a mixing console channel: a brushed aluminium cap with bevelled edges and a grip line, a machined metal slot with a violet fill up to the cap, a dB scale (plus 3, 0, minus 6, minus 12) with 0 dB highlighted, all mounted on a small dark anodised metal plate so the scale stays readable over the meters. Same range and effect as before (minus 12 to plus 3 dB). Controls: drag the cap or click anywhere on the track to jump there, mouse wheel, arrow</w:t>
-            </w:r>
-            <w:r>
-              <w:t xml:space="preserve"> keys, Page Up and Page Down, Home and End, double-click to reset, and touch drag on phones. Tested in Chrome at 1366 and 390 px.</w:t>
+              <w:t>Prices on the Choose your session cards are 15% smaller: 13 to 11.05 px on desktop, 12.5 to 10.6 px on the compact phone cards. The first card price now fits on one line. Deployed to Netlify with 1.13.2.</w:t>
             </w:r>
           </w:p>
         </w:tc>
@@ -10590,7 +9924,7 @@
               <w:spacing w:after="40"/>
             </w:pPr>
             <w:r>
-              <w:t>1.7.0</w:t>
+              <w:t>1.11.0</w:t>
             </w:r>
           </w:p>
         </w:tc>
@@ -10640,10 +9974,7 @@
               <w:spacing w:after="40"/>
             </w:pPr>
             <w:r>
-              <w:t>Added a Gain dial to the Ready when you are card that sets the height of the meter bars, styled like a plugin knob with a violet value arc and a dB readout. Range minus 12 dB (bars reach about a quarter height) to plus 3 dB (bars clip into the red), starting at 0 dB. Controls: drag up, down or sideways, mouse wheel, arrow keys (0.5 dB), Page Up and Page Down (3 dB), Home and End, and double-click to reset. Works with touch on phones. Announced to screen readers as a slider with its dB value. The dial only c</w:t>
-            </w:r>
-            <w:r>
-              <w:t>hanges two values on the meter bank; the bars keep animating on the graphics card. Tested in Chrome at 1366 and 390 px with mouse drag, double-click and keyboard.</w:t>
+              <w:t>All headings now use Inter: page headings (h1, weight 800), section headings (h2, weight 800), card and panel titles (h3, weight 700) and the form section titles. Letter spacing tightened slightly to suit Inter at large sizes. The logo keeps Syne. Inter is bundled (about 130 KB, including accented letters and the cedi sign) and preloaded on every page. Boldonse is no longer used, so its files and preload were removed. Deployed to Netlify with 1.13.2.</w:t>
             </w:r>
           </w:p>
         </w:tc>
@@ -10676,7 +10007,7 @@
               <w:spacing w:after="40"/>
             </w:pPr>
             <w:r>
-              <w:t>1.6.2</w:t>
+              <w:t>1.10.0</w:t>
             </w:r>
           </w:p>
         </w:tc>
@@ -10726,7 +10057,7 @@
               <w:spacing w:after="40"/>
             </w:pPr>
             <w:r>
-              <w:t>Slowed the meter bank in the Ready when you are card by 25%. Each bar now loops over 3.3 to 4.8 seconds instead of 2.6 to 3.8, with start offsets scaled to match so the bars stay spread out and stereo pairs stay together.</w:t>
+              <w:t>The main heading (h1) on every page now uses Boldonse, with line spacing 1.45 for its tall letters; inner page headings are sized 26 to 48 px. Section headings (h2) and the logo keep Syne. Boldonse is now preloaded on every page. On the Choose your session cards, the action links (Book this session, Book recording, Send your project, Request a beat, Request artwork) now sit at the bottom of each card so they line up across all five. Deployed to Netlify with 1.13.2.</w:t>
             </w:r>
           </w:p>
         </w:tc>
@@ -10759,7 +10090,7 @@
               <w:spacing w:after="40"/>
             </w:pPr>
             <w:r>
-              <w:t>1.6.1</w:t>
+              <w:t>1.9.0</w:t>
             </w:r>
           </w:p>
         </w:tc>
@@ -10809,10 +10140,7 @@
               <w:spacing w:after="40"/>
             </w:pPr>
             <w:r>
-              <w:t>Replaced the analog VU meters with a digital meter bank in the style of DAW mixer meters: 14 stereo channel strips (28 bars) of LED segments lit ice blue at the bottom, violet in the middle and booth red at the top, with unlit segments faintly visible and a white peak-hold line on each bar. The bank is a background layer that fades into the card: towards the text on the left and down into the card at the bottom on desktop, and at both sides and the bottom on phones where it sits under the buttons. Performan</w:t>
-            </w:r>
-            <w:r>
-              <w:t>ce: segments and colours are static, only a dark cover over unlit segments and the peak line move (transform on the graphics card, no JavaScript per frame), six shared motion patterns are reused with different timing, left and right bars in a pair move together with a small offset, and the bank pauses when off screen. Tested in Chrome at 1366 and 390 px.</w:t>
+              <w:t>Desktop split navigation. Over the hero photo the whole nav is transparent. Once the page scrolls past the hero, the right side (Home, Purchase Beats, Contact Us and Book a session) sits in a rounded dark pill with a light blur that fades in, while the logo on the left keeps no background. A soft dark glow behind the logo lettering keeps it readable over content. Phones keep the solid bar. Tested in Chrome on the home page and a booking page. Deployed to Netlify with 1.13.2.</w:t>
             </w:r>
           </w:p>
         </w:tc>
@@ -10845,7 +10173,7 @@
               <w:spacing w:after="40"/>
             </w:pPr>
             <w:r>
-              <w:t>1.6.0</w:t>
+              <w:t>1.8.3</w:t>
             </w:r>
           </w:p>
         </w:tc>
@@ -10895,10 +10223,7 @@
               <w:spacing w:after="40"/>
             </w:pPr>
             <w:r>
-              <w:t>Added a pair of analog VU meters (L and R) to the Ready when you are card. Scale from minus 20 to plus 3 VU with the 0 to plus 3 red zone, glowing needles and a red peak light that flashes when a needle reaches the red. Needles follow fixed musical patterns of different lengths so the channels never move in sync. Performance: faces are drawn once as SVG, only the needles and peak lights animate (rotation and opacity, handled by the graphics card with no JavaScript per frame), the meters pause whenever the c</w:t>
-            </w:r>
-            <w:r>
-              <w:t>ard is off screen, and they stay still for visitors with reduced motion on. Tested in Chrome at 1366 and 390 px: running on screen, paused when scrolled away. On phones the meters sit under the buttons.</w:t>
+              <w:t>Desktop (wider than 820 px): the navigation bar has no background or blur, and the hero photo on every page now extends up behind it so the nav floats over the image. A soft dark fade across the top 150 px of the photo keeps the nav links readable over bright areas. The nav stays fixed at the top and remains transparent while scrolling, so it sits directly over page content further down. Phones keep the solid bar because the dropdown menu needs it. Deployed to Netlify with 1.13.2.</w:t>
             </w:r>
           </w:p>
         </w:tc>
@@ -10931,7 +10256,7 @@
               <w:spacing w:after="40"/>
             </w:pPr>
             <w:r>
-              <w:t>1.5.2</w:t>
+              <w:t>1.8.2</w:t>
             </w:r>
           </w:p>
         </w:tc>
@@ -10981,7 +10306,7 @@
               <w:spacing w:after="40"/>
             </w:pPr>
             <w:r>
-              <w:t>On phones and tablets (up to 860 px wide) the studio section heading, The studio / A room built around your voice, now sits on the bottom of the studio photo over a dark fade instead of below it. The description and gear list follow under the photo. Desktop layout is unchanged. The photo and text now fade in together as one block so the heading never shows without its photo.</w:t>
+              <w:t>Made the two home page hero buttons (Book a session and Purchase beats) 15% smaller than the other site buttons: text 14 to 11.9 px, icons 18 to 15.3 px, padding 10 x 18 to 8.5 x 15.3 px. They are now about 36 px tall. Other buttons are unchanged. Deployed to Netlify with 1.13.2.</w:t>
             </w:r>
           </w:p>
         </w:tc>
@@ -11014,7 +10339,7 @@
               <w:spacing w:after="40"/>
             </w:pPr>
             <w:r>
-              <w:t>1.5.1</w:t>
+              <w:t>1.8.1</w:t>
             </w:r>
           </w:p>
         </w:tc>
@@ -11064,7 +10389,7 @@
               <w:spacing w:after="40"/>
             </w:pPr>
             <w:r>
-              <w:t>Phone menu button: removed its round border and background in both the closed and open states, so only the equalizer bars (and the X when open) show. The bar bounce and the open and close morph now run 25% slower.</w:t>
+              <w:t>Made every button slightly smaller: text 15 to 14 px, icons 20 to 18 px, padding 12 x 22 to 10 x 18 px (navigation button 9 x 18 to 8 x 16 px). Buttons are now about 42 px tall. On phones the two hero buttons now sit side by side. Deployed to Netlify with 1.13.2.</w:t>
             </w:r>
           </w:p>
         </w:tc>
@@ -11097,6 +10422,848 @@
               <w:spacing w:after="40"/>
             </w:pPr>
             <w:r>
+              <w:t>1.8.0</w:t>
+            </w:r>
+          </w:p>
+        </w:tc>
+        <w:tc>
+          <w:tcPr>
+            <w:tcW w:w="1582" w:type="dxa"/>
+            <w:tcBorders>
+              <w:top w:val="single" w:sz="4" w:space="0" w:color="C9C3E6"/>
+              <w:left w:val="single" w:sz="4" w:space="0" w:color="C9C3E6"/>
+              <w:bottom w:val="single" w:sz="4" w:space="0" w:color="C9C3E6"/>
+              <w:right w:val="single" w:sz="4" w:space="0" w:color="C9C3E6"/>
+            </w:tcBorders>
+            <w:tcMar>
+              <w:top w:w="80" w:type="dxa"/>
+              <w:left w:w="110" w:type="dxa"/>
+              <w:bottom w:w="80" w:type="dxa"/>
+              <w:right w:w="110" w:type="dxa"/>
+            </w:tcMar>
+          </w:tcPr>
+          <w:p>
+            <w:pPr>
+              <w:spacing w:after="40"/>
+            </w:pPr>
+            <w:r>
+              <w:t>27 Sep 2026</w:t>
+            </w:r>
+          </w:p>
+        </w:tc>
+        <w:tc>
+          <w:tcPr>
+            <w:tcW w:w="6515" w:type="dxa"/>
+            <w:tcBorders>
+              <w:top w:val="single" w:sz="4" w:space="0" w:color="C9C3E6"/>
+              <w:left w:val="single" w:sz="4" w:space="0" w:color="C9C3E6"/>
+              <w:bottom w:val="single" w:sz="4" w:space="0" w:color="C9C3E6"/>
+              <w:right w:val="single" w:sz="4" w:space="0" w:color="C9C3E6"/>
+            </w:tcBorders>
+            <w:tcMar>
+              <w:top w:w="80" w:type="dxa"/>
+              <w:left w:w="110" w:type="dxa"/>
+              <w:bottom w:w="80" w:type="dxa"/>
+              <w:right w:w="110" w:type="dxa"/>
+            </w:tcMar>
+          </w:tcPr>
+          <w:p>
+            <w:pPr>
+              <w:spacing w:after="40"/>
+            </w:pPr>
+            <w:r>
+              <w:t>Home page hero headline (Elevate your sound with us.) now uses Boldonse, a Google font under the SIL Open Font License, bundled with the site (about 36 KB) and preloaded on the home page so it shows without a flash. Line spacing set to 1.45 to suit its tall letters. The logo in the navigation and every other heading keep Syne. Deployed to Netlify with 1.13.2.</w:t>
+            </w:r>
+          </w:p>
+        </w:tc>
+      </w:tr>
+      <w:tr>
+        <w:tblPrEx>
+          <w:tblCellMar>
+            <w:top w:w="0" w:type="dxa"/>
+            <w:bottom w:w="0" w:type="dxa"/>
+          </w:tblCellMar>
+        </w:tblPrEx>
+        <w:tc>
+          <w:tcPr>
+            <w:tcW w:w="1209" w:type="dxa"/>
+            <w:tcBorders>
+              <w:top w:val="single" w:sz="4" w:space="0" w:color="C9C3E6"/>
+              <w:left w:val="single" w:sz="4" w:space="0" w:color="C9C3E6"/>
+              <w:bottom w:val="single" w:sz="4" w:space="0" w:color="C9C3E6"/>
+              <w:right w:val="single" w:sz="4" w:space="0" w:color="C9C3E6"/>
+            </w:tcBorders>
+            <w:tcMar>
+              <w:top w:w="80" w:type="dxa"/>
+              <w:left w:w="110" w:type="dxa"/>
+              <w:bottom w:w="80" w:type="dxa"/>
+              <w:right w:w="110" w:type="dxa"/>
+            </w:tcMar>
+          </w:tcPr>
+          <w:p>
+            <w:pPr>
+              <w:spacing w:after="40"/>
+            </w:pPr>
+            <w:r>
+              <w:t>1.7.1</w:t>
+            </w:r>
+          </w:p>
+        </w:tc>
+        <w:tc>
+          <w:tcPr>
+            <w:tcW w:w="1582" w:type="dxa"/>
+            <w:tcBorders>
+              <w:top w:val="single" w:sz="4" w:space="0" w:color="C9C3E6"/>
+              <w:left w:val="single" w:sz="4" w:space="0" w:color="C9C3E6"/>
+              <w:bottom w:val="single" w:sz="4" w:space="0" w:color="C9C3E6"/>
+              <w:right w:val="single" w:sz="4" w:space="0" w:color="C9C3E6"/>
+            </w:tcBorders>
+            <w:tcMar>
+              <w:top w:w="80" w:type="dxa"/>
+              <w:left w:w="110" w:type="dxa"/>
+              <w:bottom w:w="80" w:type="dxa"/>
+              <w:right w:w="110" w:type="dxa"/>
+            </w:tcMar>
+          </w:tcPr>
+          <w:p>
+            <w:pPr>
+              <w:spacing w:after="40"/>
+            </w:pPr>
+            <w:r>
+              <w:t>27 Sep 2026</w:t>
+            </w:r>
+          </w:p>
+        </w:tc>
+        <w:tc>
+          <w:tcPr>
+            <w:tcW w:w="6515" w:type="dxa"/>
+            <w:tcBorders>
+              <w:top w:val="single" w:sz="4" w:space="0" w:color="C9C3E6"/>
+              <w:left w:val="single" w:sz="4" w:space="0" w:color="C9C3E6"/>
+              <w:bottom w:val="single" w:sz="4" w:space="0" w:color="C9C3E6"/>
+              <w:right w:val="single" w:sz="4" w:space="0" w:color="C9C3E6"/>
+            </w:tcBorders>
+            <w:tcMar>
+              <w:top w:w="80" w:type="dxa"/>
+              <w:left w:w="110" w:type="dxa"/>
+              <w:bottom w:w="80" w:type="dxa"/>
+              <w:right w:w="110" w:type="dxa"/>
+            </w:tcMar>
+          </w:tcPr>
+          <w:p>
+            <w:pPr>
+              <w:spacing w:after="40"/>
+            </w:pPr>
+            <w:r>
+              <w:t xml:space="preserve">Added </w:t>
+            </w:r>
+            <w:r>
+              <w:rPr>
+                <w:rFonts w:ascii="Consolas" w:eastAsia="Consolas" w:hAnsi="Consolas" w:cs="Consolas"/>
+                <w:color w:val="4E11DC"/>
+                <w:sz w:val="19"/>
+                <w:szCs w:val="19"/>
+              </w:rPr>
+              <w:t>netlify.toml</w:t>
+            </w:r>
+            <w:r>
+              <w:t xml:space="preserve"> (publish folder, one year cache for fonts, one week for images, basic security headers) and deployed to Netlify at https://altura-hertz.netlify.app. The local folder is linked to the Netlify project.</w:t>
+            </w:r>
+          </w:p>
+        </w:tc>
+      </w:tr>
+      <w:tr>
+        <w:tblPrEx>
+          <w:tblCellMar>
+            <w:top w:w="0" w:type="dxa"/>
+            <w:bottom w:w="0" w:type="dxa"/>
+          </w:tblCellMar>
+        </w:tblPrEx>
+        <w:tc>
+          <w:tcPr>
+            <w:tcW w:w="1209" w:type="dxa"/>
+            <w:tcBorders>
+              <w:top w:val="single" w:sz="4" w:space="0" w:color="C9C3E6"/>
+              <w:left w:val="single" w:sz="4" w:space="0" w:color="C9C3E6"/>
+              <w:bottom w:val="single" w:sz="4" w:space="0" w:color="C9C3E6"/>
+              <w:right w:val="single" w:sz="4" w:space="0" w:color="C9C3E6"/>
+            </w:tcBorders>
+            <w:tcMar>
+              <w:top w:w="80" w:type="dxa"/>
+              <w:left w:w="110" w:type="dxa"/>
+              <w:bottom w:w="80" w:type="dxa"/>
+              <w:right w:w="110" w:type="dxa"/>
+            </w:tcMar>
+          </w:tcPr>
+          <w:p>
+            <w:pPr>
+              <w:spacing w:after="40"/>
+            </w:pPr>
+            <w:r>
+              <w:t>1.7.1</w:t>
+            </w:r>
+          </w:p>
+        </w:tc>
+        <w:tc>
+          <w:tcPr>
+            <w:tcW w:w="1582" w:type="dxa"/>
+            <w:tcBorders>
+              <w:top w:val="single" w:sz="4" w:space="0" w:color="C9C3E6"/>
+              <w:left w:val="single" w:sz="4" w:space="0" w:color="C9C3E6"/>
+              <w:bottom w:val="single" w:sz="4" w:space="0" w:color="C9C3E6"/>
+              <w:right w:val="single" w:sz="4" w:space="0" w:color="C9C3E6"/>
+            </w:tcBorders>
+            <w:tcMar>
+              <w:top w:w="80" w:type="dxa"/>
+              <w:left w:w="110" w:type="dxa"/>
+              <w:bottom w:w="80" w:type="dxa"/>
+              <w:right w:w="110" w:type="dxa"/>
+            </w:tcMar>
+          </w:tcPr>
+          <w:p>
+            <w:pPr>
+              <w:spacing w:after="40"/>
+            </w:pPr>
+            <w:r>
+              <w:t>27 Sep 2026</w:t>
+            </w:r>
+          </w:p>
+        </w:tc>
+        <w:tc>
+          <w:tcPr>
+            <w:tcW w:w="6515" w:type="dxa"/>
+            <w:tcBorders>
+              <w:top w:val="single" w:sz="4" w:space="0" w:color="C9C3E6"/>
+              <w:left w:val="single" w:sz="4" w:space="0" w:color="C9C3E6"/>
+              <w:bottom w:val="single" w:sz="4" w:space="0" w:color="C9C3E6"/>
+              <w:right w:val="single" w:sz="4" w:space="0" w:color="C9C3E6"/>
+            </w:tcBorders>
+            <w:tcMar>
+              <w:top w:w="80" w:type="dxa"/>
+              <w:left w:w="110" w:type="dxa"/>
+              <w:bottom w:w="80" w:type="dxa"/>
+              <w:right w:w="110" w:type="dxa"/>
+            </w:tcMar>
+          </w:tcPr>
+          <w:p>
+            <w:pPr>
+              <w:spacing w:after="40"/>
+            </w:pPr>
+            <w:r>
+              <w:t>Project put under version control and pushed to GitHub at github.com/ohemengemmanuel/Altura-hurtz (branch main). Added a README and a .gitignore. The development/font-preview folder and font-preview.html are kept out of the repository because the trial font licences are unconfirmed.</w:t>
+            </w:r>
+          </w:p>
+        </w:tc>
+      </w:tr>
+      <w:tr>
+        <w:tblPrEx>
+          <w:tblCellMar>
+            <w:top w:w="0" w:type="dxa"/>
+            <w:bottom w:w="0" w:type="dxa"/>
+          </w:tblCellMar>
+        </w:tblPrEx>
+        <w:tc>
+          <w:tcPr>
+            <w:tcW w:w="1209" w:type="dxa"/>
+            <w:tcBorders>
+              <w:top w:val="single" w:sz="4" w:space="0" w:color="C9C3E6"/>
+              <w:left w:val="single" w:sz="4" w:space="0" w:color="C9C3E6"/>
+              <w:bottom w:val="single" w:sz="4" w:space="0" w:color="C9C3E6"/>
+              <w:right w:val="single" w:sz="4" w:space="0" w:color="C9C3E6"/>
+            </w:tcBorders>
+            <w:tcMar>
+              <w:top w:w="80" w:type="dxa"/>
+              <w:left w:w="110" w:type="dxa"/>
+              <w:bottom w:w="80" w:type="dxa"/>
+              <w:right w:w="110" w:type="dxa"/>
+            </w:tcMar>
+          </w:tcPr>
+          <w:p>
+            <w:pPr>
+              <w:spacing w:after="40"/>
+            </w:pPr>
+            <w:r>
+              <w:t>1.7.1</w:t>
+            </w:r>
+          </w:p>
+        </w:tc>
+        <w:tc>
+          <w:tcPr>
+            <w:tcW w:w="1582" w:type="dxa"/>
+            <w:tcBorders>
+              <w:top w:val="single" w:sz="4" w:space="0" w:color="C9C3E6"/>
+              <w:left w:val="single" w:sz="4" w:space="0" w:color="C9C3E6"/>
+              <w:bottom w:val="single" w:sz="4" w:space="0" w:color="C9C3E6"/>
+              <w:right w:val="single" w:sz="4" w:space="0" w:color="C9C3E6"/>
+            </w:tcBorders>
+            <w:tcMar>
+              <w:top w:w="80" w:type="dxa"/>
+              <w:left w:w="110" w:type="dxa"/>
+              <w:bottom w:w="80" w:type="dxa"/>
+              <w:right w:w="110" w:type="dxa"/>
+            </w:tcMar>
+          </w:tcPr>
+          <w:p>
+            <w:pPr>
+              <w:spacing w:after="40"/>
+            </w:pPr>
+            <w:r>
+              <w:t>27 Sep 2026</w:t>
+            </w:r>
+          </w:p>
+        </w:tc>
+        <w:tc>
+          <w:tcPr>
+            <w:tcW w:w="6515" w:type="dxa"/>
+            <w:tcBorders>
+              <w:top w:val="single" w:sz="4" w:space="0" w:color="C9C3E6"/>
+              <w:left w:val="single" w:sz="4" w:space="0" w:color="C9C3E6"/>
+              <w:bottom w:val="single" w:sz="4" w:space="0" w:color="C9C3E6"/>
+              <w:right w:val="single" w:sz="4" w:space="0" w:color="C9C3E6"/>
+            </w:tcBorders>
+            <w:tcMar>
+              <w:top w:w="80" w:type="dxa"/>
+              <w:left w:w="110" w:type="dxa"/>
+              <w:bottom w:w="80" w:type="dxa"/>
+              <w:right w:w="110" w:type="dxa"/>
+            </w:tcMar>
+          </w:tcPr>
+          <w:p>
+            <w:pPr>
+              <w:spacing w:after="40"/>
+            </w:pPr>
+            <w:r>
+              <w:t xml:space="preserve">Replaced the round Gain dial with a vertical, metallic fader like a mixing console channel: a brushed aluminium cap with bevelled edges and a grip line, a machined metal slot with a violet fill up to the cap, a dB scale (plus 3, 0, minus 6, minus 12) with 0 dB highlighted, all mounted on a small dark anodised metal plate so the scale stays readable over the meters. Same range and effect as before (minus 12 to plus 3 dB). Controls: drag the cap or click anywhere on the track to jump there, mouse wheel, arrow keys, Page Up and Page Down, Home and End, double-click to reset, and touch drag on phones. Tested in Chrome at 1366 and 390 px.</w:t>
+            </w:r>
+          </w:p>
+        </w:tc>
+      </w:tr>
+      <w:tr>
+        <w:tblPrEx>
+          <w:tblCellMar>
+            <w:top w:w="0" w:type="dxa"/>
+            <w:bottom w:w="0" w:type="dxa"/>
+          </w:tblCellMar>
+        </w:tblPrEx>
+        <w:tc>
+          <w:tcPr>
+            <w:tcW w:w="1209" w:type="dxa"/>
+            <w:tcBorders>
+              <w:top w:val="single" w:sz="4" w:space="0" w:color="C9C3E6"/>
+              <w:left w:val="single" w:sz="4" w:space="0" w:color="C9C3E6"/>
+              <w:bottom w:val="single" w:sz="4" w:space="0" w:color="C9C3E6"/>
+              <w:right w:val="single" w:sz="4" w:space="0" w:color="C9C3E6"/>
+            </w:tcBorders>
+            <w:tcMar>
+              <w:top w:w="80" w:type="dxa"/>
+              <w:left w:w="110" w:type="dxa"/>
+              <w:bottom w:w="80" w:type="dxa"/>
+              <w:right w:w="110" w:type="dxa"/>
+            </w:tcMar>
+          </w:tcPr>
+          <w:p>
+            <w:pPr>
+              <w:spacing w:after="40"/>
+            </w:pPr>
+            <w:r>
+              <w:t>1.7.0</w:t>
+            </w:r>
+          </w:p>
+        </w:tc>
+        <w:tc>
+          <w:tcPr>
+            <w:tcW w:w="1582" w:type="dxa"/>
+            <w:tcBorders>
+              <w:top w:val="single" w:sz="4" w:space="0" w:color="C9C3E6"/>
+              <w:left w:val="single" w:sz="4" w:space="0" w:color="C9C3E6"/>
+              <w:bottom w:val="single" w:sz="4" w:space="0" w:color="C9C3E6"/>
+              <w:right w:val="single" w:sz="4" w:space="0" w:color="C9C3E6"/>
+            </w:tcBorders>
+            <w:tcMar>
+              <w:top w:w="80" w:type="dxa"/>
+              <w:left w:w="110" w:type="dxa"/>
+              <w:bottom w:w="80" w:type="dxa"/>
+              <w:right w:w="110" w:type="dxa"/>
+            </w:tcMar>
+          </w:tcPr>
+          <w:p>
+            <w:pPr>
+              <w:spacing w:after="40"/>
+            </w:pPr>
+            <w:r>
+              <w:t>27 Sep 2026</w:t>
+            </w:r>
+          </w:p>
+        </w:tc>
+        <w:tc>
+          <w:tcPr>
+            <w:tcW w:w="6515" w:type="dxa"/>
+            <w:tcBorders>
+              <w:top w:val="single" w:sz="4" w:space="0" w:color="C9C3E6"/>
+              <w:left w:val="single" w:sz="4" w:space="0" w:color="C9C3E6"/>
+              <w:bottom w:val="single" w:sz="4" w:space="0" w:color="C9C3E6"/>
+              <w:right w:val="single" w:sz="4" w:space="0" w:color="C9C3E6"/>
+            </w:tcBorders>
+            <w:tcMar>
+              <w:top w:w="80" w:type="dxa"/>
+              <w:left w:w="110" w:type="dxa"/>
+              <w:bottom w:w="80" w:type="dxa"/>
+              <w:right w:w="110" w:type="dxa"/>
+            </w:tcMar>
+          </w:tcPr>
+          <w:p>
+            <w:pPr>
+              <w:spacing w:after="40"/>
+            </w:pPr>
+            <w:r>
+              <w:t>Added a Gain dial to the Ready when you are card that sets the height of the meter bars, styled like a plugin knob with a violet value arc and a dB readout. Range minus 12 dB (bars reach about a quarter height) to plus 3 dB (bars clip into the red), starting at 0 dB. Controls: drag up, down or sideways, mouse wheel, arrow keys (0.5 dB), Page Up and Page Down (3 dB), Home and End, and double-click to reset. Works with touch on phones. Announced to screen readers as a slider with its dB value. The dial only changes two values on the meter bank; the bars keep animating on the graphics card. Tested in Chrome at 1366 and 390 px with mouse drag, double-click and keyboard.</w:t>
+            </w:r>
+          </w:p>
+        </w:tc>
+      </w:tr>
+      <w:tr>
+        <w:tblPrEx>
+          <w:tblCellMar>
+            <w:top w:w="0" w:type="dxa"/>
+            <w:bottom w:w="0" w:type="dxa"/>
+          </w:tblCellMar>
+        </w:tblPrEx>
+        <w:tc>
+          <w:tcPr>
+            <w:tcW w:w="1209" w:type="dxa"/>
+            <w:tcBorders>
+              <w:top w:val="single" w:sz="4" w:space="0" w:color="C9C3E6"/>
+              <w:left w:val="single" w:sz="4" w:space="0" w:color="C9C3E6"/>
+              <w:bottom w:val="single" w:sz="4" w:space="0" w:color="C9C3E6"/>
+              <w:right w:val="single" w:sz="4" w:space="0" w:color="C9C3E6"/>
+            </w:tcBorders>
+            <w:tcMar>
+              <w:top w:w="80" w:type="dxa"/>
+              <w:left w:w="110" w:type="dxa"/>
+              <w:bottom w:w="80" w:type="dxa"/>
+              <w:right w:w="110" w:type="dxa"/>
+            </w:tcMar>
+          </w:tcPr>
+          <w:p>
+            <w:pPr>
+              <w:spacing w:after="40"/>
+            </w:pPr>
+            <w:r>
+              <w:t>1.6.2</w:t>
+            </w:r>
+          </w:p>
+        </w:tc>
+        <w:tc>
+          <w:tcPr>
+            <w:tcW w:w="1582" w:type="dxa"/>
+            <w:tcBorders>
+              <w:top w:val="single" w:sz="4" w:space="0" w:color="C9C3E6"/>
+              <w:left w:val="single" w:sz="4" w:space="0" w:color="C9C3E6"/>
+              <w:bottom w:val="single" w:sz="4" w:space="0" w:color="C9C3E6"/>
+              <w:right w:val="single" w:sz="4" w:space="0" w:color="C9C3E6"/>
+            </w:tcBorders>
+            <w:tcMar>
+              <w:top w:w="80" w:type="dxa"/>
+              <w:left w:w="110" w:type="dxa"/>
+              <w:bottom w:w="80" w:type="dxa"/>
+              <w:right w:w="110" w:type="dxa"/>
+            </w:tcMar>
+          </w:tcPr>
+          <w:p>
+            <w:pPr>
+              <w:spacing w:after="40"/>
+            </w:pPr>
+            <w:r>
+              <w:t>27 Sep 2026</w:t>
+            </w:r>
+          </w:p>
+        </w:tc>
+        <w:tc>
+          <w:tcPr>
+            <w:tcW w:w="6515" w:type="dxa"/>
+            <w:tcBorders>
+              <w:top w:val="single" w:sz="4" w:space="0" w:color="C9C3E6"/>
+              <w:left w:val="single" w:sz="4" w:space="0" w:color="C9C3E6"/>
+              <w:bottom w:val="single" w:sz="4" w:space="0" w:color="C9C3E6"/>
+              <w:right w:val="single" w:sz="4" w:space="0" w:color="C9C3E6"/>
+            </w:tcBorders>
+            <w:tcMar>
+              <w:top w:w="80" w:type="dxa"/>
+              <w:left w:w="110" w:type="dxa"/>
+              <w:bottom w:w="80" w:type="dxa"/>
+              <w:right w:w="110" w:type="dxa"/>
+            </w:tcMar>
+          </w:tcPr>
+          <w:p>
+            <w:pPr>
+              <w:spacing w:after="40"/>
+            </w:pPr>
+            <w:r>
+              <w:t>Slowed the meter bank in the Ready when you are card by 25%. Each bar now loops over 3.3 to 4.8 seconds instead of 2.6 to 3.8, with start offsets scaled to match so the bars stay spread out and stereo pairs stay together.</w:t>
+            </w:r>
+          </w:p>
+        </w:tc>
+      </w:tr>
+      <w:tr>
+        <w:tblPrEx>
+          <w:tblCellMar>
+            <w:top w:w="0" w:type="dxa"/>
+            <w:bottom w:w="0" w:type="dxa"/>
+          </w:tblCellMar>
+        </w:tblPrEx>
+        <w:tc>
+          <w:tcPr>
+            <w:tcW w:w="1209" w:type="dxa"/>
+            <w:tcBorders>
+              <w:top w:val="single" w:sz="4" w:space="0" w:color="C9C3E6"/>
+              <w:left w:val="single" w:sz="4" w:space="0" w:color="C9C3E6"/>
+              <w:bottom w:val="single" w:sz="4" w:space="0" w:color="C9C3E6"/>
+              <w:right w:val="single" w:sz="4" w:space="0" w:color="C9C3E6"/>
+            </w:tcBorders>
+            <w:tcMar>
+              <w:top w:w="80" w:type="dxa"/>
+              <w:left w:w="110" w:type="dxa"/>
+              <w:bottom w:w="80" w:type="dxa"/>
+              <w:right w:w="110" w:type="dxa"/>
+            </w:tcMar>
+          </w:tcPr>
+          <w:p>
+            <w:pPr>
+              <w:spacing w:after="40"/>
+            </w:pPr>
+            <w:r>
+              <w:t>1.6.1</w:t>
+            </w:r>
+          </w:p>
+        </w:tc>
+        <w:tc>
+          <w:tcPr>
+            <w:tcW w:w="1582" w:type="dxa"/>
+            <w:tcBorders>
+              <w:top w:val="single" w:sz="4" w:space="0" w:color="C9C3E6"/>
+              <w:left w:val="single" w:sz="4" w:space="0" w:color="C9C3E6"/>
+              <w:bottom w:val="single" w:sz="4" w:space="0" w:color="C9C3E6"/>
+              <w:right w:val="single" w:sz="4" w:space="0" w:color="C9C3E6"/>
+            </w:tcBorders>
+            <w:tcMar>
+              <w:top w:w="80" w:type="dxa"/>
+              <w:left w:w="110" w:type="dxa"/>
+              <w:bottom w:w="80" w:type="dxa"/>
+              <w:right w:w="110" w:type="dxa"/>
+            </w:tcMar>
+          </w:tcPr>
+          <w:p>
+            <w:pPr>
+              <w:spacing w:after="40"/>
+            </w:pPr>
+            <w:r>
+              <w:t>27 Sep 2026</w:t>
+            </w:r>
+          </w:p>
+        </w:tc>
+        <w:tc>
+          <w:tcPr>
+            <w:tcW w:w="6515" w:type="dxa"/>
+            <w:tcBorders>
+              <w:top w:val="single" w:sz="4" w:space="0" w:color="C9C3E6"/>
+              <w:left w:val="single" w:sz="4" w:space="0" w:color="C9C3E6"/>
+              <w:bottom w:val="single" w:sz="4" w:space="0" w:color="C9C3E6"/>
+              <w:right w:val="single" w:sz="4" w:space="0" w:color="C9C3E6"/>
+            </w:tcBorders>
+            <w:tcMar>
+              <w:top w:w="80" w:type="dxa"/>
+              <w:left w:w="110" w:type="dxa"/>
+              <w:bottom w:w="80" w:type="dxa"/>
+              <w:right w:w="110" w:type="dxa"/>
+            </w:tcMar>
+          </w:tcPr>
+          <w:p>
+            <w:pPr>
+              <w:spacing w:after="40"/>
+            </w:pPr>
+            <w:r>
+              <w:t>Replaced the analog VU meters with a digital meter bank in the style of DAW mixer meters: 14 stereo channel strips (28 bars) of LED segments lit ice blue at the bottom, violet in the middle and booth red at the top, with unlit segments faintly visible and a white peak-hold line on each bar. The bank is a background layer that fades into the card: towards the text on the left and down into the card at the bottom on desktop, and at both sides and the bottom on phones where it sits under the buttons. Performance: segments and colours are static, only a dark cover over unlit segments and the peak line move (transform on the graphics card, no JavaScript per frame), six shared motion patterns are reused with different timing, left and right bars in a pair move together with a small offset, and the bank pauses when off screen. Tested in Chrome at 1366 and 390 px.</w:t>
+            </w:r>
+          </w:p>
+        </w:tc>
+      </w:tr>
+      <w:tr>
+        <w:tblPrEx>
+          <w:tblCellMar>
+            <w:top w:w="0" w:type="dxa"/>
+            <w:bottom w:w="0" w:type="dxa"/>
+          </w:tblCellMar>
+        </w:tblPrEx>
+        <w:tc>
+          <w:tcPr>
+            <w:tcW w:w="1209" w:type="dxa"/>
+            <w:tcBorders>
+              <w:top w:val="single" w:sz="4" w:space="0" w:color="C9C3E6"/>
+              <w:left w:val="single" w:sz="4" w:space="0" w:color="C9C3E6"/>
+              <w:bottom w:val="single" w:sz="4" w:space="0" w:color="C9C3E6"/>
+              <w:right w:val="single" w:sz="4" w:space="0" w:color="C9C3E6"/>
+            </w:tcBorders>
+            <w:tcMar>
+              <w:top w:w="80" w:type="dxa"/>
+              <w:left w:w="110" w:type="dxa"/>
+              <w:bottom w:w="80" w:type="dxa"/>
+              <w:right w:w="110" w:type="dxa"/>
+            </w:tcMar>
+          </w:tcPr>
+          <w:p>
+            <w:pPr>
+              <w:spacing w:after="40"/>
+            </w:pPr>
+            <w:r>
+              <w:t>1.6.0</w:t>
+            </w:r>
+          </w:p>
+        </w:tc>
+        <w:tc>
+          <w:tcPr>
+            <w:tcW w:w="1582" w:type="dxa"/>
+            <w:tcBorders>
+              <w:top w:val="single" w:sz="4" w:space="0" w:color="C9C3E6"/>
+              <w:left w:val="single" w:sz="4" w:space="0" w:color="C9C3E6"/>
+              <w:bottom w:val="single" w:sz="4" w:space="0" w:color="C9C3E6"/>
+              <w:right w:val="single" w:sz="4" w:space="0" w:color="C9C3E6"/>
+            </w:tcBorders>
+            <w:tcMar>
+              <w:top w:w="80" w:type="dxa"/>
+              <w:left w:w="110" w:type="dxa"/>
+              <w:bottom w:w="80" w:type="dxa"/>
+              <w:right w:w="110" w:type="dxa"/>
+            </w:tcMar>
+          </w:tcPr>
+          <w:p>
+            <w:pPr>
+              <w:spacing w:after="40"/>
+            </w:pPr>
+            <w:r>
+              <w:t>27 Sep 2026</w:t>
+            </w:r>
+          </w:p>
+        </w:tc>
+        <w:tc>
+          <w:tcPr>
+            <w:tcW w:w="6515" w:type="dxa"/>
+            <w:tcBorders>
+              <w:top w:val="single" w:sz="4" w:space="0" w:color="C9C3E6"/>
+              <w:left w:val="single" w:sz="4" w:space="0" w:color="C9C3E6"/>
+              <w:bottom w:val="single" w:sz="4" w:space="0" w:color="C9C3E6"/>
+              <w:right w:val="single" w:sz="4" w:space="0" w:color="C9C3E6"/>
+            </w:tcBorders>
+            <w:tcMar>
+              <w:top w:w="80" w:type="dxa"/>
+              <w:left w:w="110" w:type="dxa"/>
+              <w:bottom w:w="80" w:type="dxa"/>
+              <w:right w:w="110" w:type="dxa"/>
+            </w:tcMar>
+          </w:tcPr>
+          <w:p>
+            <w:pPr>
+              <w:spacing w:after="40"/>
+            </w:pPr>
+            <w:r>
+              <w:t>Added a pair of analog VU meters (L and R) to the Ready when you are card. Scale from minus 20 to plus 3 VU with the 0 to plus 3 red zone, glowing needles and a red peak light that flashes when a needle reaches the red. Needles follow fixed musical patterns of different lengths so the channels never move in sync. Performance: faces are drawn once as SVG, only the needles and peak lights animate (rotation and opacity, handled by the graphics card with no JavaScript per frame), the meters pause whenever the card is off screen, and they stay still for visitors with reduced motion on. Tested in Chrome at 1366 and 390 px: running on screen, paused when scrolled away. On phones the meters sit under the buttons.</w:t>
+            </w:r>
+          </w:p>
+        </w:tc>
+      </w:tr>
+      <w:tr>
+        <w:tblPrEx>
+          <w:tblCellMar>
+            <w:top w:w="0" w:type="dxa"/>
+            <w:bottom w:w="0" w:type="dxa"/>
+          </w:tblCellMar>
+        </w:tblPrEx>
+        <w:tc>
+          <w:tcPr>
+            <w:tcW w:w="1209" w:type="dxa"/>
+            <w:tcBorders>
+              <w:top w:val="single" w:sz="4" w:space="0" w:color="C9C3E6"/>
+              <w:left w:val="single" w:sz="4" w:space="0" w:color="C9C3E6"/>
+              <w:bottom w:val="single" w:sz="4" w:space="0" w:color="C9C3E6"/>
+              <w:right w:val="single" w:sz="4" w:space="0" w:color="C9C3E6"/>
+            </w:tcBorders>
+            <w:tcMar>
+              <w:top w:w="80" w:type="dxa"/>
+              <w:left w:w="110" w:type="dxa"/>
+              <w:bottom w:w="80" w:type="dxa"/>
+              <w:right w:w="110" w:type="dxa"/>
+            </w:tcMar>
+          </w:tcPr>
+          <w:p>
+            <w:pPr>
+              <w:spacing w:after="40"/>
+            </w:pPr>
+            <w:r>
+              <w:t>1.5.2</w:t>
+            </w:r>
+          </w:p>
+        </w:tc>
+        <w:tc>
+          <w:tcPr>
+            <w:tcW w:w="1582" w:type="dxa"/>
+            <w:tcBorders>
+              <w:top w:val="single" w:sz="4" w:space="0" w:color="C9C3E6"/>
+              <w:left w:val="single" w:sz="4" w:space="0" w:color="C9C3E6"/>
+              <w:bottom w:val="single" w:sz="4" w:space="0" w:color="C9C3E6"/>
+              <w:right w:val="single" w:sz="4" w:space="0" w:color="C9C3E6"/>
+            </w:tcBorders>
+            <w:tcMar>
+              <w:top w:w="80" w:type="dxa"/>
+              <w:left w:w="110" w:type="dxa"/>
+              <w:bottom w:w="80" w:type="dxa"/>
+              <w:right w:w="110" w:type="dxa"/>
+            </w:tcMar>
+          </w:tcPr>
+          <w:p>
+            <w:pPr>
+              <w:spacing w:after="40"/>
+            </w:pPr>
+            <w:r>
+              <w:t>27 Sep 2026</w:t>
+            </w:r>
+          </w:p>
+        </w:tc>
+        <w:tc>
+          <w:tcPr>
+            <w:tcW w:w="6515" w:type="dxa"/>
+            <w:tcBorders>
+              <w:top w:val="single" w:sz="4" w:space="0" w:color="C9C3E6"/>
+              <w:left w:val="single" w:sz="4" w:space="0" w:color="C9C3E6"/>
+              <w:bottom w:val="single" w:sz="4" w:space="0" w:color="C9C3E6"/>
+              <w:right w:val="single" w:sz="4" w:space="0" w:color="C9C3E6"/>
+            </w:tcBorders>
+            <w:tcMar>
+              <w:top w:w="80" w:type="dxa"/>
+              <w:left w:w="110" w:type="dxa"/>
+              <w:bottom w:w="80" w:type="dxa"/>
+              <w:right w:w="110" w:type="dxa"/>
+            </w:tcMar>
+          </w:tcPr>
+          <w:p>
+            <w:pPr>
+              <w:spacing w:after="40"/>
+            </w:pPr>
+            <w:r>
+              <w:t>On phones and tablets (up to 860 px wide) the studio section heading, The studio / A room built around your voice, now sits on the bottom of the studio photo over a dark fade instead of below it. The description and gear list follow under the photo. Desktop layout is unchanged. The photo and text now fade in together as one block so the heading never shows without its photo.</w:t>
+            </w:r>
+          </w:p>
+        </w:tc>
+      </w:tr>
+      <w:tr>
+        <w:tblPrEx>
+          <w:tblCellMar>
+            <w:top w:w="0" w:type="dxa"/>
+            <w:bottom w:w="0" w:type="dxa"/>
+          </w:tblCellMar>
+        </w:tblPrEx>
+        <w:tc>
+          <w:tcPr>
+            <w:tcW w:w="1209" w:type="dxa"/>
+            <w:tcBorders>
+              <w:top w:val="single" w:sz="4" w:space="0" w:color="C9C3E6"/>
+              <w:left w:val="single" w:sz="4" w:space="0" w:color="C9C3E6"/>
+              <w:bottom w:val="single" w:sz="4" w:space="0" w:color="C9C3E6"/>
+              <w:right w:val="single" w:sz="4" w:space="0" w:color="C9C3E6"/>
+            </w:tcBorders>
+            <w:tcMar>
+              <w:top w:w="80" w:type="dxa"/>
+              <w:left w:w="110" w:type="dxa"/>
+              <w:bottom w:w="80" w:type="dxa"/>
+              <w:right w:w="110" w:type="dxa"/>
+            </w:tcMar>
+          </w:tcPr>
+          <w:p>
+            <w:pPr>
+              <w:spacing w:after="40"/>
+            </w:pPr>
+            <w:r>
+              <w:t>1.5.1</w:t>
+            </w:r>
+          </w:p>
+        </w:tc>
+        <w:tc>
+          <w:tcPr>
+            <w:tcW w:w="1582" w:type="dxa"/>
+            <w:tcBorders>
+              <w:top w:val="single" w:sz="4" w:space="0" w:color="C9C3E6"/>
+              <w:left w:val="single" w:sz="4" w:space="0" w:color="C9C3E6"/>
+              <w:bottom w:val="single" w:sz="4" w:space="0" w:color="C9C3E6"/>
+              <w:right w:val="single" w:sz="4" w:space="0" w:color="C9C3E6"/>
+            </w:tcBorders>
+            <w:tcMar>
+              <w:top w:w="80" w:type="dxa"/>
+              <w:left w:w="110" w:type="dxa"/>
+              <w:bottom w:w="80" w:type="dxa"/>
+              <w:right w:w="110" w:type="dxa"/>
+            </w:tcMar>
+          </w:tcPr>
+          <w:p>
+            <w:pPr>
+              <w:spacing w:after="40"/>
+            </w:pPr>
+            <w:r>
+              <w:t>27 Sep 2026</w:t>
+            </w:r>
+          </w:p>
+        </w:tc>
+        <w:tc>
+          <w:tcPr>
+            <w:tcW w:w="6515" w:type="dxa"/>
+            <w:tcBorders>
+              <w:top w:val="single" w:sz="4" w:space="0" w:color="C9C3E6"/>
+              <w:left w:val="single" w:sz="4" w:space="0" w:color="C9C3E6"/>
+              <w:bottom w:val="single" w:sz="4" w:space="0" w:color="C9C3E6"/>
+              <w:right w:val="single" w:sz="4" w:space="0" w:color="C9C3E6"/>
+            </w:tcBorders>
+            <w:tcMar>
+              <w:top w:w="80" w:type="dxa"/>
+              <w:left w:w="110" w:type="dxa"/>
+              <w:bottom w:w="80" w:type="dxa"/>
+              <w:right w:w="110" w:type="dxa"/>
+            </w:tcMar>
+          </w:tcPr>
+          <w:p>
+            <w:pPr>
+              <w:spacing w:after="40"/>
+            </w:pPr>
+            <w:r>
+              <w:t>Phone menu button: removed its round border and background in both the closed and open states, so only the equalizer bars (and the X when open) show. The bar bounce and the open and close morph now run 25% slower.</w:t>
+            </w:r>
+          </w:p>
+        </w:tc>
+      </w:tr>
+      <w:tr>
+        <w:tblPrEx>
+          <w:tblCellMar>
+            <w:top w:w="0" w:type="dxa"/>
+            <w:bottom w:w="0" w:type="dxa"/>
+          </w:tblCellMar>
+        </w:tblPrEx>
+        <w:tc>
+          <w:tcPr>
+            <w:tcW w:w="1209" w:type="dxa"/>
+            <w:tcBorders>
+              <w:top w:val="single" w:sz="4" w:space="0" w:color="C9C3E6"/>
+              <w:left w:val="single" w:sz="4" w:space="0" w:color="C9C3E6"/>
+              <w:bottom w:val="single" w:sz="4" w:space="0" w:color="C9C3E6"/>
+              <w:right w:val="single" w:sz="4" w:space="0" w:color="C9C3E6"/>
+            </w:tcBorders>
+            <w:tcMar>
+              <w:top w:w="80" w:type="dxa"/>
+              <w:left w:w="110" w:type="dxa"/>
+              <w:bottom w:w="80" w:type="dxa"/>
+              <w:right w:w="110" w:type="dxa"/>
+            </w:tcMar>
+          </w:tcPr>
+          <w:p>
+            <w:pPr>
+              <w:spacing w:after="40"/>
+            </w:pPr>
+            <w:r>
               <w:t>1.5.0</w:t>
             </w:r>
           </w:p>
@@ -11147,10 +11314,7 @@
               <w:spacing w:after="40"/>
             </w:pPr>
             <w:r>
-              <w:t xml:space="preserve">Added mild animations. Scroll reveal: section headings, service cards, steps, policies, contact details, forms and summaries fade up 14 px as they come into view, with a short stagger inside grids. Only elements that start below the screen are animated, so nothing visible flickers on page load. Home hero: text rises in and the photo settles from a slight zoom, on the first home visit of a browsing session only. Hover: cards lift and their photos zoom slightly, card arrows nudge forward, buttons lift with a </w:t>
-            </w:r>
-            <w:r>
-              <w:t>violet glow, social icons lift. Booking: the estimated total pulses when it changes and the booking summary eases in. Tested in Chrome in real time on four pages: nothing on screen was hidden at load and every element was visible after scrolling.</w:t>
+              <w:t xml:space="preserve">Added mild animations. Scroll reveal: section headings, service cards, steps, policies, contact details, forms and summaries fade up 14 px as they come into view, with a short stagger inside grids. Only elements that start below the screen are animated, so nothing visible flickers on page load. Home hero: text rises in and the photo settles from a slight zoom, on the first home visit of a browsing session only. Hover: cards lift and their photos zoom slightly, card arrows nudge forward, buttons lift with a violet glow, social icons lift. Booking: the estimated total pulses when it changes and the booking summary eases in. Tested in Chrome in real time on four pages: nothing on screen was hidden at load and every element was visible after scrolling.</w:t>
             </w:r>
           </w:p>
         </w:tc>
@@ -12750,10 +12914,10 @@
           <w:b/>
           <w:bCs/>
         </w:rPr>
-        <w:t>Recording only is priced by the hour.</w:t>
-      </w:r>
-      <w:r>
-        <w:t xml:space="preserve"> The brief lists a per track price on this form, but recording is charged hourly, so the track count is collected without a price.</w:t>
+        <w:t xml:space="preserve">Recording only is priced by the hour. The brief lists a per track price on this form, but recording is charged hourly. The track count and track titles were later removed from this form altogether.</w:t>
+      </w:r>
+      <w:r>
+        <w:t/>
       </w:r>
     </w:p>
     <w:p>
@@ -12770,10 +12934,10 @@
           <w:b/>
           <w:bCs/>
         </w:rPr>
-        <w:t>Uploads accept a file or a link.</w:t>
-      </w:r>
-      <w:r>
-        <w:t xml:space="preserve"> The brief marks instrumental upload as required. Large files cannot always go through a form, so a link counts too.</w:t>
+        <w:t xml:space="preserve">Uploads. The brief marks instrumental upload as required. Stems for mixing and mastering accept a file or a link because large files cannot always go through a form. Instrumentals are files only, and are optional on the Recording only form.</w:t>
+      </w:r>
+      <w:r>
+        <w:t/>
       </w:r>
     </w:p>
     <w:p>

</xml_diff>